<commit_message>
docs: update detailed technical documentation with comprehensive schemas and code snippets
</commit_message>
<xml_diff>
--- a/HO_SO_KY_THUAT.docx
+++ b/HO_SO_KY_THUAT.docx
@@ -44,7 +44,7 @@
         <w:rPr>
           <w:i/>
         </w:rPr>
-        <w:t>Tài liệu kỹ thuật này được lập chi tiết nhằm chứng minh toàn diện quy trình sản xuất và chất lượng phần mềm của sản phẩm **StationOS - Power Monitor (Phiên bản v3.x)**, đáp ứng các tiêu chuẩn khắt khe về bàn giao kỹ thuật công nghiệp và kiểm toán thuế của Bộ Tài chính/Tổng cục Thuế Việt Nam.</w:t>
+        <w:t>Tài liệu kỹ thuật chi tiết này được biên soạn cho dự án **StationOS - Power Monitor (Phiên bản v3.x)** nhằm phục vụ công tác nghiệm thu dự án, chứng minh năng lực tự chủ sản xuất phần mềm và đáp ứng các quy định của Tổng cục Thuế Việt Nam về quy trình công nghệ phát triển phần mềm được hưởng ưu đãi thuế VAT.</w:t>
       </w:r>
     </w:p>
     <w:p>
@@ -94,7 +94,7 @@
         <w:t>Đơn vị yêu cầu</w:t>
       </w:r>
       <w:r>
-        <w:t>: Công ty Điện lực truyền tải và Ban Quản lý Dự án điện lực cấp Tỉnh (đại diện: Trạm 110kV Long An, huyện Bến Lức, tỉnh Long An).</w:t>
+        <w:t>: Công ty Điện lực truyền tải và Ban Quản lý Dự án điện lực cấp Tỉnh (đại diện vận hành: Trạm biến áp 110kV Long An, Huyện Bến Lức, Tỉnh Long An).</w:t>
       </w:r>
     </w:p>
     <w:p>
@@ -606,21 +606,7 @@
         <w:spacing w:after="120" w:line="276" w:lineRule="auto"/>
       </w:pPr>
       <w:r>
-        <w:t>Hệ thống quản lý dữ liệu thông qua cơ sở dữ liệu PostgreSQL gồm 24 bảng dữ liệu, dưới đây là các bảng dữ liệu cốt lõi nhất:</w:t>
-      </w:r>
-    </w:p>
-    <w:p>
-      <w:pPr>
-        <w:pStyle w:val="Heading4"/>
-        <w:spacing w:before="120" w:after="40"/>
-      </w:pPr>
-      <w:r>
-        <w:rPr>
-          <w:rFonts w:ascii="Arial" w:hAnsi="Arial"/>
-          <w:i/>
-          <w:color w:val="505050"/>
-        </w:rPr>
-        <w:t>Bảng `Stations` (Danh sách các trạm giám sát)</w:t>
+        <w:t>Hệ thống quản lý dữ liệu thông qua cơ sở dữ liệu PostgreSQL gồm 24 bảng dữ liệu, dưới đây là các bảng dữ liệu cốt lõi nhất được thiết kế chi tiết:</w:t>
       </w:r>
     </w:p>
     <w:p>
@@ -634,6 +620,8 @@
           <w:color w:val="323232"/>
           <w:sz w:val="19"/>
         </w:rPr>
+        <w:t>-- 1. Bảng Stations (Danh sách các trạm giám sát)</w:t>
+        <w:br/>
         <w:t>CREATE TABLE "Stations" (</w:t>
         <w:br/>
         <w:t xml:space="preserve">    "Id" UUID PRIMARY KEY,</w:t>
@@ -647,33 +635,10 @@
         <w:t xml:space="preserve">    "Status" VARCHAR(20) NOT NULL DEFAULT 'active'</w:t>
         <w:br/>
         <w:t>);</w:t>
-      </w:r>
-    </w:p>
-    <w:p>
-      <w:pPr>
-        <w:pStyle w:val="Heading4"/>
-        <w:spacing w:before="120" w:after="40"/>
-      </w:pPr>
-      <w:r>
-        <w:rPr>
-          <w:rFonts w:ascii="Arial" w:hAnsi="Arial"/>
-          <w:i/>
-          <w:color w:val="505050"/>
-        </w:rPr>
-        <w:t>Bảng `Devices` (Danh sách thiết bị kết nối)</w:t>
-      </w:r>
-    </w:p>
-    <w:p>
-      <w:pPr>
-        <w:spacing w:before="120" w:after="120"/>
-        <w:ind w:left="576"/>
-      </w:pPr>
-      <w:r>
-        <w:rPr>
-          <w:rFonts w:ascii="Courier New" w:hAnsi="Courier New"/>
-          <w:color w:val="323232"/>
-          <w:sz w:val="19"/>
-        </w:rPr>
+        <w:br/>
+        <w:br/>
+        <w:t>-- 2. Bảng Devices (Danh sách thiết bị kết nối)</w:t>
+        <w:br/>
         <w:t>CREATE TABLE "Devices" (</w:t>
         <w:br/>
         <w:t xml:space="preserve">    "Id" UUID PRIMARY KEY,</w:t>
@@ -688,36 +653,15 @@
         <w:br/>
         <w:t xml:space="preserve">    "Config" TEXT NOT NULL, -- Lưu cấu hình kết nối chi tiết (IP, Port, Username, Password) dạng JSON</w:t>
         <w:br/>
-        <w:t xml:space="preserve">    "IsOnline" BOOLEAN NOT NULL DEFAULT false</w:t>
+        <w:t xml:space="preserve">    "IsOnline" BOOLEAN NOT NULL DEFAULT false,</w:t>
+        <w:br/>
+        <w:t xml:space="preserve">    "Status" VARCHAR(50) NOT NULL DEFAULT 'unknown'</w:t>
         <w:br/>
         <w:t>);</w:t>
-      </w:r>
-    </w:p>
-    <w:p>
-      <w:pPr>
-        <w:pStyle w:val="Heading4"/>
-        <w:spacing w:before="120" w:after="40"/>
-      </w:pPr>
-      <w:r>
-        <w:rPr>
-          <w:rFonts w:ascii="Arial" w:hAnsi="Arial"/>
-          <w:i/>
-          <w:color w:val="505050"/>
-        </w:rPr>
-        <w:t>Bảng `Users` (Danh sách tài khoản &amp; phân quyền)</w:t>
-      </w:r>
-    </w:p>
-    <w:p>
-      <w:pPr>
-        <w:spacing w:before="120" w:after="120"/>
-        <w:ind w:left="576"/>
-      </w:pPr>
-      <w:r>
-        <w:rPr>
-          <w:rFonts w:ascii="Courier New" w:hAnsi="Courier New"/>
-          <w:color w:val="323232"/>
-          <w:sz w:val="19"/>
-        </w:rPr>
+        <w:br/>
+        <w:br/>
+        <w:t>-- 3. Bảng Users (Danh sách tài khoản &amp; phân quyền)</w:t>
+        <w:br/>
         <w:t>CREATE TABLE "Users" (</w:t>
         <w:br/>
         <w:t xml:space="preserve">    "Id" UUID PRIMARY KEY,</w:t>
@@ -735,33 +679,10 @@
         <w:t xml:space="preserve">    "CreatedAt" TIMESTAMP NOT NULL DEFAULT CURRENT_TIMESTAMP</w:t>
         <w:br/>
         <w:t>);</w:t>
-      </w:r>
-    </w:p>
-    <w:p>
-      <w:pPr>
-        <w:pStyle w:val="Heading4"/>
-        <w:spacing w:before="120" w:after="40"/>
-      </w:pPr>
-      <w:r>
-        <w:rPr>
-          <w:rFonts w:ascii="Arial" w:hAnsi="Arial"/>
-          <w:i/>
-          <w:color w:val="505050"/>
-        </w:rPr>
-        <w:t>Bảng `SldFiles` (Thông tin tệp sơ đồ một sợi SVG)</w:t>
-      </w:r>
-    </w:p>
-    <w:p>
-      <w:pPr>
-        <w:spacing w:before="120" w:after="120"/>
-        <w:ind w:left="576"/>
-      </w:pPr>
-      <w:r>
-        <w:rPr>
-          <w:rFonts w:ascii="Courier New" w:hAnsi="Courier New"/>
-          <w:color w:val="323232"/>
-          <w:sz w:val="19"/>
-        </w:rPr>
+        <w:br/>
+        <w:br/>
+        <w:t>-- 4. Bảng SldFiles (Thông tin tệp sơ đồ một sợi SVG)</w:t>
+        <w:br/>
         <w:t>CREATE TABLE "SldFiles" (</w:t>
         <w:br/>
         <w:t xml:space="preserve">    "Id" UUID PRIMARY KEY,</w:t>
@@ -773,33 +694,10 @@
         <w:t xml:space="preserve">    "CreatedAt" TIMESTAMP NOT NULL DEFAULT CURRENT_TIMESTAMP</w:t>
         <w:br/>
         <w:t>);</w:t>
-      </w:r>
-    </w:p>
-    <w:p>
-      <w:pPr>
-        <w:pStyle w:val="Heading4"/>
-        <w:spacing w:before="120" w:after="40"/>
-      </w:pPr>
-      <w:r>
-        <w:rPr>
-          <w:rFonts w:ascii="Arial" w:hAnsi="Arial"/>
-          <w:i/>
-          <w:color w:val="505050"/>
-        </w:rPr>
-        <w:t>Bảng `SldPoints` (Liên kết điểm đo với phần tử đồ họa SVG)</w:t>
-      </w:r>
-    </w:p>
-    <w:p>
-      <w:pPr>
-        <w:spacing w:before="120" w:after="120"/>
-        <w:ind w:left="576"/>
-      </w:pPr>
-      <w:r>
-        <w:rPr>
-          <w:rFonts w:ascii="Courier New" w:hAnsi="Courier New"/>
-          <w:color w:val="323232"/>
-          <w:sz w:val="19"/>
-        </w:rPr>
+        <w:br/>
+        <w:br/>
+        <w:t>-- 5. Bảng SldPoints (Liên kết điểm đo với phần tử đồ họa SVG)</w:t>
+        <w:br/>
         <w:t>CREATE TABLE "SldPoints" (</w:t>
         <w:br/>
         <w:t xml:space="preserve">    "Id" UUID PRIMARY KEY,</w:t>
@@ -813,73 +711,33 @@
         <w:t xml:space="preserve">    "Description" VARCHAR(200) NULL</w:t>
         <w:br/>
         <w:t>);</w:t>
-      </w:r>
-    </w:p>
-    <w:p>
-      <w:pPr>
-        <w:pStyle w:val="Heading4"/>
-        <w:spacing w:before="120" w:after="40"/>
-      </w:pPr>
-      <w:r>
-        <w:rPr>
-          <w:rFonts w:ascii="Arial" w:hAnsi="Arial"/>
-          <w:i/>
-          <w:color w:val="505050"/>
-        </w:rPr>
-        <w:t>Bảng `SensorReadings` (Dữ liệu tức thời của cảm biến)</w:t>
-      </w:r>
-    </w:p>
-    <w:p>
-      <w:pPr>
-        <w:spacing w:before="120" w:after="120"/>
-        <w:ind w:left="576"/>
-      </w:pPr>
-      <w:r>
-        <w:rPr>
-          <w:rFonts w:ascii="Courier New" w:hAnsi="Courier New"/>
-          <w:color w:val="323232"/>
-          <w:sz w:val="19"/>
-        </w:rPr>
+        <w:br/>
+        <w:br/>
+        <w:t>-- 6. Bảng SensorReadings (Dữ liệu tức thời của cảm biến)</w:t>
+        <w:br/>
         <w:t>CREATE TABLE "SensorReadings" (</w:t>
         <w:br/>
         <w:t xml:space="preserve">    "Id" SERIAL PRIMARY KEY,</w:t>
         <w:br/>
-        <w:t xml:space="preserve">    "PointId" VARCHAR(100) UNIQUE NOT NULL,</w:t>
+        <w:t xml:space="preserve">    "Time" TIMESTAMP NOT NULL,</w:t>
+        <w:br/>
+        <w:t xml:space="preserve">    "StationId" UUID REFERENCES "Stations"("Id") ON DELETE CASCADE,</w:t>
+        <w:br/>
+        <w:t xml:space="preserve">    "DeviceId" UUID REFERENCES "Devices"("Id") ON DELETE CASCADE,</w:t>
+        <w:br/>
+        <w:t xml:space="preserve">    "PointId" VARCHAR(100) NOT NULL,</w:t>
         <w:br/>
         <w:t xml:space="preserve">    "Value" DOUBLE PRECISION NULL,</w:t>
         <w:br/>
-        <w:t xml:space="preserve">    "Quality" INTEGER NOT NULL, -- 1 = Tốt, 2 = Mất kết nối thiết bị</w:t>
-        <w:br/>
-        <w:t xml:space="preserve">    "Timestamp" TIMESTAMP NOT NULL</w:t>
+        <w:t xml:space="preserve">    "Unit" VARCHAR(50) NULL,</w:t>
+        <w:br/>
+        <w:t xml:space="preserve">    "Quality" INTEGER NOT NULL -- 1 = Tốt, 2 = Mất kết nối thiết bị</w:t>
         <w:br/>
         <w:t>);</w:t>
-      </w:r>
-    </w:p>
-    <w:p>
-      <w:pPr>
-        <w:pStyle w:val="Heading4"/>
-        <w:spacing w:before="120" w:after="40"/>
-      </w:pPr>
-      <w:r>
-        <w:rPr>
-          <w:rFonts w:ascii="Arial" w:hAnsi="Arial"/>
-          <w:i/>
-          <w:color w:val="505050"/>
-        </w:rPr>
-        <w:t>Bảng `Alerts` (Nhật ký cảnh báo sự cố đang xảy ra)</w:t>
-      </w:r>
-    </w:p>
-    <w:p>
-      <w:pPr>
-        <w:spacing w:before="120" w:after="120"/>
-        <w:ind w:left="576"/>
-      </w:pPr>
-      <w:r>
-        <w:rPr>
-          <w:rFonts w:ascii="Courier New" w:hAnsi="Courier New"/>
-          <w:color w:val="323232"/>
-          <w:sz w:val="19"/>
-        </w:rPr>
+        <w:br/>
+        <w:br/>
+        <w:t>-- 7. Bảng Alerts (Nhật ký cảnh báo sự cố đang xảy ra)</w:t>
+        <w:br/>
         <w:t>CREATE TABLE "Alerts" (</w:t>
         <w:br/>
         <w:t xml:space="preserve">    "Id" UUID PRIMARY KEY,</w:t>
@@ -905,40 +763,38 @@
         <w:t xml:space="preserve">    "AckAt" TIMESTAMP NULL</w:t>
         <w:br/>
         <w:t>);</w:t>
-      </w:r>
-    </w:p>
-    <w:p>
-      <w:pPr>
-        <w:pStyle w:val="Heading4"/>
-        <w:spacing w:before="120" w:after="40"/>
-      </w:pPr>
-      <w:r>
-        <w:rPr>
-          <w:rFonts w:ascii="Arial" w:hAnsi="Arial"/>
-          <w:i/>
-          <w:color w:val="505050"/>
-        </w:rPr>
-        <w:t>Bảng `SyncQueues` (Hàng đợi đồng bộ dữ liệu)</w:t>
-      </w:r>
-    </w:p>
-    <w:p>
-      <w:pPr>
-        <w:spacing w:before="120" w:after="120"/>
-        <w:ind w:left="576"/>
-      </w:pPr>
-      <w:r>
-        <w:rPr>
-          <w:rFonts w:ascii="Courier New" w:hAnsi="Courier New"/>
-          <w:color w:val="323232"/>
-          <w:sz w:val="19"/>
-        </w:rPr>
+        <w:br/>
+        <w:br/>
+        <w:t>-- 8. Bảng Rules (Các quy tắc giám sát tự động)</w:t>
+        <w:br/>
+        <w:t>CREATE TABLE "Rules" (</w:t>
+        <w:br/>
+        <w:t xml:space="preserve">    "Id" UUID PRIMARY KEY,</w:t>
+        <w:br/>
+        <w:t xml:space="preserve">    "StationId" UUID REFERENCES "Stations"("Id") ON DELETE CASCADE,</w:t>
+        <w:br/>
+        <w:t xml:space="preserve">    "Name" VARCHAR(200) NOT NULL,</w:t>
+        <w:br/>
+        <w:t xml:space="preserve">    "RuleSet" TEXT NULL,</w:t>
+        <w:br/>
+        <w:t xml:space="preserve">    "Condition" TEXT NOT NULL, -- Cấu hình điều kiện logic JSON</w:t>
+        <w:br/>
+        <w:t xml:space="preserve">    "Actions" TEXT NOT NULL, -- Hành động cảnh báo JSON</w:t>
+        <w:br/>
+        <w:t xml:space="preserve">    "Enabled" BOOLEAN NOT NULL DEFAULT true</w:t>
+        <w:br/>
+        <w:t>);</w:t>
+        <w:br/>
+        <w:br/>
+        <w:t>-- 9. Bảng SyncQueues (Hàng đợi đồng bộ dữ liệu)</w:t>
+        <w:br/>
         <w:t>CREATE TABLE "SyncQueues" (</w:t>
         <w:br/>
         <w:t xml:space="preserve">    "Id" BIGSERIAL PRIMARY KEY,</w:t>
         <w:br/>
         <w:t xml:space="preserve">    "EntityType" VARCHAR(50) NOT NULL, -- 'TelemetryData', 'Alert', 'Report'</w:t>
         <w:br/>
-        <w:t xml:space="preserve">    "EntityId" VARCHAR(100) NOT NULL,</w:t>
+        <w:t xml:space="preserve">    "EntityId" UUID NOT NULL,</w:t>
         <w:br/>
         <w:t xml:space="preserve">    "Payload" TEXT NOT NULL, -- Nội dung thực thể dạng JSON để gửi lên API Trạm tổng</w:t>
         <w:br/>
@@ -946,7 +802,51 @@
         <w:br/>
         <w:t xml:space="preserve">    "RetryCount" INTEGER NOT NULL DEFAULT 0,</w:t>
         <w:br/>
+        <w:t xml:space="preserve">    "CreatedAt" TIMESTAMP NOT NULL DEFAULT CURRENT_TIMESTAMP,</w:t>
+        <w:br/>
+        <w:t xml:space="preserve">    "SentAt" TIMESTAMP NULL</w:t>
+        <w:br/>
+        <w:t>);</w:t>
+        <w:br/>
+        <w:br/>
+        <w:t>-- 10. Bảng MaintenanceTasks (Lịch bảo trì thiết bị sinh tự động)</w:t>
+        <w:br/>
+        <w:t>CREATE TABLE "MaintenanceTasks" (</w:t>
+        <w:br/>
+        <w:t xml:space="preserve">    "Id" UUID PRIMARY KEY,</w:t>
+        <w:br/>
+        <w:t xml:space="preserve">    "StationId" UUID REFERENCES "Stations"("Id") ON DELETE CASCADE,</w:t>
+        <w:br/>
+        <w:t xml:space="preserve">    "Title" VARCHAR(250) NOT NULL,</w:t>
+        <w:br/>
+        <w:t xml:space="preserve">    "Type" VARCHAR(50) NOT NULL, -- 'inspection', 'repair'</w:t>
+        <w:br/>
+        <w:t xml:space="preserve">    "Status" VARCHAR(50) NOT NULL, -- 'pending', 'in_progress', 'completed'</w:t>
+        <w:br/>
+        <w:t xml:space="preserve">    "AssignedTo" VARCHAR(100) NULL,</w:t>
+        <w:br/>
+        <w:t xml:space="preserve">    "ScheduledDate" TIMESTAMP NULL,</w:t>
+        <w:br/>
+        <w:t xml:space="preserve">    "Notes" TEXT NULL,</w:t>
+        <w:br/>
         <w:t xml:space="preserve">    "CreatedAt" TIMESTAMP NOT NULL DEFAULT CURRENT_TIMESTAMP</w:t>
+        <w:br/>
+        <w:t>);</w:t>
+        <w:br/>
+        <w:br/>
+        <w:t>-- 11. Bảng Boundaries (Định nghĩa các vùng biên nhiệt độ camera)</w:t>
+        <w:br/>
+        <w:t>CREATE TABLE "Boundaries" (</w:t>
+        <w:br/>
+        <w:t xml:space="preserve">    "Id" UUID PRIMARY KEY,</w:t>
+        <w:br/>
+        <w:t xml:space="preserve">    "DeviceId" UUID REFERENCES "Devices"("Id") ON DELETE CASCADE,</w:t>
+        <w:br/>
+        <w:t xml:space="preserve">    "PointId" VARCHAR(100) NOT NULL,</w:t>
+        <w:br/>
+        <w:t xml:space="preserve">    "PolygonCoordinates" TEXT NOT NULL, -- Tọa độ các đỉnh của đa giác ROI JSON</w:t>
+        <w:br/>
+        <w:t xml:space="preserve">    "Label" VARCHAR(100) NULL</w:t>
         <w:br/>
         <w:t>);</w:t>
       </w:r>
@@ -990,157 +890,37 @@
         <w:spacing w:after="120" w:line="276" w:lineRule="auto"/>
       </w:pPr>
       <w:r>
-        <w:t xml:space="preserve">Dưới đây là danh sách đầy đủ nhật ký phát triển tính năng và sửa lỗi của nhánh </w:t>
-      </w:r>
-      <w:r>
-        <w:rPr>
-          <w:rFonts w:ascii="Courier New" w:hAnsi="Courier New"/>
-          <w:color w:val="B43232"/>
-          <w:sz w:val="20"/>
-        </w:rPr>
-        <w:t>release/v3.0.40</w:t>
-      </w:r>
-      <w:r>
-        <w:t xml:space="preserve"> trước khi nâng cấp và đóng gói bản </w:t>
-      </w:r>
-      <w:r>
-        <w:rPr>
-          <w:rFonts w:ascii="Courier New" w:hAnsi="Courier New"/>
-          <w:color w:val="B43232"/>
-          <w:sz w:val="20"/>
-        </w:rPr>
-        <w:t>v3.0.51</w:t>
-      </w:r>
-      <w:r>
-        <w:t>:</w:t>
+        <w:t>Các thay đổi mã nguồn chính gần đây được đẩy lên kho lưu trữ để kiểm soát phiên bản:</w:t>
       </w:r>
     </w:p>
     <w:p>
       <w:pPr>
-        <w:pStyle w:val="ListBullet"/>
-        <w:spacing w:after="40" w:before="0"/>
+        <w:spacing w:before="120" w:after="120"/>
+        <w:ind w:left="576"/>
       </w:pPr>
-      <w:r/>
       <w:r>
         <w:rPr>
-          <w:b/>
+          <w:rFonts w:ascii="Courier New" w:hAnsi="Courier New"/>
+          <w:color w:val="323232"/>
+          <w:sz w:val="19"/>
         </w:rPr>
-        <w:t>`719d13a`</w:t>
-      </w:r>
-      <w:r>
-        <w:t xml:space="preserve"> - *kennhope13*: `chore: bump version to v3.0.51 and fix camera dropdown text visibility &amp; seed SVG path` (Sửa lỗi hiển thị dropdown Camera và logic copy file SVG sơ đồ khi cài đặt).</w:t>
-      </w:r>
-    </w:p>
-    <w:p>
-      <w:pPr>
-        <w:pStyle w:val="ListBullet"/>
-        <w:spacing w:after="40" w:before="0"/>
-      </w:pPr>
-      <w:r/>
-      <w:r>
-        <w:rPr>
-          <w:b/>
-        </w:rPr>
-        <w:t>`e1a0591`</w:t>
-      </w:r>
-      <w:r>
-        <w:t xml:space="preserve"> - *kennhope13*: `chore: bump version to v3.0.50` (Tăng version chuẩn bị đóng gói).</w:t>
-      </w:r>
-    </w:p>
-    <w:p>
-      <w:pPr>
-        <w:pStyle w:val="ListBullet"/>
-        <w:spacing w:after="40" w:before="0"/>
-      </w:pPr>
-      <w:r/>
-      <w:r>
-        <w:rPr>
-          <w:b/>
-        </w:rPr>
-        <w:t>`a51f2b8`</w:t>
-      </w:r>
-      <w:r>
-        <w:t xml:space="preserve"> - *kennhope13*: `fix: instantiate builder with WebApplicationOptions to configure WebRootPath, avoiding NotSupportedException` (Sửa lỗi không tìm thấy WebRoot của API trong bản build tự chứa của Electron).</w:t>
-      </w:r>
-    </w:p>
-    <w:p>
-      <w:pPr>
-        <w:pStyle w:val="ListBullet"/>
-        <w:spacing w:after="40" w:before="0"/>
-      </w:pPr>
-      <w:r/>
-      <w:r>
-        <w:rPr>
-          <w:b/>
-        </w:rPr>
-        <w:t>`969adf6`</w:t>
-      </w:r>
-      <w:r>
-        <w:t xml:space="preserve"> - *kennhope13*: `fix: set offline simulated values to null and quality to 2 to display ----- on UI` (Sửa hiển thị các điểm đo mất kết nối mạng thành nét đứt `-----`).</w:t>
-      </w:r>
-    </w:p>
-    <w:p>
-      <w:pPr>
-        <w:pStyle w:val="ListBullet"/>
-        <w:spacing w:after="40" w:before="0"/>
-      </w:pPr>
-      <w:r/>
-      <w:r>
-        <w:rPr>
-          <w:b/>
-        </w:rPr>
-        <w:t>`ecebe38`</w:t>
-      </w:r>
-      <w:r>
-        <w:t xml:space="preserve"> - *kennhope13*: `fix: redirect backend wwwroot to AppData to resolve write permissions error` (Thay đổi Web Root sang thư mục AppData để tránh xung đột phân quyền thư mục ghi trên Windows 11).</w:t>
-      </w:r>
-    </w:p>
-    <w:p>
-      <w:pPr>
-        <w:pStyle w:val="ListBullet"/>
-        <w:spacing w:after="40" w:before="0"/>
-      </w:pPr>
-      <w:r/>
-      <w:r>
-        <w:rPr>
-          <w:b/>
-        </w:rPr>
-        <w:t>`05389ab`</w:t>
-      </w:r>
-      <w:r>
-        <w:t xml:space="preserve"> - *kennhope13*: `fix: prevent sidebar theme selection popover text wrapping` (Sửa lỗi hiển thị sidebar chọn giao diện bị tràn chữ).</w:t>
-      </w:r>
-    </w:p>
-    <w:p>
-      <w:pPr>
-        <w:pStyle w:val="ListBullet"/>
-        <w:spacing w:after="40" w:before="0"/>
-      </w:pPr>
-      <w:r/>
-      <w:r>
-        <w:rPr>
-          <w:b/>
-        </w:rPr>
-        <w:t>`63ec2c6`</w:t>
-      </w:r>
-      <w:r>
-        <w:t xml:space="preserve"> - *kennhope13*: `chore: license root configuration, sensor limit fixes, UI warnings removal, and bump version to v3.0.49` (Cấu hình giới hạn cảm biến theo giấy phép bản quyền).</w:t>
-      </w:r>
-    </w:p>
-    <w:p>
-      <w:pPr>
-        <w:pStyle w:val="ListBullet"/>
-        <w:spacing w:after="40" w:before="0"/>
-      </w:pPr>
-      <w:r/>
-      <w:r>
-        <w:rPr>
-          <w:b/>
-        </w:rPr>
-        <w:t>`8f583dc`</w:t>
-      </w:r>
-      <w:r>
-        <w:t xml:space="preserve"> - *kennhope13*: `fix: prevent local loops from resolving server_ip config in env.ts, and bump to v3.0.48` (Sửa lỗi vòng lặp DNS trên cấu hình IP Server).</w:t>
+        <w:t>719d13a - chore: bump version to v3.0.51 and fix camera dropdown text visibility &amp; seed SVG path</w:t>
+        <w:br/>
+        <w:t>e1a0591 - chore: bump version to v3.0.50</w:t>
+        <w:br/>
+        <w:t>a51f2b8 - fix: instantiate builder with WebApplicationOptions to configure WebRootPath, avoiding NotSupportedException</w:t>
+        <w:br/>
+        <w:t>969adf6 - fix: set offline simulated values to null and quality to 2 to display ----- on UI</w:t>
+        <w:br/>
+        <w:t>ecebe38 - fix: redirect backend wwwroot to AppData to resolve write permissions error</w:t>
+        <w:br/>
+        <w:t>05389ab - fix: prevent sidebar theme selection popover text wrapping</w:t>
+        <w:br/>
+        <w:t>63ec2c6 - chore: license root configuration, sensor limit fixes, UI warnings removal, and bump version to v3.0.49</w:t>
+        <w:br/>
+        <w:t>8f583dc - fix: prevent local loops from resolving server_ip config in env.ts, and bump to v3.0.48</w:t>
+        <w:br/>
+        <w:t>a903a85 - fix: catch socket errors to prevent ECONNRESET crash and deduplicate service shutdown hooks, and bump to v3.0.47</w:t>
       </w:r>
     </w:p>
     <w:p>
@@ -1167,7 +947,7 @@
           <w:i/>
           <w:color w:val="505050"/>
         </w:rPr>
-        <w:t>A. Logic cấu hình cơ sở dữ liệu DbContext và kích hoạt tính năng chuỗi thời gian TimescaleDB (`AppDbContext.cs`):</w:t>
+        <w:t>A. Tiến trình nền đọc Modbus/S7 liên tục và giám sát thiết bị (`PlcPollingWorker.cs`):</w:t>
       </w:r>
     </w:p>
     <w:p>
@@ -1181,75 +961,221 @@
           <w:color w:val="323232"/>
           <w:sz w:val="19"/>
         </w:rPr>
+        <w:t>using System.Text.Json;</w:t>
+        <w:br/>
         <w:t>using Microsoft.EntityFrameworkCore;</w:t>
         <w:br/>
+        <w:t>using Microsoft.Extensions.DependencyInjection;</w:t>
+        <w:br/>
+        <w:t>using Microsoft.Extensions.Hosting;</w:t>
+        <w:br/>
+        <w:t>using Microsoft.Extensions.Logging;</w:t>
+        <w:br/>
+        <w:t>using Microsoft.Extensions.Caching.Memory;</w:t>
+        <w:br/>
+        <w:t>using S7.Net;</w:t>
+        <w:br/>
+        <w:t>using StationOS.Data;</w:t>
+        <w:br/>
         <w:t>using StationOS.Data.Entities;</w:t>
         <w:br/>
         <w:br/>
-        <w:t>namespace StationOS.Data</w:t>
+        <w:t>namespace StationOS.Workers.Polling;</w:t>
+        <w:br/>
+        <w:br/>
+        <w:t>public class PlcPollingWorker : BackgroundService</w:t>
         <w:br/>
         <w:t>{</w:t>
         <w:br/>
-        <w:t xml:space="preserve">    public class AppDbContext : DbContext</w:t>
+        <w:t xml:space="preserve">    private readonly IServiceScopeFactory _scopeFactory;</w:t>
+        <w:br/>
+        <w:t xml:space="preserve">    private readonly IRealtimeNotifier _notifier;</w:t>
+        <w:br/>
+        <w:t xml:space="preserve">    private readonly ILogger&lt;PlcPollingWorker&gt; _logger;</w:t>
+        <w:br/>
+        <w:t xml:space="preserve">    private readonly IMemoryCache _cache;</w:t>
+        <w:br/>
+        <w:br/>
+        <w:t xml:space="preserve">    private readonly Dictionary&lt;Guid, DateTime&gt; _lastPollTimes = new();</w:t>
+        <w:br/>
+        <w:t xml:space="preserve">    private readonly Dictionary&lt;Guid, DateTime&gt; _lastDbSaveTimes = new();</w:t>
+        <w:br/>
+        <w:br/>
+        <w:t xml:space="preserve">    public PlcPollingWorker(</w:t>
+        <w:br/>
+        <w:t xml:space="preserve">        IServiceScopeFactory scopeFactory,</w:t>
+        <w:br/>
+        <w:t xml:space="preserve">        IRealtimeNotifier notifier,</w:t>
+        <w:br/>
+        <w:t xml:space="preserve">        ILogger&lt;PlcPollingWorker&gt; logger,</w:t>
+        <w:br/>
+        <w:t xml:space="preserve">        IMemoryCache cache)</w:t>
         <w:br/>
         <w:t xml:space="preserve">    {</w:t>
         <w:br/>
-        <w:t xml:space="preserve">        public AppDbContext(DbContextOptions&lt;AppDbContext&gt; options) : base(options) { }</w:t>
-        <w:br/>
-        <w:br/>
-        <w:t xml:space="preserve">        public DbSet&lt;Station&gt; Stations =&gt; Set&lt;Station&gt;();</w:t>
-        <w:br/>
-        <w:t xml:space="preserve">        public DbSet&lt;Device&gt; Devices =&gt; Set&lt;Device&gt;();</w:t>
-        <w:br/>
-        <w:t xml:space="preserve">        public DbSet&lt;User&gt; Users =&gt; Set&lt;User&gt;();</w:t>
-        <w:br/>
-        <w:t xml:space="preserve">        public DbSet&lt;SldFile&gt; SldFiles =&gt; Set&lt;SldFile&gt;();</w:t>
-        <w:br/>
-        <w:t xml:space="preserve">        public DbSet&lt;SldPoint&gt; SldPoints =&gt; Set&lt;SldPoint&gt;();</w:t>
-        <w:br/>
-        <w:t xml:space="preserve">        public DbSet&lt;SensorReading&gt; SensorReadings =&gt; Set&lt;SensorReading&gt;();</w:t>
-        <w:br/>
-        <w:t xml:space="preserve">        public DbSet&lt;Alert&gt; Alerts =&gt; Set&lt;Alert&gt;();</w:t>
-        <w:br/>
-        <w:t xml:space="preserve">        public DbSet&lt;Rule&gt; Rules =&gt; Set&lt;Rule&gt;();</w:t>
-        <w:br/>
-        <w:t xml:space="preserve">        public DbSet&lt;SyncQueue&gt; SyncQueues =&gt; Set&lt;SyncQueue&gt;();</w:t>
-        <w:br/>
-        <w:t xml:space="preserve">        public DbSet&lt;MaintenanceTask&gt; MaintenanceTasks =&gt; Set&lt;MaintenanceTask&gt;();</w:t>
-        <w:br/>
-        <w:br/>
-        <w:t xml:space="preserve">        protected override void OnModelCreating(ModelBuilder modelBuilder)</w:t>
+        <w:t xml:space="preserve">        _scopeFactory = scopeFactory;</w:t>
+        <w:br/>
+        <w:t xml:space="preserve">        _notifier = notifier;</w:t>
+        <w:br/>
+        <w:t xml:space="preserve">        _logger = logger;</w:t>
+        <w:br/>
+        <w:t xml:space="preserve">        _cache = cache;</w:t>
+        <w:br/>
+        <w:t xml:space="preserve">    }</w:t>
+        <w:br/>
+        <w:br/>
+        <w:t xml:space="preserve">    protected override async Task ExecuteAsync(CancellationToken stoppingToken)</w:t>
+        <w:br/>
+        <w:t xml:space="preserve">    {</w:t>
+        <w:br/>
+        <w:t xml:space="preserve">        _logger.LogInformation("[PLC] Worker khởi động đọc dữ liệu chu kỳ");</w:t>
+        <w:br/>
+        <w:br/>
+        <w:t xml:space="preserve">        while (!stoppingToken.IsCancellationRequested)</w:t>
         <w:br/>
         <w:t xml:space="preserve">        {</w:t>
         <w:br/>
-        <w:t xml:space="preserve">            base.OnModelCreating(modelBuilder);</w:t>
-        <w:br/>
-        <w:br/>
-        <w:t xml:space="preserve">            // Cấu hình khoá chính phức hợp cho bảng dữ liệu lịch sử đo lường (Hypertable)</w:t>
-        <w:br/>
-        <w:t xml:space="preserve">            modelBuilder.Entity&lt;TelemetryData&gt;()</w:t>
-        <w:br/>
-        <w:t xml:space="preserve">                .HasKey(t =&gt; new { t.Timestamp, t.PointId });</w:t>
-        <w:br/>
-        <w:br/>
-        <w:t xml:space="preserve">            // Chỉ mục tăng tốc độ truy vấn theo thời gian</w:t>
-        <w:br/>
-        <w:t xml:space="preserve">            modelBuilder.Entity&lt;TelemetryData&gt;()</w:t>
-        <w:br/>
-        <w:t xml:space="preserve">                .HasIndex(t =&gt; t.Timestamp);</w:t>
-        <w:br/>
-        <w:br/>
-        <w:t xml:space="preserve">            // Cấu hình quan hệ CASCADE DELETE khi xóa Trạm</w:t>
-        <w:br/>
-        <w:t xml:space="preserve">            modelBuilder.Entity&lt;Device&gt;()</w:t>
-        <w:br/>
-        <w:t xml:space="preserve">                .HasOne(d =&gt; d.Station)</w:t>
-        <w:br/>
-        <w:t xml:space="preserve">                .WithMany(s =&gt; s.Devices)</w:t>
-        <w:br/>
-        <w:t xml:space="preserve">                .HasForeignKey(d =&gt; d.StationId)</w:t>
-        <w:br/>
-        <w:t xml:space="preserve">                .OnDelete(DeleteBehavior.Cascade);</w:t>
+        <w:t xml:space="preserve">            try</w:t>
+        <w:br/>
+        <w:t xml:space="preserve">            {</w:t>
+        <w:br/>
+        <w:t xml:space="preserve">                using var scope = _scopeFactory.CreateScope();</w:t>
+        <w:br/>
+        <w:t xml:space="preserve">                var db = scope.ServiceProvider.GetRequiredService&lt;AppDbContext&gt;();</w:t>
+        <w:br/>
+        <w:t xml:space="preserve">                await PollAllPlcDevicesAsync(db, stoppingToken);</w:t>
+        <w:br/>
+        <w:t xml:space="preserve">            }</w:t>
+        <w:br/>
+        <w:t xml:space="preserve">            catch (Exception ex)</w:t>
+        <w:br/>
+        <w:t xml:space="preserve">            {</w:t>
+        <w:br/>
+        <w:t xml:space="preserve">                _logger.LogError(ex, "[PLC] Lỗi trong vòng lặp chính");</w:t>
+        <w:br/>
+        <w:t xml:space="preserve">            }</w:t>
+        <w:br/>
+        <w:br/>
+        <w:t xml:space="preserve">            await Task.Delay(1000, stoppingToken);</w:t>
+        <w:br/>
+        <w:t xml:space="preserve">        }</w:t>
+        <w:br/>
+        <w:t xml:space="preserve">    }</w:t>
+        <w:br/>
+        <w:br/>
+        <w:t xml:space="preserve">    private async Task PollAllPlcDevicesAsync(AppDbContext db, CancellationToken ct)</w:t>
+        <w:br/>
+        <w:t xml:space="preserve">    {</w:t>
+        <w:br/>
+        <w:t xml:space="preserve">        var plcDevices = await db.Devices</w:t>
+        <w:br/>
+        <w:t xml:space="preserve">            .Where(d =&gt; d.Type == "plc_s7" &amp;&amp; d.Status == "active")</w:t>
+        <w:br/>
+        <w:t xml:space="preserve">            .ToListAsync(ct);</w:t>
+        <w:br/>
+        <w:br/>
+        <w:t xml:space="preserve">        foreach (var device in plcDevices)</w:t>
+        <w:br/>
+        <w:t xml:space="preserve">        {</w:t>
+        <w:br/>
+        <w:t xml:space="preserve">            await PollSinglePlcAsync(db, device, ct);</w:t>
+        <w:br/>
+        <w:t xml:space="preserve">        }</w:t>
+        <w:br/>
+        <w:t xml:space="preserve">    }</w:t>
+        <w:br/>
+        <w:br/>
+        <w:t xml:space="preserve">    private async Task PollSinglePlcAsync(AppDbContext db, Device device, CancellationToken ct)</w:t>
+        <w:br/>
+        <w:t xml:space="preserve">    {</w:t>
+        <w:br/>
+        <w:t xml:space="preserve">        var config = JsonSerializer.Deserialize&lt;Dictionary&lt;string, string&gt;&gt;(device.Config);</w:t>
+        <w:br/>
+        <w:t xml:space="preserve">        if (config == null) return;</w:t>
+        <w:br/>
+        <w:br/>
+        <w:t xml:space="preserve">        string ip = config["ip"];</w:t>
+        <w:br/>
+        <w:t xml:space="preserve">        short rack = short.Parse(config["rack"]);</w:t>
+        <w:br/>
+        <w:t xml:space="preserve">        short slot = short.Parse(config["slot"]);</w:t>
+        <w:br/>
+        <w:t xml:space="preserve">        int dbNum = int.Parse(config["db"]);</w:t>
+        <w:br/>
+        <w:t xml:space="preserve">        int offset = int.Parse(config["offset"]);</w:t>
+        <w:br/>
+        <w:t xml:space="preserve">        int length = int.Parse(config["length"]);</w:t>
+        <w:br/>
+        <w:br/>
+        <w:t xml:space="preserve">        Plc plc = new Plc(CpuType.S71200, ip, rack, slot);</w:t>
+        <w:br/>
+        <w:t xml:space="preserve">        try</w:t>
+        <w:br/>
+        <w:t xml:space="preserve">        {</w:t>
+        <w:br/>
+        <w:t xml:space="preserve">            await plc.OpenAsync(ct);</w:t>
+        <w:br/>
+        <w:t xml:space="preserve">            if (plc.IsConnected)</w:t>
+        <w:br/>
+        <w:t xml:space="preserve">            {</w:t>
+        <w:br/>
+        <w:t xml:space="preserve">                var rawData = await plc.ReadAsync(DataType.DataBlock, dbNum, offset, VarType.Byte, length, 0, ct);</w:t>
+        <w:br/>
+        <w:t xml:space="preserve">                if (rawData is byte[] bytes)</w:t>
+        <w:br/>
+        <w:t xml:space="preserve">                {</w:t>
+        <w:br/>
+        <w:t xml:space="preserve">                    double tempVal = (short)((bytes[0] &lt;&lt; 8) | bytes[1]);</w:t>
+        <w:br/>
+        <w:t xml:space="preserve">                    // Ghi nhận giá trị đo</w:t>
+        <w:br/>
+        <w:t xml:space="preserve">                    var reading = new SensorReading</w:t>
+        <w:br/>
+        <w:t xml:space="preserve">                    {</w:t>
+        <w:br/>
+        <w:t xml:space="preserve">                        Time = DateTime.UtcNow,</w:t>
+        <w:br/>
+        <w:t xml:space="preserve">                        DeviceId = device.Id,</w:t>
+        <w:br/>
+        <w:t xml:space="preserve">                        PointId = "temp_pha_1",</w:t>
+        <w:br/>
+        <w:t xml:space="preserve">                        Value = tempVal,</w:t>
+        <w:br/>
+        <w:t xml:space="preserve">                        Unit = "°C",</w:t>
+        <w:br/>
+        <w:t xml:space="preserve">                        Quality = 1</w:t>
+        <w:br/>
+        <w:t xml:space="preserve">                    };</w:t>
+        <w:br/>
+        <w:t xml:space="preserve">                    db.SensorReadings.Add(reading);</w:t>
+        <w:br/>
+        <w:t xml:space="preserve">                    await db.SaveChangesAsync(ct);</w:t>
+        <w:br/>
+        <w:t xml:space="preserve">                    </w:t>
+        <w:br/>
+        <w:t xml:space="preserve">                    // Phát thông báo thời gian thực qua SignalR</w:t>
+        <w:br/>
+        <w:t xml:space="preserve">                    await _notifier.SendSensorUpdateAsync(new[] { new { deviceId = device.Id, pointId = "temp_pha_1", value = tempVal, quality = 1 } });</w:t>
+        <w:br/>
+        <w:t xml:space="preserve">                }</w:t>
+        <w:br/>
+        <w:t xml:space="preserve">            }</w:t>
+        <w:br/>
+        <w:t xml:space="preserve">        }</w:t>
+        <w:br/>
+        <w:t xml:space="preserve">        catch (Exception ex)</w:t>
+        <w:br/>
+        <w:t xml:space="preserve">        {</w:t>
+        <w:br/>
+        <w:t xml:space="preserve">            _logger.LogError(ex, $"[PLC] Mất kết nối tới PLC {ip}");</w:t>
+        <w:br/>
+        <w:t xml:space="preserve">        }</w:t>
+        <w:br/>
+        <w:t xml:space="preserve">        finally</w:t>
+        <w:br/>
+        <w:t xml:space="preserve">        {</w:t>
+        <w:br/>
+        <w:t xml:space="preserve">            plc.Close();</w:t>
         <w:br/>
         <w:t xml:space="preserve">        }</w:t>
         <w:br/>
@@ -1269,7 +1195,7 @@
           <w:i/>
           <w:color w:val="505050"/>
         </w:rPr>
-        <w:t>B. Logic kết nối và duy trì kết nối duy nhất (Singleton Pattern) của SignalR Client (`realtime.service.ts`):</w:t>
+        <w:t>B. Tiến trình nền đồng bộ SyncQueue lên trạm tổng trung tâm (`CentralSyncWorker.cs`):</w:t>
       </w:r>
     </w:p>
     <w:p>
@@ -1283,102 +1209,189 @@
           <w:color w:val="323232"/>
           <w:sz w:val="19"/>
         </w:rPr>
-        <w:t>import * as signalR from '@microsoft/signalr';</w:t>
-        <w:br/>
-        <w:br/>
-        <w:t>class RealtimeService {</w:t>
-        <w:br/>
-        <w:t xml:space="preserve">  private connection: signalR.HubConnection | null = null;</w:t>
-        <w:br/>
-        <w:t xml:space="preserve">  private listeners: Map&lt;string, Array&lt;(data: any) =&gt; void&gt;&gt; = new Map();</w:t>
-        <w:br/>
-        <w:br/>
-        <w:t xml:space="preserve">  public async startConnection(hubUrl: string): Promise&lt;signalR.HubConnection&gt; {</w:t>
-        <w:br/>
-        <w:t xml:space="preserve">    if (this.connection) {</w:t>
-        <w:br/>
-        <w:t xml:space="preserve">      return this.connection; // Trả về kết nối hiện có, tránh tạo song song gây nghẽn cổng</w:t>
+        <w:t>using System.Net.Http.Json;</w:t>
+        <w:br/>
+        <w:t>using System.Text.Json;</w:t>
+        <w:br/>
+        <w:t>using Microsoft.EntityFrameworkCore;</w:t>
+        <w:br/>
+        <w:t>using Microsoft.Extensions.Configuration;</w:t>
+        <w:br/>
+        <w:t>using Microsoft.Extensions.DependencyInjection;</w:t>
+        <w:br/>
+        <w:t>using Microsoft.Extensions.Hosting;</w:t>
+        <w:br/>
+        <w:t>using Microsoft.Extensions.Logging;</w:t>
+        <w:br/>
+        <w:t>using StationOS.Data;</w:t>
+        <w:br/>
+        <w:t>using StationOS.Data.Entities;</w:t>
+        <w:br/>
+        <w:br/>
+        <w:t>namespace StationOS.Workers.Polling;</w:t>
+        <w:br/>
+        <w:br/>
+        <w:t>public class CentralSyncWorker : BackgroundService</w:t>
+        <w:br/>
+        <w:t>{</w:t>
+        <w:br/>
+        <w:t xml:space="preserve">    private readonly IServiceScopeFactory _scopeFactory;</w:t>
+        <w:br/>
+        <w:t xml:space="preserve">    private readonly ILogger&lt;CentralSyncWorker&gt; _logger;</w:t>
+        <w:br/>
+        <w:t xml:space="preserve">    private readonly IHttpClientFactory _httpClientFactory;</w:t>
+        <w:br/>
+        <w:t xml:space="preserve">    private readonly string? _centralUrl;</w:t>
+        <w:br/>
+        <w:t xml:space="preserve">    private readonly string? _stationId;</w:t>
+        <w:br/>
+        <w:br/>
+        <w:t xml:space="preserve">    public CentralSyncWorker(</w:t>
+        <w:br/>
+        <w:t xml:space="preserve">        IServiceScopeFactory scopeFactory,</w:t>
+        <w:br/>
+        <w:t xml:space="preserve">        ILogger&lt;CentralSyncWorker&gt; logger,</w:t>
+        <w:br/>
+        <w:t xml:space="preserve">        IHttpClientFactory httpClientFactory,</w:t>
+        <w:br/>
+        <w:t xml:space="preserve">        IConfiguration configuration)</w:t>
+        <w:br/>
+        <w:t xml:space="preserve">    {</w:t>
+        <w:br/>
+        <w:t xml:space="preserve">        _scopeFactory = scopeFactory;</w:t>
+        <w:br/>
+        <w:t xml:space="preserve">        _logger = logger;</w:t>
+        <w:br/>
+        <w:t xml:space="preserve">        _httpClientFactory = httpClientFactory;</w:t>
+        <w:br/>
+        <w:t xml:space="preserve">        _centralUrl = configuration["CentralServer"];</w:t>
+        <w:br/>
+        <w:t xml:space="preserve">        _stationId = configuration["StationId"];</w:t>
         <w:br/>
         <w:t xml:space="preserve">    }</w:t>
         <w:br/>
         <w:br/>
-        <w:t xml:space="preserve">    this.connection = new signalR.HubConnectionBuilder()</w:t>
-        <w:br/>
-        <w:t xml:space="preserve">      .withUrl(hubUrl, {</w:t>
-        <w:br/>
-        <w:t xml:space="preserve">        skipNegotiation: true,</w:t>
-        <w:br/>
-        <w:t xml:space="preserve">        transport: signalR.HttpTransportType.WebSockets</w:t>
-        <w:br/>
-        <w:t xml:space="preserve">      })</w:t>
-        <w:br/>
-        <w:t xml:space="preserve">      .withAutomaticReconnect([0, 2000, 5000, 10000, 30000])</w:t>
-        <w:br/>
-        <w:t xml:space="preserve">      .build();</w:t>
-        <w:br/>
-        <w:br/>
-        <w:t xml:space="preserve">    this.connection.on("ReceiveTelemetry", (pointId: string, value: number, quality: number) =&gt; {</w:t>
-        <w:br/>
-        <w:t xml:space="preserve">      const callbacks = this.listeners.get(pointId);</w:t>
-        <w:br/>
-        <w:t xml:space="preserve">      if (callbacks) {</w:t>
-        <w:br/>
-        <w:t xml:space="preserve">        callbacks.forEach(callback =&gt; callback({ value, quality }));</w:t>
-        <w:br/>
-        <w:t xml:space="preserve">      }</w:t>
-        <w:br/>
-        <w:t xml:space="preserve">    });</w:t>
-        <w:br/>
-        <w:br/>
-        <w:t xml:space="preserve">    try {</w:t>
-        <w:br/>
-        <w:t xml:space="preserve">      await this.connection.start();</w:t>
-        <w:br/>
-        <w:t xml:space="preserve">      console.log("[SignalR] Kết nối thành công đến Backend Hub Server.");</w:t>
-        <w:br/>
-        <w:t xml:space="preserve">    } catch (err) {</w:t>
-        <w:br/>
-        <w:t xml:space="preserve">      console.error("[SignalR] Lỗi khởi chạy kết nối:", err);</w:t>
-        <w:br/>
-        <w:t xml:space="preserve">      setTimeout(() =&gt; this.startConnection(hubUrl), 5000);</w:t>
+        <w:t xml:space="preserve">    protected override async Task ExecuteAsync(CancellationToken stoppingToken)</w:t>
+        <w:br/>
+        <w:t xml:space="preserve">    {</w:t>
+        <w:br/>
+        <w:t xml:space="preserve">        if (string.IsNullOrEmpty(_centralUrl) || string.IsNullOrEmpty(_stationId))</w:t>
+        <w:br/>
+        <w:t xml:space="preserve">        {</w:t>
+        <w:br/>
+        <w:t xml:space="preserve">            _logger.LogInformation("[CentralSync] Chưa cấu hình Central Server hoặc StationId");</w:t>
+        <w:br/>
+        <w:t xml:space="preserve">            return;</w:t>
+        <w:br/>
+        <w:t xml:space="preserve">        }</w:t>
+        <w:br/>
+        <w:br/>
+        <w:t xml:space="preserve">        while (!stoppingToken.IsCancellationRequested)</w:t>
+        <w:br/>
+        <w:t xml:space="preserve">        {</w:t>
+        <w:br/>
+        <w:t xml:space="preserve">            try</w:t>
+        <w:br/>
+        <w:t xml:space="preserve">            {</w:t>
+        <w:br/>
+        <w:t xml:space="preserve">                await PushBatchAsync(stoppingToken);</w:t>
+        <w:br/>
+        <w:t xml:space="preserve">            }</w:t>
+        <w:br/>
+        <w:t xml:space="preserve">            catch (Exception ex)</w:t>
+        <w:br/>
+        <w:t xml:space="preserve">            {</w:t>
+        <w:br/>
+        <w:t xml:space="preserve">                _logger.LogError(ex, "[CentralSync] Lỗi trong tiến trình đồng bộ");</w:t>
+        <w:br/>
+        <w:t xml:space="preserve">            }</w:t>
+        <w:br/>
+        <w:br/>
+        <w:t xml:space="preserve">            await Task.Delay(30000, stoppingToken); // Chạy định kỳ mỗi 30 giây</w:t>
+        <w:br/>
+        <w:t xml:space="preserve">        }</w:t>
         <w:br/>
         <w:t xml:space="preserve">    }</w:t>
         <w:br/>
         <w:br/>
-        <w:t xml:space="preserve">    return this.connection;</w:t>
-        <w:br/>
-        <w:t xml:space="preserve">  }</w:t>
-        <w:br/>
-        <w:br/>
-        <w:t xml:space="preserve">  public registerListener(pointId: string, callback: (data: any) =&gt; void) {</w:t>
-        <w:br/>
-        <w:t xml:space="preserve">    if (!this.listeners.has(pointId)) {</w:t>
-        <w:br/>
-        <w:t xml:space="preserve">      this.listeners.set(pointId, []);</w:t>
+        <w:t xml:space="preserve">    private async Task PushBatchAsync(CancellationToken ct)</w:t>
+        <w:br/>
+        <w:t xml:space="preserve">    {</w:t>
+        <w:br/>
+        <w:t xml:space="preserve">        using var scope = _scopeFactory.CreateScope();</w:t>
+        <w:br/>
+        <w:t xml:space="preserve">        var db = scope.ServiceProvider.GetRequiredService&lt;AppDbContext&gt;();</w:t>
+        <w:br/>
+        <w:br/>
+        <w:t xml:space="preserve">        var pending = await db.SyncQueues</w:t>
+        <w:br/>
+        <w:t xml:space="preserve">            .Where(q =&gt; q.Status == "pending" &amp;&amp; q.RetryCount &lt; 3)</w:t>
+        <w:br/>
+        <w:t xml:space="preserve">            .OrderBy(q =&gt; q.CreatedAt)</w:t>
+        <w:br/>
+        <w:t xml:space="preserve">            .Take(50)</w:t>
+        <w:br/>
+        <w:t xml:space="preserve">            .ToListAsync(ct);</w:t>
+        <w:br/>
+        <w:br/>
+        <w:t xml:space="preserve">        if (pending.Count == 0) return;</w:t>
+        <w:br/>
+        <w:br/>
+        <w:t xml:space="preserve">        var client = _httpClientFactory.CreateClient();</w:t>
+        <w:br/>
+        <w:t xml:space="preserve">        client.DefaultRequestHeaders.Add("X-Station-Id", _stationId);</w:t>
+        <w:br/>
+        <w:br/>
+        <w:t xml:space="preserve">        foreach (var item in pending)</w:t>
+        <w:br/>
+        <w:t xml:space="preserve">        {</w:t>
+        <w:br/>
+        <w:t xml:space="preserve">            try</w:t>
+        <w:br/>
+        <w:t xml:space="preserve">            {</w:t>
+        <w:br/>
+        <w:t xml:space="preserve">                var response = await client.PostAsJsonAsync($"{_centralUrl}/api/v1/ingest/telemetry", item.Payload, ct);</w:t>
+        <w:br/>
+        <w:t xml:space="preserve">                if (response.IsSuccessStatusCode)</w:t>
+        <w:br/>
+        <w:t xml:space="preserve">                {</w:t>
+        <w:br/>
+        <w:t xml:space="preserve">                    item.Status = "sent";</w:t>
+        <w:br/>
+        <w:t xml:space="preserve">                    item.SentAt = DateTime.UtcNow;</w:t>
+        <w:br/>
+        <w:t xml:space="preserve">                }</w:t>
+        <w:br/>
+        <w:t xml:space="preserve">                else</w:t>
+        <w:br/>
+        <w:t xml:space="preserve">                {</w:t>
+        <w:br/>
+        <w:t xml:space="preserve">                    item.RetryCount++;</w:t>
+        <w:br/>
+        <w:t xml:space="preserve">                    if (item.RetryCount &gt;= 3) item.Status = "failed";</w:t>
+        <w:br/>
+        <w:t xml:space="preserve">                }</w:t>
+        <w:br/>
+        <w:t xml:space="preserve">            }</w:t>
+        <w:br/>
+        <w:t xml:space="preserve">            catch</w:t>
+        <w:br/>
+        <w:t xml:space="preserve">            {</w:t>
+        <w:br/>
+        <w:t xml:space="preserve">                item.RetryCount++;</w:t>
+        <w:br/>
+        <w:t xml:space="preserve">                if (item.RetryCount &gt;= 3) item.Status = "failed";</w:t>
+        <w:br/>
+        <w:t xml:space="preserve">            }</w:t>
+        <w:br/>
+        <w:t xml:space="preserve">        }</w:t>
+        <w:br/>
+        <w:br/>
+        <w:t xml:space="preserve">        await db.SaveChangesAsync(ct);</w:t>
         <w:br/>
         <w:t xml:space="preserve">    }</w:t>
         <w:br/>
-        <w:t xml:space="preserve">    this.listeners.get(pointId)?.push(callback);</w:t>
-        <w:br/>
-        <w:t xml:space="preserve">  }</w:t>
-        <w:br/>
-        <w:br/>
-        <w:t xml:space="preserve">  public unregisterListener(pointId: string, callback: (data: any) =&gt; void) {</w:t>
-        <w:br/>
-        <w:t xml:space="preserve">    const list = this.listeners.get(pointId);</w:t>
-        <w:br/>
-        <w:t xml:space="preserve">    if (list) {</w:t>
-        <w:br/>
-        <w:t xml:space="preserve">      this.listeners.set(pointId, list.filter(cb =&gt; cb !== callback));</w:t>
-        <w:br/>
-        <w:t xml:space="preserve">    }</w:t>
-        <w:br/>
-        <w:t xml:space="preserve">  }</w:t>
-        <w:br/>
         <w:t>}</w:t>
-        <w:br/>
-        <w:br/>
-        <w:t>export const realtimeService = new RealtimeService();</w:t>
       </w:r>
     </w:p>
     <w:p>
@@ -1399,7 +1412,7 @@
           <w:rFonts w:ascii="Arial" w:hAnsi="Arial"/>
           <w:color w:val="3572EF"/>
         </w:rPr>
-        <w:t>IV. CÔNG ĐOẠN KIỂM THỬ &amp; SỬ A LỖI (TESTING)</w:t>
+        <w:t>IV. CÔNG ĐOẠN KIỂM THỬ &amp; SỬA LỖI (TESTING)</w:t>
       </w:r>
     </w:p>
     <w:p>
@@ -1412,365 +1425,1514 @@
           <w:rFonts w:ascii="Arial" w:hAnsi="Arial"/>
           <w:color w:val="323232"/>
         </w:rPr>
-        <w:t>1. Ca kiểm thử chi tiết hoàn chỉnh (Full Test Cases Specification)</w:t>
+        <w:t>1. Danh sách ca kiểm thử chi tiết hoàn chỉnh (Test Cases Specification)</w:t>
       </w:r>
     </w:p>
-    <w:p>
-      <w:pPr>
-        <w:pStyle w:val="Heading4"/>
-        <w:spacing w:before="120" w:after="40"/>
-      </w:pPr>
-      <w:r>
-        <w:rPr>
-          <w:rFonts w:ascii="Arial" w:hAnsi="Arial"/>
-          <w:i/>
-          <w:color w:val="505050"/>
-        </w:rPr>
-        <w:t>Ca kiểm thử TC-002: Kiểm tra tự động sao chép file sơ đồ mẫu khi cài đặt</w:t>
-      </w:r>
-    </w:p>
-    <w:p>
-      <w:pPr>
-        <w:pStyle w:val="ListBullet"/>
-        <w:spacing w:after="40" w:before="0"/>
-      </w:pPr>
-      <w:r/>
-      <w:r>
-        <w:rPr>
-          <w:b/>
-        </w:rPr>
-        <w:t>Mục đích</w:t>
-      </w:r>
-      <w:r>
-        <w:t>: Đảm bảo tệp tin SVG mẫu luôn sẵn có cho trang Dashboard để tránh lỗi vỡ ảnh sơ đồ (SLD) khi người dùng chạy bộ cài đặt thương mại.</w:t>
-      </w:r>
-    </w:p>
-    <w:p>
-      <w:pPr>
-        <w:pStyle w:val="ListBullet"/>
-        <w:spacing w:after="40" w:before="0"/>
-      </w:pPr>
-      <w:r/>
-      <w:r>
-        <w:rPr>
-          <w:b/>
-        </w:rPr>
-        <w:t>Điều kiện chuẩn bị</w:t>
-      </w:r>
-      <w:r>
-        <w:t>: Xóa thư mục lưu trữ động `%APPDATA%/Station Monitor/wwwroot/sld` trên máy thử nghiệm.</w:t>
-      </w:r>
-    </w:p>
-    <w:p>
-      <w:pPr>
-        <w:pStyle w:val="ListBullet"/>
-        <w:spacing w:after="40" w:before="0"/>
-      </w:pPr>
-      <w:r/>
-      <w:r>
-        <w:rPr>
-          <w:b/>
-        </w:rPr>
-        <w:t>Các bước thực hiện</w:t>
-      </w:r>
-      <w:r>
-        <w:t>:</w:t>
-      </w:r>
-    </w:p>
-    <w:p>
-      <w:pPr>
-        <w:pStyle w:val="ListNumber"/>
-        <w:spacing w:after="60" w:before="0"/>
-      </w:pPr>
-      <w:r>
-        <w:t>Khởi chạy ứng dụng Electron từ tệp build thương mại `.exe`.</w:t>
-      </w:r>
-    </w:p>
-    <w:p>
-      <w:pPr>
-        <w:pStyle w:val="ListNumber"/>
-        <w:spacing w:after="60" w:before="0"/>
-      </w:pPr>
-      <w:r>
-        <w:t>Hệ thống gọi tiến trình Backend khởi tạo cơ sở dữ liệu (`DbInitializer.SeedDefaultSldAsync`).</w:t>
-      </w:r>
-    </w:p>
-    <w:p>
-      <w:pPr>
-        <w:pStyle w:val="ListNumber"/>
-        <w:spacing w:after="60" w:before="0"/>
-      </w:pPr>
-      <w:r>
-        <w:t>Kiểm tra sự tồn tại của tệp tin tại đường dẫn `%APPDATA%/Station Monitor/wwwroot/sld/7497ff6f-28c2-47a5-ba28-6b15f8a84c9c.svg`.</w:t>
-      </w:r>
-    </w:p>
-    <w:p>
-      <w:pPr>
-        <w:pStyle w:val="ListBullet"/>
-        <w:spacing w:after="40" w:before="0"/>
-      </w:pPr>
-      <w:r/>
-      <w:r>
-        <w:rPr>
-          <w:b/>
-        </w:rPr>
-        <w:t>Dữ liệu đầu vào</w:t>
-      </w:r>
-      <w:r>
-        <w:t>: Không có.</w:t>
-      </w:r>
-    </w:p>
-    <w:p>
-      <w:pPr>
-        <w:pStyle w:val="ListBullet"/>
-        <w:spacing w:after="40" w:before="0"/>
-      </w:pPr>
-      <w:r/>
-      <w:r>
-        <w:rPr>
-          <w:b/>
-        </w:rPr>
-        <w:t>Kết quả kỳ vọng</w:t>
-      </w:r>
-      <w:r>
-        <w:t>: Tệp tin SVG được sao chép thành công. Ứng dụng hiển thị đúng đồ họa sơ đồ một sợi lên Dashboard mà không báo lỗi 404.</w:t>
-      </w:r>
-    </w:p>
-    <w:p>
-      <w:pPr>
-        <w:pStyle w:val="ListBullet"/>
-        <w:spacing w:after="40" w:before="0"/>
-      </w:pPr>
-      <w:r/>
-      <w:r>
-        <w:rPr>
-          <w:b/>
-        </w:rPr>
-        <w:t>Kết quả thực tế</w:t>
-      </w:r>
-      <w:r>
-        <w:t>: Tệp tin tự động sao chép thành công. Đồ họa SLD vẽ mượt mà.</w:t>
-      </w:r>
-    </w:p>
-    <w:p>
-      <w:pPr>
-        <w:pStyle w:val="ListBullet"/>
-        <w:spacing w:after="40" w:before="0"/>
-      </w:pPr>
-      <w:r/>
-      <w:r>
-        <w:rPr>
-          <w:b/>
-        </w:rPr>
-        <w:t>Trạng thái</w:t>
-      </w:r>
-      <w:r>
-        <w:t xml:space="preserve">: </w:t>
-      </w:r>
-      <w:r>
-        <w:rPr>
-          <w:b/>
-        </w:rPr>
-        <w:t>ĐẠT (Passed)</w:t>
-      </w:r>
-      <w:r>
-        <w:t>.</w:t>
-      </w:r>
-    </w:p>
-    <w:p>
-      <w:pPr>
-        <w:pStyle w:val="ListBullet"/>
-        <w:spacing w:after="40" w:before="0"/>
-      </w:pPr>
-      <w:r/>
-      <w:r>
-        <w:rPr>
-          <w:b/>
-        </w:rPr>
-        <w:t>Người thực hiện</w:t>
-      </w:r>
-      <w:r>
-        <w:t>: Nguyễn Tiến Minh (Kiểm thử viên).</w:t>
-      </w:r>
-    </w:p>
-    <w:p>
-      <w:pPr>
-        <w:pStyle w:val="Heading4"/>
-        <w:spacing w:before="120" w:after="40"/>
-      </w:pPr>
-      <w:r>
-        <w:rPr>
-          <w:rFonts w:ascii="Arial" w:hAnsi="Arial"/>
-          <w:i/>
-          <w:color w:val="505050"/>
-        </w:rPr>
-        <w:t>Ca kiểm thử TC-007: Hiển thị giá trị lỗi mạng của cảm biến/thiết bị đo lường</w:t>
-      </w:r>
-    </w:p>
-    <w:p>
-      <w:pPr>
-        <w:pStyle w:val="ListBullet"/>
-        <w:spacing w:after="40" w:before="0"/>
-      </w:pPr>
-      <w:r/>
-      <w:r>
-        <w:rPr>
-          <w:b/>
-        </w:rPr>
-        <w:t>Mục đích</w:t>
-      </w:r>
-      <w:r>
-        <w:t>: Đảm bảo nhân viên vận hành phân biệt được giữa thiết bị đo được giá trị bằng `0` và thiết bị thực tế đang bị mất kết nối mạng.</w:t>
-      </w:r>
-    </w:p>
-    <w:p>
-      <w:pPr>
-        <w:pStyle w:val="ListBullet"/>
-        <w:spacing w:after="40" w:before="0"/>
-      </w:pPr>
-      <w:r/>
-      <w:r>
-        <w:rPr>
-          <w:b/>
-        </w:rPr>
-        <w:t>Điều kiện chuẩn bị</w:t>
-      </w:r>
-      <w:r>
-        <w:t>: Thiết lập 1 thiết bị Modbus TCP đang hoạt động bình thường, hiển thị nhiệt độ máy biến áp là `45.2°C`.</w:t>
-      </w:r>
-    </w:p>
-    <w:p>
-      <w:pPr>
-        <w:pStyle w:val="ListBullet"/>
-        <w:spacing w:after="40" w:before="0"/>
-      </w:pPr>
-      <w:r/>
-      <w:r>
-        <w:rPr>
-          <w:b/>
-        </w:rPr>
-        <w:t>Các bước thực hiện</w:t>
-      </w:r>
-      <w:r>
-        <w:t>:</w:t>
-      </w:r>
-    </w:p>
-    <w:p>
-      <w:pPr>
-        <w:pStyle w:val="ListNumber"/>
-        <w:spacing w:after="60" w:before="0"/>
-      </w:pPr>
-      <w:r>
-        <w:t>Rút cáp mạng LAN kết nối từ máy tính trạm con tới thiết bị Modbus.</w:t>
-      </w:r>
-    </w:p>
-    <w:p>
-      <w:pPr>
-        <w:pStyle w:val="ListNumber"/>
-        <w:spacing w:after="60" w:before="0"/>
-      </w:pPr>
-      <w:r>
-        <w:t>Chờ tiến trình nền `PlcPollingWorker` quét chu kỳ tiếp theo (sau 2 giây).</w:t>
-      </w:r>
-    </w:p>
-    <w:p>
-      <w:pPr>
-        <w:pStyle w:val="ListNumber"/>
-        <w:spacing w:after="60" w:before="0"/>
-      </w:pPr>
-      <w:r>
-        <w:t>Theo dõi hiển thị giá trị nhiệt độ máy biến áp trên sơ đồ SLD và bảng Dashboard.</w:t>
-      </w:r>
-    </w:p>
-    <w:p>
-      <w:pPr>
-        <w:pStyle w:val="ListBullet"/>
-        <w:spacing w:after="40" w:before="0"/>
-      </w:pPr>
-      <w:r/>
-      <w:r>
-        <w:rPr>
-          <w:b/>
-        </w:rPr>
-        <w:t>Dữ liệu đầu vào</w:t>
-      </w:r>
-      <w:r>
-        <w:t>: Trạng thái cổng kết nối vật lý bị tắt.</w:t>
-      </w:r>
-    </w:p>
-    <w:p>
-      <w:pPr>
-        <w:pStyle w:val="ListBullet"/>
-        <w:spacing w:after="40" w:before="0"/>
-      </w:pPr>
-      <w:r/>
-      <w:r>
-        <w:rPr>
-          <w:b/>
-        </w:rPr>
-        <w:t>Kết quả kỳ vọng</w:t>
-      </w:r>
-      <w:r>
-        <w:t>: Lấy mẫu thất bại, chất lượng dữ liệu chuyển thành `Quality = 2`. Giá trị nhiệt độ lập tức đổi từ `45.2°C` thành nét đứt `-----`.</w:t>
-      </w:r>
-    </w:p>
-    <w:p>
-      <w:pPr>
-        <w:pStyle w:val="ListBullet"/>
-        <w:spacing w:after="40" w:before="0"/>
-      </w:pPr>
-      <w:r/>
-      <w:r>
-        <w:rPr>
-          <w:b/>
-        </w:rPr>
-        <w:t>Kết quả thực tế</w:t>
-      </w:r>
-      <w:r>
-        <w:t>: Giá trị hiển thị đúng dạng `-----`, hệ thống đồng thời kích hoạt cảnh báo mất kết nối thiết bị ngoại vi.</w:t>
-      </w:r>
-    </w:p>
-    <w:p>
-      <w:pPr>
-        <w:pStyle w:val="ListBullet"/>
-        <w:spacing w:after="40" w:before="0"/>
-      </w:pPr>
-      <w:r/>
-      <w:r>
-        <w:rPr>
-          <w:b/>
-        </w:rPr>
-        <w:t>Trạng thái</w:t>
-      </w:r>
-      <w:r>
-        <w:t xml:space="preserve">: </w:t>
-      </w:r>
-      <w:r>
-        <w:rPr>
-          <w:b/>
-        </w:rPr>
-        <w:t>ĐẠT (Passed)</w:t>
-      </w:r>
-      <w:r>
-        <w:t>.</w:t>
-      </w:r>
-    </w:p>
-    <w:p>
-      <w:pPr>
-        <w:pStyle w:val="ListBullet"/>
-        <w:spacing w:after="40" w:before="0"/>
-      </w:pPr>
-      <w:r/>
-      <w:r>
-        <w:rPr>
-          <w:b/>
-        </w:rPr>
-        <w:t>Người thực hiện</w:t>
-      </w:r>
-      <w:r>
-        <w:t>: Nguyễn Tiến Minh (Kiểm thử viên).</w:t>
-      </w:r>
-    </w:p>
+    <w:tbl>
+      <w:tblPr>
+        <w:tblStyle w:val="TableGrid"/>
+        <w:tblW w:type="auto" w:w="0"/>
+        <w:tblLook w:firstColumn="1" w:firstRow="1" w:lastColumn="0" w:lastRow="0" w:noHBand="0" w:noVBand="1" w:val="04A0"/>
+      </w:tblPr>
+      <w:tblGrid>
+        <w:gridCol w:w="1337"/>
+        <w:gridCol w:w="1337"/>
+        <w:gridCol w:w="1337"/>
+        <w:gridCol w:w="1337"/>
+        <w:gridCol w:w="1337"/>
+        <w:gridCol w:w="1337"/>
+        <w:gridCol w:w="1337"/>
+      </w:tblGrid>
+      <w:tr>
+        <w:tc>
+          <w:tcPr>
+            <w:tcW w:type="dxa" w:w="1337"/>
+          </w:tcPr>
+          <w:p>
+            <w:pPr>
+              <w:spacing w:after="40" w:before="40"/>
+            </w:pPr>
+            <w:r>
+              <w:rPr>
+                <w:b/>
+                <w:sz w:val="20"/>
+              </w:rPr>
+              <w:t>STT</w:t>
+            </w:r>
+          </w:p>
+        </w:tc>
+        <w:tc>
+          <w:tcPr>
+            <w:tcW w:type="dxa" w:w="1337"/>
+          </w:tcPr>
+          <w:p>
+            <w:pPr>
+              <w:spacing w:after="40" w:before="40"/>
+            </w:pPr>
+            <w:r>
+              <w:rPr>
+                <w:b/>
+                <w:sz w:val="20"/>
+              </w:rPr>
+              <w:t>Mã TC</w:t>
+            </w:r>
+          </w:p>
+        </w:tc>
+        <w:tc>
+          <w:tcPr>
+            <w:tcW w:type="dxa" w:w="1337"/>
+          </w:tcPr>
+          <w:p>
+            <w:pPr>
+              <w:spacing w:after="40" w:before="40"/>
+            </w:pPr>
+            <w:r>
+              <w:rPr>
+                <w:b/>
+                <w:sz w:val="20"/>
+              </w:rPr>
+              <w:t>Tên ca kiểm thử</w:t>
+            </w:r>
+          </w:p>
+        </w:tc>
+        <w:tc>
+          <w:tcPr>
+            <w:tcW w:type="dxa" w:w="1337"/>
+          </w:tcPr>
+          <w:p>
+            <w:pPr>
+              <w:spacing w:after="40" w:before="40"/>
+            </w:pPr>
+            <w:r>
+              <w:rPr>
+                <w:b/>
+                <w:sz w:val="20"/>
+              </w:rPr>
+              <w:t>Điều kiện chuẩn bị</w:t>
+            </w:r>
+          </w:p>
+        </w:tc>
+        <w:tc>
+          <w:tcPr>
+            <w:tcW w:type="dxa" w:w="1337"/>
+          </w:tcPr>
+          <w:p>
+            <w:pPr>
+              <w:spacing w:after="40" w:before="40"/>
+            </w:pPr>
+            <w:r>
+              <w:rPr>
+                <w:b/>
+                <w:sz w:val="20"/>
+              </w:rPr>
+              <w:t>Các bước thực hiện</w:t>
+            </w:r>
+          </w:p>
+        </w:tc>
+        <w:tc>
+          <w:tcPr>
+            <w:tcW w:type="dxa" w:w="1337"/>
+          </w:tcPr>
+          <w:p>
+            <w:pPr>
+              <w:spacing w:after="40" w:before="40"/>
+            </w:pPr>
+            <w:r>
+              <w:rPr>
+                <w:b/>
+                <w:sz w:val="20"/>
+              </w:rPr>
+              <w:t>Kết quả kỳ vọng</w:t>
+            </w:r>
+          </w:p>
+        </w:tc>
+        <w:tc>
+          <w:tcPr>
+            <w:tcW w:type="dxa" w:w="1337"/>
+          </w:tcPr>
+          <w:p>
+            <w:pPr>
+              <w:spacing w:after="40" w:before="40"/>
+            </w:pPr>
+            <w:r>
+              <w:rPr>
+                <w:b/>
+                <w:sz w:val="20"/>
+              </w:rPr>
+              <w:t>Trạng thái</w:t>
+            </w:r>
+          </w:p>
+        </w:tc>
+      </w:tr>
+      <w:tr>
+        <w:tc>
+          <w:tcPr>
+            <w:tcW w:type="dxa" w:w="1337"/>
+          </w:tcPr>
+          <w:p>
+            <w:pPr>
+              <w:spacing w:after="40" w:before="40"/>
+            </w:pPr>
+            <w:r>
+              <w:rPr>
+                <w:sz w:val="19"/>
+              </w:rPr>
+              <w:t>1</w:t>
+            </w:r>
+          </w:p>
+        </w:tc>
+        <w:tc>
+          <w:tcPr>
+            <w:tcW w:type="dxa" w:w="1337"/>
+          </w:tcPr>
+          <w:p>
+            <w:pPr>
+              <w:spacing w:after="40" w:before="40"/>
+            </w:pPr>
+            <w:r>
+              <w:rPr>
+                <w:sz w:val="19"/>
+              </w:rPr>
+              <w:t>**TC-001**</w:t>
+            </w:r>
+          </w:p>
+        </w:tc>
+        <w:tc>
+          <w:tcPr>
+            <w:tcW w:type="dxa" w:w="1337"/>
+          </w:tcPr>
+          <w:p>
+            <w:pPr>
+              <w:spacing w:after="40" w:before="40"/>
+            </w:pPr>
+            <w:r>
+              <w:rPr>
+                <w:sz w:val="19"/>
+              </w:rPr>
+              <w:t>Khởi tạo CSDL lần đầu</w:t>
+            </w:r>
+          </w:p>
+        </w:tc>
+        <w:tc>
+          <w:tcPr>
+            <w:tcW w:type="dxa" w:w="1337"/>
+          </w:tcPr>
+          <w:p>
+            <w:pPr>
+              <w:spacing w:after="40" w:before="40"/>
+            </w:pPr>
+            <w:r>
+              <w:rPr>
+                <w:sz w:val="19"/>
+              </w:rPr>
+              <w:t>Hệ thống sạch, chưa cài CSDL PostgreSQL.</w:t>
+            </w:r>
+          </w:p>
+        </w:tc>
+        <w:tc>
+          <w:tcPr>
+            <w:tcW w:type="dxa" w:w="1337"/>
+          </w:tcPr>
+          <w:p>
+            <w:pPr>
+              <w:spacing w:after="40" w:before="40"/>
+            </w:pPr>
+            <w:r>
+              <w:rPr>
+                <w:sz w:val="19"/>
+              </w:rPr>
+              <w:t>Khởi chạy tệp `.exe` cài đặt.</w:t>
+            </w:r>
+          </w:p>
+        </w:tc>
+        <w:tc>
+          <w:tcPr>
+            <w:tcW w:type="dxa" w:w="1337"/>
+          </w:tcPr>
+          <w:p>
+            <w:pPr>
+              <w:spacing w:after="40" w:before="40"/>
+            </w:pPr>
+            <w:r>
+              <w:rPr>
+                <w:sz w:val="19"/>
+              </w:rPr>
+              <w:t>Thư mục `pg_data` được tự động tạo tại thư mục người dùng `%APPDATA%/MasterStation/pg_data` và chạy ngầm cổng 6432.</w:t>
+            </w:r>
+          </w:p>
+        </w:tc>
+        <w:tc>
+          <w:tcPr>
+            <w:tcW w:type="dxa" w:w="1337"/>
+          </w:tcPr>
+          <w:p>
+            <w:pPr>
+              <w:spacing w:after="40" w:before="40"/>
+            </w:pPr>
+            <w:r>
+              <w:rPr>
+                <w:sz w:val="19"/>
+              </w:rPr>
+              <w:t>**ĐẠT (Passed)**</w:t>
+            </w:r>
+          </w:p>
+        </w:tc>
+      </w:tr>
+      <w:tr>
+        <w:tc>
+          <w:tcPr>
+            <w:tcW w:type="dxa" w:w="1337"/>
+          </w:tcPr>
+          <w:p>
+            <w:pPr>
+              <w:spacing w:after="40" w:before="40"/>
+            </w:pPr>
+            <w:r>
+              <w:rPr>
+                <w:sz w:val="19"/>
+              </w:rPr>
+              <w:t>2</w:t>
+            </w:r>
+          </w:p>
+        </w:tc>
+        <w:tc>
+          <w:tcPr>
+            <w:tcW w:type="dxa" w:w="1337"/>
+          </w:tcPr>
+          <w:p>
+            <w:pPr>
+              <w:spacing w:after="40" w:before="40"/>
+            </w:pPr>
+            <w:r>
+              <w:rPr>
+                <w:sz w:val="19"/>
+              </w:rPr>
+              <w:t>**TC-002**</w:t>
+            </w:r>
+          </w:p>
+        </w:tc>
+        <w:tc>
+          <w:tcPr>
+            <w:tcW w:type="dxa" w:w="1337"/>
+          </w:tcPr>
+          <w:p>
+            <w:pPr>
+              <w:spacing w:after="40" w:before="40"/>
+            </w:pPr>
+            <w:r>
+              <w:rPr>
+                <w:sz w:val="19"/>
+              </w:rPr>
+              <w:t>Sao chép sơ đồ SVG mẫu</w:t>
+            </w:r>
+          </w:p>
+        </w:tc>
+        <w:tc>
+          <w:tcPr>
+            <w:tcW w:type="dxa" w:w="1337"/>
+          </w:tcPr>
+          <w:p>
+            <w:pPr>
+              <w:spacing w:after="40" w:before="40"/>
+            </w:pPr>
+            <w:r>
+              <w:rPr>
+                <w:sz w:val="19"/>
+              </w:rPr>
+              <w:t>Không có tệp SVG trong AppData.</w:t>
+            </w:r>
+          </w:p>
+        </w:tc>
+        <w:tc>
+          <w:tcPr>
+            <w:tcW w:type="dxa" w:w="1337"/>
+          </w:tcPr>
+          <w:p>
+            <w:pPr>
+              <w:spacing w:after="40" w:before="40"/>
+            </w:pPr>
+            <w:r>
+              <w:rPr>
+                <w:sz w:val="19"/>
+              </w:rPr>
+              <w:t>Chạy ứng dụng. Logic `SeedDefaultSldAsync` kích hoạt.</w:t>
+            </w:r>
+          </w:p>
+        </w:tc>
+        <w:tc>
+          <w:tcPr>
+            <w:tcW w:type="dxa" w:w="1337"/>
+          </w:tcPr>
+          <w:p>
+            <w:pPr>
+              <w:spacing w:after="40" w:before="40"/>
+            </w:pPr>
+            <w:r>
+              <w:rPr>
+                <w:sz w:val="19"/>
+              </w:rPr>
+              <w:t>Tệp tin `7497ff6f-28c2-47a5-ba28-6b15f8a84c9c.svg` được copy an toàn từ ứng dụng nguồn sang AppData.</w:t>
+            </w:r>
+          </w:p>
+        </w:tc>
+        <w:tc>
+          <w:tcPr>
+            <w:tcW w:type="dxa" w:w="1337"/>
+          </w:tcPr>
+          <w:p>
+            <w:pPr>
+              <w:spacing w:after="40" w:before="40"/>
+            </w:pPr>
+            <w:r>
+              <w:rPr>
+                <w:sz w:val="19"/>
+              </w:rPr>
+              <w:t>**ĐẠT (Passed)**</w:t>
+            </w:r>
+          </w:p>
+        </w:tc>
+      </w:tr>
+      <w:tr>
+        <w:tc>
+          <w:tcPr>
+            <w:tcW w:type="dxa" w:w="1337"/>
+          </w:tcPr>
+          <w:p>
+            <w:pPr>
+              <w:spacing w:after="40" w:before="40"/>
+            </w:pPr>
+            <w:r>
+              <w:rPr>
+                <w:sz w:val="19"/>
+              </w:rPr>
+              <w:t>3</w:t>
+            </w:r>
+          </w:p>
+        </w:tc>
+        <w:tc>
+          <w:tcPr>
+            <w:tcW w:type="dxa" w:w="1337"/>
+          </w:tcPr>
+          <w:p>
+            <w:pPr>
+              <w:spacing w:after="40" w:before="40"/>
+            </w:pPr>
+            <w:r>
+              <w:rPr>
+                <w:sz w:val="19"/>
+              </w:rPr>
+              <w:t>**TC-003**</w:t>
+            </w:r>
+          </w:p>
+        </w:tc>
+        <w:tc>
+          <w:tcPr>
+            <w:tcW w:type="dxa" w:w="1337"/>
+          </w:tcPr>
+          <w:p>
+            <w:pPr>
+              <w:spacing w:after="40" w:before="40"/>
+            </w:pPr>
+            <w:r>
+              <w:rPr>
+                <w:sz w:val="19"/>
+              </w:rPr>
+              <w:t>Xác thực JWT và Đăng nhập</w:t>
+            </w:r>
+          </w:p>
+        </w:tc>
+        <w:tc>
+          <w:tcPr>
+            <w:tcW w:type="dxa" w:w="1337"/>
+          </w:tcPr>
+          <w:p>
+            <w:pPr>
+              <w:spacing w:after="40" w:before="40"/>
+            </w:pPr>
+            <w:r>
+              <w:rPr>
+                <w:sz w:val="19"/>
+              </w:rPr>
+              <w:t>Cơ sở dữ liệu đã cài đặt thành công.</w:t>
+            </w:r>
+          </w:p>
+        </w:tc>
+        <w:tc>
+          <w:tcPr>
+            <w:tcW w:type="dxa" w:w="1337"/>
+          </w:tcPr>
+          <w:p>
+            <w:pPr>
+              <w:spacing w:after="40" w:before="40"/>
+            </w:pPr>
+            <w:r>
+              <w:rPr>
+                <w:sz w:val="19"/>
+              </w:rPr>
+              <w:t>Nhập tài khoản `admin` / mật khẩu `admin`.</w:t>
+            </w:r>
+          </w:p>
+        </w:tc>
+        <w:tc>
+          <w:tcPr>
+            <w:tcW w:type="dxa" w:w="1337"/>
+          </w:tcPr>
+          <w:p>
+            <w:pPr>
+              <w:spacing w:after="40" w:before="40"/>
+            </w:pPr>
+            <w:r>
+              <w:rPr>
+                <w:sz w:val="19"/>
+              </w:rPr>
+              <w:t>Đăng nhập thành công, token JWT lưu vào LocalStorage, chuyển hướng vào Dashboard.</w:t>
+            </w:r>
+          </w:p>
+        </w:tc>
+        <w:tc>
+          <w:tcPr>
+            <w:tcW w:type="dxa" w:w="1337"/>
+          </w:tcPr>
+          <w:p>
+            <w:pPr>
+              <w:spacing w:after="40" w:before="40"/>
+            </w:pPr>
+            <w:r>
+              <w:rPr>
+                <w:sz w:val="19"/>
+              </w:rPr>
+              <w:t>**ĐẠT (Passed)**</w:t>
+            </w:r>
+          </w:p>
+        </w:tc>
+      </w:tr>
+      <w:tr>
+        <w:tc>
+          <w:tcPr>
+            <w:tcW w:type="dxa" w:w="1337"/>
+          </w:tcPr>
+          <w:p>
+            <w:pPr>
+              <w:spacing w:after="40" w:before="40"/>
+            </w:pPr>
+            <w:r>
+              <w:rPr>
+                <w:sz w:val="19"/>
+              </w:rPr>
+              <w:t>4</w:t>
+            </w:r>
+          </w:p>
+        </w:tc>
+        <w:tc>
+          <w:tcPr>
+            <w:tcW w:type="dxa" w:w="1337"/>
+          </w:tcPr>
+          <w:p>
+            <w:pPr>
+              <w:spacing w:after="40" w:before="40"/>
+            </w:pPr>
+            <w:r>
+              <w:rPr>
+                <w:sz w:val="19"/>
+              </w:rPr>
+              <w:t>**TC-004**</w:t>
+            </w:r>
+          </w:p>
+        </w:tc>
+        <w:tc>
+          <w:tcPr>
+            <w:tcW w:type="dxa" w:w="1337"/>
+          </w:tcPr>
+          <w:p>
+            <w:pPr>
+              <w:spacing w:after="40" w:before="40"/>
+            </w:pPr>
+            <w:r>
+              <w:rPr>
+                <w:sz w:val="19"/>
+              </w:rPr>
+              <w:t>Dò tìm ONVIF tự động</w:t>
+            </w:r>
+          </w:p>
+        </w:tc>
+        <w:tc>
+          <w:tcPr>
+            <w:tcW w:type="dxa" w:w="1337"/>
+          </w:tcPr>
+          <w:p>
+            <w:pPr>
+              <w:spacing w:after="40" w:before="40"/>
+            </w:pPr>
+            <w:r>
+              <w:rPr>
+                <w:sz w:val="19"/>
+              </w:rPr>
+              <w:t>Camera ONVIF hoạt động cùng subnet mạng LAN.</w:t>
+            </w:r>
+          </w:p>
+        </w:tc>
+        <w:tc>
+          <w:tcPr>
+            <w:tcW w:type="dxa" w:w="1337"/>
+          </w:tcPr>
+          <w:p>
+            <w:pPr>
+              <w:spacing w:after="40" w:before="40"/>
+            </w:pPr>
+            <w:r>
+              <w:rPr>
+                <w:sz w:val="19"/>
+              </w:rPr>
+              <w:t>Bấm nút quét ONVIF trong Cấu hình thiết bị.</w:t>
+            </w:r>
+          </w:p>
+        </w:tc>
+        <w:tc>
+          <w:tcPr>
+            <w:tcW w:type="dxa" w:w="1337"/>
+          </w:tcPr>
+          <w:p>
+            <w:pPr>
+              <w:spacing w:after="40" w:before="40"/>
+            </w:pPr>
+            <w:r>
+              <w:rPr>
+                <w:sz w:val="19"/>
+              </w:rPr>
+              <w:t>Quét được IP, lấy được RTSP URL của camera hiển thị lên lưới dữ liệu.</w:t>
+            </w:r>
+          </w:p>
+        </w:tc>
+        <w:tc>
+          <w:tcPr>
+            <w:tcW w:type="dxa" w:w="1337"/>
+          </w:tcPr>
+          <w:p>
+            <w:pPr>
+              <w:spacing w:after="40" w:before="40"/>
+            </w:pPr>
+            <w:r>
+              <w:rPr>
+                <w:sz w:val="19"/>
+              </w:rPr>
+              <w:t>**ĐẠT (Passed)**</w:t>
+            </w:r>
+          </w:p>
+        </w:tc>
+      </w:tr>
+      <w:tr>
+        <w:tc>
+          <w:tcPr>
+            <w:tcW w:type="dxa" w:w="1337"/>
+          </w:tcPr>
+          <w:p>
+            <w:pPr>
+              <w:spacing w:after="40" w:before="40"/>
+            </w:pPr>
+            <w:r>
+              <w:rPr>
+                <w:sz w:val="19"/>
+              </w:rPr>
+              <w:t>5</w:t>
+            </w:r>
+          </w:p>
+        </w:tc>
+        <w:tc>
+          <w:tcPr>
+            <w:tcW w:type="dxa" w:w="1337"/>
+          </w:tcPr>
+          <w:p>
+            <w:pPr>
+              <w:spacing w:after="40" w:before="40"/>
+            </w:pPr>
+            <w:r>
+              <w:rPr>
+                <w:sz w:val="19"/>
+              </w:rPr>
+              <w:t>**TC-005**</w:t>
+            </w:r>
+          </w:p>
+        </w:tc>
+        <w:tc>
+          <w:tcPr>
+            <w:tcW w:type="dxa" w:w="1337"/>
+          </w:tcPr>
+          <w:p>
+            <w:pPr>
+              <w:spacing w:after="40" w:before="40"/>
+            </w:pPr>
+            <w:r>
+              <w:rPr>
+                <w:sz w:val="19"/>
+              </w:rPr>
+              <w:t>Thêm thiết bị camera RTSP</w:t>
+            </w:r>
+          </w:p>
+        </w:tc>
+        <w:tc>
+          <w:tcPr>
+            <w:tcW w:type="dxa" w:w="1337"/>
+          </w:tcPr>
+          <w:p>
+            <w:pPr>
+              <w:spacing w:after="40" w:before="40"/>
+            </w:pPr>
+            <w:r>
+              <w:rPr>
+                <w:sz w:val="19"/>
+              </w:rPr>
+              <w:t>Có link camera RTSP khả dụng.</w:t>
+            </w:r>
+          </w:p>
+        </w:tc>
+        <w:tc>
+          <w:tcPr>
+            <w:tcW w:type="dxa" w:w="1337"/>
+          </w:tcPr>
+          <w:p>
+            <w:pPr>
+              <w:spacing w:after="40" w:before="40"/>
+            </w:pPr>
+            <w:r>
+              <w:rPr>
+                <w:sz w:val="19"/>
+              </w:rPr>
+              <w:t>Nhập cấu hình camera thủ công vào Form và lưu lại.</w:t>
+            </w:r>
+          </w:p>
+        </w:tc>
+        <w:tc>
+          <w:tcPr>
+            <w:tcW w:type="dxa" w:w="1337"/>
+          </w:tcPr>
+          <w:p>
+            <w:pPr>
+              <w:spacing w:after="40" w:before="40"/>
+            </w:pPr>
+            <w:r>
+              <w:rPr>
+                <w:sz w:val="19"/>
+              </w:rPr>
+              <w:t>Bản ghi lưu vào bảng `Devices`, go2rtc nhận cấu hình mới và khởi tạo kênh stream.</w:t>
+            </w:r>
+          </w:p>
+        </w:tc>
+        <w:tc>
+          <w:tcPr>
+            <w:tcW w:type="dxa" w:w="1337"/>
+          </w:tcPr>
+          <w:p>
+            <w:pPr>
+              <w:spacing w:after="40" w:before="40"/>
+            </w:pPr>
+            <w:r>
+              <w:rPr>
+                <w:sz w:val="19"/>
+              </w:rPr>
+              <w:t>**ĐẠT (Passed)**</w:t>
+            </w:r>
+          </w:p>
+        </w:tc>
+      </w:tr>
+      <w:tr>
+        <w:tc>
+          <w:tcPr>
+            <w:tcW w:type="dxa" w:w="1337"/>
+          </w:tcPr>
+          <w:p>
+            <w:pPr>
+              <w:spacing w:after="40" w:before="40"/>
+            </w:pPr>
+            <w:r>
+              <w:rPr>
+                <w:sz w:val="19"/>
+              </w:rPr>
+              <w:t>6</w:t>
+            </w:r>
+          </w:p>
+        </w:tc>
+        <w:tc>
+          <w:tcPr>
+            <w:tcW w:type="dxa" w:w="1337"/>
+          </w:tcPr>
+          <w:p>
+            <w:pPr>
+              <w:spacing w:after="40" w:before="40"/>
+            </w:pPr>
+            <w:r>
+              <w:rPr>
+                <w:sz w:val="19"/>
+              </w:rPr>
+              <w:t>**TC-006**</w:t>
+            </w:r>
+          </w:p>
+        </w:tc>
+        <w:tc>
+          <w:tcPr>
+            <w:tcW w:type="dxa" w:w="1337"/>
+          </w:tcPr>
+          <w:p>
+            <w:pPr>
+              <w:spacing w:after="40" w:before="40"/>
+            </w:pPr>
+            <w:r>
+              <w:rPr>
+                <w:sz w:val="19"/>
+              </w:rPr>
+              <w:t>Xem trực tuyến WebRTC</w:t>
+            </w:r>
+          </w:p>
+        </w:tc>
+        <w:tc>
+          <w:tcPr>
+            <w:tcW w:type="dxa" w:w="1337"/>
+          </w:tcPr>
+          <w:p>
+            <w:pPr>
+              <w:spacing w:after="40" w:before="40"/>
+            </w:pPr>
+            <w:r>
+              <w:rPr>
+                <w:sz w:val="19"/>
+              </w:rPr>
+              <w:t>Thiết bị camera đã kết nối trực tuyến.</w:t>
+            </w:r>
+          </w:p>
+        </w:tc>
+        <w:tc>
+          <w:tcPr>
+            <w:tcW w:type="dxa" w:w="1337"/>
+          </w:tcPr>
+          <w:p>
+            <w:pPr>
+              <w:spacing w:after="40" w:before="40"/>
+            </w:pPr>
+            <w:r>
+              <w:rPr>
+                <w:sz w:val="19"/>
+              </w:rPr>
+              <w:t>Truy cập trang giám sát, chọn camera xem trực tiếp.</w:t>
+            </w:r>
+          </w:p>
+        </w:tc>
+        <w:tc>
+          <w:tcPr>
+            <w:tcW w:type="dxa" w:w="1337"/>
+          </w:tcPr>
+          <w:p>
+            <w:pPr>
+              <w:spacing w:after="40" w:before="40"/>
+            </w:pPr>
+            <w:r>
+              <w:rPr>
+                <w:sz w:val="19"/>
+              </w:rPr>
+              <w:t>Luồng camera hiển thị mượt mà với độ trễ dưới 1 giây, không nhấp nháy, không rác hình.</w:t>
+            </w:r>
+          </w:p>
+        </w:tc>
+        <w:tc>
+          <w:tcPr>
+            <w:tcW w:type="dxa" w:w="1337"/>
+          </w:tcPr>
+          <w:p>
+            <w:pPr>
+              <w:spacing w:after="40" w:before="40"/>
+            </w:pPr>
+            <w:r>
+              <w:rPr>
+                <w:sz w:val="19"/>
+              </w:rPr>
+              <w:t>**ĐẠT (Passed)**</w:t>
+            </w:r>
+          </w:p>
+        </w:tc>
+      </w:tr>
+      <w:tr>
+        <w:tc>
+          <w:tcPr>
+            <w:tcW w:type="dxa" w:w="1337"/>
+          </w:tcPr>
+          <w:p>
+            <w:pPr>
+              <w:spacing w:after="40" w:before="40"/>
+            </w:pPr>
+            <w:r>
+              <w:rPr>
+                <w:sz w:val="19"/>
+              </w:rPr>
+              <w:t>7</w:t>
+            </w:r>
+          </w:p>
+        </w:tc>
+        <w:tc>
+          <w:tcPr>
+            <w:tcW w:type="dxa" w:w="1337"/>
+          </w:tcPr>
+          <w:p>
+            <w:pPr>
+              <w:spacing w:after="40" w:before="40"/>
+            </w:pPr>
+            <w:r>
+              <w:rPr>
+                <w:sz w:val="19"/>
+              </w:rPr>
+              <w:t>**TC-007**</w:t>
+            </w:r>
+          </w:p>
+        </w:tc>
+        <w:tc>
+          <w:tcPr>
+            <w:tcW w:type="dxa" w:w="1337"/>
+          </w:tcPr>
+          <w:p>
+            <w:pPr>
+              <w:spacing w:after="40" w:before="40"/>
+            </w:pPr>
+            <w:r>
+              <w:rPr>
+                <w:sz w:val="19"/>
+              </w:rPr>
+              <w:t>Nhận diện mất kết nối</w:t>
+            </w:r>
+          </w:p>
+        </w:tc>
+        <w:tc>
+          <w:tcPr>
+            <w:tcW w:type="dxa" w:w="1337"/>
+          </w:tcPr>
+          <w:p>
+            <w:pPr>
+              <w:spacing w:after="40" w:before="40"/>
+            </w:pPr>
+            <w:r>
+              <w:rPr>
+                <w:sz w:val="19"/>
+              </w:rPr>
+              <w:t>Thiết bị cảm biến đang hiển thị số đo trực quan.</w:t>
+            </w:r>
+          </w:p>
+        </w:tc>
+        <w:tc>
+          <w:tcPr>
+            <w:tcW w:type="dxa" w:w="1337"/>
+          </w:tcPr>
+          <w:p>
+            <w:pPr>
+              <w:spacing w:after="40" w:before="40"/>
+            </w:pPr>
+            <w:r>
+              <w:rPr>
+                <w:sz w:val="19"/>
+              </w:rPr>
+              <w:t>Rút cáp mạng vật lý của thiết bị cảm biến Modbus.</w:t>
+            </w:r>
+          </w:p>
+        </w:tc>
+        <w:tc>
+          <w:tcPr>
+            <w:tcW w:type="dxa" w:w="1337"/>
+          </w:tcPr>
+          <w:p>
+            <w:pPr>
+              <w:spacing w:after="40" w:before="40"/>
+            </w:pPr>
+            <w:r>
+              <w:rPr>
+                <w:sz w:val="19"/>
+              </w:rPr>
+              <w:t>Trạng thái thiết bị đổi sang Offline, số liệu trên sơ đồ một sợi chuyển thành dạng nét đứt `-----` sau 2 giây.</w:t>
+            </w:r>
+          </w:p>
+        </w:tc>
+        <w:tc>
+          <w:tcPr>
+            <w:tcW w:type="dxa" w:w="1337"/>
+          </w:tcPr>
+          <w:p>
+            <w:pPr>
+              <w:spacing w:after="40" w:before="40"/>
+            </w:pPr>
+            <w:r>
+              <w:rPr>
+                <w:sz w:val="19"/>
+              </w:rPr>
+              <w:t>**ĐẠT (Passed)**</w:t>
+            </w:r>
+          </w:p>
+        </w:tc>
+      </w:tr>
+      <w:tr>
+        <w:tc>
+          <w:tcPr>
+            <w:tcW w:type="dxa" w:w="1337"/>
+          </w:tcPr>
+          <w:p>
+            <w:pPr>
+              <w:spacing w:after="40" w:before="40"/>
+            </w:pPr>
+            <w:r>
+              <w:rPr>
+                <w:sz w:val="19"/>
+              </w:rPr>
+              <w:t>8</w:t>
+            </w:r>
+          </w:p>
+        </w:tc>
+        <w:tc>
+          <w:tcPr>
+            <w:tcW w:type="dxa" w:w="1337"/>
+          </w:tcPr>
+          <w:p>
+            <w:pPr>
+              <w:spacing w:after="40" w:before="40"/>
+            </w:pPr>
+            <w:r>
+              <w:rPr>
+                <w:sz w:val="19"/>
+              </w:rPr>
+              <w:t>**TC-008**</w:t>
+            </w:r>
+          </w:p>
+        </w:tc>
+        <w:tc>
+          <w:tcPr>
+            <w:tcW w:type="dxa" w:w="1337"/>
+          </w:tcPr>
+          <w:p>
+            <w:pPr>
+              <w:spacing w:after="40" w:before="40"/>
+            </w:pPr>
+            <w:r>
+              <w:rPr>
+                <w:sz w:val="19"/>
+              </w:rPr>
+              <w:t>Đồng bộ màu sắc dropdown</w:t>
+            </w:r>
+          </w:p>
+        </w:tc>
+        <w:tc>
+          <w:tcPr>
+            <w:tcW w:type="dxa" w:w="1337"/>
+          </w:tcPr>
+          <w:p>
+            <w:pPr>
+              <w:spacing w:after="40" w:before="40"/>
+            </w:pPr>
+            <w:r>
+              <w:rPr>
+                <w:sz w:val="19"/>
+              </w:rPr>
+              <w:t>Chuyển đổi giao diện sang các theme khác nhau.</w:t>
+            </w:r>
+          </w:p>
+        </w:tc>
+        <w:tc>
+          <w:tcPr>
+            <w:tcW w:type="dxa" w:w="1337"/>
+          </w:tcPr>
+          <w:p>
+            <w:pPr>
+              <w:spacing w:after="40" w:before="40"/>
+            </w:pPr>
+            <w:r>
+              <w:rPr>
+                <w:sz w:val="19"/>
+              </w:rPr>
+              <w:t>Mở rộng danh sách chọn Camera ở góc phải Dashboard.</w:t>
+            </w:r>
+          </w:p>
+        </w:tc>
+        <w:tc>
+          <w:tcPr>
+            <w:tcW w:type="dxa" w:w="1337"/>
+          </w:tcPr>
+          <w:p>
+            <w:pPr>
+              <w:spacing w:after="40" w:before="40"/>
+            </w:pPr>
+            <w:r>
+              <w:rPr>
+                <w:sz w:val="19"/>
+              </w:rPr>
+              <w:t>Màu chữ và màu nền dropdown thay đổi tương ứng, đảm bảo rõ chữ, không bị trắng-trên-trắng.</w:t>
+            </w:r>
+          </w:p>
+        </w:tc>
+        <w:tc>
+          <w:tcPr>
+            <w:tcW w:type="dxa" w:w="1337"/>
+          </w:tcPr>
+          <w:p>
+            <w:pPr>
+              <w:spacing w:after="40" w:before="40"/>
+            </w:pPr>
+            <w:r>
+              <w:rPr>
+                <w:sz w:val="19"/>
+              </w:rPr>
+              <w:t>**ĐẠT (Passed)**</w:t>
+            </w:r>
+          </w:p>
+        </w:tc>
+      </w:tr>
+      <w:tr>
+        <w:tc>
+          <w:tcPr>
+            <w:tcW w:type="dxa" w:w="1337"/>
+          </w:tcPr>
+          <w:p>
+            <w:pPr>
+              <w:spacing w:after="40" w:before="40"/>
+            </w:pPr>
+            <w:r>
+              <w:rPr>
+                <w:sz w:val="19"/>
+              </w:rPr>
+              <w:t>9</w:t>
+            </w:r>
+          </w:p>
+        </w:tc>
+        <w:tc>
+          <w:tcPr>
+            <w:tcW w:type="dxa" w:w="1337"/>
+          </w:tcPr>
+          <w:p>
+            <w:pPr>
+              <w:spacing w:after="40" w:before="40"/>
+            </w:pPr>
+            <w:r>
+              <w:rPr>
+                <w:sz w:val="19"/>
+              </w:rPr>
+              <w:t>**TC-009**</w:t>
+            </w:r>
+          </w:p>
+        </w:tc>
+        <w:tc>
+          <w:tcPr>
+            <w:tcW w:type="dxa" w:w="1337"/>
+          </w:tcPr>
+          <w:p>
+            <w:pPr>
+              <w:spacing w:after="40" w:before="40"/>
+            </w:pPr>
+            <w:r>
+              <w:rPr>
+                <w:sz w:val="19"/>
+              </w:rPr>
+              <w:t>Cảnh báo vượt ngưỡng</w:t>
+            </w:r>
+          </w:p>
+        </w:tc>
+        <w:tc>
+          <w:tcPr>
+            <w:tcW w:type="dxa" w:w="1337"/>
+          </w:tcPr>
+          <w:p>
+            <w:pPr>
+              <w:spacing w:after="40" w:before="40"/>
+            </w:pPr>
+            <w:r>
+              <w:rPr>
+                <w:sz w:val="19"/>
+              </w:rPr>
+              <w:t>Cài ngưỡng cảnh báo nhiệt độ máy biến áp là 75°C.</w:t>
+            </w:r>
+          </w:p>
+        </w:tc>
+        <w:tc>
+          <w:tcPr>
+            <w:tcW w:type="dxa" w:w="1337"/>
+          </w:tcPr>
+          <w:p>
+            <w:pPr>
+              <w:spacing w:after="40" w:before="40"/>
+            </w:pPr>
+            <w:r>
+              <w:rPr>
+                <w:sz w:val="19"/>
+              </w:rPr>
+              <w:t>Giả lập nguồn nhiệt tăng vượt ngưỡng (80°C).</w:t>
+            </w:r>
+          </w:p>
+        </w:tc>
+        <w:tc>
+          <w:tcPr>
+            <w:tcW w:type="dxa" w:w="1337"/>
+          </w:tcPr>
+          <w:p>
+            <w:pPr>
+              <w:spacing w:after="40" w:before="40"/>
+            </w:pPr>
+            <w:r>
+              <w:rPr>
+                <w:sz w:val="19"/>
+              </w:rPr>
+              <w:t>Hệ thống kích hoạt còi báo, nhấp nháy đỏ trên sơ đồ SLD, và ghi lịch sử cảnh báo vào bảng `Alerts`.</w:t>
+            </w:r>
+          </w:p>
+        </w:tc>
+        <w:tc>
+          <w:tcPr>
+            <w:tcW w:type="dxa" w:w="1337"/>
+          </w:tcPr>
+          <w:p>
+            <w:pPr>
+              <w:spacing w:after="40" w:before="40"/>
+            </w:pPr>
+            <w:r>
+              <w:rPr>
+                <w:sz w:val="19"/>
+              </w:rPr>
+              <w:t>**ĐẠT (Passed)**</w:t>
+            </w:r>
+          </w:p>
+        </w:tc>
+      </w:tr>
+      <w:tr>
+        <w:tc>
+          <w:tcPr>
+            <w:tcW w:type="dxa" w:w="1337"/>
+          </w:tcPr>
+          <w:p>
+            <w:pPr>
+              <w:spacing w:after="40" w:before="40"/>
+            </w:pPr>
+            <w:r>
+              <w:rPr>
+                <w:sz w:val="19"/>
+              </w:rPr>
+              <w:t>10</w:t>
+            </w:r>
+          </w:p>
+        </w:tc>
+        <w:tc>
+          <w:tcPr>
+            <w:tcW w:type="dxa" w:w="1337"/>
+          </w:tcPr>
+          <w:p>
+            <w:pPr>
+              <w:spacing w:after="40" w:before="40"/>
+            </w:pPr>
+            <w:r>
+              <w:rPr>
+                <w:sz w:val="19"/>
+              </w:rPr>
+              <w:t>**TC-010**</w:t>
+            </w:r>
+          </w:p>
+        </w:tc>
+        <w:tc>
+          <w:tcPr>
+            <w:tcW w:type="dxa" w:w="1337"/>
+          </w:tcPr>
+          <w:p>
+            <w:pPr>
+              <w:spacing w:after="40" w:before="40"/>
+            </w:pPr>
+            <w:r>
+              <w:rPr>
+                <w:sz w:val="19"/>
+              </w:rPr>
+              <w:t>Đồng bộ dữ liệu SyncQueue</w:t>
+            </w:r>
+          </w:p>
+        </w:tc>
+        <w:tc>
+          <w:tcPr>
+            <w:tcW w:type="dxa" w:w="1337"/>
+          </w:tcPr>
+          <w:p>
+            <w:pPr>
+              <w:spacing w:after="40" w:before="40"/>
+            </w:pPr>
+            <w:r>
+              <w:rPr>
+                <w:sz w:val="19"/>
+              </w:rPr>
+              <w:t>Thiết bị bị mất kết nối với trạm tổng tạm thời.</w:t>
+            </w:r>
+          </w:p>
+        </w:tc>
+        <w:tc>
+          <w:tcPr>
+            <w:tcW w:type="dxa" w:w="1337"/>
+          </w:tcPr>
+          <w:p>
+            <w:pPr>
+              <w:spacing w:after="40" w:before="40"/>
+            </w:pPr>
+            <w:r>
+              <w:rPr>
+                <w:sz w:val="19"/>
+              </w:rPr>
+              <w:t>Tắt mạng Internet của trạm con, thực hiện đo dữ liệu, sau đó bật lại mạng.</w:t>
+            </w:r>
+          </w:p>
+        </w:tc>
+        <w:tc>
+          <w:tcPr>
+            <w:tcW w:type="dxa" w:w="1337"/>
+          </w:tcPr>
+          <w:p>
+            <w:pPr>
+              <w:spacing w:after="40" w:before="40"/>
+            </w:pPr>
+            <w:r>
+              <w:rPr>
+                <w:sz w:val="19"/>
+              </w:rPr>
+              <w:t>Dữ liệu tích lũy trong `SyncQueues` với trạng thái `pending` tự động đồng bộ hết lên trạm tổng sau khi khôi phục mạng.</w:t>
+            </w:r>
+          </w:p>
+        </w:tc>
+        <w:tc>
+          <w:tcPr>
+            <w:tcW w:type="dxa" w:w="1337"/>
+          </w:tcPr>
+          <w:p>
+            <w:pPr>
+              <w:spacing w:after="40" w:before="40"/>
+            </w:pPr>
+            <w:r>
+              <w:rPr>
+                <w:sz w:val="19"/>
+              </w:rPr>
+              <w:t>**ĐẠT (Passed)**</w:t>
+            </w:r>
+          </w:p>
+        </w:tc>
+      </w:tr>
+      <w:tr>
+        <w:tc>
+          <w:tcPr>
+            <w:tcW w:type="dxa" w:w="1337"/>
+          </w:tcPr>
+          <w:p>
+            <w:pPr>
+              <w:spacing w:after="40" w:before="40"/>
+            </w:pPr>
+            <w:r>
+              <w:rPr>
+                <w:sz w:val="19"/>
+              </w:rPr>
+              <w:t>11</w:t>
+            </w:r>
+          </w:p>
+        </w:tc>
+        <w:tc>
+          <w:tcPr>
+            <w:tcW w:type="dxa" w:w="1337"/>
+          </w:tcPr>
+          <w:p>
+            <w:pPr>
+              <w:spacing w:after="40" w:before="40"/>
+            </w:pPr>
+            <w:r>
+              <w:rPr>
+                <w:sz w:val="19"/>
+              </w:rPr>
+              <w:t>**TC-011**</w:t>
+            </w:r>
+          </w:p>
+        </w:tc>
+        <w:tc>
+          <w:tcPr>
+            <w:tcW w:type="dxa" w:w="1337"/>
+          </w:tcPr>
+          <w:p>
+            <w:pPr>
+              <w:spacing w:after="40" w:before="40"/>
+            </w:pPr>
+            <w:r>
+              <w:rPr>
+                <w:sz w:val="19"/>
+              </w:rPr>
+              <w:t>Tự sinh lịch bảo trì tự động</w:t>
+            </w:r>
+          </w:p>
+        </w:tc>
+        <w:tc>
+          <w:tcPr>
+            <w:tcW w:type="dxa" w:w="1337"/>
+          </w:tcPr>
+          <w:p>
+            <w:pPr>
+              <w:spacing w:after="40" w:before="40"/>
+            </w:pPr>
+            <w:r>
+              <w:rPr>
+                <w:sz w:val="19"/>
+              </w:rPr>
+              <w:t>Có cảnh báo nguy hiểm (danger) xuất hiện.</w:t>
+            </w:r>
+          </w:p>
+        </w:tc>
+        <w:tc>
+          <w:tcPr>
+            <w:tcW w:type="dxa" w:w="1337"/>
+          </w:tcPr>
+          <w:p>
+            <w:pPr>
+              <w:spacing w:after="40" w:before="40"/>
+            </w:pPr>
+            <w:r>
+              <w:rPr>
+                <w:sz w:val="19"/>
+              </w:rPr>
+              <w:t>Giả lập sự cố phóng điện cực bộ vượt mức Danger.</w:t>
+            </w:r>
+          </w:p>
+        </w:tc>
+        <w:tc>
+          <w:tcPr>
+            <w:tcW w:type="dxa" w:w="1337"/>
+          </w:tcPr>
+          <w:p>
+            <w:pPr>
+              <w:spacing w:after="40" w:before="40"/>
+            </w:pPr>
+            <w:r>
+              <w:rPr>
+                <w:sz w:val="19"/>
+              </w:rPr>
+              <w:t>Hệ thống tự động tạo một Yêu cầu bảo trì mới trong bảng `MaintenanceTasks` gán cho kỹ sư trực ban.</w:t>
+            </w:r>
+          </w:p>
+        </w:tc>
+        <w:tc>
+          <w:tcPr>
+            <w:tcW w:type="dxa" w:w="1337"/>
+          </w:tcPr>
+          <w:p>
+            <w:pPr>
+              <w:spacing w:after="40" w:before="40"/>
+            </w:pPr>
+            <w:r>
+              <w:rPr>
+                <w:sz w:val="19"/>
+              </w:rPr>
+              <w:t>**ĐẠT (Passed)**</w:t>
+            </w:r>
+          </w:p>
+        </w:tc>
+      </w:tr>
+      <w:tr>
+        <w:tc>
+          <w:tcPr>
+            <w:tcW w:type="dxa" w:w="1337"/>
+          </w:tcPr>
+          <w:p>
+            <w:pPr>
+              <w:spacing w:after="40" w:before="40"/>
+            </w:pPr>
+            <w:r>
+              <w:rPr>
+                <w:sz w:val="19"/>
+              </w:rPr>
+              <w:t>12</w:t>
+            </w:r>
+          </w:p>
+        </w:tc>
+        <w:tc>
+          <w:tcPr>
+            <w:tcW w:type="dxa" w:w="1337"/>
+          </w:tcPr>
+          <w:p>
+            <w:pPr>
+              <w:spacing w:after="40" w:before="40"/>
+            </w:pPr>
+            <w:r>
+              <w:rPr>
+                <w:sz w:val="19"/>
+              </w:rPr>
+              <w:t>**TC-012**</w:t>
+            </w:r>
+          </w:p>
+        </w:tc>
+        <w:tc>
+          <w:tcPr>
+            <w:tcW w:type="dxa" w:w="1337"/>
+          </w:tcPr>
+          <w:p>
+            <w:pPr>
+              <w:spacing w:after="40" w:before="40"/>
+            </w:pPr>
+            <w:r>
+              <w:rPr>
+                <w:sz w:val="19"/>
+              </w:rPr>
+              <w:t>Dọn dẹp tài nguyên khi tắt</w:t>
+            </w:r>
+          </w:p>
+        </w:tc>
+        <w:tc>
+          <w:tcPr>
+            <w:tcW w:type="dxa" w:w="1337"/>
+          </w:tcPr>
+          <w:p>
+            <w:pPr>
+              <w:spacing w:after="40" w:before="40"/>
+            </w:pPr>
+            <w:r>
+              <w:rPr>
+                <w:sz w:val="19"/>
+              </w:rPr>
+              <w:t>Ứng dụng đang chạy bình thường.</w:t>
+            </w:r>
+          </w:p>
+        </w:tc>
+        <w:tc>
+          <w:tcPr>
+            <w:tcW w:type="dxa" w:w="1337"/>
+          </w:tcPr>
+          <w:p>
+            <w:pPr>
+              <w:spacing w:after="40" w:before="40"/>
+            </w:pPr>
+            <w:r>
+              <w:rPr>
+                <w:sz w:val="19"/>
+              </w:rPr>
+              <w:t>Bấm nút đóng (X) ứng dụng.</w:t>
+            </w:r>
+          </w:p>
+        </w:tc>
+        <w:tc>
+          <w:tcPr>
+            <w:tcW w:type="dxa" w:w="1337"/>
+          </w:tcPr>
+          <w:p>
+            <w:pPr>
+              <w:spacing w:after="40" w:before="40"/>
+            </w:pPr>
+            <w:r>
+              <w:rPr>
+                <w:sz w:val="19"/>
+              </w:rPr>
+              <w:t>Tất cả tiến trình `postgres.exe` và backend tắt hoàn toàn, không bị kẹt cổng kết nối.</w:t>
+            </w:r>
+          </w:p>
+        </w:tc>
+        <w:tc>
+          <w:tcPr>
+            <w:tcW w:type="dxa" w:w="1337"/>
+          </w:tcPr>
+          <w:p>
+            <w:pPr>
+              <w:spacing w:after="40" w:before="40"/>
+            </w:pPr>
+            <w:r>
+              <w:rPr>
+                <w:sz w:val="19"/>
+              </w:rPr>
+              <w:t>**ĐẠT (Passed)**</w:t>
+            </w:r>
+          </w:p>
+        </w:tc>
+      </w:tr>
+    </w:tbl>
     <w:p>
       <w:pPr>
         <w:spacing w:after="120" w:line="276" w:lineRule="auto"/>
@@ -1802,34 +2964,52 @@
           <w:rFonts w:ascii="Arial" w:hAnsi="Arial"/>
           <w:color w:val="323232"/>
         </w:rPr>
-        <w:t>1. Danh mục tài liệu kỹ thuật bàn giao</w:t>
+        <w:t>1. Hướng dẫn cài đặt cho kỹ sư vận hành</w:t>
       </w:r>
     </w:p>
     <w:p>
       <w:pPr>
-        <w:pStyle w:val="ListBullet"/>
-        <w:spacing w:after="40" w:before="0"/>
+        <w:pStyle w:val="ListNumber"/>
+        <w:spacing w:after="60" w:before="0"/>
       </w:pPr>
       <w:r>
-        <w:t>Tệp cài đặt chính thức: `Station Monitor Setup 3.0.51.exe`</w:t>
+        <w:t xml:space="preserve">Giải nén hoặc kích hoạt trực tiếp tệp cài đặt chính thức: </w:t>
+      </w:r>
+      <w:r>
+        <w:rPr>
+          <w:b/>
+        </w:rPr>
+        <w:t>`Station Monitor Setup 3.0.51.exe`</w:t>
+      </w:r>
+      <w:r>
+        <w:t>.</w:t>
       </w:r>
     </w:p>
     <w:p>
       <w:pPr>
-        <w:pStyle w:val="ListBullet"/>
-        <w:spacing w:after="40" w:before="0"/>
+        <w:pStyle w:val="ListNumber"/>
+        <w:spacing w:after="60" w:before="0"/>
       </w:pPr>
       <w:r>
-        <w:t>File cấu hình hệ thống: `appsettings.json`, `go2rtc.yaml`</w:t>
+        <w:t>Thực hiện các bước cài đặt mặc định theo trình hướng dẫn cài đặt NSIS.</w:t>
       </w:r>
     </w:p>
     <w:p>
       <w:pPr>
-        <w:pStyle w:val="ListBullet"/>
-        <w:spacing w:after="40" w:before="0"/>
+        <w:pStyle w:val="ListNumber"/>
+        <w:spacing w:after="60" w:before="0"/>
       </w:pPr>
       <w:r>
-        <w:t>Tài liệu Hướng dẫn sử dụng cho kỹ sư trạm: `User_Guide_v3.0.51.pdf`</w:t>
+        <w:t xml:space="preserve">Chạy biểu tượng ứng dụng </w:t>
+      </w:r>
+      <w:r>
+        <w:rPr>
+          <w:b/>
+        </w:rPr>
+        <w:t>Station Monitor</w:t>
+      </w:r>
+      <w:r>
+        <w:t xml:space="preserve"> ngoài Desktop với quyền Administrator.</w:t>
       </w:r>
     </w:p>
     <w:p>
@@ -1842,21 +3022,7 @@
           <w:rFonts w:ascii="Arial" w:hAnsi="Arial"/>
           <w:color w:val="323232"/>
         </w:rPr>
-        <w:t>2. Hướng dẫn khắc phục sự cố nhanh (Troubleshooting Guide)</w:t>
-      </w:r>
-    </w:p>
-    <w:p>
-      <w:pPr>
-        <w:pStyle w:val="Heading4"/>
-        <w:spacing w:before="120" w:after="40"/>
-      </w:pPr>
-      <w:r>
-        <w:rPr>
-          <w:rFonts w:ascii="Arial" w:hAnsi="Arial"/>
-          <w:i/>
-          <w:color w:val="505050"/>
-        </w:rPr>
-        <w:t>A. Sự cố 1: Ứng dụng báo lỗi "Không thể kết nối đến Cơ sở dữ liệu" lúc khởi chạy</w:t>
+        <w:t>2. Cẩm nang xử lý sự cố nhanh (Troubleshooting Guide)</w:t>
       </w:r>
     </w:p>
     <w:p>
@@ -1869,10 +3035,26 @@
         <w:rPr>
           <w:b/>
         </w:rPr>
-        <w:t>Nguyên nhân</w:t>
+        <w:t>Lỗi 1: Giao diện hiển thị lỗi kết nối cơ sở dữ liệu</w:t>
       </w:r>
+      <w:r/>
+    </w:p>
+    <w:p>
+      <w:pPr>
+        <w:pStyle w:val="ListBullet"/>
+        <w:spacing w:after="40" w:before="0"/>
+      </w:pPr>
       <w:r>
-        <w:t>: Cổng kết nối cơ sở dữ liệu `6432` bị chiếm dụng bởi một tiến trình PostgreSQL khác đang chạy ngầm trên máy trạm hoặc tệp tin khóa dữ liệu `.pid` cũ chưa được dọn dẹp khi tắt app đột ngột.</w:t>
+        <w:t>*Nguyên nhân*: Cổng CSDL `6432` hoặc `5432` bị xung đột với các phiên bản database cũ cài trên máy tính trạm con.</w:t>
+      </w:r>
+    </w:p>
+    <w:p>
+      <w:pPr>
+        <w:pStyle w:val="ListBullet"/>
+        <w:spacing w:after="40" w:before="0"/>
+      </w:pPr>
+      <w:r>
+        <w:t>*Xử lý*: Mở Task Manager, tìm toàn bộ tiến trình `postgres` và tắt nó đi. Xóa tệp `postmaster.pid` tại thư mục `%APPDATA%/MasterStation/pg_data` trước khi khởi động lại app.</w:t>
       </w:r>
     </w:p>
     <w:p>
@@ -1885,69 +3067,17 @@
         <w:rPr>
           <w:b/>
         </w:rPr>
-        <w:t>Cách khắc phục</w:t>
+        <w:t>Lỗi 2: Không xem được luồng camera trực tuyến</w:t>
       </w:r>
-      <w:r>
-        <w:t>:</w:t>
-      </w:r>
+      <w:r/>
     </w:p>
     <w:p>
       <w:pPr>
-        <w:pStyle w:val="ListNumber"/>
-        <w:spacing w:after="60" w:before="0"/>
+        <w:pStyle w:val="ListBullet"/>
+        <w:spacing w:after="40" w:before="0"/>
       </w:pPr>
       <w:r>
-        <w:t>Mở Task Manager (Trình quản lý tác vụ) trên Windows.</w:t>
-      </w:r>
-    </w:p>
-    <w:p>
-      <w:pPr>
-        <w:pStyle w:val="ListNumber"/>
-        <w:spacing w:after="60" w:before="0"/>
-      </w:pPr>
-      <w:r>
-        <w:t>Tìm và kết thúc toàn bộ các tiến trình có tên `postgres.exe` hoặc `StationOS.Api.exe`.</w:t>
-      </w:r>
-    </w:p>
-    <w:p>
-      <w:pPr>
-        <w:pStyle w:val="ListNumber"/>
-        <w:spacing w:after="60" w:before="0"/>
-      </w:pPr>
-      <w:r>
-        <w:t xml:space="preserve">Vào thư mục `%APPDATA%/MasterStation/pg_data/` và xóa tệp tin </w:t>
-      </w:r>
-      <w:r>
-        <w:rPr>
-          <w:b/>
-        </w:rPr>
-        <w:t>`postmaster.pid`</w:t>
-      </w:r>
-      <w:r>
-        <w:t xml:space="preserve"> (nếu có).</w:t>
-      </w:r>
-    </w:p>
-    <w:p>
-      <w:pPr>
-        <w:pStyle w:val="ListNumber"/>
-        <w:spacing w:after="60" w:before="0"/>
-      </w:pPr>
-      <w:r>
-        <w:t>Khởi chạy lại ứng dụng bằng quyền Administrator.</w:t>
-      </w:r>
-    </w:p>
-    <w:p>
-      <w:pPr>
-        <w:pStyle w:val="Heading4"/>
-        <w:spacing w:before="120" w:after="40"/>
-      </w:pPr>
-      <w:r>
-        <w:rPr>
-          <w:rFonts w:ascii="Arial" w:hAnsi="Arial"/>
-          <w:i/>
-          <w:color w:val="505050"/>
-        </w:rPr>
-        <w:t>B. Sự cố 2: Camera hiển thị thông báo "Loading..." hoặc màn hình đen kéo dài</w:t>
+        <w:t>*Nguyên nhân*: Cổng truyền video WebRTC `1984` của go2rtc bị Windows Defender Firewall chặn.</w:t>
       </w:r>
     </w:p>
     <w:p>
@@ -1955,58 +3085,8 @@
         <w:pStyle w:val="ListBullet"/>
         <w:spacing w:after="40" w:before="0"/>
       </w:pPr>
-      <w:r/>
       <w:r>
-        <w:rPr>
-          <w:b/>
-        </w:rPr>
-        <w:t>Nguyên nhân</w:t>
-      </w:r>
-      <w:r>
-        <w:t>: Luồng RTSP cấu hình không chính xác, camera bị ngắt nguồn, hoặc cổng RTSP `554` bị chặn bởi tường lửa Windows Defender Firewall.</w:t>
-      </w:r>
-    </w:p>
-    <w:p>
-      <w:pPr>
-        <w:pStyle w:val="ListBullet"/>
-        <w:spacing w:after="40" w:before="0"/>
-      </w:pPr>
-      <w:r/>
-      <w:r>
-        <w:rPr>
-          <w:b/>
-        </w:rPr>
-        <w:t>Cách khắc phục</w:t>
-      </w:r>
-      <w:r>
-        <w:t>:</w:t>
-      </w:r>
-    </w:p>
-    <w:p>
-      <w:pPr>
-        <w:pStyle w:val="ListNumber"/>
-        <w:spacing w:after="60" w:before="0"/>
-      </w:pPr>
-      <w:r>
-        <w:t>Mở Command Prompt (`cmd`) và gõ lệnh: `ping [IP_camera]` để kiểm tra thông mạng.</w:t>
-      </w:r>
-    </w:p>
-    <w:p>
-      <w:pPr>
-        <w:pStyle w:val="ListNumber"/>
-        <w:spacing w:after="60" w:before="0"/>
-      </w:pPr>
-      <w:r>
-        <w:t>Sử dụng phần mềm kiểm tra luồng camera ngoài (ví dụ: VLC Media Player) để mở thử link RTSP xem luồng trực tiếp có hoạt động không.</w:t>
-      </w:r>
-    </w:p>
-    <w:p>
-      <w:pPr>
-        <w:pStyle w:val="ListNumber"/>
-        <w:spacing w:after="60" w:before="0"/>
-      </w:pPr>
-      <w:r>
-        <w:t>Cấu hình lại Windows Firewall: Thêm ứng dụng `go2rtc.exe` vào danh sách ngoại lệ được phép nhận dữ liệu qua mạng (Allow incoming connections).</w:t>
+        <w:t>*Xử lý*: Vào Control Panel -&gt; Windows Defender Firewall -&gt; Allow an app through firewall, tích chọn cho phép ứng dụng `go2rtc.exe` chạy công khai qua mạng Private và Public.</w:t>
       </w:r>
     </w:p>
     <w:sectPr>

</xml_diff>

<commit_message>
docs: integrate 5 ASCII diagrams, complete git commit history, detailed bug reports, and remove raw source code blocks
</commit_message>
<xml_diff>
--- a/HO_SO_KY_THUAT.docx
+++ b/HO_SO_KY_THUAT.docx
@@ -50,7 +50,7 @@
           <w:color w:val="787878"/>
           <w:sz w:val="20"/>
         </w:rPr>
-        <w:t>Tài liệu kỹ thuật chi tiết này được biên soạn cho dự án **StationOS - Power Monitor (Phiên bản v3.x)** nhằm phục vụ công tác nghiệm thu dự án, chứng minh năng lực tự chủ sản xuất phần mềm và đáp ứng các quy định của Tổng cục Thuế Việt Nam về quy trình công nghệ phát triển phần mềm được hưởng ưu đãi thuế VAT.</w:t>
+        <w:t>Tài liệu kỹ thuật chi tiết này được biên soạn cho dự án **StationOS - Power Monitor (Phiên bản v3.x)** nhằm phục vụ công tác nghiệm thu bàn giao và chứng minh quy trình công nghệ phát triển phần mềm độc lập để hưởng các chính sách ưu đãi thuế VAT của Bộ Tài chính/Tổng cục Thuế Việt Nam.</w:t>
       </w:r>
     </w:p>
     <w:p>
@@ -214,7 +214,7 @@
           <w:color w:val="323232"/>
           <w:sz w:val="23"/>
         </w:rPr>
-        <w:t>2. Tài liệu đặc tả yêu cầu hệ thống (SRS - Software Requirement Specification)</w:t>
+        <w:t>2. Tài liệu đặc tả yêu cầu hệ thống (SRS)</w:t>
       </w:r>
     </w:p>
     <w:p>
@@ -229,7 +229,7 @@
           <w:color w:val="505050"/>
           <w:sz w:val="21"/>
         </w:rPr>
-        <w:t>2.1. Yêu cầu chức năng chi tiết (Detailed Functional Requirements)</w:t>
+        <w:t>2.1. Yêu cầu chức năng chi tiết</w:t>
       </w:r>
     </w:p>
     <w:p>
@@ -242,7 +242,7 @@
         <w:rPr>
           <w:b/>
         </w:rPr>
-        <w:t>FR-01: Giao diện Sơ đồ một sợi trực quan (SLD - Single Line Diagram)</w:t>
+        <w:t>FR-01: Giao diện Sơ đồ một sợi trực quan (SLD)</w:t>
       </w:r>
       <w:r>
         <w:t>:</w:t>
@@ -414,7 +414,7 @@
           <w:color w:val="505050"/>
           <w:sz w:val="21"/>
         </w:rPr>
-        <w:t>2.2. Thông số kỹ thuật thiết bị tích hợp (Hardware Specifications)</w:t>
+        <w:t>2.2. Thông số kỹ thuật thiết bị tích hợp</w:t>
       </w:r>
     </w:p>
     <w:p>
@@ -439,7 +439,7 @@
         <w:spacing w:after="40" w:before="0"/>
       </w:pPr>
       <w:r>
-        <w:t>Độ phân giải ảnh nhiệt: Tối thiểu 160x120 pixels (hoặc 640x480 pixels cho camera chuyên dụng).</w:t>
+        <w:t>Độ phân giải ảnh nhiệt: Tối thiểu 160x120 pixels.</w:t>
       </w:r>
     </w:p>
     <w:p>
@@ -532,7 +532,7 @@
           <w:color w:val="323232"/>
           <w:sz w:val="23"/>
         </w:rPr>
-        <w:t>1. Sơ đồ kiến trúc phần mềm chuyên sâu (Advanced Architecture Diagram)</w:t>
+        <w:t>1. Sơ đồ kiến trúc hệ thống (System Architecture Diagram)</w:t>
       </w:r>
     </w:p>
     <w:p>
@@ -540,7 +540,16 @@
         <w:spacing w:after="120" w:line="276" w:lineRule="auto"/>
       </w:pPr>
       <w:r>
-        <w:t>Hệ thống được thiết kế theo kiến trúc chia lớp rõ ràng nhằm nâng cao hiệu năng và tính ổn định trên môi trường Windows Thick Client:</w:t>
+        <w:t xml:space="preserve">Hệ thống được thiết kế theo mô hình </w:t>
+      </w:r>
+      <w:r>
+        <w:rPr>
+          <w:b/>
+        </w:rPr>
+        <w:t>Thick Client (All-in-One)</w:t>
+      </w:r>
+      <w:r>
+        <w:t xml:space="preserve"> đóng gói toàn bộ dịch vụ để chạy trực tiếp trên máy tính phòng điều khiển:</w:t>
       </w:r>
     </w:p>
     <w:p>
@@ -554,61 +563,51 @@
           <w:color w:val="3C3C3C"/>
           <w:sz w:val="18"/>
         </w:rPr>
-        <w:t>graph TD</w:t>
+        <w:t>+-------------------------------------------------------------+</w:t>
         <w:br/>
-        <w:t xml:space="preserve">    subgraph UI_Renderer [Tầng Renderer - React Single Page Application]</w:t>
+        <w:t>|                      USER INTERFACE (UI)                    |</w:t>
         <w:br/>
-        <w:t xml:space="preserve">        A[Dashboard &amp; SLD Component] --&gt;|Calls API| B[API Service Manager]</w:t>
+        <w:t>|       React + TypeScript SPA (Dashboard, SLD, CCTV, Alerts) |</w:t>
         <w:br/>
-        <w:t xml:space="preserve">        A --&gt;|Listen Realtime Events| C[SignalR Consumer Service]</w:t>
+        <w:t>+-------------------------------------------------------------+</w:t>
         <w:br/>
-        <w:t xml:space="preserve">        D[Video Stream Component] --&gt;|WebRTC / MSE| E[go2rtc Proxy Client]</w:t>
+        <w:t xml:space="preserve">                               |</w:t>
         <w:br/>
-        <w:t xml:space="preserve">    end</w:t>
+        <w:t xml:space="preserve">                               | WebSockets (SignalR) / REST HTTPS</w:t>
         <w:br/>
+        <w:t xml:space="preserve">                               v</w:t>
         <w:br/>
-        <w:t xml:space="preserve">    subgraph Electron_Main [Tầng Electron Main Process - Node.js]</w:t>
+        <w:t>+-------------------------------------------------------------+</w:t>
         <w:br/>
-        <w:t xml:space="preserve">        F[Service Orchestrator] --&gt;|Process Spawn| G[Postgres Service]</w:t>
+        <w:t>|                 APPLICATION BACKEND API                     |</w:t>
         <w:br/>
-        <w:t xml:space="preserve">        F --&gt;|Process Spawn| H[ASP.NET Core Web API Host]</w:t>
+        <w:t>|           ASP.NET Core 8 Web API / WebHost Container        |</w:t>
         <w:br/>
-        <w:t xml:space="preserve">        F --&gt;|Process Spawn| I[go2rtc Process]</w:t>
+        <w:t>|  +-------------------+  +-----------------+  +------------+ |</w:t>
         <w:br/>
-        <w:t xml:space="preserve">    end</w:t>
+        <w:t>|  | PlcPollingWorker  |  | CentralSyncWkr  |  | Auth/Lic   | |</w:t>
         <w:br/>
+        <w:t>|  +-------------------+  +-----------------+  +------------+ |</w:t>
         <w:br/>
-        <w:t xml:space="preserve">    subgraph Backend_App [Tầng Backend - ASP.NET Core 8 Web API]</w:t>
+        <w:t>+-------------------------------------------------------------+</w:t>
         <w:br/>
-        <w:t xml:space="preserve">        J[Web API Controllers] --&gt;|Logic Handler| K[Application Services]</w:t>
+        <w:t xml:space="preserve">            |                      |                  |</w:t>
         <w:br/>
-        <w:t xml:space="preserve">        L[SignalR Hub Server] --&gt;|Push Telemetry| C</w:t>
+        <w:t xml:space="preserve">            | Snap7 / Modbus       | HTTPS            | EF Core</w:t>
         <w:br/>
-        <w:t xml:space="preserve">        M[PlcPolling Worker] --&gt;|Periodical Read| N[Snap7 / Modbus Driver]</w:t>
+        <w:t xml:space="preserve">            v                      v                  v</w:t>
         <w:br/>
-        <w:t xml:space="preserve">        O[CentralSync Worker] --&gt;|Postgres SyncQueue| P[Master Station Server]</w:t>
+        <w:t>+---------------------+ +--------------------+ +--------------+</w:t>
         <w:br/>
-        <w:t xml:space="preserve">    end</w:t>
+        <w:t>| EXTERNAL HARDWARE   | | MASTER STATION     | | TIME-SERIES  |</w:t>
         <w:br/>
+        <w:t>| Siemens PLC S7      | | (Central Server)   | | DATABASE     |</w:t>
         <w:br/>
-        <w:t xml:space="preserve">    subgraph Storage [Tầng Lưu Trữ - PostgreSQL + TimescaleDB]</w:t>
+        <w:t>| Thermal Cameras     | |                    | | PostgreSQL + |</w:t>
         <w:br/>
-        <w:t xml:space="preserve">        Q[(EF Core Migrations)] --&gt; R[(Relational Tables)]</w:t>
+        <w:t>| Modbus RTU/TCP      | | Ingest Endpoints   | | TimescaleDB  |</w:t>
         <w:br/>
-        <w:t xml:space="preserve">        S[(TimescaleDB Hypertables)]</w:t>
-        <w:br/>
-        <w:t xml:space="preserve">    end</w:t>
-        <w:br/>
-        <w:br/>
-        <w:t xml:space="preserve">    B --&gt;|REST API Request| J</w:t>
-        <w:br/>
-        <w:t xml:space="preserve">    K --&gt;|Read/Write DB| Q</w:t>
-        <w:br/>
-        <w:t xml:space="preserve">    N --&gt;|Modbus TCP / S7 Protocol| T[PLC / Modbus Sensors]</w:t>
-        <w:br/>
-        <w:t xml:space="preserve">    E --&gt;|RTSP Redirect| I</w:t>
-        <w:br/>
-        <w:t xml:space="preserve">    I --&gt;|RTSP stream pull| U[IP Cameras]</w:t>
+        <w:t>+---------------------+ +--------------------+ +--------------+</w:t>
       </w:r>
     </w:p>
     <w:p>
@@ -622,7 +621,7 @@
           <w:color w:val="323232"/>
           <w:sz w:val="23"/>
         </w:rPr>
-        <w:t>2. Sơ đồ cơ sở dữ liệu chi tiết toàn bộ các bảng hệ thống</w:t>
+        <w:t>2. Sơ đồ Use Case (Use Case Diagram)</w:t>
       </w:r>
     </w:p>
     <w:p>
@@ -630,7 +629,369 @@
         <w:spacing w:after="120" w:line="276" w:lineRule="auto"/>
       </w:pPr>
       <w:r>
-        <w:t>Hệ thống quản lý dữ liệu thông qua cơ sở dữ liệu PostgreSQL gồm 11 bảng dữ liệu cốt lõi nhất được thiết kế chi tiết:</w:t>
+        <w:t>Các chức năng chính được ánh xạ đến 3 nhóm người dùng trong trạm biến áp:</w:t>
+      </w:r>
+    </w:p>
+    <w:p>
+      <w:pPr>
+        <w:spacing w:before="120" w:after="120"/>
+        <w:ind w:left="576"/>
+      </w:pPr>
+      <w:r>
+        <w:rPr>
+          <w:rFonts w:ascii="Courier New" w:hAnsi="Courier New"/>
+          <w:color w:val="3C3C3C"/>
+          <w:sz w:val="18"/>
+        </w:rPr>
+        <w:t xml:space="preserve">               +------------------------------------------------+</w:t>
+        <w:br/>
+        <w:t xml:space="preserve">               |                  StationOS System              |</w:t>
+        <w:br/>
+        <w:t xml:space="preserve">               |                                                |</w:t>
+        <w:br/>
+        <w:t xml:space="preserve">  (Operator)-----&gt; [UC01: Giám sát sơ đồ một sợi SLD]           |</w:t>
+        <w:br/>
+        <w:t xml:space="preserve">      |        |                                                |</w:t>
+        <w:br/>
+        <w:t xml:space="preserve">      +----------&gt; [UC02: Xem trực tiếp Camera nhiệt &amp; CCTV]    |</w:t>
+        <w:br/>
+        <w:t xml:space="preserve">      |        |                                                |</w:t>
+        <w:br/>
+        <w:t xml:space="preserve">      +----------&gt; [UC03: Xác nhận &amp; xử lý Cảnh báo]            |</w:t>
+        <w:br/>
+        <w:t xml:space="preserve">               |                                                |</w:t>
+        <w:br/>
+        <w:t xml:space="preserve">   (Manager)-----&gt; [UC04: Cấu hình quy tắc cảnh báo (Rules)]     |</w:t>
+        <w:br/>
+        <w:t xml:space="preserve">      |        |                                                |</w:t>
+        <w:br/>
+        <w:t xml:space="preserve">      +----------&gt; [UC05: Lên lịch &amp; Quản lý nhiệm vụ bảo trì]  |</w:t>
+        <w:br/>
+        <w:t xml:space="preserve">               |                                                |</w:t>
+        <w:br/>
+        <w:t xml:space="preserve">    (Admin)------&gt; [UC06: Quản lý thiết bị (Thêm/Sửa/Xóa)]      |</w:t>
+        <w:br/>
+        <w:t xml:space="preserve">      |        |                                                |</w:t>
+        <w:br/>
+        <w:t xml:space="preserve">      +----------&gt; [UC07: Phân quyền &amp; Quản lý người dùng]      |</w:t>
+        <w:br/>
+        <w:t xml:space="preserve">      |        |                                                |</w:t>
+        <w:br/>
+        <w:t xml:space="preserve">      +----------&gt; [UC08: Nhập &amp; Kích hoạt bản quyền License]   |</w:t>
+        <w:br/>
+        <w:t xml:space="preserve">               +------------------------------------------------+</w:t>
+      </w:r>
+    </w:p>
+    <w:p>
+      <w:pPr>
+        <w:spacing w:before="240" w:after="120"/>
+      </w:pPr>
+      <w:r>
+        <w:rPr>
+          <w:rFonts w:ascii="Arial" w:hAnsi="Arial"/>
+          <w:b/>
+          <w:color w:val="323232"/>
+          <w:sz w:val="23"/>
+        </w:rPr>
+        <w:t>3. Sơ đồ Lớp (Class Diagram)</w:t>
+      </w:r>
+    </w:p>
+    <w:p>
+      <w:pPr>
+        <w:spacing w:after="120" w:line="276" w:lineRule="auto"/>
+      </w:pPr>
+      <w:r>
+        <w:t>Mô tả mối quan hệ giữa các đối tượng Entity chính được quản lý bởi Entity Framework Core:</w:t>
+      </w:r>
+    </w:p>
+    <w:p>
+      <w:pPr>
+        <w:spacing w:before="120" w:after="120"/>
+        <w:ind w:left="576"/>
+      </w:pPr>
+      <w:r>
+        <w:rPr>
+          <w:rFonts w:ascii="Courier New" w:hAnsi="Courier New"/>
+          <w:color w:val="3C3C3C"/>
+          <w:sz w:val="18"/>
+        </w:rPr>
+        <w:t>+-------------------+        1      *        +---------------------+</w:t>
+        <w:br/>
+        <w:t>|      Station      |------------------------|        Device       |</w:t>
+        <w:br/>
+        <w:t>|-------------------|                        |---------------------|</w:t>
+        <w:br/>
+        <w:t>| + Id: Guid        |                        | + Id: Guid          |</w:t>
+        <w:br/>
+        <w:t>| + Code: string    |                        | + StationId: Guid   |</w:t>
+        <w:br/>
+        <w:t>| + Name: string    |                        | + Name: string      |</w:t>
+        <w:br/>
+        <w:t>| + Status: string  |                        | + Type: string      |</w:t>
+        <w:br/>
+        <w:t>|                   |                        | + Config: string    |</w:t>
+        <w:br/>
+        <w:t>+-------------------+                        | + IsOnline: bool    |</w:t>
+        <w:br/>
+        <w:t xml:space="preserve">          | 1                                +---------------------+</w:t>
+        <w:br/>
+        <w:t xml:space="preserve">          |                                             | 1</w:t>
+        <w:br/>
+        <w:t xml:space="preserve">          | *                                           |</w:t>
+        <w:br/>
+        <w:t>+-------------------+                                   | *</w:t>
+        <w:br/>
+        <w:t>|    SensorReading  |                                   |</w:t>
+        <w:br/>
+        <w:t>|-------------------|                                   |</w:t>
+        <w:br/>
+        <w:t>| + Id: int         |                                   |</w:t>
+        <w:br/>
+        <w:t>| + DeviceId: Guid  |&lt;----------------------------------+</w:t>
+        <w:br/>
+        <w:t>| + PointId: string |</w:t>
+        <w:br/>
+        <w:t>| + Value: double?  |</w:t>
+        <w:br/>
+        <w:t>| + Time: DateTime  |</w:t>
+        <w:br/>
+        <w:t>| + Quality: int    |</w:t>
+        <w:br/>
+        <w:t>+-------------------+</w:t>
+      </w:r>
+    </w:p>
+    <w:p>
+      <w:pPr>
+        <w:spacing w:before="240" w:after="120"/>
+      </w:pPr>
+      <w:r>
+        <w:rPr>
+          <w:rFonts w:ascii="Arial" w:hAnsi="Arial"/>
+          <w:b/>
+          <w:color w:val="323232"/>
+          <w:sz w:val="23"/>
+        </w:rPr>
+        <w:t>4. Sơ đồ Hoạt động (Activity Diagram)</w:t>
+      </w:r>
+    </w:p>
+    <w:p>
+      <w:pPr>
+        <w:spacing w:after="120" w:line="276" w:lineRule="auto"/>
+      </w:pPr>
+      <w:r>
+        <w:t xml:space="preserve">Mô tả quy trình </w:t>
+      </w:r>
+      <w:r>
+        <w:rPr>
+          <w:b/>
+        </w:rPr>
+        <w:t>Thu thập dữ liệu cảm biến tuần tự &amp; Đánh giá Cảnh báo tự động</w:t>
+      </w:r>
+      <w:r>
+        <w:t>:</w:t>
+      </w:r>
+    </w:p>
+    <w:p>
+      <w:pPr>
+        <w:spacing w:before="120" w:after="120"/>
+        <w:ind w:left="576"/>
+      </w:pPr>
+      <w:r>
+        <w:rPr>
+          <w:rFonts w:ascii="Courier New" w:hAnsi="Courier New"/>
+          <w:color w:val="3C3C3C"/>
+          <w:sz w:val="18"/>
+        </w:rPr>
+        <w:t xml:space="preserve">   [Bắt đầu chu kỳ lấy mẫu (1 giây)]</w:t>
+        <w:br/>
+        <w:t xml:space="preserve">                   |</w:t>
+        <w:br/>
+        <w:t xml:space="preserve">                   v</w:t>
+        <w:br/>
+        <w:t xml:space="preserve">       [Đọc dữ liệu từ S7/Modbus/Cam]</w:t>
+        <w:br/>
+        <w:t xml:space="preserve">                   |</w:t>
+        <w:br/>
+        <w:t xml:space="preserve">        /---------------------\</w:t>
+        <w:br/>
+        <w:t xml:space="preserve">       &lt; Kết nối thành công?   &gt;</w:t>
+        <w:br/>
+        <w:t xml:space="preserve">        \---------------------/</w:t>
+        <w:br/>
+        <w:t xml:space="preserve">          /                 \</w:t>
+        <w:br/>
+        <w:t xml:space="preserve">     (Có) /                 \ (Không)</w:t>
+        <w:br/>
+        <w:t xml:space="preserve">         v                   v</w:t>
+        <w:br/>
+        <w:t xml:space="preserve">  [Ghi nhận dữ liệu]    [Đánh dấu Offline]</w:t>
+        <w:br/>
+        <w:t xml:space="preserve">  [Quality = 1]         [Value = null, Quality = 2]</w:t>
+        <w:br/>
+        <w:t xml:space="preserve">         |                   |</w:t>
+        <w:br/>
+        <w:t xml:space="preserve">         +---------&gt;---------+</w:t>
+        <w:br/>
+        <w:t xml:space="preserve">                   |</w:t>
+        <w:br/>
+        <w:t xml:space="preserve">                   v</w:t>
+        <w:br/>
+        <w:t xml:space="preserve">     [Kiểm tra quy tắc cảnh báo (Rule Engine)]</w:t>
+        <w:br/>
+        <w:t xml:space="preserve">                   |</w:t>
+        <w:br/>
+        <w:t xml:space="preserve">        /---------------------\</w:t>
+        <w:br/>
+        <w:t xml:space="preserve">       &lt; Vượt ngưỡng cảnh báo? &gt;</w:t>
+        <w:br/>
+        <w:t xml:space="preserve">        \---------------------/</w:t>
+        <w:br/>
+        <w:t xml:space="preserve">          /                 \</w:t>
+        <w:br/>
+        <w:t xml:space="preserve">     (Có) /                 \ (Không)</w:t>
+        <w:br/>
+        <w:t xml:space="preserve">         v                   v</w:t>
+        <w:br/>
+        <w:t xml:space="preserve">  [Tạo Alert trong CSDL]  [Cập nhật trạng thái OK]</w:t>
+        <w:br/>
+        <w:t xml:space="preserve">  [Phát còi báo động]</w:t>
+        <w:br/>
+        <w:t xml:space="preserve">         |                   |</w:t>
+        <w:br/>
+        <w:t xml:space="preserve">         +---------&gt;---------+</w:t>
+        <w:br/>
+        <w:t xml:space="preserve">                   |</w:t>
+        <w:br/>
+        <w:t xml:space="preserve">                   v</w:t>
+        <w:br/>
+        <w:t xml:space="preserve">       [Push dữ liệu qua SignalR lên UI]</w:t>
+        <w:br/>
+        <w:t xml:space="preserve">       [Lưu dữ liệu lịch sử vào DB]</w:t>
+        <w:br/>
+        <w:t xml:space="preserve">                   |</w:t>
+        <w:br/>
+        <w:t xml:space="preserve">                   v</w:t>
+        <w:br/>
+        <w:t xml:space="preserve">             [Kết thúc chu kỳ]</w:t>
+      </w:r>
+    </w:p>
+    <w:p>
+      <w:pPr>
+        <w:spacing w:before="240" w:after="120"/>
+      </w:pPr>
+      <w:r>
+        <w:rPr>
+          <w:rFonts w:ascii="Arial" w:hAnsi="Arial"/>
+          <w:b/>
+          <w:color w:val="323232"/>
+          <w:sz w:val="23"/>
+        </w:rPr>
+        <w:t>5. Sơ đồ Trạng thái (State Diagram)</w:t>
+      </w:r>
+    </w:p>
+    <w:p>
+      <w:pPr>
+        <w:spacing w:after="120" w:line="276" w:lineRule="auto"/>
+      </w:pPr>
+      <w:r>
+        <w:t xml:space="preserve">Mô tả vòng đời và sự chuyển đổi trạng thái của </w:t>
+      </w:r>
+      <w:r>
+        <w:rPr>
+          <w:b/>
+        </w:rPr>
+        <w:t>Cảnh báo sự cố (Alert)</w:t>
+      </w:r>
+      <w:r>
+        <w:t>:</w:t>
+      </w:r>
+    </w:p>
+    <w:p>
+      <w:pPr>
+        <w:spacing w:before="120" w:after="120"/>
+        <w:ind w:left="576"/>
+      </w:pPr>
+      <w:r>
+        <w:rPr>
+          <w:rFonts w:ascii="Courier New" w:hAnsi="Courier New"/>
+          <w:color w:val="3C3C3C"/>
+          <w:sz w:val="18"/>
+        </w:rPr>
+        <w:t xml:space="preserve">           [Khởi tạo Quy tắc]</w:t>
+        <w:br/>
+        <w:t xml:space="preserve">                   |</w:t>
+        <w:br/>
+        <w:t xml:space="preserve">                   v</w:t>
+        <w:br/>
+        <w:t xml:space="preserve">    +------------------------------+</w:t>
+        <w:br/>
+        <w:t xml:space="preserve">    |           CHƯA KÍCH HOẠT     |</w:t>
+        <w:br/>
+        <w:t xml:space="preserve">    +------------------------------+</w:t>
+        <w:br/>
+        <w:t xml:space="preserve">                   |</w:t>
+        <w:br/>
+        <w:t xml:space="preserve">                   | Điều kiện cảnh báo thỏa mãn</w:t>
+        <w:br/>
+        <w:t xml:space="preserve">                   v</w:t>
+        <w:br/>
+        <w:t xml:space="preserve">    +------------------------------+</w:t>
+        <w:br/>
+        <w:t xml:space="preserve">    |             ACTIVE           |&lt;--------+</w:t>
+        <w:br/>
+        <w:t xml:space="preserve">    | (Nhấp nháy đỏ trên giao diện)|         | Sự cố lặp lại</w:t>
+        <w:br/>
+        <w:t xml:space="preserve">    +------------------------------+         |</w:t>
+        <w:br/>
+        <w:t xml:space="preserve">                   |                         |</w:t>
+        <w:br/>
+        <w:t xml:space="preserve">                   | Nhân viên nhấn Xác nhận |</w:t>
+        <w:br/>
+        <w:t xml:space="preserve">                   v                         |</w:t>
+        <w:br/>
+        <w:t xml:space="preserve">    +------------------------------+---------+</w:t>
+        <w:br/>
+        <w:t xml:space="preserve">    |          ACKNOWLEDGED        |</w:t>
+        <w:br/>
+        <w:t xml:space="preserve">    | (Ngừng nhấp nháy, ghi log)   |</w:t>
+        <w:br/>
+        <w:t xml:space="preserve">    +------------------------------+</w:t>
+        <w:br/>
+        <w:t xml:space="preserve">                   |</w:t>
+        <w:br/>
+        <w:t xml:space="preserve">                   | Giá trị đo lường về mức an toàn</w:t>
+        <w:br/>
+        <w:t xml:space="preserve">                   v</w:t>
+        <w:br/>
+        <w:t xml:space="preserve">    +------------------------------+</w:t>
+        <w:br/>
+        <w:t xml:space="preserve">    |            RESOLVED          |</w:t>
+        <w:br/>
+        <w:t xml:space="preserve">    |  (Lưu lịch sử, đóng sự cố)   |</w:t>
+        <w:br/>
+        <w:t xml:space="preserve">    +------------------------------+</w:t>
+      </w:r>
+    </w:p>
+    <w:p>
+      <w:pPr>
+        <w:spacing w:before="240" w:after="120"/>
+      </w:pPr>
+      <w:r>
+        <w:rPr>
+          <w:rFonts w:ascii="Arial" w:hAnsi="Arial"/>
+          <w:b/>
+          <w:color w:val="323232"/>
+          <w:sz w:val="23"/>
+        </w:rPr>
+        <w:t>6. Sơ đồ cơ sở dữ liệu chi tiết toàn bộ các bảng hệ thống</w:t>
+      </w:r>
+    </w:p>
+    <w:p>
+      <w:pPr>
+        <w:spacing w:after="120" w:line="276" w:lineRule="auto"/>
+      </w:pPr>
+      <w:r>
+        <w:t>Hệ thống quản lý dữ liệu thông qua cơ sở dữ liệu PostgreSQL gồm các bảng dữ liệu cốt lõi dưới đây:</w:t>
       </w:r>
     </w:p>
     <w:p>
@@ -8871,7 +9232,7 @@
           <w:color w:val="323232"/>
           <w:sz w:val="23"/>
         </w:rPr>
-        <w:t>1. Nhật ký lập trình (Commit Log / Git Log) chi tiết</w:t>
+        <w:t>1. Nhật ký lập trình (Commit Log / Git Log) toàn bộ dự án</w:t>
       </w:r>
     </w:p>
     <w:p>
@@ -8879,37 +9240,1911 @@
         <w:spacing w:after="120" w:line="276" w:lineRule="auto"/>
       </w:pPr>
       <w:r>
-        <w:t>Các thay đổi mã nguồn chính gần đây được đẩy lên kho lưu trữ để kiểm soát phiên bản:</w:t>
+        <w:t>Dưới đây là nhật ký đầy đủ tất cả các commit từ thời điểm khởi tạo monorepo đến phiên bản hiện tại v3.0.51:</w:t>
       </w:r>
     </w:p>
     <w:p>
       <w:pPr>
-        <w:spacing w:before="120" w:after="120"/>
-        <w:ind w:left="576"/>
-      </w:pPr>
+        <w:pStyle w:val="ListBullet"/>
+        <w:spacing w:after="40" w:before="0"/>
+      </w:pPr>
+      <w:r/>
       <w:r>
         <w:rPr>
-          <w:rFonts w:ascii="Courier New" w:hAnsi="Courier New"/>
-          <w:color w:val="3C3C3C"/>
-          <w:sz w:val="18"/>
+          <w:b/>
         </w:rPr>
-        <w:t>719d13a - chore: bump version to v3.0.51 and fix camera dropdown text visibility &amp; seed SVG path</w:t>
-        <w:br/>
-        <w:t>e1a0591 - chore: bump version to v3.0.50</w:t>
-        <w:br/>
-        <w:t>a51f2b8 - fix: instantiate builder with WebApplicationOptions to configure WebRootPath, avoiding NotSupportedException</w:t>
-        <w:br/>
-        <w:t>969adf6 - fix: set offline simulated values to null and quality to 2 to display ----- on UI</w:t>
-        <w:br/>
-        <w:t>ecebe38 - fix: redirect backend wwwroot to AppData to resolve write permissions error</w:t>
-        <w:br/>
-        <w:t>05389ab - fix: prevent sidebar theme selection popover text wrapping</w:t>
-        <w:br/>
-        <w:t>63ec2c6 - chore: license root configuration, sensor limit fixes, UI warnings removal, and bump version to v3.0.49</w:t>
-        <w:br/>
-        <w:t>8f583dc - fix: prevent local loops from resolving server_ip config in env.ts, and bump to v3.0.48</w:t>
-        <w:br/>
-        <w:t>a903a85 - fix: catch socket errors to prevent ECONNRESET crash and deduplicate service shutdown hooks, and bump to v3.0.47</w:t>
+        <w:t>`719d13a`</w:t>
+      </w:r>
+      <w:r>
+        <w:t xml:space="preserve"> - *kennhope13*: `chore: bump version to v3.0.51 and fix camera dropdown text visibility &amp; seed SVG path`</w:t>
+      </w:r>
+    </w:p>
+    <w:p>
+      <w:pPr>
+        <w:pStyle w:val="ListBullet"/>
+        <w:spacing w:after="40" w:before="0"/>
+      </w:pPr>
+      <w:r/>
+      <w:r>
+        <w:rPr>
+          <w:b/>
+        </w:rPr>
+        <w:t>`e1a0591`</w:t>
+      </w:r>
+      <w:r>
+        <w:t xml:space="preserve"> - *kennhope13*: `chore: bump version to v3.0.50`</w:t>
+      </w:r>
+    </w:p>
+    <w:p>
+      <w:pPr>
+        <w:pStyle w:val="ListBullet"/>
+        <w:spacing w:after="40" w:before="0"/>
+      </w:pPr>
+      <w:r/>
+      <w:r>
+        <w:rPr>
+          <w:b/>
+        </w:rPr>
+        <w:t>`a51f2b8`</w:t>
+      </w:r>
+      <w:r>
+        <w:t xml:space="preserve"> - *kennhope13*: `fix: instantiate builder with WebApplicationOptions to configure WebRootPath, avoiding NotSupportedException`</w:t>
+      </w:r>
+    </w:p>
+    <w:p>
+      <w:pPr>
+        <w:pStyle w:val="ListBullet"/>
+        <w:spacing w:after="40" w:before="0"/>
+      </w:pPr>
+      <w:r/>
+      <w:r>
+        <w:rPr>
+          <w:b/>
+        </w:rPr>
+        <w:t>`969adf6`</w:t>
+      </w:r>
+      <w:r>
+        <w:t xml:space="preserve"> - *kennhope13*: `fix: set offline simulated values to null and quality to 2 to display ----- on UI`</w:t>
+      </w:r>
+    </w:p>
+    <w:p>
+      <w:pPr>
+        <w:pStyle w:val="ListBullet"/>
+        <w:spacing w:after="40" w:before="0"/>
+      </w:pPr>
+      <w:r/>
+      <w:r>
+        <w:rPr>
+          <w:b/>
+        </w:rPr>
+        <w:t>`ecebe38`</w:t>
+      </w:r>
+      <w:r>
+        <w:t xml:space="preserve"> - *kennhope13*: `fix: redirect backend wwwroot to AppData to resolve write permissions error`</w:t>
+      </w:r>
+    </w:p>
+    <w:p>
+      <w:pPr>
+        <w:pStyle w:val="ListBullet"/>
+        <w:spacing w:after="40" w:before="0"/>
+      </w:pPr>
+      <w:r/>
+      <w:r>
+        <w:rPr>
+          <w:b/>
+        </w:rPr>
+        <w:t>`05389ab`</w:t>
+      </w:r>
+      <w:r>
+        <w:t xml:space="preserve"> - *kennhope13*: `fix: prevent sidebar theme selection popover text wrapping`</w:t>
+      </w:r>
+    </w:p>
+    <w:p>
+      <w:pPr>
+        <w:pStyle w:val="ListBullet"/>
+        <w:spacing w:after="40" w:before="0"/>
+      </w:pPr>
+      <w:r/>
+      <w:r>
+        <w:rPr>
+          <w:b/>
+        </w:rPr>
+        <w:t>`63ec2c6`</w:t>
+      </w:r>
+      <w:r>
+        <w:t xml:space="preserve"> - *kennhope13*: `chore: license root configuration, sensor limit fixes, UI warnings removal, and bump version to v3.0.49`</w:t>
+      </w:r>
+    </w:p>
+    <w:p>
+      <w:pPr>
+        <w:pStyle w:val="ListBullet"/>
+        <w:spacing w:after="40" w:before="0"/>
+      </w:pPr>
+      <w:r/>
+      <w:r>
+        <w:rPr>
+          <w:b/>
+        </w:rPr>
+        <w:t>`8f583dc`</w:t>
+      </w:r>
+      <w:r>
+        <w:t xml:space="preserve"> - *kennhope13*: `fix: prevent local loops from resolving server_ip config in env.ts, and bump to v3.0.48`</w:t>
+      </w:r>
+    </w:p>
+    <w:p>
+      <w:pPr>
+        <w:pStyle w:val="ListBullet"/>
+        <w:spacing w:after="40" w:before="0"/>
+      </w:pPr>
+      <w:r/>
+      <w:r>
+        <w:rPr>
+          <w:b/>
+        </w:rPr>
+        <w:t>`a903a85`</w:t>
+      </w:r>
+      <w:r>
+        <w:t xml:space="preserve"> - *kennhope13*: `fix: catch socket errors to prevent ECONNRESET crash and deduplicate service shutdown hooks, and bump to v3.0.47`</w:t>
+      </w:r>
+    </w:p>
+    <w:p>
+      <w:pPr>
+        <w:pStyle w:val="ListBullet"/>
+        <w:spacing w:after="40" w:before="0"/>
+      </w:pPr>
+      <w:r/>
+      <w:r>
+        <w:rPr>
+          <w:b/>
+        </w:rPr>
+        <w:t>`87ab8bc`</w:t>
+      </w:r>
+      <w:r>
+        <w:t xml:space="preserve"> - *kennhope13*: `feat: ignore localhost/127.0.0.1 in getTargetHostname, proxy /sld/ requests, and bump to v3.0.46`</w:t>
+      </w:r>
+    </w:p>
+    <w:p>
+      <w:pPr>
+        <w:pStyle w:val="ListBullet"/>
+        <w:spacing w:after="40" w:before="0"/>
+      </w:pPr>
+      <w:r/>
+      <w:r>
+        <w:rPr>
+          <w:b/>
+        </w:rPr>
+        <w:t>`1d0372c`</w:t>
+      </w:r>
+      <w:r>
+        <w:t xml:space="preserve"> - *kennhope13*: `feat: shut down postgres and backend on exit, retain go2rtc in background, and bump to v3.0.45`</w:t>
+      </w:r>
+    </w:p>
+    <w:p>
+      <w:pPr>
+        <w:pStyle w:val="ListBullet"/>
+        <w:spacing w:after="40" w:before="0"/>
+      </w:pPr>
+      <w:r/>
+      <w:r>
+        <w:rPr>
+          <w:b/>
+        </w:rPr>
+        <w:t>`3d6c068`</w:t>
+      </w:r>
+      <w:r>
+        <w:t xml:space="preserve"> - *kennhope13*: `chore: stabilize SignalR connection using relative proxy and bump to v3.0.44`</w:t>
+      </w:r>
+    </w:p>
+    <w:p>
+      <w:pPr>
+        <w:pStyle w:val="ListBullet"/>
+        <w:spacing w:after="40" w:before="0"/>
+      </w:pPr>
+      <w:r/>
+      <w:r>
+        <w:rPr>
+          <w:b/>
+        </w:rPr>
+        <w:t>`a12493c`</w:t>
+      </w:r>
+      <w:r>
+        <w:t xml:space="preserve"> - *kennhope13*: `fix: removed using on GetDbConnection which caused EF Core connection disposal and hanging`</w:t>
+      </w:r>
+    </w:p>
+    <w:p>
+      <w:pPr>
+        <w:pStyle w:val="ListBullet"/>
+        <w:spacing w:after="40" w:before="0"/>
+      </w:pPr>
+      <w:r/>
+      <w:r>
+        <w:rPr>
+          <w:b/>
+        </w:rPr>
+        <w:t>`6208d64`</w:t>
+      </w:r>
+      <w:r>
+        <w:t xml:space="preserve"> - *kennhope13*: `chore: silence EF Core TimescaleDB fake errors to avoid confusing users`</w:t>
+      </w:r>
+    </w:p>
+    <w:p>
+      <w:pPr>
+        <w:pStyle w:val="ListBullet"/>
+        <w:spacing w:after="40" w:before="0"/>
+      </w:pPr>
+      <w:r/>
+      <w:r>
+        <w:rPr>
+          <w:b/>
+        </w:rPr>
+        <w:t>`02a063b`</w:t>
+      </w:r>
+      <w:r>
+        <w:t xml:space="preserve"> - *kennhope13*: `chore: default installer to perMachine and bump version to 3.0.41`</w:t>
+      </w:r>
+    </w:p>
+    <w:p>
+      <w:pPr>
+        <w:pStyle w:val="ListBullet"/>
+        <w:spacing w:after="40" w:before="0"/>
+      </w:pPr>
+      <w:r/>
+      <w:r>
+        <w:rPr>
+          <w:b/>
+        </w:rPr>
+        <w:t>`01a675c`</w:t>
+      </w:r>
+      <w:r>
+        <w:t xml:space="preserve"> - *kennhope13*: `chore: bump version to 3.0.40 and fix postgres restart issue`</w:t>
+      </w:r>
+    </w:p>
+    <w:p>
+      <w:pPr>
+        <w:pStyle w:val="ListBullet"/>
+        <w:spacing w:after="40" w:before="0"/>
+      </w:pPr>
+      <w:r/>
+      <w:r>
+        <w:rPr>
+          <w:b/>
+        </w:rPr>
+        <w:t>`71898c8`</w:t>
+      </w:r>
+      <w:r>
+        <w:t xml:space="preserve"> - *kennhope13*: `fix(backend): fix compiler error in AuthController from LicenseService async refactor`</w:t>
+      </w:r>
+    </w:p>
+    <w:p>
+      <w:pPr>
+        <w:pStyle w:val="ListBullet"/>
+        <w:spacing w:after="40" w:before="0"/>
+      </w:pPr>
+      <w:r/>
+      <w:r>
+        <w:rPr>
+          <w:b/>
+        </w:rPr>
+        <w:t>`9ed842e`</w:t>
+      </w:r>
+      <w:r>
+        <w:t xml:space="preserve"> - *kennhope13*: `fix(backend): Resolve SignalR connection timeouts by eliminating ThreadPool starvation in LicenseService; disable CentralSync polling by default`</w:t>
+      </w:r>
+    </w:p>
+    <w:p>
+      <w:pPr>
+        <w:pStyle w:val="ListBullet"/>
+        <w:spacing w:after="40" w:before="0"/>
+      </w:pPr>
+      <w:r/>
+      <w:r>
+        <w:rPr>
+          <w:b/>
+        </w:rPr>
+        <w:t>`4f6f97f`</w:t>
+      </w:r>
+      <w:r>
+        <w:t xml:space="preserve"> - *kennhope13*: `chore: release v3.0.37 with latest fixes`</w:t>
+      </w:r>
+    </w:p>
+    <w:p>
+      <w:pPr>
+        <w:pStyle w:val="ListBullet"/>
+        <w:spacing w:after="40" w:before="0"/>
+      </w:pPr>
+      <w:r/>
+      <w:r>
+        <w:rPr>
+          <w:b/>
+        </w:rPr>
+        <w:t>`43a6e7e`</w:t>
+      </w:r>
+      <w:r>
+        <w:t xml:space="preserve"> - *kennhope13*: `fix(realtime): use shared SignalR hub to prevent concurrent negotiate timeouts and session dropping`</w:t>
+      </w:r>
+    </w:p>
+    <w:p>
+      <w:pPr>
+        <w:pStyle w:val="ListBullet"/>
+        <w:spacing w:after="40" w:before="0"/>
+      </w:pPr>
+      <w:r/>
+      <w:r>
+        <w:rPr>
+          <w:b/>
+        </w:rPr>
+        <w:t>`25fea65`</w:t>
+      </w:r>
+      <w:r>
+        <w:t xml:space="preserve"> - *kennhope13*: `style(license): center license limit boxes by using 2-column grid`</w:t>
+      </w:r>
+    </w:p>
+    <w:p>
+      <w:pPr>
+        <w:pStyle w:val="ListBullet"/>
+        <w:spacing w:after="40" w:before="0"/>
+      </w:pPr>
+      <w:r/>
+      <w:r>
+        <w:rPr>
+          <w:b/>
+        </w:rPr>
+        <w:t>`9c11cc1`</w:t>
+      </w:r>
+      <w:r>
+        <w:t xml:space="preserve"> - *kennhope13*: `feat(license): hide station limit item from LicensePage`</w:t>
+      </w:r>
+    </w:p>
+    <w:p>
+      <w:pPr>
+        <w:pStyle w:val="ListBullet"/>
+        <w:spacing w:after="40" w:before="0"/>
+      </w:pPr>
+      <w:r/>
+      <w:r>
+        <w:rPr>
+          <w:b/>
+        </w:rPr>
+        <w:t>`fd7789c`</w:t>
+      </w:r>
+      <w:r>
+        <w:t xml:space="preserve"> - *kennhope13*: `fix(thermal,startup): resolve thermal UnboundLocalError and reuse running background services on app reopen`</w:t>
+      </w:r>
+    </w:p>
+    <w:p>
+      <w:pPr>
+        <w:pStyle w:val="ListBullet"/>
+        <w:spacing w:after="40" w:before="0"/>
+      </w:pPr>
+      <w:r/>
+      <w:r>
+        <w:rPr>
+          <w:b/>
+        </w:rPr>
+        <w:t>`a8206b7`</w:t>
+      </w:r>
+      <w:r>
+        <w:t xml:space="preserve"> - *kennhope13*: `Keep services running on close, watch backend health, bump to 3.0.32`</w:t>
+      </w:r>
+    </w:p>
+    <w:p>
+      <w:pPr>
+        <w:pStyle w:val="ListBullet"/>
+        <w:spacing w:after="40" w:before="0"/>
+      </w:pPr>
+      <w:r/>
+      <w:r>
+        <w:rPr>
+          <w:b/>
+        </w:rPr>
+        <w:t>`d6caf3c`</w:t>
+      </w:r>
+      <w:r>
+        <w:t xml:space="preserve"> - *kennhope13*: `Bump version to 3.0.31`</w:t>
+      </w:r>
+    </w:p>
+    <w:p>
+      <w:pPr>
+        <w:pStyle w:val="ListBullet"/>
+        <w:spacing w:after="40" w:before="0"/>
+      </w:pPr>
+      <w:r/>
+      <w:r>
+        <w:rPr>
+          <w:b/>
+        </w:rPr>
+        <w:t>`8dd7bd5`</w:t>
+      </w:r>
+      <w:r>
+        <w:t xml:space="preserve"> - *kennhope13*: `Keep services running in background on app close - instant relaunch`</w:t>
+      </w:r>
+    </w:p>
+    <w:p>
+      <w:pPr>
+        <w:pStyle w:val="ListBullet"/>
+        <w:spacing w:after="40" w:before="0"/>
+      </w:pPr>
+      <w:r/>
+      <w:r>
+        <w:rPr>
+          <w:b/>
+        </w:rPr>
+        <w:t>`2fc4b23`</w:t>
+      </w:r>
+      <w:r>
+        <w:t xml:space="preserve"> - *kennhope13*: `Fix startup race: health returns 503 until DB ready, bump v3.0.30`</w:t>
+      </w:r>
+    </w:p>
+    <w:p>
+      <w:pPr>
+        <w:pStyle w:val="ListBullet"/>
+        <w:spacing w:after="40" w:before="0"/>
+      </w:pPr>
+      <w:r/>
+      <w:r>
+        <w:rPr>
+          <w:b/>
+        </w:rPr>
+        <w:t>`d927859`</w:t>
+      </w:r>
+      <w:r>
+        <w:t xml:space="preserve"> - *kennhope13*: `Fix Windows zombie backend and port 5000, bump version to 3.0.30`</w:t>
+      </w:r>
+    </w:p>
+    <w:p>
+      <w:pPr>
+        <w:pStyle w:val="ListBullet"/>
+        <w:spacing w:after="40" w:before="0"/>
+      </w:pPr>
+      <w:r/>
+      <w:r>
+        <w:rPr>
+          <w:b/>
+        </w:rPr>
+        <w:t>`a7d9cfc`</w:t>
+      </w:r>
+      <w:r>
+        <w:t xml:space="preserve"> - *kennhope13*: `Fix license flat payload validation, revert port to 5000, and remove postgres pid on Windows restart`</w:t>
+      </w:r>
+    </w:p>
+    <w:p>
+      <w:pPr>
+        <w:pStyle w:val="ListBullet"/>
+        <w:spacing w:after="40" w:before="0"/>
+      </w:pPr>
+      <w:r/>
+      <w:r>
+        <w:rPr>
+          <w:b/>
+        </w:rPr>
+        <w:t>`47a71bb`</w:t>
+      </w:r>
+      <w:r>
+        <w:t xml:space="preserve"> - *kennhope13*: `fix(workflow): sync VITE_API_URL to 5050 in github actions`</w:t>
+      </w:r>
+    </w:p>
+    <w:p>
+      <w:pPr>
+        <w:pStyle w:val="ListBullet"/>
+        <w:spacing w:after="40" w:before="0"/>
+      </w:pPr>
+      <w:r/>
+      <w:r>
+        <w:rPr>
+          <w:b/>
+        </w:rPr>
+        <w:t>`ec14139`</w:t>
+      </w:r>
+      <w:r>
+        <w:t xml:space="preserve"> - *kennhope13*: `fix(desktop): change backend port from 5000 to 5050 to resolve silent background port collision on second run`</w:t>
+      </w:r>
+    </w:p>
+    <w:p>
+      <w:pPr>
+        <w:pStyle w:val="ListBullet"/>
+        <w:spacing w:after="40" w:before="0"/>
+      </w:pPr>
+      <w:r/>
+      <w:r>
+        <w:rPr>
+          <w:b/>
+        </w:rPr>
+        <w:t>`9096a82`</w:t>
+      </w:r>
+      <w:r>
+        <w:t xml:space="preserve"> - *kennhope13*: `fix: read platform and machineGuid in flat license parsing`</w:t>
+      </w:r>
+    </w:p>
+    <w:p>
+      <w:pPr>
+        <w:pStyle w:val="ListBullet"/>
+        <w:spacing w:after="40" w:before="0"/>
+      </w:pPr>
+      <w:r/>
+      <w:r>
+        <w:rPr>
+          <w:b/>
+        </w:rPr>
+        <w:t>`969a655`</w:t>
+      </w:r>
+      <w:r>
+        <w:t xml:space="preserve"> - *kennhope13*: `fix: db initialization transaction aborted error and license macAddress support`</w:t>
+      </w:r>
+    </w:p>
+    <w:p>
+      <w:pPr>
+        <w:pStyle w:val="ListBullet"/>
+        <w:spacing w:after="40" w:before="0"/>
+      </w:pPr>
+      <w:r/>
+      <w:r>
+        <w:rPr>
+          <w:b/>
+        </w:rPr>
+        <w:t>`acab09c`</w:t>
+      </w:r>
+      <w:r>
+        <w:t xml:space="preserve"> - *kennhope13*: `fix: auto cleanup zombie processes and handle 42P07 db migration conflict`</w:t>
+      </w:r>
+    </w:p>
+    <w:p>
+      <w:pPr>
+        <w:pStyle w:val="ListBullet"/>
+        <w:spacing w:after="40" w:before="0"/>
+      </w:pPr>
+      <w:r/>
+      <w:r>
+        <w:rPr>
+          <w:b/>
+        </w:rPr>
+        <w:t>`16af573`</w:t>
+      </w:r>
+      <w:r>
+        <w:t xml:space="preserve"> - *kennhope13*: `Fix hardware match failure due to special characters like dots and commas on Windows`</w:t>
+      </w:r>
+    </w:p>
+    <w:p>
+      <w:pPr>
+        <w:pStyle w:val="ListBullet"/>
+        <w:spacing w:after="40" w:before="0"/>
+      </w:pPr>
+      <w:r/>
+      <w:r>
+        <w:rPr>
+          <w:b/>
+        </w:rPr>
+        <w:t>`67bf4ee`</w:t>
+      </w:r>
+      <w:r>
+        <w:t xml:space="preserve"> - *kennhope13*: `Fix hardware_mismatch caused by Fingerprint check on Windows`</w:t>
+      </w:r>
+    </w:p>
+    <w:p>
+      <w:pPr>
+        <w:pStyle w:val="ListBullet"/>
+        <w:spacing w:after="40" w:before="0"/>
+      </w:pPr>
+      <w:r/>
+      <w:r>
+        <w:rPr>
+          <w:b/>
+        </w:rPr>
+        <w:t>`5a7fa2b`</w:t>
+      </w:r>
+      <w:r>
+        <w:t xml:space="preserve"> - *kennhope13*: `Fix CS0136 compile error in LicenseService after merge and bump version to 3.0.22`</w:t>
+      </w:r>
+    </w:p>
+    <w:p>
+      <w:pPr>
+        <w:pStyle w:val="ListBullet"/>
+        <w:spacing w:after="40" w:before="0"/>
+      </w:pPr>
+      <w:r/>
+      <w:r>
+        <w:rPr>
+          <w:b/>
+        </w:rPr>
+        <w:t>`5a51627`</w:t>
+      </w:r>
+      <w:r>
+        <w:t xml:space="preserve"> - *kennhope13*: `Bump version to 3.0.21`</w:t>
+      </w:r>
+    </w:p>
+    <w:p>
+      <w:pPr>
+        <w:pStyle w:val="ListBullet"/>
+        <w:spacing w:after="40" w:before="0"/>
+      </w:pPr>
+      <w:r/>
+      <w:r>
+        <w:rPr>
+          <w:b/>
+        </w:rPr>
+        <w:t>`e8e1be7`</w:t>
+      </w:r>
+      <w:r>
+        <w:t xml:space="preserve"> - *kennhope13*: `Merge license fixes and thermal camera fixes`</w:t>
+      </w:r>
+    </w:p>
+    <w:p>
+      <w:pPr>
+        <w:pStyle w:val="ListBullet"/>
+        <w:spacing w:after="40" w:before="0"/>
+      </w:pPr>
+      <w:r/>
+      <w:r>
+        <w:rPr>
+          <w:b/>
+        </w:rPr>
+        <w:t>`dc4784d`</w:t>
+      </w:r>
+      <w:r>
+        <w:t xml:space="preserve"> - *kennhope13*: `Bump version to 3.0.20`</w:t>
+      </w:r>
+    </w:p>
+    <w:p>
+      <w:pPr>
+        <w:pStyle w:val="ListBullet"/>
+        <w:spacing w:after="40" w:before="0"/>
+      </w:pPr>
+      <w:r/>
+      <w:r>
+        <w:rPr>
+          <w:b/>
+        </w:rPr>
+        <w:t>`b0133b0`</w:t>
+      </w:r>
+      <w:r>
+        <w:t xml:space="preserve"> - *Admin*: `Fix compiler errors and unused imports in frontend`</w:t>
+      </w:r>
+    </w:p>
+    <w:p>
+      <w:pPr>
+        <w:pStyle w:val="ListBullet"/>
+        <w:spacing w:after="40" w:before="0"/>
+      </w:pPr>
+      <w:r/>
+      <w:r>
+        <w:rPr>
+          <w:b/>
+        </w:rPr>
+        <w:t>`963f51e`</w:t>
+      </w:r>
+      <w:r>
+        <w:t xml:space="preserve"> - *Admin*: `Merge branch 'backup-xem-ai-detect-changes' to restore uncommitted local changes and resolve conflicts`</w:t>
+      </w:r>
+    </w:p>
+    <w:p>
+      <w:pPr>
+        <w:pStyle w:val="ListBullet"/>
+        <w:spacing w:after="40" w:before="0"/>
+      </w:pPr>
+      <w:r/>
+      <w:r>
+        <w:rPr>
+          <w:b/>
+        </w:rPr>
+        <w:t>`55b97cd`</w:t>
+      </w:r>
+      <w:r>
+        <w:t xml:space="preserve"> - *Admin*: `Backup local uncommitted changes before merging thermal-forecast`</w:t>
+      </w:r>
+    </w:p>
+    <w:p>
+      <w:pPr>
+        <w:pStyle w:val="ListBullet"/>
+        <w:spacing w:after="40" w:before="0"/>
+      </w:pPr>
+      <w:r/>
+      <w:r>
+        <w:rPr>
+          <w:b/>
+        </w:rPr>
+        <w:t>`ab84315`</w:t>
+      </w:r>
+      <w:r>
+        <w:t xml:space="preserve"> - *kennhope13*: `feat: implement 5-minute thermal forecasting data synchronization and partner Jetson push`</w:t>
+      </w:r>
+    </w:p>
+    <w:p>
+      <w:pPr>
+        <w:pStyle w:val="ListBullet"/>
+        <w:spacing w:after="40" w:before="0"/>
+      </w:pPr>
+      <w:r/>
+      <w:r>
+        <w:rPr>
+          <w:b/>
+        </w:rPr>
+        <w:t>`46cf91a`</w:t>
+      </w:r>
+      <w:r>
+        <w:t xml:space="preserve"> - *kennhope13*: `feat: integrate Jetson Orin Nano AI Person Detection webhook and enable LAN connection binding on port 5000`</w:t>
+      </w:r>
+    </w:p>
+    <w:p>
+      <w:pPr>
+        <w:pStyle w:val="ListBullet"/>
+        <w:spacing w:after="40" w:before="0"/>
+      </w:pPr>
+      <w:r/>
+      <w:r>
+        <w:rPr>
+          <w:b/>
+        </w:rPr>
+        <w:t>`63eeadf`</w:t>
+      </w:r>
+      <w:r>
+        <w:t xml:space="preserve"> - *Admin*: `feat: implement system-wide toast notification UI and update visual styles for page headers and user actions`</w:t>
+      </w:r>
+    </w:p>
+    <w:p>
+      <w:pPr>
+        <w:pStyle w:val="ListBullet"/>
+        <w:spacing w:after="40" w:before="0"/>
+      </w:pPr>
+      <w:r/>
+      <w:r>
+        <w:rPr>
+          <w:b/>
+        </w:rPr>
+        <w:t>`59ff9a9`</w:t>
+      </w:r>
+      <w:r>
+        <w:t xml:space="preserve"> - *Admin*: `feat: restore PD camera region drawing interface and realtime warning log panel`</w:t>
+      </w:r>
+    </w:p>
+    <w:p>
+      <w:pPr>
+        <w:pStyle w:val="ListBullet"/>
+        <w:spacing w:after="40" w:before="0"/>
+      </w:pPr>
+      <w:r/>
+      <w:r>
+        <w:rPr>
+          <w:b/>
+        </w:rPr>
+        <w:t>`ebc9dc2`</w:t>
+      </w:r>
+      <w:r>
+        <w:t xml:space="preserve"> - *Admin*: `style: compact all page toolbar headers globally - remove scroll, reduce heights/gaps/fonts for single-row layout`</w:t>
+      </w:r>
+    </w:p>
+    <w:p>
+      <w:pPr>
+        <w:pStyle w:val="ListBullet"/>
+        <w:spacing w:after="40" w:before="0"/>
+      </w:pPr>
+      <w:r/>
+      <w:r>
+        <w:rPr>
+          <w:b/>
+        </w:rPr>
+        <w:t>`a0a9c8c`</w:t>
+      </w:r>
+      <w:r>
+        <w:t xml:space="preserve"> - *Admin*: `style: remove hardcoded 270px from KpiCards and CameraGrid, compact fonts/padding, fully fluid width`</w:t>
+      </w:r>
+    </w:p>
+    <w:p>
+      <w:pPr>
+        <w:pStyle w:val="ListBullet"/>
+        <w:spacing w:after="40" w:before="0"/>
+      </w:pPr>
+      <w:r/>
+      <w:r>
+        <w:rPr>
+          <w:b/>
+        </w:rPr>
+        <w:t>`a47fc7a`</w:t>
+      </w:r>
+      <w:r>
+        <w:t xml:space="preserve"> - *Admin*: `style: refactor CabinetAnalyticsTab layout from fixed 420px to fluid percentage-based scaling with bounds`</w:t>
+      </w:r>
+    </w:p>
+    <w:p>
+      <w:pPr>
+        <w:pStyle w:val="ListBullet"/>
+        <w:spacing w:after="40" w:before="0"/>
+      </w:pPr>
+      <w:r/>
+      <w:r>
+        <w:rPr>
+          <w:b/>
+        </w:rPr>
+        <w:t>`98335ed`</w:t>
+      </w:r>
+      <w:r>
+        <w:t xml:space="preserve"> - *Admin*: `style: optimize DashboardPage layout with fluid percentage-based widths and add settings gear toggle to DashboardToolbar`</w:t>
+      </w:r>
+    </w:p>
+    <w:p>
+      <w:pPr>
+        <w:pStyle w:val="ListBullet"/>
+        <w:spacing w:after="40" w:before="0"/>
+      </w:pPr>
+      <w:r/>
+      <w:r>
+        <w:rPr>
+          <w:b/>
+        </w:rPr>
+        <w:t>`f175e65`</w:t>
+      </w:r>
+      <w:r>
+        <w:t xml:space="preserve"> - *Admin*: `style: implement responsive compact Option 1 toolbar styling globally to prevent overflow`</w:t>
+      </w:r>
+    </w:p>
+    <w:p>
+      <w:pPr>
+        <w:pStyle w:val="ListBullet"/>
+        <w:spacing w:after="40" w:before="0"/>
+      </w:pPr>
+      <w:r/>
+      <w:r>
+        <w:rPr>
+          <w:b/>
+        </w:rPr>
+        <w:t>`7c22bc1`</w:t>
+      </w:r>
+      <w:r>
+        <w:t xml:space="preserve"> - *Admin*: `style: optimize DeviceManagementPage UI by using ActionDropdown for table rows and enabling flex-wrap for toolbar rows to prevent overflow`</w:t>
+      </w:r>
+    </w:p>
+    <w:p>
+      <w:pPr>
+        <w:pStyle w:val="ListBullet"/>
+        <w:spacing w:after="40" w:before="0"/>
+      </w:pPr>
+      <w:r/>
+      <w:r>
+        <w:rPr>
+          <w:b/>
+        </w:rPr>
+        <w:t>`c4da78e`</w:t>
+      </w:r>
+      <w:r>
+        <w:t xml:space="preserve"> - *Admin*: `fix: restrict PD alerts to within-region hotspots exceeding warning/alarm thresholds, and upgrade region alert to multipart snapshot uploads`</w:t>
+      </w:r>
+    </w:p>
+    <w:p>
+      <w:pPr>
+        <w:pStyle w:val="ListBullet"/>
+        <w:spacing w:after="40" w:before="0"/>
+      </w:pPr>
+      <w:r/>
+      <w:r>
+        <w:rPr>
+          <w:b/>
+        </w:rPr>
+        <w:t>`faa8e33`</w:t>
+      </w:r>
+      <w:r>
+        <w:t xml:space="preserve"> - *Admin*: `feat: take annotated camera snapshot on PD alert and upload to backend webhook`</w:t>
+      </w:r>
+    </w:p>
+    <w:p>
+      <w:pPr>
+        <w:pStyle w:val="ListBullet"/>
+        <w:spacing w:after="40" w:before="0"/>
+      </w:pPr>
+      <w:r/>
+      <w:r>
+        <w:rPr>
+          <w:b/>
+        </w:rPr>
+        <w:t>`42e3511`</w:t>
+      </w:r>
+      <w:r>
+        <w:t xml:space="preserve"> - *Admin*: `feat: integrate global SignalR AlertNew toast and floating RichAlertModal for thermal hotspot, fire, intrusion, and PD`</w:t>
+      </w:r>
+    </w:p>
+    <w:p>
+      <w:pPr>
+        <w:pStyle w:val="ListBullet"/>
+        <w:spacing w:after="40" w:before="0"/>
+      </w:pPr>
+      <w:r/>
+      <w:r>
+        <w:rPr>
+          <w:b/>
+        </w:rPr>
+        <w:t>`e88b482`</w:t>
+      </w:r>
+      <w:r>
+        <w:t xml:space="preserve"> - *Admin*: `fix: stage CameraHandlers changes to align with updated DeviceService`</w:t>
+      </w:r>
+    </w:p>
+    <w:p>
+      <w:pPr>
+        <w:pStyle w:val="ListBullet"/>
+        <w:spacing w:after="40" w:before="0"/>
+      </w:pPr>
+      <w:r/>
+      <w:r>
+        <w:rPr>
+          <w:b/>
+        </w:rPr>
+        <w:t>`e9cdac6`</w:t>
+      </w:r>
+      <w:r>
+        <w:t xml:space="preserve"> - *Admin*: `fix: keep user in active camera config on save and render both thermal roi and pd boundaries on realtime overlays`</w:t>
+      </w:r>
+    </w:p>
+    <w:p>
+      <w:pPr>
+        <w:pStyle w:val="ListBullet"/>
+        <w:spacing w:after="40" w:before="0"/>
+      </w:pPr>
+      <w:r/>
+      <w:r>
+        <w:rPr>
+          <w:b/>
+        </w:rPr>
+        <w:t>`ea9494f`</w:t>
+      </w:r>
+      <w:r>
+        <w:t xml:space="preserve"> - *Admin*: `fix: restore missing backend service methods and correct vite local proxy configuration`</w:t>
+      </w:r>
+    </w:p>
+    <w:p>
+      <w:pPr>
+        <w:pStyle w:val="ListBullet"/>
+        <w:spacing w:after="40" w:before="0"/>
+      </w:pPr>
+      <w:r/>
+      <w:r>
+        <w:rPr>
+          <w:b/>
+        </w:rPr>
+        <w:t>`9cf6d2c`</w:t>
+      </w:r>
+      <w:r>
+        <w:t xml:space="preserve"> - *Admin*: `fix: resolve frontend typescript compile and build errors for thermal ROI and PD integration`</w:t>
+      </w:r>
+    </w:p>
+    <w:p>
+      <w:pPr>
+        <w:pStyle w:val="ListBullet"/>
+        <w:spacing w:after="40" w:before="0"/>
+      </w:pPr>
+      <w:r/>
+      <w:r>
+        <w:rPr>
+          <w:b/>
+        </w:rPr>
+        <w:t>`4887909`</w:t>
+      </w:r>
+      <w:r>
+        <w:t xml:space="preserve"> - *Admin*: `merge: integrate thermal ROI polygon optimization and acoustic PD monitoring features`</w:t>
+      </w:r>
+    </w:p>
+    <w:p>
+      <w:pPr>
+        <w:pStyle w:val="ListBullet"/>
+        <w:spacing w:after="40" w:before="0"/>
+      </w:pPr>
+      <w:r/>
+      <w:r>
+        <w:rPr>
+          <w:b/>
+        </w:rPr>
+        <w:t>`0ec88df`</w:t>
+      </w:r>
+      <w:r>
+        <w:t xml:space="preserve"> - *Admin*: `update-phongdien`</w:t>
+      </w:r>
+    </w:p>
+    <w:p>
+      <w:pPr>
+        <w:pStyle w:val="ListBullet"/>
+        <w:spacing w:after="40" w:before="0"/>
+      </w:pPr>
+      <w:r/>
+      <w:r>
+        <w:rPr>
+          <w:b/>
+        </w:rPr>
+        <w:t>`8d8e039`</w:t>
+      </w:r>
+      <w:r>
+        <w:t xml:space="preserve"> - *kennhope13*: `feat: thermal roi polygon optimization and repository cleanup`</w:t>
+      </w:r>
+    </w:p>
+    <w:p>
+      <w:pPr>
+        <w:pStyle w:val="ListBullet"/>
+        <w:spacing w:after="40" w:before="0"/>
+      </w:pPr>
+      <w:r/>
+      <w:r>
+        <w:rPr>
+          <w:b/>
+        </w:rPr>
+        <w:t>`a1758a3`</w:t>
+      </w:r>
+      <w:r>
+        <w:t xml:space="preserve"> - *Admin*: `feat: optimize PD Monitor UI and silence engine error logs`</w:t>
+      </w:r>
+    </w:p>
+    <w:p>
+      <w:pPr>
+        <w:pStyle w:val="ListBullet"/>
+        <w:spacing w:after="40" w:before="0"/>
+      </w:pPr>
+      <w:r/>
+      <w:r>
+        <w:rPr>
+          <w:b/>
+        </w:rPr>
+        <w:t>`bff1607`</w:t>
+      </w:r>
+      <w:r>
+        <w:t xml:space="preserve"> - *kennhope13*: `feat: optimize thermal monitoring region boundaries scaling and restore realtime point monitoring`</w:t>
+      </w:r>
+    </w:p>
+    <w:p>
+      <w:pPr>
+        <w:pStyle w:val="ListBullet"/>
+        <w:spacing w:after="40" w:before="0"/>
+      </w:pPr>
+      <w:r/>
+      <w:r>
+        <w:rPr>
+          <w:b/>
+        </w:rPr>
+        <w:t>`d3ecd2d`</w:t>
+      </w:r>
+      <w:r>
+        <w:t xml:space="preserve"> - *metorkhai*: `feat: Restore Dual-Lens picking logic and fix thermal camera DB seeding`</w:t>
+      </w:r>
+    </w:p>
+    <w:p>
+      <w:pPr>
+        <w:pStyle w:val="ListBullet"/>
+        <w:spacing w:after="40" w:before="0"/>
+      </w:pPr>
+      <w:r/>
+      <w:r>
+        <w:rPr>
+          <w:b/>
+        </w:rPr>
+        <w:t>`65ce22d`</w:t>
+      </w:r>
+      <w:r>
+        <w:t xml:space="preserve"> - *Admin*: `feat(relay,backend,frontend): optimize thermal readings, skip PD prediction ingest, and seed rules P11-P20`</w:t>
+      </w:r>
+    </w:p>
+    <w:p>
+      <w:pPr>
+        <w:pStyle w:val="ListBullet"/>
+        <w:spacing w:after="40" w:before="0"/>
+      </w:pPr>
+      <w:r/>
+      <w:r>
+        <w:rPr>
+          <w:b/>
+        </w:rPr>
+        <w:t>`f049819`</w:t>
+      </w:r>
+      <w:r>
+        <w:t xml:space="preserve"> - *metorkhai*: `Initial commit`</w:t>
+      </w:r>
+    </w:p>
+    <w:p>
+      <w:pPr>
+        <w:pStyle w:val="ListBullet"/>
+        <w:spacing w:after="40" w:before="0"/>
+      </w:pPr>
+      <w:r/>
+      <w:r>
+        <w:rPr>
+          <w:b/>
+        </w:rPr>
+        <w:t>`9380894`</w:t>
+      </w:r>
+      <w:r>
+        <w:t xml:space="preserve"> - *Admin*: `feat: restructure PD insights panel to 4-section 2x2 grid with AI frequency prediction`</w:t>
+      </w:r>
+    </w:p>
+    <w:p>
+      <w:pPr>
+        <w:pStyle w:val="ListBullet"/>
+        <w:spacing w:after="40" w:before="0"/>
+      </w:pPr>
+      <w:r/>
+      <w:r>
+        <w:rPr>
+          <w:b/>
+        </w:rPr>
+        <w:t>`02876f4`</w:t>
+      </w:r>
+      <w:r>
+        <w:t xml:space="preserve"> - *Admin*: `perf: optimize RuleEvaluationWorker query to avoid slow GroupBy and disable verbose EF SQL logs`</w:t>
+      </w:r>
+    </w:p>
+    <w:p>
+      <w:pPr>
+        <w:pStyle w:val="ListBullet"/>
+        <w:spacing w:after="40" w:before="0"/>
+      </w:pPr>
+      <w:r/>
+      <w:r>
+        <w:rPr>
+          <w:b/>
+        </w:rPr>
+        <w:t>`66934ca`</w:t>
+      </w:r>
+      <w:r>
+        <w:t xml:space="preserve"> - *Admin*: `perf: optimize AI predictions and PD predictions retrieval using fast backward-seeking chunk parser`</w:t>
+      </w:r>
+    </w:p>
+    <w:p>
+      <w:pPr>
+        <w:pStyle w:val="ListBullet"/>
+        <w:spacing w:after="40" w:before="0"/>
+      </w:pPr>
+      <w:r/>
+      <w:r>
+        <w:rPr>
+          <w:b/>
+        </w:rPr>
+        <w:t>`cc988ee`</w:t>
+      </w:r>
+      <w:r>
+        <w:t xml:space="preserve"> - *Admin*: `feat(thermal-points): change default overlay opacity to 100%`</w:t>
+      </w:r>
+    </w:p>
+    <w:p>
+      <w:pPr>
+        <w:pStyle w:val="ListBullet"/>
+        <w:spacing w:after="40" w:before="0"/>
+      </w:pPr>
+      <w:r/>
+      <w:r>
+        <w:rPr>
+          <w:b/>
+        </w:rPr>
+        <w:t>`f0c716e`</w:t>
+      </w:r>
+      <w:r>
+        <w:t xml:space="preserve"> - *Admin*: `feat(thermal-points): hide overlay and zoom controls from the UI, setting default blend to 40%`</w:t>
+      </w:r>
+    </w:p>
+    <w:p>
+      <w:pPr>
+        <w:pStyle w:val="ListBullet"/>
+        <w:spacing w:after="40" w:before="0"/>
+      </w:pPr>
+      <w:r/>
+      <w:r>
+        <w:rPr>
+          <w:b/>
+        </w:rPr>
+        <w:t>`2113dd3`</w:t>
+      </w:r>
+      <w:r>
+        <w:t xml:space="preserve"> - *Admin*: `fix(thermal-points): preserve picker dot and coordinates during zoom and tab changes`</w:t>
+      </w:r>
+    </w:p>
+    <w:p>
+      <w:pPr>
+        <w:pStyle w:val="ListBullet"/>
+        <w:spacing w:after="40" w:before="0"/>
+      </w:pPr>
+      <w:r/>
+      <w:r>
+        <w:rPr>
+          <w:b/>
+        </w:rPr>
+        <w:t>`002ecef`</w:t>
+      </w:r>
+      <w:r>
+        <w:t xml:space="preserve"> - *Admin*: `feat(thermal-points): implement real-time camera overlay and cursor-centered zoom; optimize DB queries for local mode`</w:t>
+      </w:r>
+    </w:p>
+    <w:p>
+      <w:pPr>
+        <w:pStyle w:val="ListBullet"/>
+        <w:spacing w:after="40" w:before="0"/>
+      </w:pPr>
+      <w:r/>
+      <w:r>
+        <w:rPr>
+          <w:b/>
+        </w:rPr>
+        <w:t>`ee5c5ab`</w:t>
+      </w:r>
+      <w:r>
+        <w:t xml:space="preserve"> - *Admin*: `feat: add scrollbar and sticky header to thermal points table`</w:t>
+      </w:r>
+    </w:p>
+    <w:p>
+      <w:pPr>
+        <w:pStyle w:val="ListBullet"/>
+        <w:spacing w:after="40" w:before="0"/>
+      </w:pPr>
+      <w:r/>
+      <w:r>
+        <w:rPr>
+          <w:b/>
+        </w:rPr>
+        <w:t>`b074be4`</w:t>
+      </w:r>
+      <w:r>
+        <w:t xml:space="preserve"> - *Admin*: `feat: Add Thermal Points management and persistent Docker DB`</w:t>
+      </w:r>
+    </w:p>
+    <w:p>
+      <w:pPr>
+        <w:pStyle w:val="ListBullet"/>
+        <w:spacing w:after="40" w:before="0"/>
+      </w:pPr>
+      <w:r/>
+      <w:r>
+        <w:rPr>
+          <w:b/>
+        </w:rPr>
+        <w:t>`3261780`</w:t>
+      </w:r>
+      <w:r>
+        <w:t xml:space="preserve"> - *Admin*: `feat: optimize thermal overlay size and fix stream connectivity issues`</w:t>
+      </w:r>
+    </w:p>
+    <w:p>
+      <w:pPr>
+        <w:pStyle w:val="ListBullet"/>
+        <w:spacing w:after="40" w:before="0"/>
+      </w:pPr>
+      <w:r/>
+      <w:r>
+        <w:rPr>
+          <w:b/>
+        </w:rPr>
+        <w:t>`59d34b7`</w:t>
+      </w:r>
+      <w:r>
+        <w:t xml:space="preserve"> - *Admin*: `backup: thermal relay state with SDK and UI optimizations`</w:t>
+      </w:r>
+    </w:p>
+    <w:p>
+      <w:pPr>
+        <w:pStyle w:val="ListBullet"/>
+        <w:spacing w:after="40" w:before="0"/>
+      </w:pPr>
+      <w:r/>
+      <w:r>
+        <w:rPr>
+          <w:b/>
+        </w:rPr>
+        <w:t>`d97c426`</w:t>
+      </w:r>
+      <w:r>
+        <w:t xml:space="preserve"> - *Admin*: `feat: stabilize 10-point thermal monitoring and high-contrast overlay`</w:t>
+      </w:r>
+    </w:p>
+    <w:p>
+      <w:pPr>
+        <w:pStyle w:val="ListBullet"/>
+        <w:spacing w:after="40" w:before="0"/>
+      </w:pPr>
+      <w:r/>
+      <w:r>
+        <w:rPr>
+          <w:b/>
+        </w:rPr>
+        <w:t>`2e9aa89`</w:t>
+      </w:r>
+      <w:r>
+        <w:t xml:space="preserve"> - *Admin*: `feat: stabilize thermal relay, optimize dashboard UI, and fix alert history limits`</w:t>
+      </w:r>
+    </w:p>
+    <w:p>
+      <w:pPr>
+        <w:pStyle w:val="ListBullet"/>
+        <w:spacing w:after="40" w:before="0"/>
+      </w:pPr>
+      <w:r/>
+      <w:r>
+        <w:rPr>
+          <w:b/>
+        </w:rPr>
+        <w:t>`58448a1`</w:t>
+      </w:r>
+      <w:r>
+        <w:t xml:space="preserve"> - *Admin*: `Fix syntax errors and optimize AI Analytics UI layout`</w:t>
+      </w:r>
+    </w:p>
+    <w:p>
+      <w:pPr>
+        <w:pStyle w:val="ListBullet"/>
+        <w:spacing w:after="40" w:before="0"/>
+      </w:pPr>
+      <w:r/>
+      <w:r>
+        <w:rPr>
+          <w:b/>
+        </w:rPr>
+        <w:t>`12f7ce2`</w:t>
+      </w:r>
+      <w:r>
+        <w:t xml:space="preserve"> - *Admin*: `feat: optimize AI thermal UI, fix flickering, and add background AI polling`</w:t>
+      </w:r>
+    </w:p>
+    <w:p>
+      <w:pPr>
+        <w:pStyle w:val="ListBullet"/>
+        <w:spacing w:after="40" w:before="0"/>
+      </w:pPr>
+      <w:r/>
+      <w:r>
+        <w:rPr>
+          <w:b/>
+        </w:rPr>
+        <w:t>`2414829`</w:t>
+      </w:r>
+      <w:r>
+        <w:t xml:space="preserve"> - *Admin*: `feat: complete AI thermal pipeline with detailed UI and forecast timestamps`</w:t>
+      </w:r>
+    </w:p>
+    <w:p>
+      <w:pPr>
+        <w:pStyle w:val="ListBullet"/>
+        <w:spacing w:after="40" w:before="0"/>
+      </w:pPr>
+      <w:r/>
+      <w:r>
+        <w:rPr>
+          <w:b/>
+        </w:rPr>
+        <w:t>`640cea8`</w:t>
+      </w:r>
+      <w:r>
+        <w:t xml:space="preserve"> - *Admin*: `feat: integrate AI thermal pipeline with 5-minute cycle and 8080/5056 dual push`</w:t>
+      </w:r>
+    </w:p>
+    <w:p>
+      <w:pPr>
+        <w:pStyle w:val="ListBullet"/>
+        <w:spacing w:after="40" w:before="0"/>
+      </w:pPr>
+      <w:r/>
+      <w:r>
+        <w:rPr>
+          <w:b/>
+        </w:rPr>
+        <w:t>`b91fc7a`</w:t>
+      </w:r>
+      <w:r>
+        <w:t xml:space="preserve"> - *Admin*: `docs: add license system test guide and troubleshooting`</w:t>
+      </w:r>
+    </w:p>
+    <w:p>
+      <w:pPr>
+        <w:pStyle w:val="ListBullet"/>
+        <w:spacing w:after="40" w:before="0"/>
+      </w:pPr>
+      <w:r/>
+      <w:r>
+        <w:rPr>
+          <w:b/>
+        </w:rPr>
+        <w:t>`4fc1063`</w:t>
+      </w:r>
+      <w:r>
+        <w:t xml:space="preserve"> - *Admin*: `feat: implement license key system + web deployment setup`</w:t>
+      </w:r>
+    </w:p>
+    <w:p>
+      <w:pPr>
+        <w:pStyle w:val="ListBullet"/>
+        <w:spacing w:after="40" w:before="0"/>
+      </w:pPr>
+      <w:r/>
+      <w:r>
+        <w:rPr>
+          <w:b/>
+        </w:rPr>
+        <w:t>`4e454f0`</w:t>
+      </w:r>
+      <w:r>
+        <w:t xml:space="preserve"> - *Admin*: `feature_update`</w:t>
+      </w:r>
+    </w:p>
+    <w:p>
+      <w:pPr>
+        <w:pStyle w:val="ListBullet"/>
+        <w:spacing w:after="40" w:before="0"/>
+      </w:pPr>
+      <w:r/>
+      <w:r>
+        <w:rPr>
+          <w:b/>
+        </w:rPr>
+        <w:t>`86fdf11`</w:t>
+      </w:r>
+      <w:r>
+        <w:t xml:space="preserve"> - *metorkhai*: `feat: tích hợp camera alerts vào dashboard + alertshistory (Phase 4)`</w:t>
+      </w:r>
+    </w:p>
+    <w:p>
+      <w:pPr>
+        <w:pStyle w:val="ListBullet"/>
+        <w:spacing w:after="40" w:before="0"/>
+      </w:pPr>
+      <w:r/>
+      <w:r>
+        <w:rPr>
+          <w:b/>
+        </w:rPr>
+        <w:t>`d22cea9`</w:t>
+      </w:r>
+      <w:r>
+        <w:t xml:space="preserve"> - *metorkhai*: `feat: add video recording + image capture from camera stream`</w:t>
+      </w:r>
+    </w:p>
+    <w:p>
+      <w:pPr>
+        <w:pStyle w:val="ListBullet"/>
+        <w:spacing w:after="40" w:before="0"/>
+      </w:pPr>
+      <w:r/>
+      <w:r>
+        <w:rPr>
+          <w:b/>
+        </w:rPr>
+        <w:t>`dcf7a51`</w:t>
+      </w:r>
+      <w:r>
+        <w:t xml:space="preserve"> - *metorkhai*: `test: fetch REAL images from camera stream (not fake)`</w:t>
+      </w:r>
+    </w:p>
+    <w:p>
+      <w:pPr>
+        <w:pStyle w:val="ListBullet"/>
+        <w:spacing w:after="40" w:before="0"/>
+      </w:pPr>
+      <w:r/>
+      <w:r>
+        <w:rPr>
+          <w:b/>
+        </w:rPr>
+        <w:t>`d36cc7a`</w:t>
+      </w:r>
+      <w:r>
+        <w:t xml:space="preserve"> - *metorkhai*: `test: add full test with realistic image + video capture`</w:t>
+      </w:r>
+    </w:p>
+    <w:p>
+      <w:pPr>
+        <w:pStyle w:val="ListBullet"/>
+        <w:spacing w:after="40" w:before="0"/>
+      </w:pPr>
+      <w:r/>
+      <w:r>
+        <w:rPr>
+          <w:b/>
+        </w:rPr>
+        <w:t>`71efa6c`</w:t>
+      </w:r>
+      <w:r>
+        <w:t xml:space="preserve"> - *metorkhai*: `test: add live event test script - verify alert + image capture`</w:t>
+      </w:r>
+    </w:p>
+    <w:p>
+      <w:pPr>
+        <w:pStyle w:val="ListBullet"/>
+        <w:spacing w:after="40" w:before="0"/>
+      </w:pPr>
+      <w:r/>
+      <w:r>
+        <w:rPr>
+          <w:b/>
+        </w:rPr>
+        <w:t>`0351c97`</w:t>
+      </w:r>
+      <w:r>
+        <w:t xml:space="preserve"> - *metorkhai*: `feat: add comprehensive notification test suite for auto-configuration`</w:t>
+      </w:r>
+    </w:p>
+    <w:p>
+      <w:pPr>
+        <w:pStyle w:val="ListBullet"/>
+        <w:spacing w:after="40" w:before="0"/>
+      </w:pPr>
+      <w:r/>
+      <w:r>
+        <w:rPr>
+          <w:b/>
+        </w:rPr>
+        <w:t>`2e0ae04`</w:t>
+      </w:r>
+      <w:r>
+        <w:t xml:space="preserve"> - *metorkhai*: `feat: add notification test system for cameras 152 &amp; 153`</w:t>
+      </w:r>
+    </w:p>
+    <w:p>
+      <w:pPr>
+        <w:pStyle w:val="ListBullet"/>
+        <w:spacing w:after="40" w:before="0"/>
+      </w:pPr>
+      <w:r/>
+      <w:r>
+        <w:rPr>
+          <w:b/>
+        </w:rPr>
+        <w:t>`fe50fcc`</w:t>
+      </w:r>
+      <w:r>
+        <w:t xml:space="preserve"> - *metorkhai*: `feat: add fire/smoke detection test script for camera 153`</w:t>
+      </w:r>
+    </w:p>
+    <w:p>
+      <w:pPr>
+        <w:pStyle w:val="ListBullet"/>
+        <w:spacing w:after="40" w:before="0"/>
+      </w:pPr>
+      <w:r/>
+      <w:r>
+        <w:rPr>
+          <w:b/>
+        </w:rPr>
+        <w:t>`7c6de38`</w:t>
+      </w:r>
+      <w:r>
+        <w:t xml:space="preserve"> - *metorkhai*: `docs: add quick-start guide for Ubuntu DL380 deployment`</w:t>
+      </w:r>
+    </w:p>
+    <w:p>
+      <w:pPr>
+        <w:pStyle w:val="ListBullet"/>
+        <w:spacing w:after="40" w:before="0"/>
+      </w:pPr>
+      <w:r/>
+      <w:r>
+        <w:rPr>
+          <w:b/>
+        </w:rPr>
+        <w:t>`8ecce3a`</w:t>
+      </w:r>
+      <w:r>
+        <w:t xml:space="preserve"> - *metorkhai*: `chore: remove deploy-jetson.sh (not needed - using Ubuntu DL380 instead)`</w:t>
+      </w:r>
+    </w:p>
+    <w:p>
+      <w:pPr>
+        <w:pStyle w:val="ListBullet"/>
+        <w:spacing w:after="40" w:before="0"/>
+      </w:pPr>
+      <w:r/>
+      <w:r>
+        <w:rPr>
+          <w:b/>
+        </w:rPr>
+        <w:t>`3d2f076`</w:t>
+      </w:r>
+      <w:r>
+        <w:t xml:space="preserve"> - *metorkhai*: `docs: add SDK setup and thermal points fix documentation`</w:t>
+      </w:r>
+    </w:p>
+    <w:p>
+      <w:pPr>
+        <w:pStyle w:val="ListBullet"/>
+        <w:spacing w:after="40" w:before="0"/>
+      </w:pPr>
+      <w:r/>
+      <w:r>
+        <w:rPr>
+          <w:b/>
+        </w:rPr>
+        <w:t>`c9307eb`</w:t>
+      </w:r>
+      <w:r>
+        <w:t xml:space="preserve"> - *metorkhai*: `docs: add complete deployment scripts guide`</w:t>
+      </w:r>
+    </w:p>
+    <w:p>
+      <w:pPr>
+        <w:pStyle w:val="ListBullet"/>
+        <w:spacing w:after="40" w:before="0"/>
+      </w:pPr>
+      <w:r/>
+      <w:r>
+        <w:rPr>
+          <w:b/>
+        </w:rPr>
+        <w:t>`28cafb0`</w:t>
+      </w:r>
+      <w:r>
+        <w:t xml:space="preserve"> - *metorkhai*: `docs: complete deployment scripts for Ubuntu`</w:t>
+      </w:r>
+    </w:p>
+    <w:p>
+      <w:pPr>
+        <w:pStyle w:val="ListBullet"/>
+        <w:spacing w:after="40" w:before="0"/>
+      </w:pPr>
+      <w:r/>
+      <w:r>
+        <w:rPr>
+          <w:b/>
+        </w:rPr>
+        <w:t>`bbc31af`</w:t>
+      </w:r>
+      <w:r>
+        <w:t xml:space="preserve"> - *metorkhai*: `feat: cross-platform SDK loading (Windows DLL + Linux SO)`</w:t>
+      </w:r>
+    </w:p>
+    <w:p>
+      <w:pPr>
+        <w:pStyle w:val="ListBullet"/>
+        <w:spacing w:after="40" w:before="0"/>
+      </w:pPr>
+      <w:r/>
+      <w:r>
+        <w:rPr>
+          <w:b/>
+        </w:rPr>
+        <w:t>`bcc5b72`</w:t>
+      </w:r>
+      <w:r>
+        <w:t xml:space="preserve"> - *metorkhai*: `docs: add comprehensive deployment guide for Ubuntu server`</w:t>
+      </w:r>
+    </w:p>
+    <w:p>
+      <w:pPr>
+        <w:pStyle w:val="ListBullet"/>
+        <w:spacing w:after="40" w:before="0"/>
+      </w:pPr>
+      <w:r/>
+      <w:r>
+        <w:rPr>
+          <w:b/>
+        </w:rPr>
+        <w:t>`0e57061`</w:t>
+      </w:r>
+      <w:r>
+        <w:t xml:space="preserve"> - *metorkhai*: `feat: ubuntu deployment, stream overlay fix, alerts UI cleanup`</w:t>
+      </w:r>
+    </w:p>
+    <w:p>
+      <w:pPr>
+        <w:pStyle w:val="ListBullet"/>
+        <w:spacing w:after="40" w:before="0"/>
+      </w:pPr>
+      <w:r/>
+      <w:r>
+        <w:rPr>
+          <w:b/>
+        </w:rPr>
+        <w:t>`9af5647`</w:t>
+      </w:r>
+      <w:r>
+        <w:t xml:space="preserve"> - *metorkhai*: `v11`</w:t>
+      </w:r>
+    </w:p>
+    <w:p>
+      <w:pPr>
+        <w:pStyle w:val="ListBullet"/>
+        <w:spacing w:after="40" w:before="0"/>
+      </w:pPr>
+      <w:r/>
+      <w:r>
+        <w:rPr>
+          <w:b/>
+        </w:rPr>
+        <w:t>`52dba66`</w:t>
+      </w:r>
+      <w:r>
+        <w:t xml:space="preserve"> - *metorkhai*: `version 1`</w:t>
+      </w:r>
+    </w:p>
+    <w:p>
+      <w:pPr>
+        <w:pStyle w:val="ListBullet"/>
+        <w:spacing w:after="40" w:before="0"/>
+      </w:pPr>
+      <w:r/>
+      <w:r>
+        <w:rPr>
+          <w:b/>
+        </w:rPr>
+        <w:t>`5f8647c`</w:t>
+      </w:r>
+      <w:r>
+        <w:t xml:space="preserve"> - *metorkhai*: `deloy`</w:t>
+      </w:r>
+    </w:p>
+    <w:p>
+      <w:pPr>
+        <w:pStyle w:val="ListBullet"/>
+        <w:spacing w:after="40" w:before="0"/>
+      </w:pPr>
+      <w:r/>
+      <w:r>
+        <w:rPr>
+          <w:b/>
+        </w:rPr>
+        <w:t>`58abd51`</w:t>
+      </w:r>
+      <w:r>
+        <w:t xml:space="preserve"> - *metorkhai*: `feat: initialize project and exclude large binaries`</w:t>
+      </w:r>
+    </w:p>
+    <w:p>
+      <w:pPr>
+        <w:pStyle w:val="ListBullet"/>
+        <w:spacing w:after="40" w:before="0"/>
+      </w:pPr>
+      <w:r/>
+      <w:r>
+        <w:rPr>
+          <w:b/>
+        </w:rPr>
+        <w:t>`d903d66`</w:t>
+      </w:r>
+      <w:r>
+        <w:t xml:space="preserve"> - *metorkhai*: `ad`</w:t>
+      </w:r>
+    </w:p>
+    <w:p>
+      <w:pPr>
+        <w:pStyle w:val="ListBullet"/>
+        <w:spacing w:after="40" w:before="0"/>
+      </w:pPr>
+      <w:r/>
+      <w:r>
+        <w:rPr>
+          <w:b/>
+        </w:rPr>
+        <w:t>`83206b3`</w:t>
+      </w:r>
+      <w:r>
+        <w:t xml:space="preserve"> - *metorkhai*: `thay doi co mobile app cloudlare`</w:t>
+      </w:r>
+    </w:p>
+    <w:p>
+      <w:pPr>
+        <w:pStyle w:val="ListBullet"/>
+        <w:spacing w:after="40" w:before="0"/>
+      </w:pPr>
+      <w:r/>
+      <w:r>
+        <w:rPr>
+          <w:b/>
+        </w:rPr>
+        <w:t>`55ff4cf`</w:t>
+      </w:r>
+      <w:r>
+        <w:t xml:space="preserve"> - *metorkhai*: `deloy: cài docker cho jetson linux`</w:t>
+      </w:r>
+    </w:p>
+    <w:p>
+      <w:pPr>
+        <w:pStyle w:val="ListBullet"/>
+        <w:spacing w:after="40" w:before="0"/>
+      </w:pPr>
+      <w:r/>
+      <w:r>
+        <w:rPr>
+          <w:b/>
+        </w:rPr>
+        <w:t>`c60a27b`</w:t>
+      </w:r>
+      <w:r>
+        <w:t xml:space="preserve"> - *metorkhai*: `feat: cải tiến giao diện Nhật ký hệ thống và triển khai các Worker giao thức (Phase 11)`</w:t>
+      </w:r>
+    </w:p>
+    <w:p>
+      <w:pPr>
+        <w:pStyle w:val="ListBullet"/>
+        <w:spacing w:after="40" w:before="0"/>
+      </w:pPr>
+      <w:r/>
+      <w:r>
+        <w:rPr>
+          <w:b/>
+        </w:rPr>
+        <w:t>`3aa7702`</w:t>
+      </w:r>
+      <w:r>
+        <w:t xml:space="preserve"> - *metorkhai*: `làm xong phase 4`</w:t>
+      </w:r>
+    </w:p>
+    <w:p>
+      <w:pPr>
+        <w:pStyle w:val="ListBullet"/>
+        <w:spacing w:after="40" w:before="0"/>
+      </w:pPr>
+      <w:r/>
+      <w:r>
+        <w:rPr>
+          <w:b/>
+        </w:rPr>
+        <w:t>`13b41d1`</w:t>
+      </w:r>
+      <w:r>
+        <w:t xml:space="preserve"> - *metorkhai*: `docs: cập nhật README, setup-env và start.bat hoàn chỉnh`</w:t>
+      </w:r>
+    </w:p>
+    <w:p>
+      <w:pPr>
+        <w:pStyle w:val="ListBullet"/>
+        <w:spacing w:after="40" w:before="0"/>
+      </w:pPr>
+      <w:r/>
+      <w:r>
+        <w:rPr>
+          <w:b/>
+        </w:rPr>
+        <w:t>`a75ed62`</w:t>
+      </w:r>
+      <w:r>
+        <w:t xml:space="preserve"> - *metorkhai*: `them các md`</w:t>
+      </w:r>
+    </w:p>
+    <w:p>
+      <w:pPr>
+        <w:pStyle w:val="ListBullet"/>
+        <w:spacing w:after="40" w:before="0"/>
+      </w:pPr>
+      <w:r/>
+      <w:r>
+        <w:rPr>
+          <w:b/>
+        </w:rPr>
+        <w:t>`350572c`</w:t>
+      </w:r>
+      <w:r>
+        <w:t xml:space="preserve"> - *metorkhai*: `feat: hoàn thiện quy trình setup-env tự động và fix start.bat`</w:t>
+      </w:r>
+    </w:p>
+    <w:p>
+      <w:pPr>
+        <w:pStyle w:val="ListBullet"/>
+        <w:spacing w:after="40" w:before="0"/>
+      </w:pPr>
+      <w:r/>
+      <w:r>
+        <w:rPr>
+          <w:b/>
+        </w:rPr>
+        <w:t>`d192551`</w:t>
+      </w:r>
+      <w:r>
+        <w:t xml:space="preserve"> - *metorkhai*: `them script de tu dong chay cai cài đặt`</w:t>
+      </w:r>
+    </w:p>
+    <w:p>
+      <w:pPr>
+        <w:pStyle w:val="ListBullet"/>
+        <w:spacing w:after="40" w:before="0"/>
+      </w:pPr>
+      <w:r/>
+      <w:r>
+        <w:rPr>
+          <w:b/>
+        </w:rPr>
+        <w:t>`478be04`</w:t>
+      </w:r>
+      <w:r>
+        <w:t xml:space="preserve"> - *metorkhai*: `feat: hoàn thiện giao diện Login, cập nhật docs và sửa lỗi start.bat`</w:t>
+      </w:r>
+    </w:p>
+    <w:p>
+      <w:pPr>
+        <w:pStyle w:val="ListBullet"/>
+        <w:spacing w:after="40" w:before="0"/>
+      </w:pPr>
+      <w:r/>
+      <w:r>
+        <w:rPr>
+          <w:b/>
+        </w:rPr>
+        <w:t>`96198bf`</w:t>
+      </w:r>
+      <w:r>
+        <w:t xml:space="preserve"> - *metorkhai*: `chore: init monorepo - merge frontend + backend`</w:t>
       </w:r>
     </w:p>
     <w:p>
@@ -8923,467 +11158,131 @@
           <w:color w:val="323232"/>
           <w:sz w:val="23"/>
         </w:rPr>
-        <w:t>2. Đoạn mã nguồn mẫu tiêu biểu mở rộng (Expanded Code Snippets)</w:t>
+        <w:t>2. Mô tả các khối chức năng và cấu trúc Module mã nguồn</w:t>
       </w:r>
     </w:p>
     <w:p>
       <w:pPr>
-        <w:spacing w:before="160" w:after="80"/>
-      </w:pPr>
-      <w:r>
-        <w:rPr>
-          <w:rFonts w:ascii="Arial" w:hAnsi="Arial"/>
-          <w:b/>
-          <w:i/>
-          <w:color w:val="505050"/>
-          <w:sz w:val="21"/>
-        </w:rPr>
-        <w:t>A. Tiến trình nền đọc Modbus/S7 liên tục và giám sát thiết bị (`PlcPollingWorker.cs`):</w:t>
+        <w:spacing w:after="120" w:line="276" w:lineRule="auto"/>
+      </w:pPr>
+      <w:r>
+        <w:t>*(Nội dung mã nguồn chi tiết được lưu trữ trực tiếp trong kho mã nguồn Git và được kiểm duyệt độc lập).*</w:t>
       </w:r>
     </w:p>
     <w:p>
       <w:pPr>
-        <w:spacing w:before="120" w:after="120"/>
-        <w:ind w:left="576"/>
-      </w:pPr>
+        <w:pStyle w:val="ListBullet"/>
+        <w:spacing w:after="40" w:before="0"/>
+      </w:pPr>
+      <w:r/>
       <w:r>
         <w:rPr>
-          <w:rFonts w:ascii="Courier New" w:hAnsi="Courier New"/>
-          <w:color w:val="3C3C3C"/>
-          <w:sz w:val="18"/>
+          <w:b/>
         </w:rPr>
-        <w:t>using System.Text.Json;</w:t>
-        <w:br/>
-        <w:t>using Microsoft.EntityFrameworkCore;</w:t>
-        <w:br/>
-        <w:t>using Microsoft.Extensions.DependencyInjection;</w:t>
-        <w:br/>
-        <w:t>using Microsoft.Extensions.Hosting;</w:t>
-        <w:br/>
-        <w:t>using Microsoft.Extensions.Logging;</w:t>
-        <w:br/>
-        <w:t>using Microsoft.Extensions.Caching.Memory;</w:t>
-        <w:br/>
-        <w:t>using S7.Net;</w:t>
-        <w:br/>
-        <w:t>using StationOS.Data;</w:t>
-        <w:br/>
-        <w:t>using StationOS.Data.Entities;</w:t>
-        <w:br/>
-        <w:br/>
-        <w:t>namespace StationOS.Workers.Polling;</w:t>
-        <w:br/>
-        <w:br/>
-        <w:t>public class PlcPollingWorker : BackgroundService</w:t>
-        <w:br/>
-        <w:t>{</w:t>
-        <w:br/>
-        <w:t xml:space="preserve">    private readonly IServiceScopeFactory _scopeFactory;</w:t>
-        <w:br/>
-        <w:t xml:space="preserve">    private readonly IRealtimeNotifier _notifier;</w:t>
-        <w:br/>
-        <w:t xml:space="preserve">    private readonly ILogger&lt;PlcPollingWorker&gt; _logger;</w:t>
-        <w:br/>
-        <w:t xml:space="preserve">    private readonly IMemoryCache _cache;</w:t>
-        <w:br/>
-        <w:br/>
-        <w:t xml:space="preserve">    private readonly Dictionary&lt;Guid, DateTime&gt; _lastPollTimes = new();</w:t>
-        <w:br/>
-        <w:t xml:space="preserve">    private readonly Dictionary&lt;Guid, DateTime&gt; _lastDbSaveTimes = new();</w:t>
-        <w:br/>
-        <w:br/>
-        <w:t xml:space="preserve">    public PlcPollingWorker(</w:t>
-        <w:br/>
-        <w:t xml:space="preserve">        IServiceScopeFactory scopeFactory,</w:t>
-        <w:br/>
-        <w:t xml:space="preserve">        IRealtimeNotifier notifier,</w:t>
-        <w:br/>
-        <w:t xml:space="preserve">        ILogger&lt;PlcPollingWorker&gt; logger,</w:t>
-        <w:br/>
-        <w:t xml:space="preserve">        IMemoryCache cache)</w:t>
-        <w:br/>
-        <w:t xml:space="preserve">    {</w:t>
-        <w:br/>
-        <w:t xml:space="preserve">        _scopeFactory = scopeFactory;</w:t>
-        <w:br/>
-        <w:t xml:space="preserve">        _notifier = notifier;</w:t>
-        <w:br/>
-        <w:t xml:space="preserve">        _logger = logger;</w:t>
-        <w:br/>
-        <w:t xml:space="preserve">        _cache = cache;</w:t>
-        <w:br/>
-        <w:t xml:space="preserve">    }</w:t>
-        <w:br/>
-        <w:br/>
-        <w:t xml:space="preserve">    protected override async Task ExecuteAsync(CancellationToken stoppingToken)</w:t>
-        <w:br/>
-        <w:t xml:space="preserve">    {</w:t>
-        <w:br/>
-        <w:t xml:space="preserve">        _logger.LogInformation("[PLC] Worker khởi động đọc dữ liệu chu kỳ");</w:t>
-        <w:br/>
-        <w:br/>
-        <w:t xml:space="preserve">        while (!stoppingToken.IsCancellationRequested)</w:t>
-        <w:br/>
-        <w:t xml:space="preserve">        {</w:t>
-        <w:br/>
-        <w:t xml:space="preserve">            try</w:t>
-        <w:br/>
-        <w:t xml:space="preserve">            {</w:t>
-        <w:br/>
-        <w:t xml:space="preserve">                using var scope = _scopeFactory.CreateScope();</w:t>
-        <w:br/>
-        <w:t xml:space="preserve">                var db = scope.ServiceProvider.GetRequiredService&lt;AppDbContext&gt;();</w:t>
-        <w:br/>
-        <w:t xml:space="preserve">                await PollAllPlcDevicesAsync(db, stoppingToken);</w:t>
-        <w:br/>
-        <w:t xml:space="preserve">            }</w:t>
-        <w:br/>
-        <w:t xml:space="preserve">            catch (Exception ex)</w:t>
-        <w:br/>
-        <w:t xml:space="preserve">            {</w:t>
-        <w:br/>
-        <w:t xml:space="preserve">                _logger.LogError(ex, "[PLC] Lỗi trong vòng lặp chính");</w:t>
-        <w:br/>
-        <w:t xml:space="preserve">            }</w:t>
-        <w:br/>
-        <w:br/>
-        <w:t xml:space="preserve">            await Task.Delay(1000, stoppingToken);</w:t>
-        <w:br/>
-        <w:t xml:space="preserve">        }</w:t>
-        <w:br/>
-        <w:t xml:space="preserve">    }</w:t>
-        <w:br/>
-        <w:br/>
-        <w:t xml:space="preserve">    private async Task PollAllPlcDevicesAsync(AppDbContext db, CancellationToken ct)</w:t>
-        <w:br/>
-        <w:t xml:space="preserve">    {</w:t>
-        <w:br/>
-        <w:t xml:space="preserve">        var plcDevices = await db.Devices</w:t>
-        <w:br/>
-        <w:t xml:space="preserve">            .Where(d =&gt; d.Type == "plc_s7" &amp;&amp; d.Status == "active")</w:t>
-        <w:br/>
-        <w:t xml:space="preserve">            .ToListAsync(ct);</w:t>
-        <w:br/>
-        <w:br/>
-        <w:t xml:space="preserve">        foreach (var device in plcDevices)</w:t>
-        <w:br/>
-        <w:t xml:space="preserve">        {</w:t>
-        <w:br/>
-        <w:t xml:space="preserve">            await PollSinglePlcAsync(db, device, ct);</w:t>
-        <w:br/>
-        <w:t xml:space="preserve">        }</w:t>
-        <w:br/>
-        <w:t xml:space="preserve">    }</w:t>
-        <w:br/>
-        <w:br/>
-        <w:t xml:space="preserve">    private async Task PollSinglePlcAsync(AppDbContext db, Device device, CancellationToken ct)</w:t>
-        <w:br/>
-        <w:t xml:space="preserve">    {</w:t>
-        <w:br/>
-        <w:t xml:space="preserve">        var config = JsonSerializer.Deserialize&lt;Dictionary&lt;string, string&gt;&gt;(device.Config);</w:t>
-        <w:br/>
-        <w:t xml:space="preserve">        if (config == null) return;</w:t>
-        <w:br/>
-        <w:br/>
-        <w:t xml:space="preserve">        string ip = config["ip"];</w:t>
-        <w:br/>
-        <w:t xml:space="preserve">        short rack = short.Parse(config["rack"]);</w:t>
-        <w:br/>
-        <w:t xml:space="preserve">        short slot = short.Parse(config["slot"]);</w:t>
-        <w:br/>
-        <w:t xml:space="preserve">        int dbNum = int.Parse(config["db"]);</w:t>
-        <w:br/>
-        <w:t xml:space="preserve">        int offset = int.Parse(config["offset"]);</w:t>
-        <w:br/>
-        <w:t xml:space="preserve">        int length = int.Parse(config["length"]);</w:t>
-        <w:br/>
-        <w:br/>
-        <w:t xml:space="preserve">        Plc plc = new Plc(CpuType.S71200, ip, rack, slot);</w:t>
-        <w:br/>
-        <w:t xml:space="preserve">        try</w:t>
-        <w:br/>
-        <w:t xml:space="preserve">        {</w:t>
-        <w:br/>
-        <w:t xml:space="preserve">            await plc.OpenAsync(ct);</w:t>
-        <w:br/>
-        <w:t xml:space="preserve">            if (plc.IsConnected)</w:t>
-        <w:br/>
-        <w:t xml:space="preserve">            {</w:t>
-        <w:br/>
-        <w:t xml:space="preserve">                var rawData = await plc.ReadAsync(DataType.DataBlock, dbNum, offset, VarType.Byte, length, 0, ct);</w:t>
-        <w:br/>
-        <w:t xml:space="preserve">                if (rawData is byte[] bytes)</w:t>
-        <w:br/>
-        <w:t xml:space="preserve">                {</w:t>
-        <w:br/>
-        <w:t xml:space="preserve">                    double tempVal = (short)((bytes[0] &lt;&lt; 8) | bytes[1]);</w:t>
-        <w:br/>
-        <w:t xml:space="preserve">                    // Ghi nhận giá trị đo</w:t>
-        <w:br/>
-        <w:t xml:space="preserve">                    var reading = new SensorReading</w:t>
-        <w:br/>
-        <w:t xml:space="preserve">                    {</w:t>
-        <w:br/>
-        <w:t xml:space="preserve">                        Time = DateTime.UtcNow,</w:t>
-        <w:br/>
-        <w:t xml:space="preserve">                        DeviceId = device.Id,</w:t>
-        <w:br/>
-        <w:t xml:space="preserve">                        PointId = "temp_pha_1",</w:t>
-        <w:br/>
-        <w:t xml:space="preserve">                        Value = tempVal,</w:t>
-        <w:br/>
-        <w:t xml:space="preserve">                        Unit = "°C",</w:t>
-        <w:br/>
-        <w:t xml:space="preserve">                        Quality = 1</w:t>
-        <w:br/>
-        <w:t xml:space="preserve">                    };</w:t>
-        <w:br/>
-        <w:t xml:space="preserve">                    db.SensorReadings.Add(reading);</w:t>
-        <w:br/>
-        <w:t xml:space="preserve">                    await db.SaveChangesAsync(ct);</w:t>
-        <w:br/>
-        <w:t xml:space="preserve">                    </w:t>
-        <w:br/>
-        <w:t xml:space="preserve">                    // Phát thông báo thời gian thực qua SignalR</w:t>
-        <w:br/>
-        <w:t xml:space="preserve">                    await _notifier.SendSensorUpdateAsync(new[] { new { deviceId = device.Id, pointId = "temp_pha_1", value = tempVal, quality = 1 } });</w:t>
-        <w:br/>
-        <w:t xml:space="preserve">                }</w:t>
-        <w:br/>
-        <w:t xml:space="preserve">            }</w:t>
-        <w:br/>
-        <w:t xml:space="preserve">        }</w:t>
-        <w:br/>
-        <w:t xml:space="preserve">        catch (Exception ex)</w:t>
-        <w:br/>
-        <w:t xml:space="preserve">        {</w:t>
-        <w:br/>
-        <w:t xml:space="preserve">            _logger.LogError(ex, $"[PLC] Mất kết nối tới PLC {ip}");</w:t>
-        <w:br/>
-        <w:t xml:space="preserve">        }</w:t>
-        <w:br/>
-        <w:t xml:space="preserve">        finally</w:t>
-        <w:br/>
-        <w:t xml:space="preserve">        {</w:t>
-        <w:br/>
-        <w:t xml:space="preserve">            plc.Close();</w:t>
-        <w:br/>
-        <w:t xml:space="preserve">        }</w:t>
-        <w:br/>
-        <w:t xml:space="preserve">    }</w:t>
-        <w:br/>
-        <w:t>}</w:t>
+        <w:t>Module `StationOS.Api`</w:t>
+      </w:r>
+      <w:r>
+        <w:t>: Điều phối luồng dữ liệu (API Controllers), quản lý kết nối xác thực người dùng bằng cơ chế JWT, cấu hình máy chủ Web API và tạo cổng kết nối WebSocket thời gian thực (SignalR Hubs).</w:t>
       </w:r>
     </w:p>
     <w:p>
       <w:pPr>
-        <w:spacing w:before="160" w:after="80"/>
-      </w:pPr>
+        <w:pStyle w:val="ListBullet"/>
+        <w:spacing w:after="40" w:before="0"/>
+      </w:pPr>
+      <w:r/>
       <w:r>
         <w:rPr>
-          <w:rFonts w:ascii="Arial" w:hAnsi="Arial"/>
           <w:b/>
-          <w:i/>
-          <w:color w:val="505050"/>
-          <w:sz w:val="21"/>
         </w:rPr>
-        <w:t>B. Tiến trình nền đồng bộ SyncQueue lên trạm tổng trung tâm (`CentralSyncWorker.cs`):</w:t>
+        <w:t>Module `StationOS.Data`</w:t>
+      </w:r>
+      <w:r>
+        <w:t>: Lớp ánh xạ cơ sở dữ liệu quan hệ (Entity Framework Core) với PostgreSQL. Quản lý việc ánh xạ thực thể (Entities), khởi tạo di chuyển dữ liệu (Migrations) và thiết lập chỉ mục để truy vấn dữ liệu chuỗi thời gian tối ưu.</w:t>
       </w:r>
     </w:p>
     <w:p>
       <w:pPr>
-        <w:spacing w:before="120" w:after="120"/>
-        <w:ind w:left="576"/>
-      </w:pPr>
+        <w:pStyle w:val="ListBullet"/>
+        <w:spacing w:after="40" w:before="0"/>
+      </w:pPr>
+      <w:r/>
       <w:r>
         <w:rPr>
-          <w:rFonts w:ascii="Courier New" w:hAnsi="Courier New"/>
-          <w:color w:val="3C3C3C"/>
-          <w:sz w:val="18"/>
+          <w:b/>
         </w:rPr>
-        <w:t>using System.Net.Http.Json;</w:t>
-        <w:br/>
-        <w:t>using System.Text.Json;</w:t>
-        <w:br/>
-        <w:t>using Microsoft.EntityFrameworkCore;</w:t>
-        <w:br/>
-        <w:t>using Microsoft.Extensions.Configuration;</w:t>
-        <w:br/>
-        <w:t>using Microsoft.Extensions.DependencyInjection;</w:t>
-        <w:br/>
-        <w:t>using Microsoft.Extensions.Hosting;</w:t>
-        <w:br/>
-        <w:t>using Microsoft.Extensions.Logging;</w:t>
-        <w:br/>
-        <w:t>using StationOS.Data;</w:t>
-        <w:br/>
-        <w:t>using StationOS.Data.Entities;</w:t>
-        <w:br/>
-        <w:br/>
-        <w:t>namespace StationOS.Workers.Polling;</w:t>
-        <w:br/>
-        <w:br/>
-        <w:t>public class CentralSyncWorker : BackgroundService</w:t>
-        <w:br/>
-        <w:t>{</w:t>
-        <w:br/>
-        <w:t xml:space="preserve">    private readonly IServiceScopeFactory _scopeFactory;</w:t>
-        <w:br/>
-        <w:t xml:space="preserve">    private readonly ILogger&lt;CentralSyncWorker&gt; _logger;</w:t>
-        <w:br/>
-        <w:t xml:space="preserve">    private readonly IHttpClientFactory _httpClientFactory;</w:t>
-        <w:br/>
-        <w:t xml:space="preserve">    private readonly string? _centralUrl;</w:t>
-        <w:br/>
-        <w:t xml:space="preserve">    private readonly string? _stationId;</w:t>
-        <w:br/>
-        <w:br/>
-        <w:t xml:space="preserve">    public CentralSyncWorker(</w:t>
-        <w:br/>
-        <w:t xml:space="preserve">        IServiceScopeFactory scopeFactory,</w:t>
-        <w:br/>
-        <w:t xml:space="preserve">        ILogger&lt;CentralSyncWorker&gt; logger,</w:t>
-        <w:br/>
-        <w:t xml:space="preserve">        IHttpClientFactory httpClientFactory,</w:t>
-        <w:br/>
-        <w:t xml:space="preserve">        IConfiguration configuration)</w:t>
-        <w:br/>
-        <w:t xml:space="preserve">    {</w:t>
-        <w:br/>
-        <w:t xml:space="preserve">        _scopeFactory = scopeFactory;</w:t>
-        <w:br/>
-        <w:t xml:space="preserve">        _logger = logger;</w:t>
-        <w:br/>
-        <w:t xml:space="preserve">        _httpClientFactory = httpClientFactory;</w:t>
-        <w:br/>
-        <w:t xml:space="preserve">        _centralUrl = configuration["CentralServer"];</w:t>
-        <w:br/>
-        <w:t xml:space="preserve">        _stationId = configuration["StationId"];</w:t>
-        <w:br/>
-        <w:t xml:space="preserve">    }</w:t>
-        <w:br/>
-        <w:br/>
-        <w:t xml:space="preserve">    protected override async Task ExecuteAsync(CancellationToken stoppingToken)</w:t>
-        <w:br/>
-        <w:t xml:space="preserve">    {</w:t>
-        <w:br/>
-        <w:t xml:space="preserve">        if (string.IsNullOrEmpty(_centralUrl) || string.IsNullOrEmpty(_stationId))</w:t>
-        <w:br/>
-        <w:t xml:space="preserve">        {</w:t>
-        <w:br/>
-        <w:t xml:space="preserve">            _logger.LogInformation("[CentralSync] Chưa cấu hình Central Server hoặc StationId");</w:t>
-        <w:br/>
-        <w:t xml:space="preserve">            return;</w:t>
-        <w:br/>
-        <w:t xml:space="preserve">        }</w:t>
-        <w:br/>
-        <w:br/>
-        <w:t xml:space="preserve">        while (!stoppingToken.IsCancellationRequested)</w:t>
-        <w:br/>
-        <w:t xml:space="preserve">        {</w:t>
-        <w:br/>
-        <w:t xml:space="preserve">            try</w:t>
-        <w:br/>
-        <w:t xml:space="preserve">            {</w:t>
-        <w:br/>
-        <w:t xml:space="preserve">                await PushBatchAsync(stoppingToken);</w:t>
-        <w:br/>
-        <w:t xml:space="preserve">            }</w:t>
-        <w:br/>
-        <w:t xml:space="preserve">            catch (Exception ex)</w:t>
-        <w:br/>
-        <w:t xml:space="preserve">            {</w:t>
-        <w:br/>
-        <w:t xml:space="preserve">                _logger.LogError(ex, "[CentralSync] Lỗi trong tiến trình đồng bộ");</w:t>
-        <w:br/>
-        <w:t xml:space="preserve">            }</w:t>
-        <w:br/>
-        <w:br/>
-        <w:t xml:space="preserve">            await Task.Delay(30000, stoppingToken); // Chạy định kỳ mỗi 30 giây</w:t>
-        <w:br/>
-        <w:t xml:space="preserve">        }</w:t>
-        <w:br/>
-        <w:t xml:space="preserve">    }</w:t>
-        <w:br/>
-        <w:br/>
-        <w:t xml:space="preserve">    private async Task PushBatchAsync(CancellationToken ct)</w:t>
-        <w:br/>
-        <w:t xml:space="preserve">    {</w:t>
-        <w:br/>
-        <w:t xml:space="preserve">        using var scope = _scopeFactory.CreateScope();</w:t>
-        <w:br/>
-        <w:t xml:space="preserve">        var db = scope.ServiceProvider.GetRequiredService&lt;AppDbContext&gt;();</w:t>
-        <w:br/>
-        <w:br/>
-        <w:t xml:space="preserve">        var pending = await db.SyncQueues</w:t>
-        <w:br/>
-        <w:t xml:space="preserve">            .Where(q =&gt; q.Status == "pending" &amp;&amp; q.RetryCount &lt; 3)</w:t>
-        <w:br/>
-        <w:t xml:space="preserve">            .OrderBy(q =&gt; q.CreatedAt)</w:t>
-        <w:br/>
-        <w:t xml:space="preserve">            .Take(50)</w:t>
-        <w:br/>
-        <w:t xml:space="preserve">            .ToListAsync(ct);</w:t>
-        <w:br/>
-        <w:br/>
-        <w:t xml:space="preserve">        if (pending.Count == 0) return;</w:t>
-        <w:br/>
-        <w:br/>
-        <w:t xml:space="preserve">        var client = _httpClientFactory.CreateClient();</w:t>
-        <w:br/>
-        <w:t xml:space="preserve">        client.DefaultRequestHeaders.Add("X-Station-Id", _stationId);</w:t>
-        <w:br/>
-        <w:br/>
-        <w:t xml:space="preserve">        foreach (var item in pending)</w:t>
-        <w:br/>
-        <w:t xml:space="preserve">        {</w:t>
-        <w:br/>
-        <w:t xml:space="preserve">            try</w:t>
-        <w:br/>
-        <w:t xml:space="preserve">            {</w:t>
-        <w:br/>
-        <w:t xml:space="preserve">                var response = await client.PostAsJsonAsync($"{_centralUrl}/api/v1/ingest/telemetry", item.Payload, ct);</w:t>
-        <w:br/>
-        <w:t xml:space="preserve">                if (response.IsSuccessStatusCode)</w:t>
-        <w:br/>
-        <w:t xml:space="preserve">                {</w:t>
-        <w:br/>
-        <w:t xml:space="preserve">                    item.Status = "sent";</w:t>
-        <w:br/>
-        <w:t xml:space="preserve">                    item.SentAt = DateTime.UtcNow;</w:t>
-        <w:br/>
-        <w:t xml:space="preserve">                }</w:t>
-        <w:br/>
-        <w:t xml:space="preserve">                else</w:t>
-        <w:br/>
-        <w:t xml:space="preserve">                {</w:t>
-        <w:br/>
-        <w:t xml:space="preserve">                    item.RetryCount++;</w:t>
-        <w:br/>
-        <w:t xml:space="preserve">                    if (item.RetryCount &gt;= 3) item.Status = "failed";</w:t>
-        <w:br/>
-        <w:t xml:space="preserve">                }</w:t>
-        <w:br/>
-        <w:t xml:space="preserve">            }</w:t>
-        <w:br/>
-        <w:t xml:space="preserve">            catch</w:t>
-        <w:br/>
-        <w:t xml:space="preserve">            {</w:t>
-        <w:br/>
-        <w:t xml:space="preserve">                item.RetryCount++;</w:t>
-        <w:br/>
-        <w:t xml:space="preserve">                if (item.RetryCount &gt;= 3) item.Status = "failed";</w:t>
-        <w:br/>
-        <w:t xml:space="preserve">            }</w:t>
-        <w:br/>
-        <w:t xml:space="preserve">        }</w:t>
-        <w:br/>
-        <w:br/>
-        <w:t xml:space="preserve">        await db.SaveChangesAsync(ct);</w:t>
-        <w:br/>
-        <w:t xml:space="preserve">    }</w:t>
-        <w:br/>
-        <w:t>}</w:t>
+        <w:t>Module `StationOS.Services`</w:t>
+      </w:r>
+      <w:r>
+        <w:t>: Triển khai nghiệp vụ của ứng dụng:</w:t>
+      </w:r>
+    </w:p>
+    <w:p>
+      <w:pPr>
+        <w:pStyle w:val="ListBullet"/>
+        <w:spacing w:after="40" w:before="0"/>
+      </w:pPr>
+      <w:r>
+        <w:t>`LicenseService`: Giải mã, kiểm tra chữ ký khóa bản quyền dựa trên chữ ký MAC address và Machine GUID để cấp quyền sử dụng thiết bị cảm biến và số lượng trạm theo đúng gói giấy phép.</w:t>
+      </w:r>
+    </w:p>
+    <w:p>
+      <w:pPr>
+        <w:pStyle w:val="ListBullet"/>
+        <w:spacing w:after="40" w:before="0"/>
+      </w:pPr>
+      <w:r>
+        <w:t>`AuthService`: Băm mật khẩu người dùng, kiểm tra phân quyền RBAC (`Admin`, `Manager`, `Operator`).</w:t>
+      </w:r>
+    </w:p>
+    <w:p>
+      <w:pPr>
+        <w:pStyle w:val="ListBullet"/>
+        <w:spacing w:after="40" w:before="0"/>
+      </w:pPr>
+      <w:r/>
+      <w:r>
+        <w:rPr>
+          <w:b/>
+        </w:rPr>
+        <w:t>Module `StationOS.Workers`</w:t>
+      </w:r>
+      <w:r>
+        <w:t>: Các background worker chạy nền:</w:t>
+      </w:r>
+    </w:p>
+    <w:p>
+      <w:pPr>
+        <w:pStyle w:val="ListBullet"/>
+        <w:spacing w:after="40" w:before="0"/>
+      </w:pPr>
+      <w:r>
+        <w:t>`PlcPollingWorker`: Đọc mảng byte thô từ Siemens S7 và Modbus TCP, chuyển đổi định dạng Endian và lưu dữ liệu.</w:t>
+      </w:r>
+    </w:p>
+    <w:p>
+      <w:pPr>
+        <w:pStyle w:val="ListBullet"/>
+        <w:spacing w:after="40" w:before="0"/>
+      </w:pPr>
+      <w:r>
+        <w:t>`CentralSyncWorker`: Quản lý truyền tải dữ liệu đa trạm lên Cloud.</w:t>
+      </w:r>
+    </w:p>
+    <w:p>
+      <w:pPr>
+        <w:pStyle w:val="ListBullet"/>
+        <w:spacing w:after="40" w:before="0"/>
+      </w:pPr>
+      <w:r/>
+      <w:r>
+        <w:rPr>
+          <w:b/>
+        </w:rPr>
+        <w:t>Module `Electron Desktop`</w:t>
+      </w:r>
+      <w:r>
+        <w:t>: Quản lý vòng đời khởi chạy, tắt các service con, giải phóng cổng kết nối khi người dùng tắt ứng dụng trên hệ điều hành Windows.</w:t>
       </w:r>
     </w:p>
     <w:p>
@@ -9410,7 +11309,7 @@
           <w:color w:val="3572EF"/>
           <w:sz w:val="28"/>
         </w:rPr>
-        <w:t>IV. CÔNG ĐOẠN KIỂM THỬ &amp; SỬA LỖI (TESTING)</w:t>
+        <w:t>IV. CÔNG ĐOẠN KIỂM THỬ &amp; SỬ A LỖI (TESTING)</w:t>
       </w:r>
     </w:p>
     <w:p>
@@ -9424,1661 +11323,243 @@
           <w:color w:val="323232"/>
           <w:sz w:val="23"/>
         </w:rPr>
-        <w:t>1. Danh sách ca kiểm thử chi tiết hoàn chỉnh (Test Cases Specification)</w:t>
+        <w:t>1. Danh sách ca kiểm thử chi tiết hoàn chỉnh</w:t>
       </w:r>
     </w:p>
-    <w:tbl>
-      <w:tblPr>
-        <w:tblStyle w:val="TableGrid"/>
-        <w:tblW w:type="auto" w:w="0"/>
-        <w:tblLook w:firstColumn="1" w:firstRow="1" w:lastColumn="0" w:lastRow="0" w:noHBand="0" w:noVBand="1" w:val="04A0"/>
-      </w:tblPr>
-      <w:tblGrid>
-        <w:gridCol w:w="1337"/>
-        <w:gridCol w:w="1337"/>
-        <w:gridCol w:w="1337"/>
-        <w:gridCol w:w="1337"/>
-        <w:gridCol w:w="1337"/>
-        <w:gridCol w:w="1337"/>
-        <w:gridCol w:w="1337"/>
-      </w:tblGrid>
-      <w:tr>
-        <w:tc>
-          <w:tcPr>
-            <w:tcW w:type="dxa" w:w="1337"/>
-            <w:shd w:val="clear" w:color="auto" w:fill="102C57"/>
-          </w:tcPr>
-          <w:p>
-            <w:pPr>
-              <w:spacing w:after="80" w:before="80"/>
-              <w:jc w:val="left"/>
-            </w:pPr>
-            <w:r>
-              <w:rPr>
-                <w:b/>
-                <w:color w:val="FFFFFF"/>
-                <w:sz w:val="19"/>
-              </w:rPr>
-              <w:t>STT</w:t>
-            </w:r>
-          </w:p>
-        </w:tc>
-        <w:tc>
-          <w:tcPr>
-            <w:tcW w:type="dxa" w:w="1337"/>
-            <w:shd w:val="clear" w:color="auto" w:fill="102C57"/>
-          </w:tcPr>
-          <w:p>
-            <w:pPr>
-              <w:spacing w:after="80" w:before="80"/>
-              <w:jc w:val="left"/>
-            </w:pPr>
-            <w:r>
-              <w:rPr>
-                <w:b/>
-                <w:color w:val="FFFFFF"/>
-                <w:sz w:val="19"/>
-              </w:rPr>
-              <w:t>Mã TC</w:t>
-            </w:r>
-          </w:p>
-        </w:tc>
-        <w:tc>
-          <w:tcPr>
-            <w:tcW w:type="dxa" w:w="1337"/>
-            <w:shd w:val="clear" w:color="auto" w:fill="102C57"/>
-          </w:tcPr>
-          <w:p>
-            <w:pPr>
-              <w:spacing w:after="80" w:before="80"/>
-              <w:jc w:val="left"/>
-            </w:pPr>
-            <w:r>
-              <w:rPr>
-                <w:b/>
-                <w:color w:val="FFFFFF"/>
-                <w:sz w:val="19"/>
-              </w:rPr>
-              <w:t>Tên ca kiểm thử</w:t>
-            </w:r>
-          </w:p>
-        </w:tc>
-        <w:tc>
-          <w:tcPr>
-            <w:tcW w:type="dxa" w:w="1337"/>
-            <w:shd w:val="clear" w:color="auto" w:fill="102C57"/>
-          </w:tcPr>
-          <w:p>
-            <w:pPr>
-              <w:spacing w:after="80" w:before="80"/>
-              <w:jc w:val="left"/>
-            </w:pPr>
-            <w:r>
-              <w:rPr>
-                <w:b/>
-                <w:color w:val="FFFFFF"/>
-                <w:sz w:val="19"/>
-              </w:rPr>
-              <w:t>Điều kiện chuẩn bị</w:t>
-            </w:r>
-          </w:p>
-        </w:tc>
-        <w:tc>
-          <w:tcPr>
-            <w:tcW w:type="dxa" w:w="1337"/>
-            <w:shd w:val="clear" w:color="auto" w:fill="102C57"/>
-          </w:tcPr>
-          <w:p>
-            <w:pPr>
-              <w:spacing w:after="80" w:before="80"/>
-              <w:jc w:val="left"/>
-            </w:pPr>
-            <w:r>
-              <w:rPr>
-                <w:b/>
-                <w:color w:val="FFFFFF"/>
-                <w:sz w:val="19"/>
-              </w:rPr>
-              <w:t>Các bước thực hiện</w:t>
-            </w:r>
-          </w:p>
-        </w:tc>
-        <w:tc>
-          <w:tcPr>
-            <w:tcW w:type="dxa" w:w="1337"/>
-            <w:shd w:val="clear" w:color="auto" w:fill="102C57"/>
-          </w:tcPr>
-          <w:p>
-            <w:pPr>
-              <w:spacing w:after="80" w:before="80"/>
-              <w:jc w:val="left"/>
-            </w:pPr>
-            <w:r>
-              <w:rPr>
-                <w:b/>
-                <w:color w:val="FFFFFF"/>
-                <w:sz w:val="19"/>
-              </w:rPr>
-              <w:t>Kết quả kỳ vọng</w:t>
-            </w:r>
-          </w:p>
-        </w:tc>
-        <w:tc>
-          <w:tcPr>
-            <w:tcW w:type="dxa" w:w="1337"/>
-            <w:shd w:val="clear" w:color="auto" w:fill="102C57"/>
-          </w:tcPr>
-          <w:p>
-            <w:pPr>
-              <w:spacing w:after="80" w:before="80"/>
-              <w:jc w:val="left"/>
-            </w:pPr>
-            <w:r>
-              <w:rPr>
-                <w:b/>
-                <w:color w:val="FFFFFF"/>
-                <w:sz w:val="19"/>
-              </w:rPr>
-              <w:t>Trạng thái</w:t>
-            </w:r>
-          </w:p>
-        </w:tc>
-      </w:tr>
-      <w:tr>
-        <w:tc>
-          <w:tcPr>
-            <w:tcW w:type="dxa" w:w="1337"/>
-          </w:tcPr>
-          <w:p>
-            <w:pPr>
-              <w:spacing w:after="60" w:before="60"/>
-            </w:pPr>
-            <w:r>
-              <w:rPr>
-                <w:rFonts w:ascii="Arial" w:hAnsi="Arial"/>
-                <w:sz w:val="18"/>
-              </w:rPr>
-              <w:t>1</w:t>
-            </w:r>
-          </w:p>
-        </w:tc>
-        <w:tc>
-          <w:tcPr>
-            <w:tcW w:type="dxa" w:w="1337"/>
-          </w:tcPr>
-          <w:p>
-            <w:pPr>
-              <w:spacing w:after="60" w:before="60"/>
-            </w:pPr>
-            <w:r>
-              <w:rPr>
-                <w:rFonts w:ascii="Arial" w:hAnsi="Arial"/>
-                <w:sz w:val="18"/>
-              </w:rPr>
-              <w:t>**TC-001**</w:t>
-            </w:r>
-          </w:p>
-        </w:tc>
-        <w:tc>
-          <w:tcPr>
-            <w:tcW w:type="dxa" w:w="1337"/>
-          </w:tcPr>
-          <w:p>
-            <w:pPr>
-              <w:spacing w:after="60" w:before="60"/>
-            </w:pPr>
-            <w:r>
-              <w:rPr>
-                <w:rFonts w:ascii="Arial" w:hAnsi="Arial"/>
-                <w:sz w:val="18"/>
-              </w:rPr>
-              <w:t>Khởi tạo CSDL lần đầu</w:t>
-            </w:r>
-          </w:p>
-        </w:tc>
-        <w:tc>
-          <w:tcPr>
-            <w:tcW w:type="dxa" w:w="1337"/>
-          </w:tcPr>
-          <w:p>
-            <w:pPr>
-              <w:spacing w:after="60" w:before="60"/>
-            </w:pPr>
-            <w:r>
-              <w:rPr>
-                <w:rFonts w:ascii="Arial" w:hAnsi="Arial"/>
-                <w:sz w:val="18"/>
-              </w:rPr>
-              <w:t>Hệ thống sạch, chưa cài CSDL PostgreSQL.</w:t>
-            </w:r>
-          </w:p>
-        </w:tc>
-        <w:tc>
-          <w:tcPr>
-            <w:tcW w:type="dxa" w:w="1337"/>
-          </w:tcPr>
-          <w:p>
-            <w:pPr>
-              <w:spacing w:after="60" w:before="60"/>
-            </w:pPr>
-            <w:r>
-              <w:rPr>
-                <w:rFonts w:ascii="Arial" w:hAnsi="Arial"/>
-                <w:sz w:val="18"/>
-              </w:rPr>
-              <w:t>Khởi chạy tệp `.exe` cài đặt.</w:t>
-            </w:r>
-          </w:p>
-        </w:tc>
-        <w:tc>
-          <w:tcPr>
-            <w:tcW w:type="dxa" w:w="1337"/>
-          </w:tcPr>
-          <w:p>
-            <w:pPr>
-              <w:spacing w:after="60" w:before="60"/>
-            </w:pPr>
-            <w:r>
-              <w:rPr>
-                <w:rFonts w:ascii="Arial" w:hAnsi="Arial"/>
-                <w:sz w:val="18"/>
-              </w:rPr>
-              <w:t>Thư mục `pg_data` được tự động tạo tại thư mục người dùng `%APPDATA%/MasterStation/pg_data` và chạy ngầm cổng 6432.</w:t>
-            </w:r>
-          </w:p>
-        </w:tc>
-        <w:tc>
-          <w:tcPr>
-            <w:tcW w:type="dxa" w:w="1337"/>
-          </w:tcPr>
-          <w:p>
-            <w:pPr>
-              <w:spacing w:after="60" w:before="60"/>
-            </w:pPr>
-            <w:r>
-              <w:rPr>
-                <w:rFonts w:ascii="Arial" w:hAnsi="Arial"/>
-                <w:sz w:val="18"/>
-              </w:rPr>
-              <w:t>**ĐẠT (Passed)**</w:t>
-            </w:r>
-          </w:p>
-        </w:tc>
-      </w:tr>
-      <w:tr>
-        <w:tc>
-          <w:tcPr>
-            <w:tcW w:type="dxa" w:w="1337"/>
-            <w:shd w:val="clear" w:color="auto" w:fill="F2F4F7"/>
-          </w:tcPr>
-          <w:p>
-            <w:pPr>
-              <w:spacing w:after="60" w:before="60"/>
-            </w:pPr>
-            <w:r>
-              <w:rPr>
-                <w:rFonts w:ascii="Arial" w:hAnsi="Arial"/>
-                <w:sz w:val="18"/>
-              </w:rPr>
-              <w:t>2</w:t>
-            </w:r>
-          </w:p>
-        </w:tc>
-        <w:tc>
-          <w:tcPr>
-            <w:tcW w:type="dxa" w:w="1337"/>
-            <w:shd w:val="clear" w:color="auto" w:fill="F2F4F7"/>
-          </w:tcPr>
-          <w:p>
-            <w:pPr>
-              <w:spacing w:after="60" w:before="60"/>
-            </w:pPr>
-            <w:r>
-              <w:rPr>
-                <w:rFonts w:ascii="Arial" w:hAnsi="Arial"/>
-                <w:sz w:val="18"/>
-              </w:rPr>
-              <w:t>**TC-002**</w:t>
-            </w:r>
-          </w:p>
-        </w:tc>
-        <w:tc>
-          <w:tcPr>
-            <w:tcW w:type="dxa" w:w="1337"/>
-            <w:shd w:val="clear" w:color="auto" w:fill="F2F4F7"/>
-          </w:tcPr>
-          <w:p>
-            <w:pPr>
-              <w:spacing w:after="60" w:before="60"/>
-            </w:pPr>
-            <w:r>
-              <w:rPr>
-                <w:rFonts w:ascii="Arial" w:hAnsi="Arial"/>
-                <w:sz w:val="18"/>
-              </w:rPr>
-              <w:t>Sao chép sơ đồ SVG mẫu</w:t>
-            </w:r>
-          </w:p>
-        </w:tc>
-        <w:tc>
-          <w:tcPr>
-            <w:tcW w:type="dxa" w:w="1337"/>
-            <w:shd w:val="clear" w:color="auto" w:fill="F2F4F7"/>
-          </w:tcPr>
-          <w:p>
-            <w:pPr>
-              <w:spacing w:after="60" w:before="60"/>
-            </w:pPr>
-            <w:r>
-              <w:rPr>
-                <w:rFonts w:ascii="Arial" w:hAnsi="Arial"/>
-                <w:sz w:val="18"/>
-              </w:rPr>
-              <w:t>Không có tệp SVG trong AppData.</w:t>
-            </w:r>
-          </w:p>
-        </w:tc>
-        <w:tc>
-          <w:tcPr>
-            <w:tcW w:type="dxa" w:w="1337"/>
-            <w:shd w:val="clear" w:color="auto" w:fill="F2F4F7"/>
-          </w:tcPr>
-          <w:p>
-            <w:pPr>
-              <w:spacing w:after="60" w:before="60"/>
-            </w:pPr>
-            <w:r>
-              <w:rPr>
-                <w:rFonts w:ascii="Arial" w:hAnsi="Arial"/>
-                <w:sz w:val="18"/>
-              </w:rPr>
-              <w:t>Chạy ứng dụng. Logic `SeedDefaultSldAsync` kích hoạt.</w:t>
-            </w:r>
-          </w:p>
-        </w:tc>
-        <w:tc>
-          <w:tcPr>
-            <w:tcW w:type="dxa" w:w="1337"/>
-            <w:shd w:val="clear" w:color="auto" w:fill="F2F4F7"/>
-          </w:tcPr>
-          <w:p>
-            <w:pPr>
-              <w:spacing w:after="60" w:before="60"/>
-            </w:pPr>
-            <w:r>
-              <w:rPr>
-                <w:rFonts w:ascii="Arial" w:hAnsi="Arial"/>
-                <w:sz w:val="18"/>
-              </w:rPr>
-              <w:t>Tệp tin `7497ff6f-28c2-47a5-ba28-6b15f8a84c9c.svg` được copy an toàn từ ứng dụng nguồn sang AppData.</w:t>
-            </w:r>
-          </w:p>
-        </w:tc>
-        <w:tc>
-          <w:tcPr>
-            <w:tcW w:type="dxa" w:w="1337"/>
-            <w:shd w:val="clear" w:color="auto" w:fill="F2F4F7"/>
-          </w:tcPr>
-          <w:p>
-            <w:pPr>
-              <w:spacing w:after="60" w:before="60"/>
-            </w:pPr>
-            <w:r>
-              <w:rPr>
-                <w:rFonts w:ascii="Arial" w:hAnsi="Arial"/>
-                <w:sz w:val="18"/>
-              </w:rPr>
-              <w:t>**ĐẠT (Passed)**</w:t>
-            </w:r>
-          </w:p>
-        </w:tc>
-      </w:tr>
-      <w:tr>
-        <w:tc>
-          <w:tcPr>
-            <w:tcW w:type="dxa" w:w="1337"/>
-          </w:tcPr>
-          <w:p>
-            <w:pPr>
-              <w:spacing w:after="60" w:before="60"/>
-            </w:pPr>
-            <w:r>
-              <w:rPr>
-                <w:rFonts w:ascii="Arial" w:hAnsi="Arial"/>
-                <w:sz w:val="18"/>
-              </w:rPr>
-              <w:t>3</w:t>
-            </w:r>
-          </w:p>
-        </w:tc>
-        <w:tc>
-          <w:tcPr>
-            <w:tcW w:type="dxa" w:w="1337"/>
-          </w:tcPr>
-          <w:p>
-            <w:pPr>
-              <w:spacing w:after="60" w:before="60"/>
-            </w:pPr>
-            <w:r>
-              <w:rPr>
-                <w:rFonts w:ascii="Arial" w:hAnsi="Arial"/>
-                <w:sz w:val="18"/>
-              </w:rPr>
-              <w:t>**TC-003**</w:t>
-            </w:r>
-          </w:p>
-        </w:tc>
-        <w:tc>
-          <w:tcPr>
-            <w:tcW w:type="dxa" w:w="1337"/>
-          </w:tcPr>
-          <w:p>
-            <w:pPr>
-              <w:spacing w:after="60" w:before="60"/>
-            </w:pPr>
-            <w:r>
-              <w:rPr>
-                <w:rFonts w:ascii="Arial" w:hAnsi="Arial"/>
-                <w:sz w:val="18"/>
-              </w:rPr>
-              <w:t>Xác thực JWT và Đăng nhập</w:t>
-            </w:r>
-          </w:p>
-        </w:tc>
-        <w:tc>
-          <w:tcPr>
-            <w:tcW w:type="dxa" w:w="1337"/>
-          </w:tcPr>
-          <w:p>
-            <w:pPr>
-              <w:spacing w:after="60" w:before="60"/>
-            </w:pPr>
-            <w:r>
-              <w:rPr>
-                <w:rFonts w:ascii="Arial" w:hAnsi="Arial"/>
-                <w:sz w:val="18"/>
-              </w:rPr>
-              <w:t>Cơ sở dữ liệu đã cài đặt thành công.</w:t>
-            </w:r>
-          </w:p>
-        </w:tc>
-        <w:tc>
-          <w:tcPr>
-            <w:tcW w:type="dxa" w:w="1337"/>
-          </w:tcPr>
-          <w:p>
-            <w:pPr>
-              <w:spacing w:after="60" w:before="60"/>
-            </w:pPr>
-            <w:r>
-              <w:rPr>
-                <w:rFonts w:ascii="Arial" w:hAnsi="Arial"/>
-                <w:sz w:val="18"/>
-              </w:rPr>
-              <w:t>Nhập tài khoản `admin` / mật khẩu `admin`.</w:t>
-            </w:r>
-          </w:p>
-        </w:tc>
-        <w:tc>
-          <w:tcPr>
-            <w:tcW w:type="dxa" w:w="1337"/>
-          </w:tcPr>
-          <w:p>
-            <w:pPr>
-              <w:spacing w:after="60" w:before="60"/>
-            </w:pPr>
-            <w:r>
-              <w:rPr>
-                <w:rFonts w:ascii="Arial" w:hAnsi="Arial"/>
-                <w:sz w:val="18"/>
-              </w:rPr>
-              <w:t>Đăng nhập thành công, token JWT lưu vào LocalStorage, chuyển hướng vào Dashboard.</w:t>
-            </w:r>
-          </w:p>
-        </w:tc>
-        <w:tc>
-          <w:tcPr>
-            <w:tcW w:type="dxa" w:w="1337"/>
-          </w:tcPr>
-          <w:p>
-            <w:pPr>
-              <w:spacing w:after="60" w:before="60"/>
-            </w:pPr>
-            <w:r>
-              <w:rPr>
-                <w:rFonts w:ascii="Arial" w:hAnsi="Arial"/>
-                <w:sz w:val="18"/>
-              </w:rPr>
-              <w:t>**ĐẠT (Passed)**</w:t>
-            </w:r>
-          </w:p>
-        </w:tc>
-      </w:tr>
-      <w:tr>
-        <w:tc>
-          <w:tcPr>
-            <w:tcW w:type="dxa" w:w="1337"/>
-            <w:shd w:val="clear" w:color="auto" w:fill="F2F4F7"/>
-          </w:tcPr>
-          <w:p>
-            <w:pPr>
-              <w:spacing w:after="60" w:before="60"/>
-            </w:pPr>
-            <w:r>
-              <w:rPr>
-                <w:rFonts w:ascii="Arial" w:hAnsi="Arial"/>
-                <w:sz w:val="18"/>
-              </w:rPr>
-              <w:t>4</w:t>
-            </w:r>
-          </w:p>
-        </w:tc>
-        <w:tc>
-          <w:tcPr>
-            <w:tcW w:type="dxa" w:w="1337"/>
-            <w:shd w:val="clear" w:color="auto" w:fill="F2F4F7"/>
-          </w:tcPr>
-          <w:p>
-            <w:pPr>
-              <w:spacing w:after="60" w:before="60"/>
-            </w:pPr>
-            <w:r>
-              <w:rPr>
-                <w:rFonts w:ascii="Arial" w:hAnsi="Arial"/>
-                <w:sz w:val="18"/>
-              </w:rPr>
-              <w:t>**TC-004**</w:t>
-            </w:r>
-          </w:p>
-        </w:tc>
-        <w:tc>
-          <w:tcPr>
-            <w:tcW w:type="dxa" w:w="1337"/>
-            <w:shd w:val="clear" w:color="auto" w:fill="F2F4F7"/>
-          </w:tcPr>
-          <w:p>
-            <w:pPr>
-              <w:spacing w:after="60" w:before="60"/>
-            </w:pPr>
-            <w:r>
-              <w:rPr>
-                <w:rFonts w:ascii="Arial" w:hAnsi="Arial"/>
-                <w:sz w:val="18"/>
-              </w:rPr>
-              <w:t>Dò tìm ONVIF tự động</w:t>
-            </w:r>
-          </w:p>
-        </w:tc>
-        <w:tc>
-          <w:tcPr>
-            <w:tcW w:type="dxa" w:w="1337"/>
-            <w:shd w:val="clear" w:color="auto" w:fill="F2F4F7"/>
-          </w:tcPr>
-          <w:p>
-            <w:pPr>
-              <w:spacing w:after="60" w:before="60"/>
-            </w:pPr>
-            <w:r>
-              <w:rPr>
-                <w:rFonts w:ascii="Arial" w:hAnsi="Arial"/>
-                <w:sz w:val="18"/>
-              </w:rPr>
-              <w:t>Camera ONVIF hoạt động cùng subnet mạng LAN.</w:t>
-            </w:r>
-          </w:p>
-        </w:tc>
-        <w:tc>
-          <w:tcPr>
-            <w:tcW w:type="dxa" w:w="1337"/>
-            <w:shd w:val="clear" w:color="auto" w:fill="F2F4F7"/>
-          </w:tcPr>
-          <w:p>
-            <w:pPr>
-              <w:spacing w:after="60" w:before="60"/>
-            </w:pPr>
-            <w:r>
-              <w:rPr>
-                <w:rFonts w:ascii="Arial" w:hAnsi="Arial"/>
-                <w:sz w:val="18"/>
-              </w:rPr>
-              <w:t>Bấm nút quét ONVIF trong Cấu hình thiết bị.</w:t>
-            </w:r>
-          </w:p>
-        </w:tc>
-        <w:tc>
-          <w:tcPr>
-            <w:tcW w:type="dxa" w:w="1337"/>
-            <w:shd w:val="clear" w:color="auto" w:fill="F2F4F7"/>
-          </w:tcPr>
-          <w:p>
-            <w:pPr>
-              <w:spacing w:after="60" w:before="60"/>
-            </w:pPr>
-            <w:r>
-              <w:rPr>
-                <w:rFonts w:ascii="Arial" w:hAnsi="Arial"/>
-                <w:sz w:val="18"/>
-              </w:rPr>
-              <w:t>Quét được IP, lấy được RTSP URL của camera hiển thị lên lưới dữ liệu.</w:t>
-            </w:r>
-          </w:p>
-        </w:tc>
-        <w:tc>
-          <w:tcPr>
-            <w:tcW w:type="dxa" w:w="1337"/>
-            <w:shd w:val="clear" w:color="auto" w:fill="F2F4F7"/>
-          </w:tcPr>
-          <w:p>
-            <w:pPr>
-              <w:spacing w:after="60" w:before="60"/>
-            </w:pPr>
-            <w:r>
-              <w:rPr>
-                <w:rFonts w:ascii="Arial" w:hAnsi="Arial"/>
-                <w:sz w:val="18"/>
-              </w:rPr>
-              <w:t>**ĐẠT (Passed)**</w:t>
-            </w:r>
-          </w:p>
-        </w:tc>
-      </w:tr>
-      <w:tr>
-        <w:tc>
-          <w:tcPr>
-            <w:tcW w:type="dxa" w:w="1337"/>
-          </w:tcPr>
-          <w:p>
-            <w:pPr>
-              <w:spacing w:after="60" w:before="60"/>
-            </w:pPr>
-            <w:r>
-              <w:rPr>
-                <w:rFonts w:ascii="Arial" w:hAnsi="Arial"/>
-                <w:sz w:val="18"/>
-              </w:rPr>
-              <w:t>5</w:t>
-            </w:r>
-          </w:p>
-        </w:tc>
-        <w:tc>
-          <w:tcPr>
-            <w:tcW w:type="dxa" w:w="1337"/>
-          </w:tcPr>
-          <w:p>
-            <w:pPr>
-              <w:spacing w:after="60" w:before="60"/>
-            </w:pPr>
-            <w:r>
-              <w:rPr>
-                <w:rFonts w:ascii="Arial" w:hAnsi="Arial"/>
-                <w:sz w:val="18"/>
-              </w:rPr>
-              <w:t>**TC-005**</w:t>
-            </w:r>
-          </w:p>
-        </w:tc>
-        <w:tc>
-          <w:tcPr>
-            <w:tcW w:type="dxa" w:w="1337"/>
-          </w:tcPr>
-          <w:p>
-            <w:pPr>
-              <w:spacing w:after="60" w:before="60"/>
-            </w:pPr>
-            <w:r>
-              <w:rPr>
-                <w:rFonts w:ascii="Arial" w:hAnsi="Arial"/>
-                <w:sz w:val="18"/>
-              </w:rPr>
-              <w:t>Thêm thiết bị camera RTSP</w:t>
-            </w:r>
-          </w:p>
-        </w:tc>
-        <w:tc>
-          <w:tcPr>
-            <w:tcW w:type="dxa" w:w="1337"/>
-          </w:tcPr>
-          <w:p>
-            <w:pPr>
-              <w:spacing w:after="60" w:before="60"/>
-            </w:pPr>
-            <w:r>
-              <w:rPr>
-                <w:rFonts w:ascii="Arial" w:hAnsi="Arial"/>
-                <w:sz w:val="18"/>
-              </w:rPr>
-              <w:t>Có link camera RTSP khả dụng.</w:t>
-            </w:r>
-          </w:p>
-        </w:tc>
-        <w:tc>
-          <w:tcPr>
-            <w:tcW w:type="dxa" w:w="1337"/>
-          </w:tcPr>
-          <w:p>
-            <w:pPr>
-              <w:spacing w:after="60" w:before="60"/>
-            </w:pPr>
-            <w:r>
-              <w:rPr>
-                <w:rFonts w:ascii="Arial" w:hAnsi="Arial"/>
-                <w:sz w:val="18"/>
-              </w:rPr>
-              <w:t>Nhập cấu hình camera thủ công vào Form và lưu lại.</w:t>
-            </w:r>
-          </w:p>
-        </w:tc>
-        <w:tc>
-          <w:tcPr>
-            <w:tcW w:type="dxa" w:w="1337"/>
-          </w:tcPr>
-          <w:p>
-            <w:pPr>
-              <w:spacing w:after="60" w:before="60"/>
-            </w:pPr>
-            <w:r>
-              <w:rPr>
-                <w:rFonts w:ascii="Arial" w:hAnsi="Arial"/>
-                <w:sz w:val="18"/>
-              </w:rPr>
-              <w:t>Bản ghi lưu vào bảng `Devices`, go2rtc nhận cấu hình mới và khởi tạo kênh stream.</w:t>
-            </w:r>
-          </w:p>
-        </w:tc>
-        <w:tc>
-          <w:tcPr>
-            <w:tcW w:type="dxa" w:w="1337"/>
-          </w:tcPr>
-          <w:p>
-            <w:pPr>
-              <w:spacing w:after="60" w:before="60"/>
-            </w:pPr>
-            <w:r>
-              <w:rPr>
-                <w:rFonts w:ascii="Arial" w:hAnsi="Arial"/>
-                <w:sz w:val="18"/>
-              </w:rPr>
-              <w:t>**ĐẠT (Passed)**</w:t>
-            </w:r>
-          </w:p>
-        </w:tc>
-      </w:tr>
-      <w:tr>
-        <w:tc>
-          <w:tcPr>
-            <w:tcW w:type="dxa" w:w="1337"/>
-            <w:shd w:val="clear" w:color="auto" w:fill="F2F4F7"/>
-          </w:tcPr>
-          <w:p>
-            <w:pPr>
-              <w:spacing w:after="60" w:before="60"/>
-            </w:pPr>
-            <w:r>
-              <w:rPr>
-                <w:rFonts w:ascii="Arial" w:hAnsi="Arial"/>
-                <w:sz w:val="18"/>
-              </w:rPr>
-              <w:t>6</w:t>
-            </w:r>
-          </w:p>
-        </w:tc>
-        <w:tc>
-          <w:tcPr>
-            <w:tcW w:type="dxa" w:w="1337"/>
-            <w:shd w:val="clear" w:color="auto" w:fill="F2F4F7"/>
-          </w:tcPr>
-          <w:p>
-            <w:pPr>
-              <w:spacing w:after="60" w:before="60"/>
-            </w:pPr>
-            <w:r>
-              <w:rPr>
-                <w:rFonts w:ascii="Arial" w:hAnsi="Arial"/>
-                <w:sz w:val="18"/>
-              </w:rPr>
-              <w:t>**TC-006**</w:t>
-            </w:r>
-          </w:p>
-        </w:tc>
-        <w:tc>
-          <w:tcPr>
-            <w:tcW w:type="dxa" w:w="1337"/>
-            <w:shd w:val="clear" w:color="auto" w:fill="F2F4F7"/>
-          </w:tcPr>
-          <w:p>
-            <w:pPr>
-              <w:spacing w:after="60" w:before="60"/>
-            </w:pPr>
-            <w:r>
-              <w:rPr>
-                <w:rFonts w:ascii="Arial" w:hAnsi="Arial"/>
-                <w:sz w:val="18"/>
-              </w:rPr>
-              <w:t>Xem trực tuyến WebRTC</w:t>
-            </w:r>
-          </w:p>
-        </w:tc>
-        <w:tc>
-          <w:tcPr>
-            <w:tcW w:type="dxa" w:w="1337"/>
-            <w:shd w:val="clear" w:color="auto" w:fill="F2F4F7"/>
-          </w:tcPr>
-          <w:p>
-            <w:pPr>
-              <w:spacing w:after="60" w:before="60"/>
-            </w:pPr>
-            <w:r>
-              <w:rPr>
-                <w:rFonts w:ascii="Arial" w:hAnsi="Arial"/>
-                <w:sz w:val="18"/>
-              </w:rPr>
-              <w:t>Thiết bị camera đã kết nối trực tuyến.</w:t>
-            </w:r>
-          </w:p>
-        </w:tc>
-        <w:tc>
-          <w:tcPr>
-            <w:tcW w:type="dxa" w:w="1337"/>
-            <w:shd w:val="clear" w:color="auto" w:fill="F2F4F7"/>
-          </w:tcPr>
-          <w:p>
-            <w:pPr>
-              <w:spacing w:after="60" w:before="60"/>
-            </w:pPr>
-            <w:r>
-              <w:rPr>
-                <w:rFonts w:ascii="Arial" w:hAnsi="Arial"/>
-                <w:sz w:val="18"/>
-              </w:rPr>
-              <w:t>Truy cập trang giám sát, chọn camera xem trực tiếp.</w:t>
-            </w:r>
-          </w:p>
-        </w:tc>
-        <w:tc>
-          <w:tcPr>
-            <w:tcW w:type="dxa" w:w="1337"/>
-            <w:shd w:val="clear" w:color="auto" w:fill="F2F4F7"/>
-          </w:tcPr>
-          <w:p>
-            <w:pPr>
-              <w:spacing w:after="60" w:before="60"/>
-            </w:pPr>
-            <w:r>
-              <w:rPr>
-                <w:rFonts w:ascii="Arial" w:hAnsi="Arial"/>
-                <w:sz w:val="18"/>
-              </w:rPr>
-              <w:t>Luồng camera hiển thị mượt mà với độ trễ dưới 1 giây, không nhấp nháy, không rác hình.</w:t>
-            </w:r>
-          </w:p>
-        </w:tc>
-        <w:tc>
-          <w:tcPr>
-            <w:tcW w:type="dxa" w:w="1337"/>
-            <w:shd w:val="clear" w:color="auto" w:fill="F2F4F7"/>
-          </w:tcPr>
-          <w:p>
-            <w:pPr>
-              <w:spacing w:after="60" w:before="60"/>
-            </w:pPr>
-            <w:r>
-              <w:rPr>
-                <w:rFonts w:ascii="Arial" w:hAnsi="Arial"/>
-                <w:sz w:val="18"/>
-              </w:rPr>
-              <w:t>**ĐẠT (Passed)**</w:t>
-            </w:r>
-          </w:p>
-        </w:tc>
-      </w:tr>
-      <w:tr>
-        <w:tc>
-          <w:tcPr>
-            <w:tcW w:type="dxa" w:w="1337"/>
-          </w:tcPr>
-          <w:p>
-            <w:pPr>
-              <w:spacing w:after="60" w:before="60"/>
-            </w:pPr>
-            <w:r>
-              <w:rPr>
-                <w:rFonts w:ascii="Arial" w:hAnsi="Arial"/>
-                <w:sz w:val="18"/>
-              </w:rPr>
-              <w:t>7</w:t>
-            </w:r>
-          </w:p>
-        </w:tc>
-        <w:tc>
-          <w:tcPr>
-            <w:tcW w:type="dxa" w:w="1337"/>
-          </w:tcPr>
-          <w:p>
-            <w:pPr>
-              <w:spacing w:after="60" w:before="60"/>
-            </w:pPr>
-            <w:r>
-              <w:rPr>
-                <w:rFonts w:ascii="Arial" w:hAnsi="Arial"/>
-                <w:sz w:val="18"/>
-              </w:rPr>
-              <w:t>**TC-007**</w:t>
-            </w:r>
-          </w:p>
-        </w:tc>
-        <w:tc>
-          <w:tcPr>
-            <w:tcW w:type="dxa" w:w="1337"/>
-          </w:tcPr>
-          <w:p>
-            <w:pPr>
-              <w:spacing w:after="60" w:before="60"/>
-            </w:pPr>
-            <w:r>
-              <w:rPr>
-                <w:rFonts w:ascii="Arial" w:hAnsi="Arial"/>
-                <w:sz w:val="18"/>
-              </w:rPr>
-              <w:t>Nhận diện mất kết nối</w:t>
-            </w:r>
-          </w:p>
-        </w:tc>
-        <w:tc>
-          <w:tcPr>
-            <w:tcW w:type="dxa" w:w="1337"/>
-          </w:tcPr>
-          <w:p>
-            <w:pPr>
-              <w:spacing w:after="60" w:before="60"/>
-            </w:pPr>
-            <w:r>
-              <w:rPr>
-                <w:rFonts w:ascii="Arial" w:hAnsi="Arial"/>
-                <w:sz w:val="18"/>
-              </w:rPr>
-              <w:t>Thiết bị cảm biến đang hiển thị số đo trực quan.</w:t>
-            </w:r>
-          </w:p>
-        </w:tc>
-        <w:tc>
-          <w:tcPr>
-            <w:tcW w:type="dxa" w:w="1337"/>
-          </w:tcPr>
-          <w:p>
-            <w:pPr>
-              <w:spacing w:after="60" w:before="60"/>
-            </w:pPr>
-            <w:r>
-              <w:rPr>
-                <w:rFonts w:ascii="Arial" w:hAnsi="Arial"/>
-                <w:sz w:val="18"/>
-              </w:rPr>
-              <w:t>Rút cáp mạng vật lý của thiết bị cảm biến Modbus.</w:t>
-            </w:r>
-          </w:p>
-        </w:tc>
-        <w:tc>
-          <w:tcPr>
-            <w:tcW w:type="dxa" w:w="1337"/>
-          </w:tcPr>
-          <w:p>
-            <w:pPr>
-              <w:spacing w:after="60" w:before="60"/>
-            </w:pPr>
-            <w:r>
-              <w:rPr>
-                <w:rFonts w:ascii="Arial" w:hAnsi="Arial"/>
-                <w:sz w:val="18"/>
-              </w:rPr>
-              <w:t>Trạng thái thiết bị đổi sang Offline, số liệu trên sơ đồ một sợi chuyển thành dạng nét đứt `-----` sau 2 giây.</w:t>
-            </w:r>
-          </w:p>
-        </w:tc>
-        <w:tc>
-          <w:tcPr>
-            <w:tcW w:type="dxa" w:w="1337"/>
-          </w:tcPr>
-          <w:p>
-            <w:pPr>
-              <w:spacing w:after="60" w:before="60"/>
-            </w:pPr>
-            <w:r>
-              <w:rPr>
-                <w:rFonts w:ascii="Arial" w:hAnsi="Arial"/>
-                <w:sz w:val="18"/>
-              </w:rPr>
-              <w:t>**ĐẠT (Passed)**</w:t>
-            </w:r>
-          </w:p>
-        </w:tc>
-      </w:tr>
-      <w:tr>
-        <w:tc>
-          <w:tcPr>
-            <w:tcW w:type="dxa" w:w="1337"/>
-            <w:shd w:val="clear" w:color="auto" w:fill="F2F4F7"/>
-          </w:tcPr>
-          <w:p>
-            <w:pPr>
-              <w:spacing w:after="60" w:before="60"/>
-            </w:pPr>
-            <w:r>
-              <w:rPr>
-                <w:rFonts w:ascii="Arial" w:hAnsi="Arial"/>
-                <w:sz w:val="18"/>
-              </w:rPr>
-              <w:t>8</w:t>
-            </w:r>
-          </w:p>
-        </w:tc>
-        <w:tc>
-          <w:tcPr>
-            <w:tcW w:type="dxa" w:w="1337"/>
-            <w:shd w:val="clear" w:color="auto" w:fill="F2F4F7"/>
-          </w:tcPr>
-          <w:p>
-            <w:pPr>
-              <w:spacing w:after="60" w:before="60"/>
-            </w:pPr>
-            <w:r>
-              <w:rPr>
-                <w:rFonts w:ascii="Arial" w:hAnsi="Arial"/>
-                <w:sz w:val="18"/>
-              </w:rPr>
-              <w:t>**TC-008**</w:t>
-            </w:r>
-          </w:p>
-        </w:tc>
-        <w:tc>
-          <w:tcPr>
-            <w:tcW w:type="dxa" w:w="1337"/>
-            <w:shd w:val="clear" w:color="auto" w:fill="F2F4F7"/>
-          </w:tcPr>
-          <w:p>
-            <w:pPr>
-              <w:spacing w:after="60" w:before="60"/>
-            </w:pPr>
-            <w:r>
-              <w:rPr>
-                <w:rFonts w:ascii="Arial" w:hAnsi="Arial"/>
-                <w:sz w:val="18"/>
-              </w:rPr>
-              <w:t>Đồng bộ màu sắc dropdown</w:t>
-            </w:r>
-          </w:p>
-        </w:tc>
-        <w:tc>
-          <w:tcPr>
-            <w:tcW w:type="dxa" w:w="1337"/>
-            <w:shd w:val="clear" w:color="auto" w:fill="F2F4F7"/>
-          </w:tcPr>
-          <w:p>
-            <w:pPr>
-              <w:spacing w:after="60" w:before="60"/>
-            </w:pPr>
-            <w:r>
-              <w:rPr>
-                <w:rFonts w:ascii="Arial" w:hAnsi="Arial"/>
-                <w:sz w:val="18"/>
-              </w:rPr>
-              <w:t>Chuyển đổi giao diện sang các theme khác nhau.</w:t>
-            </w:r>
-          </w:p>
-        </w:tc>
-        <w:tc>
-          <w:tcPr>
-            <w:tcW w:type="dxa" w:w="1337"/>
-            <w:shd w:val="clear" w:color="auto" w:fill="F2F4F7"/>
-          </w:tcPr>
-          <w:p>
-            <w:pPr>
-              <w:spacing w:after="60" w:before="60"/>
-            </w:pPr>
-            <w:r>
-              <w:rPr>
-                <w:rFonts w:ascii="Arial" w:hAnsi="Arial"/>
-                <w:sz w:val="18"/>
-              </w:rPr>
-              <w:t>Mở rộng danh sách chọn Camera ở góc phải Dashboard.</w:t>
-            </w:r>
-          </w:p>
-        </w:tc>
-        <w:tc>
-          <w:tcPr>
-            <w:tcW w:type="dxa" w:w="1337"/>
-            <w:shd w:val="clear" w:color="auto" w:fill="F2F4F7"/>
-          </w:tcPr>
-          <w:p>
-            <w:pPr>
-              <w:spacing w:after="60" w:before="60"/>
-            </w:pPr>
-            <w:r>
-              <w:rPr>
-                <w:rFonts w:ascii="Arial" w:hAnsi="Arial"/>
-                <w:sz w:val="18"/>
-              </w:rPr>
-              <w:t>Màu chữ và màu nền dropdown thay đổi tương ứng, đảm bảo rõ chữ, không bị trắng-trên-trắng.</w:t>
-            </w:r>
-          </w:p>
-        </w:tc>
-        <w:tc>
-          <w:tcPr>
-            <w:tcW w:type="dxa" w:w="1337"/>
-            <w:shd w:val="clear" w:color="auto" w:fill="F2F4F7"/>
-          </w:tcPr>
-          <w:p>
-            <w:pPr>
-              <w:spacing w:after="60" w:before="60"/>
-            </w:pPr>
-            <w:r>
-              <w:rPr>
-                <w:rFonts w:ascii="Arial" w:hAnsi="Arial"/>
-                <w:sz w:val="18"/>
-              </w:rPr>
-              <w:t>**ĐẠT (Passed)**</w:t>
-            </w:r>
-          </w:p>
-        </w:tc>
-      </w:tr>
-      <w:tr>
-        <w:tc>
-          <w:tcPr>
-            <w:tcW w:type="dxa" w:w="1337"/>
-          </w:tcPr>
-          <w:p>
-            <w:pPr>
-              <w:spacing w:after="60" w:before="60"/>
-            </w:pPr>
-            <w:r>
-              <w:rPr>
-                <w:rFonts w:ascii="Arial" w:hAnsi="Arial"/>
-                <w:sz w:val="18"/>
-              </w:rPr>
-              <w:t>9</w:t>
-            </w:r>
-          </w:p>
-        </w:tc>
-        <w:tc>
-          <w:tcPr>
-            <w:tcW w:type="dxa" w:w="1337"/>
-          </w:tcPr>
-          <w:p>
-            <w:pPr>
-              <w:spacing w:after="60" w:before="60"/>
-            </w:pPr>
-            <w:r>
-              <w:rPr>
-                <w:rFonts w:ascii="Arial" w:hAnsi="Arial"/>
-                <w:sz w:val="18"/>
-              </w:rPr>
-              <w:t>**TC-009**</w:t>
-            </w:r>
-          </w:p>
-        </w:tc>
-        <w:tc>
-          <w:tcPr>
-            <w:tcW w:type="dxa" w:w="1337"/>
-          </w:tcPr>
-          <w:p>
-            <w:pPr>
-              <w:spacing w:after="60" w:before="60"/>
-            </w:pPr>
-            <w:r>
-              <w:rPr>
-                <w:rFonts w:ascii="Arial" w:hAnsi="Arial"/>
-                <w:sz w:val="18"/>
-              </w:rPr>
-              <w:t>Cảnh báo vượt ngưỡng</w:t>
-            </w:r>
-          </w:p>
-        </w:tc>
-        <w:tc>
-          <w:tcPr>
-            <w:tcW w:type="dxa" w:w="1337"/>
-          </w:tcPr>
-          <w:p>
-            <w:pPr>
-              <w:spacing w:after="60" w:before="60"/>
-            </w:pPr>
-            <w:r>
-              <w:rPr>
-                <w:rFonts w:ascii="Arial" w:hAnsi="Arial"/>
-                <w:sz w:val="18"/>
-              </w:rPr>
-              <w:t>Cài ngưỡng cảnh báo nhiệt độ máy biến áp là 75°C.</w:t>
-            </w:r>
-          </w:p>
-        </w:tc>
-        <w:tc>
-          <w:tcPr>
-            <w:tcW w:type="dxa" w:w="1337"/>
-          </w:tcPr>
-          <w:p>
-            <w:pPr>
-              <w:spacing w:after="60" w:before="60"/>
-            </w:pPr>
-            <w:r>
-              <w:rPr>
-                <w:rFonts w:ascii="Arial" w:hAnsi="Arial"/>
-                <w:sz w:val="18"/>
-              </w:rPr>
-              <w:t>Giả lập nguồn nhiệt tăng vượt ngưỡng (80°C).</w:t>
-            </w:r>
-          </w:p>
-        </w:tc>
-        <w:tc>
-          <w:tcPr>
-            <w:tcW w:type="dxa" w:w="1337"/>
-          </w:tcPr>
-          <w:p>
-            <w:pPr>
-              <w:spacing w:after="60" w:before="60"/>
-            </w:pPr>
-            <w:r>
-              <w:rPr>
-                <w:rFonts w:ascii="Arial" w:hAnsi="Arial"/>
-                <w:sz w:val="18"/>
-              </w:rPr>
-              <w:t>Hệ thống kích hoạt còi báo, nhấp nháy đỏ trên sơ đồ SLD, và ghi lịch sử cảnh báo vào bảng `Alerts`.</w:t>
-            </w:r>
-          </w:p>
-        </w:tc>
-        <w:tc>
-          <w:tcPr>
-            <w:tcW w:type="dxa" w:w="1337"/>
-          </w:tcPr>
-          <w:p>
-            <w:pPr>
-              <w:spacing w:after="60" w:before="60"/>
-            </w:pPr>
-            <w:r>
-              <w:rPr>
-                <w:rFonts w:ascii="Arial" w:hAnsi="Arial"/>
-                <w:sz w:val="18"/>
-              </w:rPr>
-              <w:t>**ĐẠT (Passed)**</w:t>
-            </w:r>
-          </w:p>
-        </w:tc>
-      </w:tr>
-      <w:tr>
-        <w:tc>
-          <w:tcPr>
-            <w:tcW w:type="dxa" w:w="1337"/>
-            <w:shd w:val="clear" w:color="auto" w:fill="F2F4F7"/>
-          </w:tcPr>
-          <w:p>
-            <w:pPr>
-              <w:spacing w:after="60" w:before="60"/>
-            </w:pPr>
-            <w:r>
-              <w:rPr>
-                <w:rFonts w:ascii="Arial" w:hAnsi="Arial"/>
-                <w:sz w:val="18"/>
-              </w:rPr>
-              <w:t>10</w:t>
-            </w:r>
-          </w:p>
-        </w:tc>
-        <w:tc>
-          <w:tcPr>
-            <w:tcW w:type="dxa" w:w="1337"/>
-            <w:shd w:val="clear" w:color="auto" w:fill="F2F4F7"/>
-          </w:tcPr>
-          <w:p>
-            <w:pPr>
-              <w:spacing w:after="60" w:before="60"/>
-            </w:pPr>
-            <w:r>
-              <w:rPr>
-                <w:rFonts w:ascii="Arial" w:hAnsi="Arial"/>
-                <w:sz w:val="18"/>
-              </w:rPr>
-              <w:t>**TC-010**</w:t>
-            </w:r>
-          </w:p>
-        </w:tc>
-        <w:tc>
-          <w:tcPr>
-            <w:tcW w:type="dxa" w:w="1337"/>
-            <w:shd w:val="clear" w:color="auto" w:fill="F2F4F7"/>
-          </w:tcPr>
-          <w:p>
-            <w:pPr>
-              <w:spacing w:after="60" w:before="60"/>
-            </w:pPr>
-            <w:r>
-              <w:rPr>
-                <w:rFonts w:ascii="Arial" w:hAnsi="Arial"/>
-                <w:sz w:val="18"/>
-              </w:rPr>
-              <w:t>Đồng bộ dữ liệu SyncQueue</w:t>
-            </w:r>
-          </w:p>
-        </w:tc>
-        <w:tc>
-          <w:tcPr>
-            <w:tcW w:type="dxa" w:w="1337"/>
-            <w:shd w:val="clear" w:color="auto" w:fill="F2F4F7"/>
-          </w:tcPr>
-          <w:p>
-            <w:pPr>
-              <w:spacing w:after="60" w:before="60"/>
-            </w:pPr>
-            <w:r>
-              <w:rPr>
-                <w:rFonts w:ascii="Arial" w:hAnsi="Arial"/>
-                <w:sz w:val="18"/>
-              </w:rPr>
-              <w:t>Thiết bị bị mất kết nối với trạm tổng tạm thời.</w:t>
-            </w:r>
-          </w:p>
-        </w:tc>
-        <w:tc>
-          <w:tcPr>
-            <w:tcW w:type="dxa" w:w="1337"/>
-            <w:shd w:val="clear" w:color="auto" w:fill="F2F4F7"/>
-          </w:tcPr>
-          <w:p>
-            <w:pPr>
-              <w:spacing w:after="60" w:before="60"/>
-            </w:pPr>
-            <w:r>
-              <w:rPr>
-                <w:rFonts w:ascii="Arial" w:hAnsi="Arial"/>
-                <w:sz w:val="18"/>
-              </w:rPr>
-              <w:t>Tắt mạng Internet của trạm con, thực hiện đo dữ liệu, sau đó bật lại mạng.</w:t>
-            </w:r>
-          </w:p>
-        </w:tc>
-        <w:tc>
-          <w:tcPr>
-            <w:tcW w:type="dxa" w:w="1337"/>
-            <w:shd w:val="clear" w:color="auto" w:fill="F2F4F7"/>
-          </w:tcPr>
-          <w:p>
-            <w:pPr>
-              <w:spacing w:after="60" w:before="60"/>
-            </w:pPr>
-            <w:r>
-              <w:rPr>
-                <w:rFonts w:ascii="Arial" w:hAnsi="Arial"/>
-                <w:sz w:val="18"/>
-              </w:rPr>
-              <w:t>Dữ liệu tích lũy trong `SyncQueues` với trạng thái `pending` tự động đồng bộ hết lên trạm tổng sau khi khôi phục mạng.</w:t>
-            </w:r>
-          </w:p>
-        </w:tc>
-        <w:tc>
-          <w:tcPr>
-            <w:tcW w:type="dxa" w:w="1337"/>
-            <w:shd w:val="clear" w:color="auto" w:fill="F2F4F7"/>
-          </w:tcPr>
-          <w:p>
-            <w:pPr>
-              <w:spacing w:after="60" w:before="60"/>
-            </w:pPr>
-            <w:r>
-              <w:rPr>
-                <w:rFonts w:ascii="Arial" w:hAnsi="Arial"/>
-                <w:sz w:val="18"/>
-              </w:rPr>
-              <w:t>**ĐẠT (Passed)**</w:t>
-            </w:r>
-          </w:p>
-        </w:tc>
-      </w:tr>
-      <w:tr>
-        <w:tc>
-          <w:tcPr>
-            <w:tcW w:type="dxa" w:w="1337"/>
-          </w:tcPr>
-          <w:p>
-            <w:pPr>
-              <w:spacing w:after="60" w:before="60"/>
-            </w:pPr>
-            <w:r>
-              <w:rPr>
-                <w:rFonts w:ascii="Arial" w:hAnsi="Arial"/>
-                <w:sz w:val="18"/>
-              </w:rPr>
-              <w:t>11</w:t>
-            </w:r>
-          </w:p>
-        </w:tc>
-        <w:tc>
-          <w:tcPr>
-            <w:tcW w:type="dxa" w:w="1337"/>
-          </w:tcPr>
-          <w:p>
-            <w:pPr>
-              <w:spacing w:after="60" w:before="60"/>
-            </w:pPr>
-            <w:r>
-              <w:rPr>
-                <w:rFonts w:ascii="Arial" w:hAnsi="Arial"/>
-                <w:sz w:val="18"/>
-              </w:rPr>
-              <w:t>**TC-011**</w:t>
-            </w:r>
-          </w:p>
-        </w:tc>
-        <w:tc>
-          <w:tcPr>
-            <w:tcW w:type="dxa" w:w="1337"/>
-          </w:tcPr>
-          <w:p>
-            <w:pPr>
-              <w:spacing w:after="60" w:before="60"/>
-            </w:pPr>
-            <w:r>
-              <w:rPr>
-                <w:rFonts w:ascii="Arial" w:hAnsi="Arial"/>
-                <w:sz w:val="18"/>
-              </w:rPr>
-              <w:t>Tự sinh lịch bảo trì tự động</w:t>
-            </w:r>
-          </w:p>
-        </w:tc>
-        <w:tc>
-          <w:tcPr>
-            <w:tcW w:type="dxa" w:w="1337"/>
-          </w:tcPr>
-          <w:p>
-            <w:pPr>
-              <w:spacing w:after="60" w:before="60"/>
-            </w:pPr>
-            <w:r>
-              <w:rPr>
-                <w:rFonts w:ascii="Arial" w:hAnsi="Arial"/>
-                <w:sz w:val="18"/>
-              </w:rPr>
-              <w:t>Có cảnh báo nguy hiểm (danger) xuất hiện.</w:t>
-            </w:r>
-          </w:p>
-        </w:tc>
-        <w:tc>
-          <w:tcPr>
-            <w:tcW w:type="dxa" w:w="1337"/>
-          </w:tcPr>
-          <w:p>
-            <w:pPr>
-              <w:spacing w:after="60" w:before="60"/>
-            </w:pPr>
-            <w:r>
-              <w:rPr>
-                <w:rFonts w:ascii="Arial" w:hAnsi="Arial"/>
-                <w:sz w:val="18"/>
-              </w:rPr>
-              <w:t>Giả lập sự cố phóng điện cực bộ vượt mức Danger.</w:t>
-            </w:r>
-          </w:p>
-        </w:tc>
-        <w:tc>
-          <w:tcPr>
-            <w:tcW w:type="dxa" w:w="1337"/>
-          </w:tcPr>
-          <w:p>
-            <w:pPr>
-              <w:spacing w:after="60" w:before="60"/>
-            </w:pPr>
-            <w:r>
-              <w:rPr>
-                <w:rFonts w:ascii="Arial" w:hAnsi="Arial"/>
-                <w:sz w:val="18"/>
-              </w:rPr>
-              <w:t>Hệ thống tự động tạo một Yêu cầu bảo trì mới trong bảng `MaintenanceTasks` gán cho kỹ sư trực ban.</w:t>
-            </w:r>
-          </w:p>
-        </w:tc>
-        <w:tc>
-          <w:tcPr>
-            <w:tcW w:type="dxa" w:w="1337"/>
-          </w:tcPr>
-          <w:p>
-            <w:pPr>
-              <w:spacing w:after="60" w:before="60"/>
-            </w:pPr>
-            <w:r>
-              <w:rPr>
-                <w:rFonts w:ascii="Arial" w:hAnsi="Arial"/>
-                <w:sz w:val="18"/>
-              </w:rPr>
-              <w:t>**ĐẠT (Passed)**</w:t>
-            </w:r>
-          </w:p>
-        </w:tc>
-      </w:tr>
-      <w:tr>
-        <w:tc>
-          <w:tcPr>
-            <w:tcW w:type="dxa" w:w="1337"/>
-            <w:shd w:val="clear" w:color="auto" w:fill="F2F4F7"/>
-          </w:tcPr>
-          <w:p>
-            <w:pPr>
-              <w:spacing w:after="60" w:before="60"/>
-            </w:pPr>
-            <w:r>
-              <w:rPr>
-                <w:rFonts w:ascii="Arial" w:hAnsi="Arial"/>
-                <w:sz w:val="18"/>
-              </w:rPr>
-              <w:t>12</w:t>
-            </w:r>
-          </w:p>
-        </w:tc>
-        <w:tc>
-          <w:tcPr>
-            <w:tcW w:type="dxa" w:w="1337"/>
-            <w:shd w:val="clear" w:color="auto" w:fill="F2F4F7"/>
-          </w:tcPr>
-          <w:p>
-            <w:pPr>
-              <w:spacing w:after="60" w:before="60"/>
-            </w:pPr>
-            <w:r>
-              <w:rPr>
-                <w:rFonts w:ascii="Arial" w:hAnsi="Arial"/>
-                <w:sz w:val="18"/>
-              </w:rPr>
-              <w:t>**TC-012**</w:t>
-            </w:r>
-          </w:p>
-        </w:tc>
-        <w:tc>
-          <w:tcPr>
-            <w:tcW w:type="dxa" w:w="1337"/>
-            <w:shd w:val="clear" w:color="auto" w:fill="F2F4F7"/>
-          </w:tcPr>
-          <w:p>
-            <w:pPr>
-              <w:spacing w:after="60" w:before="60"/>
-            </w:pPr>
-            <w:r>
-              <w:rPr>
-                <w:rFonts w:ascii="Arial" w:hAnsi="Arial"/>
-                <w:sz w:val="18"/>
-              </w:rPr>
-              <w:t>Dọn dẹp tài nguyên khi tắt</w:t>
-            </w:r>
-          </w:p>
-        </w:tc>
-        <w:tc>
-          <w:tcPr>
-            <w:tcW w:type="dxa" w:w="1337"/>
-            <w:shd w:val="clear" w:color="auto" w:fill="F2F4F7"/>
-          </w:tcPr>
-          <w:p>
-            <w:pPr>
-              <w:spacing w:after="60" w:before="60"/>
-            </w:pPr>
-            <w:r>
-              <w:rPr>
-                <w:rFonts w:ascii="Arial" w:hAnsi="Arial"/>
-                <w:sz w:val="18"/>
-              </w:rPr>
-              <w:t>Ứng dụng đang chạy bình thường.</w:t>
-            </w:r>
-          </w:p>
-        </w:tc>
-        <w:tc>
-          <w:tcPr>
-            <w:tcW w:type="dxa" w:w="1337"/>
-            <w:shd w:val="clear" w:color="auto" w:fill="F2F4F7"/>
-          </w:tcPr>
-          <w:p>
-            <w:pPr>
-              <w:spacing w:after="60" w:before="60"/>
-            </w:pPr>
-            <w:r>
-              <w:rPr>
-                <w:rFonts w:ascii="Arial" w:hAnsi="Arial"/>
-                <w:sz w:val="18"/>
-              </w:rPr>
-              <w:t>Bấm nút đóng (X) ứng dụng.</w:t>
-            </w:r>
-          </w:p>
-        </w:tc>
-        <w:tc>
-          <w:tcPr>
-            <w:tcW w:type="dxa" w:w="1337"/>
-            <w:shd w:val="clear" w:color="auto" w:fill="F2F4F7"/>
-          </w:tcPr>
-          <w:p>
-            <w:pPr>
-              <w:spacing w:after="60" w:before="60"/>
-            </w:pPr>
-            <w:r>
-              <w:rPr>
-                <w:rFonts w:ascii="Arial" w:hAnsi="Arial"/>
-                <w:sz w:val="18"/>
-              </w:rPr>
-              <w:t>Tất cả tiến trình `postgres.exe` và backend tắt hoàn toàn, không bị kẹt cổng kết nối.</w:t>
-            </w:r>
-          </w:p>
-        </w:tc>
-        <w:tc>
-          <w:tcPr>
-            <w:tcW w:type="dxa" w:w="1337"/>
-            <w:shd w:val="clear" w:color="auto" w:fill="F2F4F7"/>
-          </w:tcPr>
-          <w:p>
-            <w:pPr>
-              <w:spacing w:after="60" w:before="60"/>
-            </w:pPr>
-            <w:r>
-              <w:rPr>
-                <w:rFonts w:ascii="Arial" w:hAnsi="Arial"/>
-                <w:sz w:val="18"/>
-              </w:rPr>
-              <w:t>**ĐẠT (Passed)**</w:t>
-            </w:r>
-          </w:p>
-        </w:tc>
-      </w:tr>
-    </w:tbl>
+    <w:p>
+      <w:pPr>
+        <w:spacing w:after="120" w:line="276" w:lineRule="auto"/>
+      </w:pPr>
+      <w:r>
+        <w:t>*(Xem bảng chi tiết 12 ca kiểm thử đã được phê duyệt ở phần trên).*</w:t>
+      </w:r>
+    </w:p>
+    <w:p>
+      <w:pPr>
+        <w:spacing w:before="240" w:after="120"/>
+      </w:pPr>
+      <w:r>
+        <w:rPr>
+          <w:rFonts w:ascii="Arial" w:hAnsi="Arial"/>
+          <w:b/>
+          <w:color w:val="323232"/>
+          <w:sz w:val="23"/>
+        </w:rPr>
+        <w:t>2. Báo cáo sửa lỗi chi tiết (Bug Fix Log)</w:t>
+      </w:r>
+    </w:p>
+    <w:p>
+      <w:pPr>
+        <w:spacing w:after="120" w:line="276" w:lineRule="auto"/>
+      </w:pPr>
+      <w:r>
+        <w:t>Dưới đây là báo cáo lịch sử các lỗi được phát hiện trong quá trình phát triển mã nguồn và các giải pháp đã được áp dụng để sửa đổi mã nguồn tương ứng:</w:t>
+      </w:r>
+    </w:p>
+    <w:p>
+      <w:pPr>
+        <w:pStyle w:val="ListBullet"/>
+        <w:spacing w:after="40" w:before="0"/>
+      </w:pPr>
+      <w:r/>
+      <w:r>
+        <w:rPr>
+          <w:b/>
+        </w:rPr>
+        <w:t>Sửa lỗi crash cổng kết nối socket</w:t>
+      </w:r>
+      <w:r>
+        <w:t>:</w:t>
+      </w:r>
+    </w:p>
+    <w:p>
+      <w:pPr>
+        <w:pStyle w:val="ListBullet"/>
+        <w:spacing w:after="40" w:before="0"/>
+      </w:pPr>
+      <w:r>
+        <w:t>*Lỗi phát hiện*: Khi trạm con bị mất điện hoặc dây mạng bị chập chờn, các kết nối Socket TCP từ tiến trình API đến thiết bị bị ngắt đột ngột gây lỗi `ECONNRESET`, làm treo/crash toàn bộ tiến trình API backend.</w:t>
+      </w:r>
+    </w:p>
+    <w:p>
+      <w:pPr>
+        <w:pStyle w:val="ListBullet"/>
+        <w:spacing w:after="40" w:before="0"/>
+      </w:pPr>
+      <w:r>
+        <w:t>*Giải pháp*: Bổ sung cơ chế bắt lỗi (`try-catch`) cấp độ mạng, tự động giải phóng socket cũ và khởi tạo hàng đợi thử lại sau 5 giây.</w:t>
+      </w:r>
+    </w:p>
+    <w:p>
+      <w:pPr>
+        <w:pStyle w:val="ListBullet"/>
+        <w:spacing w:after="40" w:before="0"/>
+      </w:pPr>
+      <w:r/>
+      <w:r>
+        <w:rPr>
+          <w:b/>
+        </w:rPr>
+        <w:t>Tối ưu hóa truy vấn Worker đánh giá quy tắc (Rule Evaluation)</w:t>
+      </w:r>
+      <w:r>
+        <w:t>:</w:t>
+      </w:r>
+    </w:p>
+    <w:p>
+      <w:pPr>
+        <w:pStyle w:val="ListBullet"/>
+        <w:spacing w:after="40" w:before="0"/>
+      </w:pPr>
+      <w:r>
+        <w:t>*Lỗi phát hiện*: Tiến trình Rule Engine chạy chậm và chiếm dụng nhiều tài nguyên do truy vấn cơ sở dữ liệu SQL có sử dụng lệnh nhóm `GroupBy` quá nhiều.</w:t>
+      </w:r>
+    </w:p>
+    <w:p>
+      <w:pPr>
+        <w:pStyle w:val="ListBullet"/>
+        <w:spacing w:after="40" w:before="0"/>
+      </w:pPr>
+      <w:r>
+        <w:t>*Giải pháp*: Loại bỏ truy vấn `GroupBy`, chuyển sang truy vấn tìm kiếm gián tiếp sử dụng bộ đệm bộ nhớ đệm `IMemoryCache` để lấy giá trị tức thời mới nhất.</w:t>
+      </w:r>
+    </w:p>
+    <w:p>
+      <w:pPr>
+        <w:pStyle w:val="ListBullet"/>
+        <w:spacing w:after="40" w:before="0"/>
+      </w:pPr>
+      <w:r/>
+      <w:r>
+        <w:rPr>
+          <w:b/>
+        </w:rPr>
+        <w:t>Sửa lỗi không nhận diện bản quyền trên Windows</w:t>
+      </w:r>
+      <w:r>
+        <w:t>:</w:t>
+      </w:r>
+    </w:p>
+    <w:p>
+      <w:pPr>
+        <w:pStyle w:val="ListBullet"/>
+        <w:spacing w:after="40" w:before="0"/>
+      </w:pPr>
+      <w:r>
+        <w:t>*Lỗi phát hiện*: Hàm lấy mã định danh phần cứng (Fingerprint) bị lỗi so khớp do các ký tự đặc biệt (dấu phẩy, dấu chấm) trong tên thiết bị phần cứng của Windows.</w:t>
+      </w:r>
+    </w:p>
+    <w:p>
+      <w:pPr>
+        <w:pStyle w:val="ListBullet"/>
+        <w:spacing w:after="40" w:before="0"/>
+      </w:pPr>
+      <w:r>
+        <w:t>*Giải pháp*: Chuẩn hóa và làm sạch chuỗi thông tin phần cứng, loại bỏ toàn bộ khoảng trắng và ký tự đặc biệt trước khi băm tạo mã Machine GUID.</w:t>
+      </w:r>
+    </w:p>
+    <w:p>
+      <w:pPr>
+        <w:pStyle w:val="ListBullet"/>
+        <w:spacing w:after="40" w:before="0"/>
+      </w:pPr>
+      <w:r/>
+      <w:r>
+        <w:rPr>
+          <w:b/>
+        </w:rPr>
+        <w:t>Sửa lỗi ThreadPool Starvation gây đứt kết nối SignalR</w:t>
+      </w:r>
+      <w:r>
+        <w:t>:</w:t>
+      </w:r>
+    </w:p>
+    <w:p>
+      <w:pPr>
+        <w:pStyle w:val="ListBullet"/>
+        <w:spacing w:after="40" w:before="0"/>
+      </w:pPr>
+      <w:r>
+        <w:t>*Lỗi phát hiện*: Hàm kiểm tra bản quyền `LicenseService` chạy đồng bộ chặn luồng xử lý làm cạn kiệt tài nguyên ThreadPool, dẫn đến các yêu cầu đàm phán SignalR kết nối thời gian thực bị hết hạn (timeout).</w:t>
+      </w:r>
+    </w:p>
+    <w:p>
+      <w:pPr>
+        <w:pStyle w:val="ListBullet"/>
+        <w:spacing w:after="40" w:before="0"/>
+      </w:pPr>
+      <w:r>
+        <w:t>*Giải pháp*: Chuyển đổi toàn bộ các hàm đọc ghi tệp tin của `LicenseService` sang chế độ bất đồng bộ (`async/await`) để giải phóng luồng xử lý cho ThreadPool.</w:t>
+      </w:r>
+    </w:p>
+    <w:p>
+      <w:pPr>
+        <w:pStyle w:val="ListBullet"/>
+        <w:spacing w:after="40" w:before="0"/>
+      </w:pPr>
+      <w:r/>
+      <w:r>
+        <w:rPr>
+          <w:b/>
+        </w:rPr>
+        <w:t>Sửa lỗi hiển thị màu chữ dropdown của danh sách camera</w:t>
+      </w:r>
+      <w:r>
+        <w:t>:</w:t>
+      </w:r>
+    </w:p>
+    <w:p>
+      <w:pPr>
+        <w:pStyle w:val="ListBullet"/>
+        <w:spacing w:after="40" w:before="0"/>
+      </w:pPr>
+      <w:r>
+        <w:t>*Lỗi phát hiện*: Lỗi hiển thị "trắng trên trắng" (chữ trắng trên nền trắng) của dropdown chọn camera ở giao diện chủ đề sáng (Light Theme).</w:t>
+      </w:r>
+    </w:p>
+    <w:p>
+      <w:pPr>
+        <w:pStyle w:val="ListBullet"/>
+        <w:spacing w:after="40" w:before="0"/>
+      </w:pPr>
+      <w:r>
+        <w:t>*Giải pháp*: Đồng bộ hóa màu CSS cho thẻ dropdown theo biến chủ đề động của hệ thống (`var(--admin-text)` và `var(--admin-border)`).</w:t>
+      </w:r>
+    </w:p>
+    <w:p>
+      <w:pPr>
+        <w:pStyle w:val="ListBullet"/>
+        <w:spacing w:after="40" w:before="0"/>
+      </w:pPr>
+      <w:r/>
+      <w:r>
+        <w:rPr>
+          <w:b/>
+        </w:rPr>
+        <w:t>Sửa lỗi 404 không tìm thấy sơ đồ SLD</w:t>
+      </w:r>
+      <w:r>
+        <w:t>:</w:t>
+      </w:r>
+    </w:p>
+    <w:p>
+      <w:pPr>
+        <w:pStyle w:val="ListBullet"/>
+        <w:spacing w:after="40" w:before="0"/>
+      </w:pPr>
+      <w:r>
+        <w:t>*Lỗi phát hiện*: Thư mục cài đặt `Program Files` trên Windows 10/11 bị giới hạn quyền ghi tệp tin khiến backend không thể lưu hoặc sinh tệp ảnh SVG mẫu.</w:t>
+      </w:r>
+    </w:p>
+    <w:p>
+      <w:pPr>
+        <w:pStyle w:val="ListBullet"/>
+        <w:spacing w:after="40" w:before="0"/>
+      </w:pPr>
+      <w:r>
+        <w:t>*Giải pháp*: Chuyển hướng thư mục lưu trữ động sang `%APPDATA%` của người dùng và copy tệp tin SVG mẫu khi database được khởi chạy lần đầu.</w:t>
+      </w:r>
+    </w:p>
     <w:p>
       <w:pPr>
         <w:spacing w:after="120" w:line="276" w:lineRule="auto"/>

</xml_diff>

<commit_message>
docs: adjust diagram box sizes and center text alignment to prevent text clipping
</commit_message>
<xml_diff>
--- a/HO_SO_KY_THUAT.docx
+++ b/HO_SO_KY_THUAT.docx
@@ -788,7 +788,7 @@
       <w:r>
         <w:drawing>
           <wp:inline xmlns:a="http://schemas.openxmlformats.org/drawingml/2006/main" xmlns:pic="http://schemas.openxmlformats.org/drawingml/2006/picture">
-            <wp:extent cx="5486400" cy="3098202"/>
+            <wp:extent cx="5486400" cy="2743200"/>
             <wp:docPr id="1" name="Picture 1"/>
             <wp:cNvGraphicFramePr>
               <a:graphicFrameLocks noChangeAspect="1"/>
@@ -809,7 +809,7 @@
                   <pic:spPr>
                     <a:xfrm>
                       <a:off x="0" y="0"/>
-                      <a:ext cx="5486400" cy="3098202"/>
+                      <a:ext cx="5486400" cy="2743200"/>
                     </a:xfrm>
                     <a:prstGeom prst="rect"/>
                   </pic:spPr>
@@ -857,7 +857,7 @@
       <w:r>
         <w:drawing>
           <wp:inline xmlns:a="http://schemas.openxmlformats.org/drawingml/2006/main" xmlns:pic="http://schemas.openxmlformats.org/drawingml/2006/picture">
-            <wp:extent cx="5486400" cy="3550024"/>
+            <wp:extent cx="5486400" cy="3176337"/>
             <wp:docPr id="2" name="Picture 2"/>
             <wp:cNvGraphicFramePr>
               <a:graphicFrameLocks noChangeAspect="1"/>
@@ -878,7 +878,7 @@
                   <pic:spPr>
                     <a:xfrm>
                       <a:off x="0" y="0"/>
-                      <a:ext cx="5486400" cy="3550024"/>
+                      <a:ext cx="5486400" cy="3176337"/>
                     </a:xfrm>
                     <a:prstGeom prst="rect"/>
                   </pic:spPr>
@@ -926,7 +926,7 @@
       <w:r>
         <w:drawing>
           <wp:inline xmlns:a="http://schemas.openxmlformats.org/drawingml/2006/main" xmlns:pic="http://schemas.openxmlformats.org/drawingml/2006/picture">
-            <wp:extent cx="5486400" cy="3349592"/>
+            <wp:extent cx="5486400" cy="3182112"/>
             <wp:docPr id="3" name="Picture 3"/>
             <wp:cNvGraphicFramePr>
               <a:graphicFrameLocks noChangeAspect="1"/>
@@ -947,7 +947,7 @@
                   <pic:spPr>
                     <a:xfrm>
                       <a:off x="0" y="0"/>
-                      <a:ext cx="5486400" cy="3349592"/>
+                      <a:ext cx="5486400" cy="3182112"/>
                     </a:xfrm>
                     <a:prstGeom prst="rect"/>
                   </pic:spPr>
@@ -995,7 +995,7 @@
       <w:r>
         <w:drawing>
           <wp:inline xmlns:a="http://schemas.openxmlformats.org/drawingml/2006/main" xmlns:pic="http://schemas.openxmlformats.org/drawingml/2006/picture">
-            <wp:extent cx="5486400" cy="3098202"/>
+            <wp:extent cx="5486400" cy="2772076"/>
             <wp:docPr id="4" name="Picture 4"/>
             <wp:cNvGraphicFramePr>
               <a:graphicFrameLocks noChangeAspect="1"/>
@@ -1016,7 +1016,7 @@
                   <pic:spPr>
                     <a:xfrm>
                       <a:off x="0" y="0"/>
-                      <a:ext cx="5486400" cy="3098202"/>
+                      <a:ext cx="5486400" cy="2772076"/>
                     </a:xfrm>
                     <a:prstGeom prst="rect"/>
                   </pic:spPr>
@@ -1064,7 +1064,7 @@
       <w:r>
         <w:drawing>
           <wp:inline xmlns:a="http://schemas.openxmlformats.org/drawingml/2006/main" xmlns:pic="http://schemas.openxmlformats.org/drawingml/2006/picture">
-            <wp:extent cx="5486400" cy="2710927"/>
+            <wp:extent cx="5486400" cy="2425566"/>
             <wp:docPr id="5" name="Picture 5"/>
             <wp:cNvGraphicFramePr>
               <a:graphicFrameLocks noChangeAspect="1"/>
@@ -1085,7 +1085,7 @@
                   <pic:spPr>
                     <a:xfrm>
                       <a:off x="0" y="0"/>
-                      <a:ext cx="5486400" cy="2710927"/>
+                      <a:ext cx="5486400" cy="2425566"/>
                     </a:xfrm>
                     <a:prstGeom prst="rect"/>
                   </pic:spPr>
@@ -1133,7 +1133,7 @@
       <w:r>
         <w:drawing>
           <wp:inline xmlns:a="http://schemas.openxmlformats.org/drawingml/2006/main" xmlns:pic="http://schemas.openxmlformats.org/drawingml/2006/picture">
-            <wp:extent cx="5486400" cy="3580598"/>
+            <wp:extent cx="5486400" cy="3401568"/>
             <wp:docPr id="6" name="Picture 6"/>
             <wp:cNvGraphicFramePr>
               <a:graphicFrameLocks noChangeAspect="1"/>
@@ -1154,7 +1154,7 @@
                   <pic:spPr>
                     <a:xfrm>
                       <a:off x="0" y="0"/>
-                      <a:ext cx="5486400" cy="3580598"/>
+                      <a:ext cx="5486400" cy="3401568"/>
                     </a:xfrm>
                     <a:prstGeom prst="rect"/>
                   </pic:spPr>

</xml_diff>

<commit_message>
docs: improve state diagram symmetry and center box text alignment
</commit_message>
<xml_diff>
--- a/HO_SO_KY_THUAT.docx
+++ b/HO_SO_KY_THUAT.docx
@@ -1064,7 +1064,7 @@
       <w:r>
         <w:drawing>
           <wp:inline xmlns:a="http://schemas.openxmlformats.org/drawingml/2006/main" xmlns:pic="http://schemas.openxmlformats.org/drawingml/2006/picture">
-            <wp:extent cx="5486400" cy="2425566"/>
+            <wp:extent cx="5486400" cy="2304288"/>
             <wp:docPr id="5" name="Picture 5"/>
             <wp:cNvGraphicFramePr>
               <a:graphicFrameLocks noChangeAspect="1"/>
@@ -1085,7 +1085,7 @@
                   <pic:spPr>
                     <a:xfrm>
                       <a:off x="0" y="0"/>
-                      <a:ext cx="5486400" cy="2425566"/>
+                      <a:ext cx="5486400" cy="2304288"/>
                     </a:xfrm>
                     <a:prstGeom prst="rect"/>
                   </pic:spPr>

</xml_diff>

<commit_message>
docs: expand technical structure to fully document all UI pages and AI modules
</commit_message>
<xml_diff>
--- a/HO_SO_KY_THUAT.docx
+++ b/HO_SO_KY_THUAT.docx
@@ -12630,14 +12630,112 @@
           <w:b/>
           <w:sz w:val="22"/>
         </w:rPr>
-        <w:t>Module `StationOS.Api`</w:t>
-      </w:r>
-      <w:r>
-        <w:rPr>
-          <w:rFonts w:ascii="Arial" w:hAnsi="Arial"/>
-          <w:sz w:val="22"/>
-        </w:rPr>
-        <w:t>: Điều phối luồng dữ liệu (API Controllers), quản lý kết nối xác thực người dùng bằng cơ chế JWT, cấu hình máy chủ Web API và tạo cổng kết nối WebSocket thời gian thực (SignalR Hubs).</w:t>
+        <w:t>Lớp Giao diện &amp; Trải nghiệm Người dùng (Frontend AppShell &amp; UI Pages)</w:t>
+      </w:r>
+      <w:r>
+        <w:rPr>
+          <w:rFonts w:ascii="Arial" w:hAnsi="Arial"/>
+          <w:sz w:val="22"/>
+        </w:rPr>
+        <w:t>:</w:t>
+      </w:r>
+    </w:p>
+    <w:p>
+      <w:pPr>
+        <w:pStyle w:val="ListBullet"/>
+        <w:spacing w:before="40" w:after="40" w:line="276" w:lineRule="auto"/>
+        <w:ind w:left="792"/>
+      </w:pPr>
+      <w:r>
+        <w:rPr>
+          <w:rFonts w:ascii="Arial" w:hAnsi="Arial"/>
+          <w:sz w:val="22"/>
+        </w:rPr>
+        <w:t>`DashboardPage`: Hiển thị các chỉ số KPI vận hành, biểu đồ cảnh báo tổng quan và danh sách trạng thái kết nối các thiết bị ngoại vi của trạm con.</w:t>
+      </w:r>
+    </w:p>
+    <w:p>
+      <w:pPr>
+        <w:pStyle w:val="ListBullet"/>
+        <w:spacing w:before="40" w:after="40" w:line="276" w:lineRule="auto"/>
+        <w:ind w:left="792"/>
+      </w:pPr>
+      <w:r>
+        <w:rPr>
+          <w:rFonts w:ascii="Arial" w:hAnsi="Arial"/>
+          <w:sz w:val="22"/>
+        </w:rPr>
+        <w:t>`RealtimeMonitorPage`: Tải sơ đồ một sợi động SVG, ánh xạ thời gian thực giá trị nhiệt độ lên bản vẽ, tích hợp lưới hiển thị camera IP và camera nhiệt.</w:t>
+      </w:r>
+    </w:p>
+    <w:p>
+      <w:pPr>
+        <w:pStyle w:val="ListBullet"/>
+        <w:spacing w:before="40" w:after="40" w:line="276" w:lineRule="auto"/>
+        <w:ind w:left="792"/>
+      </w:pPr>
+      <w:r>
+        <w:rPr>
+          <w:rFonts w:ascii="Arial" w:hAnsi="Arial"/>
+          <w:sz w:val="22"/>
+        </w:rPr>
+        <w:t>`DeviceManagementPage`: Quản lý danh sách thiết bị kết nối, cấu hình IP/Cổng, dải thanh ghi Modbus, hoặc cấu hình vùng giám sát đa giác (ROI) trên camera nhiệt.</w:t>
+      </w:r>
+    </w:p>
+    <w:p>
+      <w:pPr>
+        <w:pStyle w:val="ListBullet"/>
+        <w:spacing w:before="40" w:after="40" w:line="276" w:lineRule="auto"/>
+        <w:ind w:left="792"/>
+      </w:pPr>
+      <w:r>
+        <w:rPr>
+          <w:rFonts w:ascii="Arial" w:hAnsi="Arial"/>
+          <w:sz w:val="22"/>
+        </w:rPr>
+        <w:t>`AlertsHistoryPage`: Tra cứu nhật ký cảnh báo chi tiết theo thời gian, lọc theo mức độ nguy hiểm và hỗ trợ xác nhận (Acknowledge) cảnh báo.</w:t>
+      </w:r>
+    </w:p>
+    <w:p>
+      <w:pPr>
+        <w:pStyle w:val="ListBullet"/>
+        <w:spacing w:before="40" w:after="40" w:line="276" w:lineRule="auto"/>
+        <w:ind w:left="792"/>
+      </w:pPr>
+      <w:r>
+        <w:rPr>
+          <w:rFonts w:ascii="Arial" w:hAnsi="Arial"/>
+          <w:sz w:val="22"/>
+        </w:rPr>
+        <w:t>`AnalyticsPage`: Tích hợp các biểu đồ phân tích sâu về phóng điện cục bộ (PD) và phân tích xu hướng nhiệt độ trạm.</w:t>
+      </w:r>
+    </w:p>
+    <w:p>
+      <w:pPr>
+        <w:pStyle w:val="ListBullet"/>
+        <w:spacing w:before="40" w:after="40" w:line="276" w:lineRule="auto"/>
+        <w:ind w:left="792"/>
+      </w:pPr>
+      <w:r>
+        <w:rPr>
+          <w:rFonts w:ascii="Arial" w:hAnsi="Arial"/>
+          <w:sz w:val="22"/>
+        </w:rPr>
+        <w:t>`MaintenancePage`: Quản lý các phiếu giao việc, lịch trình bảo dưỡng định kỳ tự động và thủ công.</w:t>
+      </w:r>
+    </w:p>
+    <w:p>
+      <w:pPr>
+        <w:pStyle w:val="ListBullet"/>
+        <w:spacing w:before="40" w:after="40" w:line="276" w:lineRule="auto"/>
+        <w:ind w:left="792"/>
+      </w:pPr>
+      <w:r>
+        <w:rPr>
+          <w:rFonts w:ascii="Arial" w:hAnsi="Arial"/>
+          <w:sz w:val="22"/>
+        </w:rPr>
+        <w:t>`UserManagementPage` &amp; `AuditLogPage`: Quản trị người dùng theo phân quyền RBAC và ghi nhật ký hoạt động hệ thống (audit trail).</w:t>
       </w:r>
     </w:p>
     <w:p>
@@ -12658,14 +12756,42 @@
           <w:b/>
           <w:sz w:val="22"/>
         </w:rPr>
-        <w:t>Module `StationOS.Data`</w:t>
-      </w:r>
-      <w:r>
-        <w:rPr>
-          <w:rFonts w:ascii="Arial" w:hAnsi="Arial"/>
-          <w:sz w:val="22"/>
-        </w:rPr>
-        <w:t>: Lớp ánh xạ cơ sở dữ liệu quan hệ (Entity Framework Core) với PostgreSQL. Quản lý việc ánh xạ thực thể (Entities), khởi tạo di chuyển dữ liệu (Migrations) và thiết lập chỉ mục để truy vấn dữ liệu chuỗi thời gian tối ưu.</w:t>
+        <w:t>Module `StationOS.Api` (Web API Controllers &amp; Hubs)</w:t>
+      </w:r>
+      <w:r>
+        <w:rPr>
+          <w:rFonts w:ascii="Arial" w:hAnsi="Arial"/>
+          <w:sz w:val="22"/>
+        </w:rPr>
+        <w:t>:</w:t>
+      </w:r>
+    </w:p>
+    <w:p>
+      <w:pPr>
+        <w:pStyle w:val="ListBullet"/>
+        <w:spacing w:before="40" w:after="40" w:line="276" w:lineRule="auto"/>
+        <w:ind w:left="792"/>
+      </w:pPr>
+      <w:r>
+        <w:rPr>
+          <w:rFonts w:ascii="Arial" w:hAnsi="Arial"/>
+          <w:sz w:val="22"/>
+        </w:rPr>
+        <w:t>Điều phối các yêu cầu API từ Client, thực hiện xác thực bằng JWT Token.</w:t>
+      </w:r>
+    </w:p>
+    <w:p>
+      <w:pPr>
+        <w:pStyle w:val="ListBullet"/>
+        <w:spacing w:before="40" w:after="40" w:line="276" w:lineRule="auto"/>
+        <w:ind w:left="792"/>
+      </w:pPr>
+      <w:r>
+        <w:rPr>
+          <w:rFonts w:ascii="Arial" w:hAnsi="Arial"/>
+          <w:sz w:val="22"/>
+        </w:rPr>
+        <w:t>`Realtime Hub (SignalR)`: Đẩy các gói tin dữ liệu tức thời và thông báo cảnh báo tức thì từ Worker nền lên giao diện Client mà không cần Refresh.</w:t>
       </w:r>
     </w:p>
     <w:p>
@@ -12686,14 +12812,14 @@
           <w:b/>
           <w:sz w:val="22"/>
         </w:rPr>
-        <w:t>Module `StationOS.Services`</w:t>
-      </w:r>
-      <w:r>
-        <w:rPr>
-          <w:rFonts w:ascii="Arial" w:hAnsi="Arial"/>
-          <w:sz w:val="22"/>
-        </w:rPr>
-        <w:t>: Triển khai nghiệp vụ của ứng dụng:</w:t>
+        <w:t>Module `StationOS.Data` (Lớp Cơ sở Dữ liệu EF Core)</w:t>
+      </w:r>
+      <w:r>
+        <w:rPr>
+          <w:rFonts w:ascii="Arial" w:hAnsi="Arial"/>
+          <w:sz w:val="22"/>
+        </w:rPr>
+        <w:t>:</w:t>
       </w:r>
     </w:p>
     <w:p>
@@ -12707,7 +12833,7 @@
           <w:rFonts w:ascii="Arial" w:hAnsi="Arial"/>
           <w:sz w:val="22"/>
         </w:rPr>
-        <w:t>`LicenseService`: Giải mã, kiểm tra chữ ký khóa bản quyền dựa trên chữ ký MAC address và Machine GUID để cấp quyền sử dụng thiết bị cảm biến và số lượng trạm theo đúng gói giấy phép.</w:t>
+        <w:t>Ánh xạ các thực thể cấu hình thiết bị, nhật ký số liệu, cảnh báo, quy tắc (Rules) sang PostgreSQL.</w:t>
       </w:r>
     </w:p>
     <w:p>
@@ -12721,7 +12847,7 @@
           <w:rFonts w:ascii="Arial" w:hAnsi="Arial"/>
           <w:sz w:val="22"/>
         </w:rPr>
-        <w:t>`AuthService`: Băm mật khẩu người dùng, kiểm tra phân quyền RBAC (`Admin`, `Manager`, `Operator`).</w:t>
+        <w:t>Quản lý việc thiết lập chỉ mục (Indexes) trên các cột thời gian (`Time`/`Timestamp`) để tối ưu hóa hiệu suất truy vấn dữ liệu lớn.</w:t>
       </w:r>
     </w:p>
     <w:p>
@@ -12742,14 +12868,14 @@
           <w:b/>
           <w:sz w:val="22"/>
         </w:rPr>
-        <w:t>Module `StationOS.Workers`</w:t>
-      </w:r>
-      <w:r>
-        <w:rPr>
-          <w:rFonts w:ascii="Arial" w:hAnsi="Arial"/>
-          <w:sz w:val="22"/>
-        </w:rPr>
-        <w:t>: Các background worker chạy nền:</w:t>
+        <w:t>Module `StationOS.Services` (Nghiệp vụ Hệ thống)</w:t>
+      </w:r>
+      <w:r>
+        <w:rPr>
+          <w:rFonts w:ascii="Arial" w:hAnsi="Arial"/>
+          <w:sz w:val="22"/>
+        </w:rPr>
+        <w:t>:</w:t>
       </w:r>
     </w:p>
     <w:p>
@@ -12763,7 +12889,7 @@
           <w:rFonts w:ascii="Arial" w:hAnsi="Arial"/>
           <w:sz w:val="22"/>
         </w:rPr>
-        <w:t>`PlcPollingWorker`: Đọc mảng byte thô từ Siemens S7 và Modbus TCP, chuyển đổi định dạng Endian và lưu dữ liệu.</w:t>
+        <w:t>`LicenseService`: Giải mã, kiểm tra chữ ký khóa bản quyền dựa trên chữ ký MAC address và Machine GUID để cấp quyền sử dụng thiết bị cảm biến và số lượng trạm theo đúng gói giấy phép.</w:t>
       </w:r>
     </w:p>
     <w:p>
@@ -12777,7 +12903,7 @@
           <w:rFonts w:ascii="Arial" w:hAnsi="Arial"/>
           <w:sz w:val="22"/>
         </w:rPr>
-        <w:t>`CentralSyncWorker`: Quản lý truyền tải dữ liệu đa trạm lên Cloud.</w:t>
+        <w:t>`AuthService`: Băm mật khẩu người dùng, kiểm tra phân quyền RBAC (`Admin`, `Manager`, `Operator`).</w:t>
       </w:r>
     </w:p>
     <w:p>
@@ -12798,14 +12924,154 @@
           <w:b/>
           <w:sz w:val="22"/>
         </w:rPr>
-        <w:t>Module `Electron Desktop`</w:t>
-      </w:r>
-      <w:r>
-        <w:rPr>
-          <w:rFonts w:ascii="Arial" w:hAnsi="Arial"/>
-          <w:sz w:val="22"/>
-        </w:rPr>
-        <w:t>: Quản lý vòng đời khởi chạy, tắt các service con, giải phóng cổng kết nối khi người dùng tắt ứng dụng trên hệ điều hành Windows.</w:t>
+        <w:t>Module `StationOS.Workers` (Các Background Worker chạy nền)</w:t>
+      </w:r>
+      <w:r>
+        <w:rPr>
+          <w:rFonts w:ascii="Arial" w:hAnsi="Arial"/>
+          <w:sz w:val="22"/>
+        </w:rPr>
+        <w:t>:</w:t>
+      </w:r>
+    </w:p>
+    <w:p>
+      <w:pPr>
+        <w:pStyle w:val="ListBullet"/>
+        <w:spacing w:before="40" w:after="40" w:line="276" w:lineRule="auto"/>
+        <w:ind w:left="792"/>
+      </w:pPr>
+      <w:r>
+        <w:rPr>
+          <w:rFonts w:ascii="Arial" w:hAnsi="Arial"/>
+          <w:sz w:val="22"/>
+        </w:rPr>
+        <w:t>`PlcPollingWorker`: Kết nối liên tục Siemens S7 và Modbus TCP để đọc mảng byte thô, xử lý thứ tự byte (Endianness) và cập nhật số liệu.</w:t>
+      </w:r>
+    </w:p>
+    <w:p>
+      <w:pPr>
+        <w:pStyle w:val="ListBullet"/>
+        <w:spacing w:before="40" w:after="40" w:line="276" w:lineRule="auto"/>
+        <w:ind w:left="792"/>
+      </w:pPr>
+      <w:r>
+        <w:rPr>
+          <w:rFonts w:ascii="Arial" w:hAnsi="Arial"/>
+          <w:sz w:val="22"/>
+        </w:rPr>
+        <w:t>`CentralSyncWorker`: Quản lý hàng đợi đồng bộ dữ liệu (`SyncQueue`), tự động đóng gói dữ liệu đo lường, nhật ký cảnh báo và gửi về Trạm trung tâm qua HTTPS.</w:t>
+      </w:r>
+    </w:p>
+    <w:p>
+      <w:pPr>
+        <w:pStyle w:val="ListBullet"/>
+        <w:spacing w:before="40" w:after="40" w:line="276" w:lineRule="auto"/>
+        <w:ind w:left="792"/>
+      </w:pPr>
+      <w:r>
+        <w:rPr>
+          <w:rFonts w:ascii="Arial" w:hAnsi="Arial"/>
+          <w:sz w:val="22"/>
+        </w:rPr>
+        <w:t>`RuleEvaluationWorker`: Bộ máy luật (Rule Engine) đánh giá tức thời các giá trị đo cảm biến theo các quy tắc do người vận hành cấu hình, kích hoạt ngõ ra Relay còi hú của PLC khi phát hiện vượt ngưỡng.</w:t>
+      </w:r>
+    </w:p>
+    <w:p>
+      <w:pPr>
+        <w:pStyle w:val="ListBullet"/>
+        <w:spacing w:before="40" w:after="40" w:line="276" w:lineRule="auto"/>
+        <w:ind w:left="360"/>
+      </w:pPr>
+      <w:r>
+        <w:rPr>
+          <w:rFonts w:ascii="Arial" w:hAnsi="Arial"/>
+          <w:sz w:val="22"/>
+        </w:rPr>
+      </w:r>
+      <w:r>
+        <w:rPr>
+          <w:rFonts w:ascii="Arial" w:hAnsi="Arial"/>
+          <w:b/>
+          <w:sz w:val="22"/>
+        </w:rPr>
+        <w:t>Module `StationOS.Analytics` (Dự báo và Phân tích AI)</w:t>
+      </w:r>
+      <w:r>
+        <w:rPr>
+          <w:rFonts w:ascii="Arial" w:hAnsi="Arial"/>
+          <w:sz w:val="22"/>
+        </w:rPr>
+        <w:t>:</w:t>
+      </w:r>
+    </w:p>
+    <w:p>
+      <w:pPr>
+        <w:pStyle w:val="ListBullet"/>
+        <w:spacing w:before="40" w:after="40" w:line="276" w:lineRule="auto"/>
+        <w:ind w:left="792"/>
+      </w:pPr>
+      <w:r>
+        <w:rPr>
+          <w:rFonts w:ascii="Arial" w:hAnsi="Arial"/>
+          <w:sz w:val="22"/>
+        </w:rPr>
+        <w:t>Triển khai thuật toán dự báo nhiệt độ máy biến áp và đầu cốt trong tương lai gần (5-10 phút) để cảnh báo sớm.</w:t>
+      </w:r>
+    </w:p>
+    <w:p>
+      <w:pPr>
+        <w:pStyle w:val="ListBullet"/>
+        <w:spacing w:before="40" w:after="40" w:line="276" w:lineRule="auto"/>
+        <w:ind w:left="792"/>
+      </w:pPr>
+      <w:r>
+        <w:rPr>
+          <w:rFonts w:ascii="Arial" w:hAnsi="Arial"/>
+          <w:sz w:val="22"/>
+        </w:rPr>
+        <w:t>Phân tích tín hiệu phóng điện cục bộ (PD) từ cảm biến siêu âm, tính toán xác suất rủi ro lỗi cách điện.</w:t>
+      </w:r>
+    </w:p>
+    <w:p>
+      <w:pPr>
+        <w:pStyle w:val="ListBullet"/>
+        <w:spacing w:before="40" w:after="40" w:line="276" w:lineRule="auto"/>
+        <w:ind w:left="360"/>
+      </w:pPr>
+      <w:r>
+        <w:rPr>
+          <w:rFonts w:ascii="Arial" w:hAnsi="Arial"/>
+          <w:sz w:val="22"/>
+        </w:rPr>
+      </w:r>
+      <w:r>
+        <w:rPr>
+          <w:rFonts w:ascii="Arial" w:hAnsi="Arial"/>
+          <w:b/>
+          <w:sz w:val="22"/>
+        </w:rPr>
+        <w:t>Module `Electron Desktop` (Trình đóng gói Thick Client)</w:t>
+      </w:r>
+      <w:r>
+        <w:rPr>
+          <w:rFonts w:ascii="Arial" w:hAnsi="Arial"/>
+          <w:sz w:val="22"/>
+        </w:rPr>
+        <w:t>:</w:t>
+      </w:r>
+    </w:p>
+    <w:p>
+      <w:pPr>
+        <w:pStyle w:val="ListBullet"/>
+        <w:spacing w:before="40" w:after="40" w:line="276" w:lineRule="auto"/>
+        <w:ind w:left="792"/>
+      </w:pPr>
+      <w:r>
+        <w:rPr>
+          <w:rFonts w:ascii="Arial" w:hAnsi="Arial"/>
+          <w:sz w:val="22"/>
+        </w:rPr>
+        <w:t>Quản lý vòng đời khởi chạy phần mềm desktop, tự động quản lý khởi động/dừng các tiến trình nền PostgreSQL, Backend API và dịch vụ truyền luồng video `go2rtc` dưới nền.</w:t>
       </w:r>
     </w:p>
     <w:p>

</xml_diff>

<commit_message>
docs: rename StationOS references to POWER MONITOR in document and diagrams
</commit_message>
<xml_diff>
--- a/HO_SO_KY_THUAT.docx
+++ b/HO_SO_KY_THUAT.docx
@@ -28,7 +28,7 @@
           <w:color w:val="3572EF"/>
           <w:sz w:val="28"/>
         </w:rPr>
-        <w:t>HỆ THỐNG GIÁM SÁT TRẠM BIẾN ÁP (STATIONOS - POWER MONITOR)</w:t>
+        <w:t>HỆ THỐNG GIÁM SÁT TRẠM BIẾN ÁP (POWER MONITOR)</w:t>
       </w:r>
     </w:p>
     <w:p>
@@ -55,7 +55,7 @@
           <w:color w:val="800000"/>
           <w:sz w:val="21"/>
         </w:rPr>
-        <w:t>Tài liệu kỹ thuật chi tiết này được biên soạn cho dự án **StationOS - Power Monitor (Phiên bản v3.x)** nhằm phục vụ công tác nghiệm thu bàn giao và chứng minh quy trình công nghệ phát triển phần mềm độc lập để hưởng các chính sách ưu đãi thuế VAT của Bộ Tài chính/Tổng cục Thuế Việt Nam.</w:t>
+        <w:t>Tài liệu kỹ thuật chi tiết này được biên soạn cho dự án **POWER MONITOR (Phiên bản v3.x)** nhằm phục vụ công tác nghiệm thu bàn giao và chứng minh quy trình công nghệ phát triển phần mềm độc lập để hưởng các chính sách ưu đãi thuế VAT của Bộ Tài chính/Tổng cục Thuế Việt Nam.</w:t>
       </w:r>
     </w:p>
     <w:p>
@@ -832,7 +832,7 @@
           <w:color w:val="787878"/>
           <w:sz w:val="19"/>
         </w:rPr>
-        <w:t>Hình: Sơ đồ kiến trúc hệ thống StationOS</w:t>
+        <w:t>Hình: Sơ đồ kiến trúc hệ thống POWER MONITOR</w:t>
       </w:r>
     </w:p>
     <w:p>
@@ -901,7 +901,7 @@
           <w:color w:val="787878"/>
           <w:sz w:val="19"/>
         </w:rPr>
-        <w:t>Hình: Sơ đồ Use Case hệ thống StationOS</w:t>
+        <w:t>Hình: Sơ đồ Use Case hệ thống POWER MONITOR</w:t>
       </w:r>
     </w:p>
     <w:p>
@@ -970,7 +970,7 @@
           <w:color w:val="787878"/>
           <w:sz w:val="19"/>
         </w:rPr>
-        <w:t>Hình: Sơ đồ lớp hệ thống StationOS</w:t>
+        <w:t>Hình: Sơ đồ lớp hệ thống POWER MONITOR</w:t>
       </w:r>
     </w:p>
     <w:p>
@@ -1039,7 +1039,7 @@
           <w:color w:val="787878"/>
           <w:sz w:val="19"/>
         </w:rPr>
-        <w:t>Hình: Sơ đồ hoạt động hệ thống StationOS</w:t>
+        <w:t>Hình: Sơ đồ hoạt động hệ thống POWER MONITOR</w:t>
       </w:r>
     </w:p>
     <w:p>
@@ -1108,7 +1108,7 @@
           <w:color w:val="787878"/>
           <w:sz w:val="19"/>
         </w:rPr>
-        <w:t>Hình: Sơ đồ trạng thái hệ thống StationOS</w:t>
+        <w:t>Hình: Sơ đồ trạng thái hệ thống POWER MONITOR</w:t>
       </w:r>
     </w:p>
     <w:p>
@@ -12756,7 +12756,7 @@
           <w:b/>
           <w:sz w:val="22"/>
         </w:rPr>
-        <w:t>Module `StationOS.Api` (Web API Controllers &amp; Hubs)</w:t>
+        <w:t>Module `POWER MONITOR - API` (StationOS.Api)</w:t>
       </w:r>
       <w:r>
         <w:rPr>
@@ -12812,7 +12812,7 @@
           <w:b/>
           <w:sz w:val="22"/>
         </w:rPr>
-        <w:t>Module `StationOS.Data` (Lớp Cơ sở Dữ liệu EF Core)</w:t>
+        <w:t>Module `POWER MONITOR - Database` (StationOS.Data)</w:t>
       </w:r>
       <w:r>
         <w:rPr>
@@ -12868,7 +12868,7 @@
           <w:b/>
           <w:sz w:val="22"/>
         </w:rPr>
-        <w:t>Module `StationOS.Services` (Nghiệp vụ Hệ thống)</w:t>
+        <w:t>Module `POWER MONITOR - Services` (StationOS.Services)</w:t>
       </w:r>
       <w:r>
         <w:rPr>
@@ -12924,7 +12924,7 @@
           <w:b/>
           <w:sz w:val="22"/>
         </w:rPr>
-        <w:t>Module `StationOS.Workers` (Các Background Worker chạy nền)</w:t>
+        <w:t>Module `POWER MONITOR - Workers` (StationOS.Workers)</w:t>
       </w:r>
       <w:r>
         <w:rPr>
@@ -12994,7 +12994,7 @@
           <w:b/>
           <w:sz w:val="22"/>
         </w:rPr>
-        <w:t>Module `StationOS.Analytics` (Dự báo và Phân tích AI)</w:t>
+        <w:t>Module `POWER MONITOR - Analytics` (StationOS.Analytics)</w:t>
       </w:r>
       <w:r>
         <w:rPr>
@@ -13050,7 +13050,7 @@
           <w:b/>
           <w:sz w:val="22"/>
         </w:rPr>
-        <w:t>Module `Electron Desktop` (Trình đóng gói Thick Client)</w:t>
+        <w:t>Module `Electron Desktop` (Trình đóng gói Thick Client - POWER MONITOR Launcher)</w:t>
       </w:r>
       <w:r>
         <w:rPr>

</xml_diff>

<commit_message>
docs: remove SQL CREATE TABLE blocks from DB schema section
</commit_message>
<xml_diff>
--- a/HO_SO_KY_THUAT.docx
+++ b/HO_SO_KY_THUAT.docx
@@ -1208,30 +1208,567 @@
         <w:t>6.1 Bảng `Stations` (Danh sách các trạm giám sát)</w:t>
       </w:r>
     </w:p>
+    <w:tbl>
+      <w:tblPr>
+        <w:tblStyle w:val="TableGrid"/>
+        <w:tblW w:type="auto" w:w="0"/>
+        <w:tblLayout w:type="autofit"/>
+        <w:tblLook w:firstColumn="1" w:firstRow="1" w:lastColumn="0" w:lastRow="0" w:noHBand="0" w:noVBand="1" w:val="04A0"/>
+      </w:tblPr>
+      <w:tblGrid>
+        <w:gridCol w:w="1872"/>
+        <w:gridCol w:w="1872"/>
+        <w:gridCol w:w="1872"/>
+        <w:gridCol w:w="1872"/>
+        <w:gridCol w:w="1872"/>
+      </w:tblGrid>
+      <w:tr>
+        <w:tc>
+          <w:tcPr>
+            <w:tcW w:type="dxa" w:w="1872"/>
+            <w:shd w:fill="E2E8F0"/>
+          </w:tcPr>
+          <w:p>
+            <w:pPr>
+              <w:spacing w:before="80" w:after="80"/>
+            </w:pPr>
+            <w:r>
+              <w:rPr>
+                <w:rFonts w:ascii="Arial" w:hAnsi="Arial"/>
+                <w:b/>
+                <w:sz w:val="19"/>
+              </w:rPr>
+              <w:t>Tên trường</w:t>
+            </w:r>
+          </w:p>
+        </w:tc>
+        <w:tc>
+          <w:tcPr>
+            <w:tcW w:type="dxa" w:w="1872"/>
+            <w:shd w:fill="E2E8F0"/>
+          </w:tcPr>
+          <w:p>
+            <w:pPr>
+              <w:spacing w:before="80" w:after="80"/>
+            </w:pPr>
+            <w:r>
+              <w:rPr>
+                <w:rFonts w:ascii="Arial" w:hAnsi="Arial"/>
+                <w:b/>
+                <w:sz w:val="19"/>
+              </w:rPr>
+              <w:t>Kiểu dữ liệu</w:t>
+            </w:r>
+          </w:p>
+        </w:tc>
+        <w:tc>
+          <w:tcPr>
+            <w:tcW w:type="dxa" w:w="1872"/>
+            <w:shd w:fill="E2E8F0"/>
+          </w:tcPr>
+          <w:p>
+            <w:pPr>
+              <w:spacing w:before="80" w:after="80"/>
+            </w:pPr>
+            <w:r>
+              <w:rPr>
+                <w:rFonts w:ascii="Arial" w:hAnsi="Arial"/>
+                <w:b/>
+                <w:sz w:val="19"/>
+              </w:rPr>
+              <w:t>Khóa</w:t>
+            </w:r>
+          </w:p>
+        </w:tc>
+        <w:tc>
+          <w:tcPr>
+            <w:tcW w:type="dxa" w:w="1872"/>
+            <w:shd w:fill="E2E8F0"/>
+          </w:tcPr>
+          <w:p>
+            <w:pPr>
+              <w:spacing w:before="80" w:after="80"/>
+            </w:pPr>
+            <w:r>
+              <w:rPr>
+                <w:rFonts w:ascii="Arial" w:hAnsi="Arial"/>
+                <w:b/>
+                <w:sz w:val="19"/>
+              </w:rPr>
+              <w:t>Ràng buộc</w:t>
+            </w:r>
+          </w:p>
+        </w:tc>
+        <w:tc>
+          <w:tcPr>
+            <w:tcW w:type="dxa" w:w="1872"/>
+            <w:shd w:fill="E2E8F0"/>
+          </w:tcPr>
+          <w:p>
+            <w:pPr>
+              <w:spacing w:before="80" w:after="80"/>
+            </w:pPr>
+            <w:r>
+              <w:rPr>
+                <w:rFonts w:ascii="Arial" w:hAnsi="Arial"/>
+                <w:b/>
+                <w:sz w:val="19"/>
+              </w:rPr>
+              <w:t>Mô tả</w:t>
+            </w:r>
+          </w:p>
+        </w:tc>
+      </w:tr>
+      <w:tr>
+        <w:tc>
+          <w:tcPr>
+            <w:tcW w:type="dxa" w:w="1872"/>
+          </w:tcPr>
+          <w:p>
+            <w:pPr>
+              <w:spacing w:before="60" w:after="60"/>
+            </w:pPr>
+            <w:r>
+              <w:rPr>
+                <w:rFonts w:ascii="Arial" w:hAnsi="Arial"/>
+                <w:sz w:val="18"/>
+              </w:rPr>
+              <w:t>`Id`</w:t>
+            </w:r>
+          </w:p>
+        </w:tc>
+        <w:tc>
+          <w:tcPr>
+            <w:tcW w:type="dxa" w:w="1872"/>
+          </w:tcPr>
+          <w:p>
+            <w:pPr>
+              <w:spacing w:before="60" w:after="60"/>
+            </w:pPr>
+            <w:r>
+              <w:rPr>
+                <w:rFonts w:ascii="Arial" w:hAnsi="Arial"/>
+                <w:sz w:val="18"/>
+              </w:rPr>
+              <w:t>`UUID`</w:t>
+            </w:r>
+          </w:p>
+        </w:tc>
+        <w:tc>
+          <w:tcPr>
+            <w:tcW w:type="dxa" w:w="1872"/>
+          </w:tcPr>
+          <w:p>
+            <w:pPr>
+              <w:spacing w:before="60" w:after="60"/>
+            </w:pPr>
+            <w:r>
+              <w:rPr>
+                <w:rFonts w:ascii="Arial" w:hAnsi="Arial"/>
+                <w:sz w:val="18"/>
+              </w:rPr>
+              <w:t>PK</w:t>
+            </w:r>
+          </w:p>
+        </w:tc>
+        <w:tc>
+          <w:tcPr>
+            <w:tcW w:type="dxa" w:w="1872"/>
+          </w:tcPr>
+          <w:p>
+            <w:pPr>
+              <w:spacing w:before="60" w:after="60"/>
+            </w:pPr>
+            <w:r>
+              <w:rPr>
+                <w:rFonts w:ascii="Arial" w:hAnsi="Arial"/>
+                <w:sz w:val="18"/>
+              </w:rPr>
+              <w:t>NOT NULL</w:t>
+            </w:r>
+          </w:p>
+        </w:tc>
+        <w:tc>
+          <w:tcPr>
+            <w:tcW w:type="dxa" w:w="1872"/>
+          </w:tcPr>
+          <w:p>
+            <w:pPr>
+              <w:spacing w:before="60" w:after="60"/>
+            </w:pPr>
+            <w:r>
+              <w:rPr>
+                <w:rFonts w:ascii="Arial" w:hAnsi="Arial"/>
+                <w:sz w:val="18"/>
+              </w:rPr>
+              <w:t>Khóa chính tự sinh</w:t>
+            </w:r>
+          </w:p>
+        </w:tc>
+      </w:tr>
+      <w:tr>
+        <w:tc>
+          <w:tcPr>
+            <w:tcW w:type="dxa" w:w="1872"/>
+          </w:tcPr>
+          <w:p>
+            <w:pPr>
+              <w:spacing w:before="60" w:after="60"/>
+            </w:pPr>
+            <w:r>
+              <w:rPr>
+                <w:rFonts w:ascii="Arial" w:hAnsi="Arial"/>
+                <w:sz w:val="18"/>
+              </w:rPr>
+              <w:t>`Code`</w:t>
+            </w:r>
+          </w:p>
+        </w:tc>
+        <w:tc>
+          <w:tcPr>
+            <w:tcW w:type="dxa" w:w="1872"/>
+          </w:tcPr>
+          <w:p>
+            <w:pPr>
+              <w:spacing w:before="60" w:after="60"/>
+            </w:pPr>
+            <w:r>
+              <w:rPr>
+                <w:rFonts w:ascii="Arial" w:hAnsi="Arial"/>
+                <w:sz w:val="18"/>
+              </w:rPr>
+              <w:t>`VARCHAR(50)`</w:t>
+            </w:r>
+          </w:p>
+        </w:tc>
+        <w:tc>
+          <w:tcPr>
+            <w:tcW w:type="dxa" w:w="1872"/>
+          </w:tcPr>
+          <w:p>
+            <w:pPr>
+              <w:spacing w:before="60" w:after="60"/>
+            </w:pPr>
+            <w:r>
+              <w:rPr>
+                <w:rFonts w:ascii="Arial" w:hAnsi="Arial"/>
+                <w:sz w:val="18"/>
+              </w:rPr>
+              <w:t>-</w:t>
+            </w:r>
+          </w:p>
+        </w:tc>
+        <w:tc>
+          <w:tcPr>
+            <w:tcW w:type="dxa" w:w="1872"/>
+          </w:tcPr>
+          <w:p>
+            <w:pPr>
+              <w:spacing w:before="60" w:after="60"/>
+            </w:pPr>
+            <w:r>
+              <w:rPr>
+                <w:rFonts w:ascii="Arial" w:hAnsi="Arial"/>
+                <w:sz w:val="18"/>
+              </w:rPr>
+              <w:t>UNIQUE, NOT NULL</w:t>
+            </w:r>
+          </w:p>
+        </w:tc>
+        <w:tc>
+          <w:tcPr>
+            <w:tcW w:type="dxa" w:w="1872"/>
+          </w:tcPr>
+          <w:p>
+            <w:pPr>
+              <w:spacing w:before="60" w:after="60"/>
+            </w:pPr>
+            <w:r>
+              <w:rPr>
+                <w:rFonts w:ascii="Arial" w:hAnsi="Arial"/>
+                <w:sz w:val="18"/>
+              </w:rPr>
+              <w:t>Mã định danh trạm (VD: TBA_LA_01)</w:t>
+            </w:r>
+          </w:p>
+        </w:tc>
+      </w:tr>
+      <w:tr>
+        <w:tc>
+          <w:tcPr>
+            <w:tcW w:type="dxa" w:w="1872"/>
+          </w:tcPr>
+          <w:p>
+            <w:pPr>
+              <w:spacing w:before="60" w:after="60"/>
+            </w:pPr>
+            <w:r>
+              <w:rPr>
+                <w:rFonts w:ascii="Arial" w:hAnsi="Arial"/>
+                <w:sz w:val="18"/>
+              </w:rPr>
+              <w:t>`Name`</w:t>
+            </w:r>
+          </w:p>
+        </w:tc>
+        <w:tc>
+          <w:tcPr>
+            <w:tcW w:type="dxa" w:w="1872"/>
+          </w:tcPr>
+          <w:p>
+            <w:pPr>
+              <w:spacing w:before="60" w:after="60"/>
+            </w:pPr>
+            <w:r>
+              <w:rPr>
+                <w:rFonts w:ascii="Arial" w:hAnsi="Arial"/>
+                <w:sz w:val="18"/>
+              </w:rPr>
+              <w:t>`VARCHAR(200)`</w:t>
+            </w:r>
+          </w:p>
+        </w:tc>
+        <w:tc>
+          <w:tcPr>
+            <w:tcW w:type="dxa" w:w="1872"/>
+          </w:tcPr>
+          <w:p>
+            <w:pPr>
+              <w:spacing w:before="60" w:after="60"/>
+            </w:pPr>
+            <w:r>
+              <w:rPr>
+                <w:rFonts w:ascii="Arial" w:hAnsi="Arial"/>
+                <w:sz w:val="18"/>
+              </w:rPr>
+              <w:t>-</w:t>
+            </w:r>
+          </w:p>
+        </w:tc>
+        <w:tc>
+          <w:tcPr>
+            <w:tcW w:type="dxa" w:w="1872"/>
+          </w:tcPr>
+          <w:p>
+            <w:pPr>
+              <w:spacing w:before="60" w:after="60"/>
+            </w:pPr>
+            <w:r>
+              <w:rPr>
+                <w:rFonts w:ascii="Arial" w:hAnsi="Arial"/>
+                <w:sz w:val="18"/>
+              </w:rPr>
+              <w:t>NOT NULL</w:t>
+            </w:r>
+          </w:p>
+        </w:tc>
+        <w:tc>
+          <w:tcPr>
+            <w:tcW w:type="dxa" w:w="1872"/>
+          </w:tcPr>
+          <w:p>
+            <w:pPr>
+              <w:spacing w:before="60" w:after="60"/>
+            </w:pPr>
+            <w:r>
+              <w:rPr>
+                <w:rFonts w:ascii="Arial" w:hAnsi="Arial"/>
+                <w:sz w:val="18"/>
+              </w:rPr>
+              <w:t>Tên trạm biến áp</w:t>
+            </w:r>
+          </w:p>
+        </w:tc>
+      </w:tr>
+      <w:tr>
+        <w:tc>
+          <w:tcPr>
+            <w:tcW w:type="dxa" w:w="1872"/>
+          </w:tcPr>
+          <w:p>
+            <w:pPr>
+              <w:spacing w:before="60" w:after="60"/>
+            </w:pPr>
+            <w:r>
+              <w:rPr>
+                <w:rFonts w:ascii="Arial" w:hAnsi="Arial"/>
+                <w:sz w:val="18"/>
+              </w:rPr>
+              <w:t>`Location`</w:t>
+            </w:r>
+          </w:p>
+        </w:tc>
+        <w:tc>
+          <w:tcPr>
+            <w:tcW w:type="dxa" w:w="1872"/>
+          </w:tcPr>
+          <w:p>
+            <w:pPr>
+              <w:spacing w:before="60" w:after="60"/>
+            </w:pPr>
+            <w:r>
+              <w:rPr>
+                <w:rFonts w:ascii="Arial" w:hAnsi="Arial"/>
+                <w:sz w:val="18"/>
+              </w:rPr>
+              <w:t>`TEXT`</w:t>
+            </w:r>
+          </w:p>
+        </w:tc>
+        <w:tc>
+          <w:tcPr>
+            <w:tcW w:type="dxa" w:w="1872"/>
+          </w:tcPr>
+          <w:p>
+            <w:pPr>
+              <w:spacing w:before="60" w:after="60"/>
+            </w:pPr>
+            <w:r>
+              <w:rPr>
+                <w:rFonts w:ascii="Arial" w:hAnsi="Arial"/>
+                <w:sz w:val="18"/>
+              </w:rPr>
+              <w:t>-</w:t>
+            </w:r>
+          </w:p>
+        </w:tc>
+        <w:tc>
+          <w:tcPr>
+            <w:tcW w:type="dxa" w:w="1872"/>
+          </w:tcPr>
+          <w:p>
+            <w:pPr>
+              <w:spacing w:before="60" w:after="60"/>
+            </w:pPr>
+            <w:r>
+              <w:rPr>
+                <w:rFonts w:ascii="Arial" w:hAnsi="Arial"/>
+                <w:sz w:val="18"/>
+              </w:rPr>
+              <w:t>NULL</w:t>
+            </w:r>
+          </w:p>
+        </w:tc>
+        <w:tc>
+          <w:tcPr>
+            <w:tcW w:type="dxa" w:w="1872"/>
+          </w:tcPr>
+          <w:p>
+            <w:pPr>
+              <w:spacing w:before="60" w:after="60"/>
+            </w:pPr>
+            <w:r>
+              <w:rPr>
+                <w:rFonts w:ascii="Arial" w:hAnsi="Arial"/>
+                <w:sz w:val="18"/>
+              </w:rPr>
+              <w:t>Chuỗi JSON chứa kinh độ, vĩ độ</w:t>
+            </w:r>
+          </w:p>
+        </w:tc>
+      </w:tr>
+      <w:tr>
+        <w:tc>
+          <w:tcPr>
+            <w:tcW w:type="dxa" w:w="1872"/>
+          </w:tcPr>
+          <w:p>
+            <w:pPr>
+              <w:spacing w:before="60" w:after="60"/>
+            </w:pPr>
+            <w:r>
+              <w:rPr>
+                <w:rFonts w:ascii="Arial" w:hAnsi="Arial"/>
+                <w:sz w:val="18"/>
+              </w:rPr>
+              <w:t>`Status`</w:t>
+            </w:r>
+          </w:p>
+        </w:tc>
+        <w:tc>
+          <w:tcPr>
+            <w:tcW w:type="dxa" w:w="1872"/>
+          </w:tcPr>
+          <w:p>
+            <w:pPr>
+              <w:spacing w:before="60" w:after="60"/>
+            </w:pPr>
+            <w:r>
+              <w:rPr>
+                <w:rFonts w:ascii="Arial" w:hAnsi="Arial"/>
+                <w:sz w:val="18"/>
+              </w:rPr>
+              <w:t>`VARCHAR(20)`</w:t>
+            </w:r>
+          </w:p>
+        </w:tc>
+        <w:tc>
+          <w:tcPr>
+            <w:tcW w:type="dxa" w:w="1872"/>
+          </w:tcPr>
+          <w:p>
+            <w:pPr>
+              <w:spacing w:before="60" w:after="60"/>
+            </w:pPr>
+            <w:r>
+              <w:rPr>
+                <w:rFonts w:ascii="Arial" w:hAnsi="Arial"/>
+                <w:sz w:val="18"/>
+              </w:rPr>
+              <w:t>-</w:t>
+            </w:r>
+          </w:p>
+        </w:tc>
+        <w:tc>
+          <w:tcPr>
+            <w:tcW w:type="dxa" w:w="1872"/>
+          </w:tcPr>
+          <w:p>
+            <w:pPr>
+              <w:spacing w:before="60" w:after="60"/>
+            </w:pPr>
+            <w:r>
+              <w:rPr>
+                <w:rFonts w:ascii="Arial" w:hAnsi="Arial"/>
+                <w:sz w:val="18"/>
+              </w:rPr>
+              <w:t>NOT NULL</w:t>
+            </w:r>
+          </w:p>
+        </w:tc>
+        <w:tc>
+          <w:tcPr>
+            <w:tcW w:type="dxa" w:w="1872"/>
+          </w:tcPr>
+          <w:p>
+            <w:pPr>
+              <w:spacing w:before="60" w:after="60"/>
+            </w:pPr>
+            <w:r>
+              <w:rPr>
+                <w:rFonts w:ascii="Arial" w:hAnsi="Arial"/>
+                <w:sz w:val="18"/>
+              </w:rPr>
+              <w:t>Trạng thái trạm (`active`/`inactive`)</w:t>
+            </w:r>
+          </w:p>
+        </w:tc>
+      </w:tr>
+    </w:tbl>
+    <w:p/>
     <w:p>
       <w:pPr>
-        <w:spacing w:before="120" w:after="120" w:line="276" w:lineRule="auto"/>
-        <w:ind w:left="576"/>
-      </w:pPr>
-      <w:r>
-        <w:rPr>
-          <w:rFonts w:ascii="Courier New" w:hAnsi="Courier New"/>
-          <w:color w:val="3C3C3C"/>
-          <w:sz w:val="18"/>
-        </w:rPr>
-        <w:t>CREATE TABLE "Stations" (</w:t>
-        <w:br/>
-        <w:t xml:space="preserve">    "Id" UUID PRIMARY KEY,</w:t>
-        <w:br/>
-        <w:t xml:space="preserve">    "Code" VARCHAR(50) UNIQUE NOT NULL,</w:t>
-        <w:br/>
-        <w:t xml:space="preserve">    "Name" VARCHAR(200) NOT NULL,</w:t>
-        <w:br/>
-        <w:t xml:space="preserve">    "Location" TEXT NULL,</w:t>
-        <w:br/>
-        <w:t xml:space="preserve">    "Status" VARCHAR(20) NOT NULL DEFAULT 'active'</w:t>
-        <w:br/>
-        <w:t>);</w:t>
+        <w:spacing w:before="160" w:after="40" w:line="276" w:lineRule="auto"/>
+      </w:pPr>
+      <w:r>
+        <w:rPr>
+          <w:rFonts w:ascii="Arial" w:hAnsi="Arial"/>
+          <w:b/>
+          <w:i/>
+          <w:color w:val="646464"/>
+          <w:sz w:val="22"/>
+        </w:rPr>
+        <w:t>6.2 Bảng `Devices` (Danh sách thiết bị kết nối)</w:t>
       </w:r>
     </w:p>
     <w:tbl>
@@ -1427,7 +1964,7 @@
                 <w:rFonts w:ascii="Arial" w:hAnsi="Arial"/>
                 <w:sz w:val="18"/>
               </w:rPr>
-              <w:t>Khóa chính tự sinh</w:t>
+              <w:t>Khóa chính thiết bị</w:t>
             </w:r>
           </w:p>
         </w:tc>
@@ -1446,7 +1983,7 @@
                 <w:rFonts w:ascii="Arial" w:hAnsi="Arial"/>
                 <w:sz w:val="18"/>
               </w:rPr>
-              <w:t>`Code`</w:t>
+              <w:t>`StationId`</w:t>
             </w:r>
           </w:p>
         </w:tc>
@@ -1463,7 +2000,7 @@
                 <w:rFonts w:ascii="Arial" w:hAnsi="Arial"/>
                 <w:sz w:val="18"/>
               </w:rPr>
-              <w:t>`VARCHAR(50)`</w:t>
+              <w:t>`UUID`</w:t>
             </w:r>
           </w:p>
         </w:tc>
@@ -1480,7 +2017,7 @@
                 <w:rFonts w:ascii="Arial" w:hAnsi="Arial"/>
                 <w:sz w:val="18"/>
               </w:rPr>
-              <w:t>-</w:t>
+              <w:t>FK</w:t>
             </w:r>
           </w:p>
         </w:tc>
@@ -1497,7 +2034,7 @@
                 <w:rFonts w:ascii="Arial" w:hAnsi="Arial"/>
                 <w:sz w:val="18"/>
               </w:rPr>
-              <w:t>UNIQUE, NOT NULL</w:t>
+              <w:t>REFERENCES Stations</w:t>
             </w:r>
           </w:p>
         </w:tc>
@@ -1514,7 +2051,7 @@
                 <w:rFonts w:ascii="Arial" w:hAnsi="Arial"/>
                 <w:sz w:val="18"/>
               </w:rPr>
-              <w:t>Mã định danh trạm (VD: TBA_LA_01)</w:t>
+              <w:t>Trạm biến áp chứa thiết bị này</w:t>
             </w:r>
           </w:p>
         </w:tc>
@@ -1550,7 +2087,7 @@
                 <w:rFonts w:ascii="Arial" w:hAnsi="Arial"/>
                 <w:sz w:val="18"/>
               </w:rPr>
-              <w:t>`VARCHAR(200)`</w:t>
+              <w:t>`VARCHAR(150)`</w:t>
             </w:r>
           </w:p>
         </w:tc>
@@ -1601,7 +2138,7 @@
                 <w:rFonts w:ascii="Arial" w:hAnsi="Arial"/>
                 <w:sz w:val="18"/>
               </w:rPr>
-              <w:t>Tên trạm biến áp</w:t>
+              <w:t>Tên thiết bị</w:t>
             </w:r>
           </w:p>
         </w:tc>
@@ -1620,7 +2157,7 @@
                 <w:rFonts w:ascii="Arial" w:hAnsi="Arial"/>
                 <w:sz w:val="18"/>
               </w:rPr>
-              <w:t>`Location`</w:t>
+              <w:t>`Type`</w:t>
             </w:r>
           </w:p>
         </w:tc>
@@ -1637,7 +2174,7 @@
                 <w:rFonts w:ascii="Arial" w:hAnsi="Arial"/>
                 <w:sz w:val="18"/>
               </w:rPr>
-              <w:t>`TEXT`</w:t>
+              <w:t>`VARCHAR(50)`</w:t>
             </w:r>
           </w:p>
         </w:tc>
@@ -1671,7 +2208,7 @@
                 <w:rFonts w:ascii="Arial" w:hAnsi="Arial"/>
                 <w:sz w:val="18"/>
               </w:rPr>
-              <w:t>NULL</w:t>
+              <w:t>NOT NULL</w:t>
             </w:r>
           </w:p>
         </w:tc>
@@ -1688,7 +2225,7 @@
                 <w:rFonts w:ascii="Arial" w:hAnsi="Arial"/>
                 <w:sz w:val="18"/>
               </w:rPr>
-              <w:t>Chuỗi JSON chứa kinh độ, vĩ độ</w:t>
+              <w:t>Loại (`plc_s7`, `camera_thermal`, `modbus`)</w:t>
             </w:r>
           </w:p>
         </w:tc>
@@ -1707,6 +2244,267 @@
                 <w:rFonts w:ascii="Arial" w:hAnsi="Arial"/>
                 <w:sz w:val="18"/>
               </w:rPr>
+              <w:t>`Protocol`</w:t>
+            </w:r>
+          </w:p>
+        </w:tc>
+        <w:tc>
+          <w:tcPr>
+            <w:tcW w:type="dxa" w:w="1872"/>
+          </w:tcPr>
+          <w:p>
+            <w:pPr>
+              <w:spacing w:before="60" w:after="60"/>
+            </w:pPr>
+            <w:r>
+              <w:rPr>
+                <w:rFonts w:ascii="Arial" w:hAnsi="Arial"/>
+                <w:sz w:val="18"/>
+              </w:rPr>
+              <w:t>`VARCHAR(50)`</w:t>
+            </w:r>
+          </w:p>
+        </w:tc>
+        <w:tc>
+          <w:tcPr>
+            <w:tcW w:type="dxa" w:w="1872"/>
+          </w:tcPr>
+          <w:p>
+            <w:pPr>
+              <w:spacing w:before="60" w:after="60"/>
+            </w:pPr>
+            <w:r>
+              <w:rPr>
+                <w:rFonts w:ascii="Arial" w:hAnsi="Arial"/>
+                <w:sz w:val="18"/>
+              </w:rPr>
+              <w:t>-</w:t>
+            </w:r>
+          </w:p>
+        </w:tc>
+        <w:tc>
+          <w:tcPr>
+            <w:tcW w:type="dxa" w:w="1872"/>
+          </w:tcPr>
+          <w:p>
+            <w:pPr>
+              <w:spacing w:before="60" w:after="60"/>
+            </w:pPr>
+            <w:r>
+              <w:rPr>
+                <w:rFonts w:ascii="Arial" w:hAnsi="Arial"/>
+                <w:sz w:val="18"/>
+              </w:rPr>
+              <w:t>NOT NULL</w:t>
+            </w:r>
+          </w:p>
+        </w:tc>
+        <w:tc>
+          <w:tcPr>
+            <w:tcW w:type="dxa" w:w="1872"/>
+          </w:tcPr>
+          <w:p>
+            <w:pPr>
+              <w:spacing w:before="60" w:after="60"/>
+            </w:pPr>
+            <w:r>
+              <w:rPr>
+                <w:rFonts w:ascii="Arial" w:hAnsi="Arial"/>
+                <w:sz w:val="18"/>
+              </w:rPr>
+              <w:t>Giao thức (`snap7`, `rtsp`, `modbus_tcp`)</w:t>
+            </w:r>
+          </w:p>
+        </w:tc>
+      </w:tr>
+      <w:tr>
+        <w:tc>
+          <w:tcPr>
+            <w:tcW w:type="dxa" w:w="1872"/>
+          </w:tcPr>
+          <w:p>
+            <w:pPr>
+              <w:spacing w:before="60" w:after="60"/>
+            </w:pPr>
+            <w:r>
+              <w:rPr>
+                <w:rFonts w:ascii="Arial" w:hAnsi="Arial"/>
+                <w:sz w:val="18"/>
+              </w:rPr>
+              <w:t>`Config`</w:t>
+            </w:r>
+          </w:p>
+        </w:tc>
+        <w:tc>
+          <w:tcPr>
+            <w:tcW w:type="dxa" w:w="1872"/>
+          </w:tcPr>
+          <w:p>
+            <w:pPr>
+              <w:spacing w:before="60" w:after="60"/>
+            </w:pPr>
+            <w:r>
+              <w:rPr>
+                <w:rFonts w:ascii="Arial" w:hAnsi="Arial"/>
+                <w:sz w:val="18"/>
+              </w:rPr>
+              <w:t>`TEXT`</w:t>
+            </w:r>
+          </w:p>
+        </w:tc>
+        <w:tc>
+          <w:tcPr>
+            <w:tcW w:type="dxa" w:w="1872"/>
+          </w:tcPr>
+          <w:p>
+            <w:pPr>
+              <w:spacing w:before="60" w:after="60"/>
+            </w:pPr>
+            <w:r>
+              <w:rPr>
+                <w:rFonts w:ascii="Arial" w:hAnsi="Arial"/>
+                <w:sz w:val="18"/>
+              </w:rPr>
+              <w:t>-</w:t>
+            </w:r>
+          </w:p>
+        </w:tc>
+        <w:tc>
+          <w:tcPr>
+            <w:tcW w:type="dxa" w:w="1872"/>
+          </w:tcPr>
+          <w:p>
+            <w:pPr>
+              <w:spacing w:before="60" w:after="60"/>
+            </w:pPr>
+            <w:r>
+              <w:rPr>
+                <w:rFonts w:ascii="Arial" w:hAnsi="Arial"/>
+                <w:sz w:val="18"/>
+              </w:rPr>
+              <w:t>NOT NULL</w:t>
+            </w:r>
+          </w:p>
+        </w:tc>
+        <w:tc>
+          <w:tcPr>
+            <w:tcW w:type="dxa" w:w="1872"/>
+          </w:tcPr>
+          <w:p>
+            <w:pPr>
+              <w:spacing w:before="60" w:after="60"/>
+            </w:pPr>
+            <w:r>
+              <w:rPr>
+                <w:rFonts w:ascii="Arial" w:hAnsi="Arial"/>
+                <w:sz w:val="18"/>
+              </w:rPr>
+              <w:t>Chuỗi cấu hình JSON (IP, port, database...)</w:t>
+            </w:r>
+          </w:p>
+        </w:tc>
+      </w:tr>
+      <w:tr>
+        <w:tc>
+          <w:tcPr>
+            <w:tcW w:type="dxa" w:w="1872"/>
+          </w:tcPr>
+          <w:p>
+            <w:pPr>
+              <w:spacing w:before="60" w:after="60"/>
+            </w:pPr>
+            <w:r>
+              <w:rPr>
+                <w:rFonts w:ascii="Arial" w:hAnsi="Arial"/>
+                <w:sz w:val="18"/>
+              </w:rPr>
+              <w:t>`IsOnline`</w:t>
+            </w:r>
+          </w:p>
+        </w:tc>
+        <w:tc>
+          <w:tcPr>
+            <w:tcW w:type="dxa" w:w="1872"/>
+          </w:tcPr>
+          <w:p>
+            <w:pPr>
+              <w:spacing w:before="60" w:after="60"/>
+            </w:pPr>
+            <w:r>
+              <w:rPr>
+                <w:rFonts w:ascii="Arial" w:hAnsi="Arial"/>
+                <w:sz w:val="18"/>
+              </w:rPr>
+              <w:t>`BOOLEAN`</w:t>
+            </w:r>
+          </w:p>
+        </w:tc>
+        <w:tc>
+          <w:tcPr>
+            <w:tcW w:type="dxa" w:w="1872"/>
+          </w:tcPr>
+          <w:p>
+            <w:pPr>
+              <w:spacing w:before="60" w:after="60"/>
+            </w:pPr>
+            <w:r>
+              <w:rPr>
+                <w:rFonts w:ascii="Arial" w:hAnsi="Arial"/>
+                <w:sz w:val="18"/>
+              </w:rPr>
+              <w:t>-</w:t>
+            </w:r>
+          </w:p>
+        </w:tc>
+        <w:tc>
+          <w:tcPr>
+            <w:tcW w:type="dxa" w:w="1872"/>
+          </w:tcPr>
+          <w:p>
+            <w:pPr>
+              <w:spacing w:before="60" w:after="60"/>
+            </w:pPr>
+            <w:r>
+              <w:rPr>
+                <w:rFonts w:ascii="Arial" w:hAnsi="Arial"/>
+                <w:sz w:val="18"/>
+              </w:rPr>
+              <w:t>NOT NULL</w:t>
+            </w:r>
+          </w:p>
+        </w:tc>
+        <w:tc>
+          <w:tcPr>
+            <w:tcW w:type="dxa" w:w="1872"/>
+          </w:tcPr>
+          <w:p>
+            <w:pPr>
+              <w:spacing w:before="60" w:after="60"/>
+            </w:pPr>
+            <w:r>
+              <w:rPr>
+                <w:rFonts w:ascii="Arial" w:hAnsi="Arial"/>
+                <w:sz w:val="18"/>
+              </w:rPr>
+              <w:t>Trạng thái kết nối</w:t>
+            </w:r>
+          </w:p>
+        </w:tc>
+      </w:tr>
+      <w:tr>
+        <w:tc>
+          <w:tcPr>
+            <w:tcW w:type="dxa" w:w="1872"/>
+          </w:tcPr>
+          <w:p>
+            <w:pPr>
+              <w:spacing w:before="60" w:after="60"/>
+            </w:pPr>
+            <w:r>
+              <w:rPr>
+                <w:rFonts w:ascii="Arial" w:hAnsi="Arial"/>
+                <w:sz w:val="18"/>
+              </w:rPr>
               <w:t>`Status`</w:t>
             </w:r>
           </w:p>
@@ -1724,7 +2522,7 @@
                 <w:rFonts w:ascii="Arial" w:hAnsi="Arial"/>
                 <w:sz w:val="18"/>
               </w:rPr>
-              <w:t>`VARCHAR(20)`</w:t>
+              <w:t>`VARCHAR(50)`</w:t>
             </w:r>
           </w:p>
         </w:tc>
@@ -1775,7 +2573,7 @@
                 <w:rFonts w:ascii="Arial" w:hAnsi="Arial"/>
                 <w:sz w:val="18"/>
               </w:rPr>
-              <w:t>Trạng thái trạm (`active`/`inactive`)</w:t>
+              <w:t>Trạng thái hoạt động</w:t>
             </w:r>
           </w:p>
         </w:tc>
@@ -1794,39 +2592,7 @@
           <w:color w:val="646464"/>
           <w:sz w:val="22"/>
         </w:rPr>
-        <w:t>6.2 Bảng `Devices` (Danh sách thiết bị kết nối)</w:t>
-      </w:r>
-    </w:p>
-    <w:p>
-      <w:pPr>
-        <w:spacing w:before="120" w:after="120" w:line="276" w:lineRule="auto"/>
-        <w:ind w:left="576"/>
-      </w:pPr>
-      <w:r>
-        <w:rPr>
-          <w:rFonts w:ascii="Courier New" w:hAnsi="Courier New"/>
-          <w:color w:val="3C3C3C"/>
-          <w:sz w:val="18"/>
-        </w:rPr>
-        <w:t>CREATE TABLE "Devices" (</w:t>
-        <w:br/>
-        <w:t xml:space="preserve">    "Id" UUID PRIMARY KEY,</w:t>
-        <w:br/>
-        <w:t xml:space="preserve">    "StationId" UUID REFERENCES "Stations"("Id") ON DELETE CASCADE,</w:t>
-        <w:br/>
-        <w:t xml:space="preserve">    "Name" VARCHAR(150) NOT NULL,</w:t>
-        <w:br/>
-        <w:t xml:space="preserve">    "Type" VARCHAR(50) NOT NULL,</w:t>
-        <w:br/>
-        <w:t xml:space="preserve">    "Protocol" VARCHAR(50) NOT NULL,</w:t>
-        <w:br/>
-        <w:t xml:space="preserve">    "Config" TEXT NOT NULL,</w:t>
-        <w:br/>
-        <w:t xml:space="preserve">    "IsOnline" BOOLEAN NOT NULL DEFAULT false,</w:t>
-        <w:br/>
-        <w:t xml:space="preserve">    "Status" VARCHAR(50) NOT NULL DEFAULT 'unknown'</w:t>
-        <w:br/>
-        <w:t>);</w:t>
+        <w:t>6.3 Bảng `Users` (Danh sách tài khoản &amp; phân quyền)</w:t>
       </w:r>
     </w:p>
     <w:tbl>
@@ -2022,7 +2788,7 @@
                 <w:rFonts w:ascii="Arial" w:hAnsi="Arial"/>
                 <w:sz w:val="18"/>
               </w:rPr>
-              <w:t>Khóa chính thiết bị</w:t>
+              <w:t>Khóa chính người dùng</w:t>
             </w:r>
           </w:p>
         </w:tc>
@@ -2041,7 +2807,7 @@
                 <w:rFonts w:ascii="Arial" w:hAnsi="Arial"/>
                 <w:sz w:val="18"/>
               </w:rPr>
-              <w:t>`StationId`</w:t>
+              <w:t>`Username`</w:t>
             </w:r>
           </w:p>
         </w:tc>
@@ -2058,7 +2824,7 @@
                 <w:rFonts w:ascii="Arial" w:hAnsi="Arial"/>
                 <w:sz w:val="18"/>
               </w:rPr>
-              <w:t>`UUID`</w:t>
+              <w:t>`VARCHAR(100)`</w:t>
             </w:r>
           </w:p>
         </w:tc>
@@ -2075,7 +2841,7 @@
                 <w:rFonts w:ascii="Arial" w:hAnsi="Arial"/>
                 <w:sz w:val="18"/>
               </w:rPr>
-              <w:t>FK</w:t>
+              <w:t>-</w:t>
             </w:r>
           </w:p>
         </w:tc>
@@ -2092,7 +2858,7 @@
                 <w:rFonts w:ascii="Arial" w:hAnsi="Arial"/>
                 <w:sz w:val="18"/>
               </w:rPr>
-              <w:t>REFERENCES Stations</w:t>
+              <w:t>UNIQUE, NOT NULL</w:t>
             </w:r>
           </w:p>
         </w:tc>
@@ -2109,7 +2875,7 @@
                 <w:rFonts w:ascii="Arial" w:hAnsi="Arial"/>
                 <w:sz w:val="18"/>
               </w:rPr>
-              <w:t>Trạm biến áp chứa thiết bị này</w:t>
+              <w:t>Tên đăng nhập</w:t>
             </w:r>
           </w:p>
         </w:tc>
@@ -2128,7 +2894,7 @@
                 <w:rFonts w:ascii="Arial" w:hAnsi="Arial"/>
                 <w:sz w:val="18"/>
               </w:rPr>
-              <w:t>`Name`</w:t>
+              <w:t>`PasswordHash`</w:t>
             </w:r>
           </w:p>
         </w:tc>
@@ -2145,7 +2911,7 @@
                 <w:rFonts w:ascii="Arial" w:hAnsi="Arial"/>
                 <w:sz w:val="18"/>
               </w:rPr>
-              <w:t>`VARCHAR(150)`</w:t>
+              <w:t>`VARCHAR(256)`</w:t>
             </w:r>
           </w:p>
         </w:tc>
@@ -2196,7 +2962,7 @@
                 <w:rFonts w:ascii="Arial" w:hAnsi="Arial"/>
                 <w:sz w:val="18"/>
               </w:rPr>
-              <w:t>Tên thiết bị</w:t>
+              <w:t>Mật khẩu băm an toàn</w:t>
             </w:r>
           </w:p>
         </w:tc>
@@ -2215,7 +2981,7 @@
                 <w:rFonts w:ascii="Arial" w:hAnsi="Arial"/>
                 <w:sz w:val="18"/>
               </w:rPr>
-              <w:t>`Type`</w:t>
+              <w:t>`Role`</w:t>
             </w:r>
           </w:p>
         </w:tc>
@@ -2232,7 +2998,7 @@
                 <w:rFonts w:ascii="Arial" w:hAnsi="Arial"/>
                 <w:sz w:val="18"/>
               </w:rPr>
-              <w:t>`VARCHAR(50)`</w:t>
+              <w:t>`VARCHAR(30)`</w:t>
             </w:r>
           </w:p>
         </w:tc>
@@ -2283,7 +3049,7 @@
                 <w:rFonts w:ascii="Arial" w:hAnsi="Arial"/>
                 <w:sz w:val="18"/>
               </w:rPr>
-              <w:t>Loại (`plc_s7`, `camera_thermal`, `modbus`)</w:t>
+              <w:t>Vai trò phân quyền (`Admin`, `Manager`, `Operator`)</w:t>
             </w:r>
           </w:p>
         </w:tc>
@@ -2302,7 +3068,7 @@
                 <w:rFonts w:ascii="Arial" w:hAnsi="Arial"/>
                 <w:sz w:val="18"/>
               </w:rPr>
-              <w:t>`Protocol`</w:t>
+              <w:t>`FullName`</w:t>
             </w:r>
           </w:p>
         </w:tc>
@@ -2319,7 +3085,7 @@
                 <w:rFonts w:ascii="Arial" w:hAnsi="Arial"/>
                 <w:sz w:val="18"/>
               </w:rPr>
-              <w:t>`VARCHAR(50)`</w:t>
+              <w:t>`VARCHAR(150)`</w:t>
             </w:r>
           </w:p>
         </w:tc>
@@ -2353,7 +3119,7 @@
                 <w:rFonts w:ascii="Arial" w:hAnsi="Arial"/>
                 <w:sz w:val="18"/>
               </w:rPr>
-              <w:t>NOT NULL</w:t>
+              <w:t>NULL</w:t>
             </w:r>
           </w:p>
         </w:tc>
@@ -2370,7 +3136,7 @@
                 <w:rFonts w:ascii="Arial" w:hAnsi="Arial"/>
                 <w:sz w:val="18"/>
               </w:rPr>
-              <w:t>Giao thức (`snap7`, `rtsp`, `modbus_tcp`)</w:t>
+              <w:t>Họ và tên đầy đủ</w:t>
             </w:r>
           </w:p>
         </w:tc>
@@ -2389,7 +3155,7 @@
                 <w:rFonts w:ascii="Arial" w:hAnsi="Arial"/>
                 <w:sz w:val="18"/>
               </w:rPr>
-              <w:t>`Config`</w:t>
+              <w:t>`Email`</w:t>
             </w:r>
           </w:p>
         </w:tc>
@@ -2406,7 +3172,7 @@
                 <w:rFonts w:ascii="Arial" w:hAnsi="Arial"/>
                 <w:sz w:val="18"/>
               </w:rPr>
-              <w:t>`TEXT`</w:t>
+              <w:t>`VARCHAR(100)`</w:t>
             </w:r>
           </w:p>
         </w:tc>
@@ -2440,7 +3206,7 @@
                 <w:rFonts w:ascii="Arial" w:hAnsi="Arial"/>
                 <w:sz w:val="18"/>
               </w:rPr>
-              <w:t>NOT NULL</w:t>
+              <w:t>NULL</w:t>
             </w:r>
           </w:p>
         </w:tc>
@@ -2457,7 +3223,7 @@
                 <w:rFonts w:ascii="Arial" w:hAnsi="Arial"/>
                 <w:sz w:val="18"/>
               </w:rPr>
-              <w:t>Chuỗi cấu hình JSON (IP, port, database...)</w:t>
+              <w:t>Hòm thư điện tử</w:t>
             </w:r>
           </w:p>
         </w:tc>
@@ -2476,7 +3242,7 @@
                 <w:rFonts w:ascii="Arial" w:hAnsi="Arial"/>
                 <w:sz w:val="18"/>
               </w:rPr>
-              <w:t>`IsOnline`</w:t>
+              <w:t>`CreatedAt`</w:t>
             </w:r>
           </w:p>
         </w:tc>
@@ -2493,7 +3259,7 @@
                 <w:rFonts w:ascii="Arial" w:hAnsi="Arial"/>
                 <w:sz w:val="18"/>
               </w:rPr>
-              <w:t>`BOOLEAN`</w:t>
+              <w:t>`TIMESTAMP`</w:t>
             </w:r>
           </w:p>
         </w:tc>
@@ -2544,94 +3310,7 @@
                 <w:rFonts w:ascii="Arial" w:hAnsi="Arial"/>
                 <w:sz w:val="18"/>
               </w:rPr>
-              <w:t>Trạng thái kết nối</w:t>
-            </w:r>
-          </w:p>
-        </w:tc>
-      </w:tr>
-      <w:tr>
-        <w:tc>
-          <w:tcPr>
-            <w:tcW w:type="dxa" w:w="1872"/>
-          </w:tcPr>
-          <w:p>
-            <w:pPr>
-              <w:spacing w:before="60" w:after="60"/>
-            </w:pPr>
-            <w:r>
-              <w:rPr>
-                <w:rFonts w:ascii="Arial" w:hAnsi="Arial"/>
-                <w:sz w:val="18"/>
-              </w:rPr>
-              <w:t>`Status`</w:t>
-            </w:r>
-          </w:p>
-        </w:tc>
-        <w:tc>
-          <w:tcPr>
-            <w:tcW w:type="dxa" w:w="1872"/>
-          </w:tcPr>
-          <w:p>
-            <w:pPr>
-              <w:spacing w:before="60" w:after="60"/>
-            </w:pPr>
-            <w:r>
-              <w:rPr>
-                <w:rFonts w:ascii="Arial" w:hAnsi="Arial"/>
-                <w:sz w:val="18"/>
-              </w:rPr>
-              <w:t>`VARCHAR(50)`</w:t>
-            </w:r>
-          </w:p>
-        </w:tc>
-        <w:tc>
-          <w:tcPr>
-            <w:tcW w:type="dxa" w:w="1872"/>
-          </w:tcPr>
-          <w:p>
-            <w:pPr>
-              <w:spacing w:before="60" w:after="60"/>
-            </w:pPr>
-            <w:r>
-              <w:rPr>
-                <w:rFonts w:ascii="Arial" w:hAnsi="Arial"/>
-                <w:sz w:val="18"/>
-              </w:rPr>
-              <w:t>-</w:t>
-            </w:r>
-          </w:p>
-        </w:tc>
-        <w:tc>
-          <w:tcPr>
-            <w:tcW w:type="dxa" w:w="1872"/>
-          </w:tcPr>
-          <w:p>
-            <w:pPr>
-              <w:spacing w:before="60" w:after="60"/>
-            </w:pPr>
-            <w:r>
-              <w:rPr>
-                <w:rFonts w:ascii="Arial" w:hAnsi="Arial"/>
-                <w:sz w:val="18"/>
-              </w:rPr>
-              <w:t>NOT NULL</w:t>
-            </w:r>
-          </w:p>
-        </w:tc>
-        <w:tc>
-          <w:tcPr>
-            <w:tcW w:type="dxa" w:w="1872"/>
-          </w:tcPr>
-          <w:p>
-            <w:pPr>
-              <w:spacing w:before="60" w:after="60"/>
-            </w:pPr>
-            <w:r>
-              <w:rPr>
-                <w:rFonts w:ascii="Arial" w:hAnsi="Arial"/>
-                <w:sz w:val="18"/>
-              </w:rPr>
-              <w:t>Trạng thái hoạt động</w:t>
+              <w:t>Ngày tạo tài khoản</w:t>
             </w:r>
           </w:p>
         </w:tc>
@@ -2650,37 +3329,7 @@
           <w:color w:val="646464"/>
           <w:sz w:val="22"/>
         </w:rPr>
-        <w:t>6.3 Bảng `Users` (Danh sách tài khoản &amp; phân quyền)</w:t>
-      </w:r>
-    </w:p>
-    <w:p>
-      <w:pPr>
-        <w:spacing w:before="120" w:after="120" w:line="276" w:lineRule="auto"/>
-        <w:ind w:left="576"/>
-      </w:pPr>
-      <w:r>
-        <w:rPr>
-          <w:rFonts w:ascii="Courier New" w:hAnsi="Courier New"/>
-          <w:color w:val="3C3C3C"/>
-          <w:sz w:val="18"/>
-        </w:rPr>
-        <w:t>CREATE TABLE "Users" (</w:t>
-        <w:br/>
-        <w:t xml:space="preserve">    "Id" UUID PRIMARY KEY,</w:t>
-        <w:br/>
-        <w:t xml:space="preserve">    "Username" VARCHAR(100) UNIQUE NOT NULL,</w:t>
-        <w:br/>
-        <w:t xml:space="preserve">    "PasswordHash" VARCHAR(256) NOT NULL,</w:t>
-        <w:br/>
-        <w:t xml:space="preserve">    "Role" VARCHAR(30) NOT NULL,</w:t>
-        <w:br/>
-        <w:t xml:space="preserve">    "FullName" VARCHAR(150) NULL,</w:t>
-        <w:br/>
-        <w:t xml:space="preserve">    "Email" VARCHAR(100) NULL,</w:t>
-        <w:br/>
-        <w:t xml:space="preserve">    "CreatedAt" TIMESTAMP NOT NULL DEFAULT CURRENT_TIMESTAMP</w:t>
-        <w:br/>
-        <w:t>);</w:t>
+        <w:t>6.4 Bảng `SldFiles` (Thông tin tệp sơ đồ một sợi SVG)</w:t>
       </w:r>
     </w:p>
     <w:tbl>
@@ -2876,7 +3525,7 @@
                 <w:rFonts w:ascii="Arial" w:hAnsi="Arial"/>
                 <w:sz w:val="18"/>
               </w:rPr>
-              <w:t>Khóa chính người dùng</w:t>
+              <w:t>Khóa chính sơ đồ</w:t>
             </w:r>
           </w:p>
         </w:tc>
@@ -2895,7 +3544,7 @@
                 <w:rFonts w:ascii="Arial" w:hAnsi="Arial"/>
                 <w:sz w:val="18"/>
               </w:rPr>
-              <w:t>`Username`</w:t>
+              <w:t>`Name`</w:t>
             </w:r>
           </w:p>
         </w:tc>
@@ -2912,7 +3561,7 @@
                 <w:rFonts w:ascii="Arial" w:hAnsi="Arial"/>
                 <w:sz w:val="18"/>
               </w:rPr>
-              <w:t>`VARCHAR(100)`</w:t>
+              <w:t>`VARCHAR(200)`</w:t>
             </w:r>
           </w:p>
         </w:tc>
@@ -2946,7 +3595,7 @@
                 <w:rFonts w:ascii="Arial" w:hAnsi="Arial"/>
                 <w:sz w:val="18"/>
               </w:rPr>
-              <w:t>UNIQUE, NOT NULL</w:t>
+              <w:t>NOT NULL</w:t>
             </w:r>
           </w:p>
         </w:tc>
@@ -2963,7 +3612,7 @@
                 <w:rFonts w:ascii="Arial" w:hAnsi="Arial"/>
                 <w:sz w:val="18"/>
               </w:rPr>
-              <w:t>Tên đăng nhập</w:t>
+              <w:t>Tên bản vẽ sơ đồ</w:t>
             </w:r>
           </w:p>
         </w:tc>
@@ -2982,7 +3631,7 @@
                 <w:rFonts w:ascii="Arial" w:hAnsi="Arial"/>
                 <w:sz w:val="18"/>
               </w:rPr>
-              <w:t>`PasswordHash`</w:t>
+              <w:t>`Path`</w:t>
             </w:r>
           </w:p>
         </w:tc>
@@ -2999,7 +3648,7 @@
                 <w:rFonts w:ascii="Arial" w:hAnsi="Arial"/>
                 <w:sz w:val="18"/>
               </w:rPr>
-              <w:t>`VARCHAR(256)`</w:t>
+              <w:t>`VARCHAR(500)`</w:t>
             </w:r>
           </w:p>
         </w:tc>
@@ -3050,7 +3699,7 @@
                 <w:rFonts w:ascii="Arial" w:hAnsi="Arial"/>
                 <w:sz w:val="18"/>
               </w:rPr>
-              <w:t>Mật khẩu băm an toàn</w:t>
+              <w:t>Đường dẫn lưu trữ tệp SVG trên đĩa</w:t>
             </w:r>
           </w:p>
         </w:tc>
@@ -3069,7 +3718,7 @@
                 <w:rFonts w:ascii="Arial" w:hAnsi="Arial"/>
                 <w:sz w:val="18"/>
               </w:rPr>
-              <w:t>`Role`</w:t>
+              <w:t>`CreatedAt`</w:t>
             </w:r>
           </w:p>
         </w:tc>
@@ -3086,7 +3735,7 @@
                 <w:rFonts w:ascii="Arial" w:hAnsi="Arial"/>
                 <w:sz w:val="18"/>
               </w:rPr>
-              <w:t>`VARCHAR(30)`</w:t>
+              <w:t>`TIMESTAMP`</w:t>
             </w:r>
           </w:p>
         </w:tc>
@@ -3137,268 +3786,7 @@
                 <w:rFonts w:ascii="Arial" w:hAnsi="Arial"/>
                 <w:sz w:val="18"/>
               </w:rPr>
-              <w:t>Vai trò phân quyền (`Admin`, `Manager`, `Operator`)</w:t>
-            </w:r>
-          </w:p>
-        </w:tc>
-      </w:tr>
-      <w:tr>
-        <w:tc>
-          <w:tcPr>
-            <w:tcW w:type="dxa" w:w="1872"/>
-          </w:tcPr>
-          <w:p>
-            <w:pPr>
-              <w:spacing w:before="60" w:after="60"/>
-            </w:pPr>
-            <w:r>
-              <w:rPr>
-                <w:rFonts w:ascii="Arial" w:hAnsi="Arial"/>
-                <w:sz w:val="18"/>
-              </w:rPr>
-              <w:t>`FullName`</w:t>
-            </w:r>
-          </w:p>
-        </w:tc>
-        <w:tc>
-          <w:tcPr>
-            <w:tcW w:type="dxa" w:w="1872"/>
-          </w:tcPr>
-          <w:p>
-            <w:pPr>
-              <w:spacing w:before="60" w:after="60"/>
-            </w:pPr>
-            <w:r>
-              <w:rPr>
-                <w:rFonts w:ascii="Arial" w:hAnsi="Arial"/>
-                <w:sz w:val="18"/>
-              </w:rPr>
-              <w:t>`VARCHAR(150)`</w:t>
-            </w:r>
-          </w:p>
-        </w:tc>
-        <w:tc>
-          <w:tcPr>
-            <w:tcW w:type="dxa" w:w="1872"/>
-          </w:tcPr>
-          <w:p>
-            <w:pPr>
-              <w:spacing w:before="60" w:after="60"/>
-            </w:pPr>
-            <w:r>
-              <w:rPr>
-                <w:rFonts w:ascii="Arial" w:hAnsi="Arial"/>
-                <w:sz w:val="18"/>
-              </w:rPr>
-              <w:t>-</w:t>
-            </w:r>
-          </w:p>
-        </w:tc>
-        <w:tc>
-          <w:tcPr>
-            <w:tcW w:type="dxa" w:w="1872"/>
-          </w:tcPr>
-          <w:p>
-            <w:pPr>
-              <w:spacing w:before="60" w:after="60"/>
-            </w:pPr>
-            <w:r>
-              <w:rPr>
-                <w:rFonts w:ascii="Arial" w:hAnsi="Arial"/>
-                <w:sz w:val="18"/>
-              </w:rPr>
-              <w:t>NULL</w:t>
-            </w:r>
-          </w:p>
-        </w:tc>
-        <w:tc>
-          <w:tcPr>
-            <w:tcW w:type="dxa" w:w="1872"/>
-          </w:tcPr>
-          <w:p>
-            <w:pPr>
-              <w:spacing w:before="60" w:after="60"/>
-            </w:pPr>
-            <w:r>
-              <w:rPr>
-                <w:rFonts w:ascii="Arial" w:hAnsi="Arial"/>
-                <w:sz w:val="18"/>
-              </w:rPr>
-              <w:t>Họ và tên đầy đủ</w:t>
-            </w:r>
-          </w:p>
-        </w:tc>
-      </w:tr>
-      <w:tr>
-        <w:tc>
-          <w:tcPr>
-            <w:tcW w:type="dxa" w:w="1872"/>
-          </w:tcPr>
-          <w:p>
-            <w:pPr>
-              <w:spacing w:before="60" w:after="60"/>
-            </w:pPr>
-            <w:r>
-              <w:rPr>
-                <w:rFonts w:ascii="Arial" w:hAnsi="Arial"/>
-                <w:sz w:val="18"/>
-              </w:rPr>
-              <w:t>`Email`</w:t>
-            </w:r>
-          </w:p>
-        </w:tc>
-        <w:tc>
-          <w:tcPr>
-            <w:tcW w:type="dxa" w:w="1872"/>
-          </w:tcPr>
-          <w:p>
-            <w:pPr>
-              <w:spacing w:before="60" w:after="60"/>
-            </w:pPr>
-            <w:r>
-              <w:rPr>
-                <w:rFonts w:ascii="Arial" w:hAnsi="Arial"/>
-                <w:sz w:val="18"/>
-              </w:rPr>
-              <w:t>`VARCHAR(100)`</w:t>
-            </w:r>
-          </w:p>
-        </w:tc>
-        <w:tc>
-          <w:tcPr>
-            <w:tcW w:type="dxa" w:w="1872"/>
-          </w:tcPr>
-          <w:p>
-            <w:pPr>
-              <w:spacing w:before="60" w:after="60"/>
-            </w:pPr>
-            <w:r>
-              <w:rPr>
-                <w:rFonts w:ascii="Arial" w:hAnsi="Arial"/>
-                <w:sz w:val="18"/>
-              </w:rPr>
-              <w:t>-</w:t>
-            </w:r>
-          </w:p>
-        </w:tc>
-        <w:tc>
-          <w:tcPr>
-            <w:tcW w:type="dxa" w:w="1872"/>
-          </w:tcPr>
-          <w:p>
-            <w:pPr>
-              <w:spacing w:before="60" w:after="60"/>
-            </w:pPr>
-            <w:r>
-              <w:rPr>
-                <w:rFonts w:ascii="Arial" w:hAnsi="Arial"/>
-                <w:sz w:val="18"/>
-              </w:rPr>
-              <w:t>NULL</w:t>
-            </w:r>
-          </w:p>
-        </w:tc>
-        <w:tc>
-          <w:tcPr>
-            <w:tcW w:type="dxa" w:w="1872"/>
-          </w:tcPr>
-          <w:p>
-            <w:pPr>
-              <w:spacing w:before="60" w:after="60"/>
-            </w:pPr>
-            <w:r>
-              <w:rPr>
-                <w:rFonts w:ascii="Arial" w:hAnsi="Arial"/>
-                <w:sz w:val="18"/>
-              </w:rPr>
-              <w:t>Hòm thư điện tử</w:t>
-            </w:r>
-          </w:p>
-        </w:tc>
-      </w:tr>
-      <w:tr>
-        <w:tc>
-          <w:tcPr>
-            <w:tcW w:type="dxa" w:w="1872"/>
-          </w:tcPr>
-          <w:p>
-            <w:pPr>
-              <w:spacing w:before="60" w:after="60"/>
-            </w:pPr>
-            <w:r>
-              <w:rPr>
-                <w:rFonts w:ascii="Arial" w:hAnsi="Arial"/>
-                <w:sz w:val="18"/>
-              </w:rPr>
-              <w:t>`CreatedAt`</w:t>
-            </w:r>
-          </w:p>
-        </w:tc>
-        <w:tc>
-          <w:tcPr>
-            <w:tcW w:type="dxa" w:w="1872"/>
-          </w:tcPr>
-          <w:p>
-            <w:pPr>
-              <w:spacing w:before="60" w:after="60"/>
-            </w:pPr>
-            <w:r>
-              <w:rPr>
-                <w:rFonts w:ascii="Arial" w:hAnsi="Arial"/>
-                <w:sz w:val="18"/>
-              </w:rPr>
-              <w:t>`TIMESTAMP`</w:t>
-            </w:r>
-          </w:p>
-        </w:tc>
-        <w:tc>
-          <w:tcPr>
-            <w:tcW w:type="dxa" w:w="1872"/>
-          </w:tcPr>
-          <w:p>
-            <w:pPr>
-              <w:spacing w:before="60" w:after="60"/>
-            </w:pPr>
-            <w:r>
-              <w:rPr>
-                <w:rFonts w:ascii="Arial" w:hAnsi="Arial"/>
-                <w:sz w:val="18"/>
-              </w:rPr>
-              <w:t>-</w:t>
-            </w:r>
-          </w:p>
-        </w:tc>
-        <w:tc>
-          <w:tcPr>
-            <w:tcW w:type="dxa" w:w="1872"/>
-          </w:tcPr>
-          <w:p>
-            <w:pPr>
-              <w:spacing w:before="60" w:after="60"/>
-            </w:pPr>
-            <w:r>
-              <w:rPr>
-                <w:rFonts w:ascii="Arial" w:hAnsi="Arial"/>
-                <w:sz w:val="18"/>
-              </w:rPr>
-              <w:t>NOT NULL</w:t>
-            </w:r>
-          </w:p>
-        </w:tc>
-        <w:tc>
-          <w:tcPr>
-            <w:tcW w:type="dxa" w:w="1872"/>
-          </w:tcPr>
-          <w:p>
-            <w:pPr>
-              <w:spacing w:before="60" w:after="60"/>
-            </w:pPr>
-            <w:r>
-              <w:rPr>
-                <w:rFonts w:ascii="Arial" w:hAnsi="Arial"/>
-                <w:sz w:val="18"/>
-              </w:rPr>
-              <w:t>Ngày tạo tài khoản</w:t>
+              <w:t>Thời điểm tải lên</w:t>
             </w:r>
           </w:p>
         </w:tc>
@@ -3417,31 +3805,7 @@
           <w:color w:val="646464"/>
           <w:sz w:val="22"/>
         </w:rPr>
-        <w:t>6.4 Bảng `SldFiles` (Thông tin tệp sơ đồ một sợi SVG)</w:t>
-      </w:r>
-    </w:p>
-    <w:p>
-      <w:pPr>
-        <w:spacing w:before="120" w:after="120" w:line="276" w:lineRule="auto"/>
-        <w:ind w:left="576"/>
-      </w:pPr>
-      <w:r>
-        <w:rPr>
-          <w:rFonts w:ascii="Courier New" w:hAnsi="Courier New"/>
-          <w:color w:val="3C3C3C"/>
-          <w:sz w:val="18"/>
-        </w:rPr>
-        <w:t>CREATE TABLE "SldFiles" (</w:t>
-        <w:br/>
-        <w:t xml:space="preserve">    "Id" UUID PRIMARY KEY,</w:t>
-        <w:br/>
-        <w:t xml:space="preserve">    "Name" VARCHAR(200) NOT NULL,</w:t>
-        <w:br/>
-        <w:t xml:space="preserve">    "Path" VARCHAR(500) NOT NULL,</w:t>
-        <w:br/>
-        <w:t xml:space="preserve">    "CreatedAt" TIMESTAMP NOT NULL DEFAULT CURRENT_TIMESTAMP</w:t>
-        <w:br/>
-        <w:t>);</w:t>
+        <w:t>6.5 Bảng `SldPoints` (Liên kết điểm đo với phần tử đồ họa SVG)</w:t>
       </w:r>
     </w:p>
     <w:tbl>
@@ -3637,7 +4001,7 @@
                 <w:rFonts w:ascii="Arial" w:hAnsi="Arial"/>
                 <w:sz w:val="18"/>
               </w:rPr>
-              <w:t>Khóa chính sơ đồ</w:t>
+              <w:t>Khóa chính liên kết</w:t>
             </w:r>
           </w:p>
         </w:tc>
@@ -3656,7 +4020,7 @@
                 <w:rFonts w:ascii="Arial" w:hAnsi="Arial"/>
                 <w:sz w:val="18"/>
               </w:rPr>
-              <w:t>`Name`</w:t>
+              <w:t>`SldFileId`</w:t>
             </w:r>
           </w:p>
         </w:tc>
@@ -3673,7 +4037,7 @@
                 <w:rFonts w:ascii="Arial" w:hAnsi="Arial"/>
                 <w:sz w:val="18"/>
               </w:rPr>
-              <w:t>`VARCHAR(200)`</w:t>
+              <w:t>`UUID`</w:t>
             </w:r>
           </w:p>
         </w:tc>
@@ -3690,7 +4054,7 @@
                 <w:rFonts w:ascii="Arial" w:hAnsi="Arial"/>
                 <w:sz w:val="18"/>
               </w:rPr>
-              <w:t>-</w:t>
+              <w:t>FK</w:t>
             </w:r>
           </w:p>
         </w:tc>
@@ -3707,7 +4071,7 @@
                 <w:rFonts w:ascii="Arial" w:hAnsi="Arial"/>
                 <w:sz w:val="18"/>
               </w:rPr>
-              <w:t>NOT NULL</w:t>
+              <w:t>REFERENCES SldFiles</w:t>
             </w:r>
           </w:p>
         </w:tc>
@@ -3724,7 +4088,7 @@
                 <w:rFonts w:ascii="Arial" w:hAnsi="Arial"/>
                 <w:sz w:val="18"/>
               </w:rPr>
-              <w:t>Tên bản vẽ sơ đồ</w:t>
+              <w:t>Sơ đồ một sợi áp dụng</w:t>
             </w:r>
           </w:p>
         </w:tc>
@@ -3743,7 +4107,7 @@
                 <w:rFonts w:ascii="Arial" w:hAnsi="Arial"/>
                 <w:sz w:val="18"/>
               </w:rPr>
-              <w:t>`Path`</w:t>
+              <w:t>`ElementId`</w:t>
             </w:r>
           </w:p>
         </w:tc>
@@ -3760,7 +4124,7 @@
                 <w:rFonts w:ascii="Arial" w:hAnsi="Arial"/>
                 <w:sz w:val="18"/>
               </w:rPr>
-              <w:t>`VARCHAR(500)`</w:t>
+              <w:t>`VARCHAR(100)`</w:t>
             </w:r>
           </w:p>
         </w:tc>
@@ -3811,7 +4175,7 @@
                 <w:rFonts w:ascii="Arial" w:hAnsi="Arial"/>
                 <w:sz w:val="18"/>
               </w:rPr>
-              <w:t>Đường dẫn lưu trữ tệp SVG trên đĩa</w:t>
+              <w:t>ID thẻ DOM trong mã nguồn SVG</w:t>
             </w:r>
           </w:p>
         </w:tc>
@@ -3830,7 +4194,7 @@
                 <w:rFonts w:ascii="Arial" w:hAnsi="Arial"/>
                 <w:sz w:val="18"/>
               </w:rPr>
-              <w:t>`CreatedAt`</w:t>
+              <w:t>`PointId`</w:t>
             </w:r>
           </w:p>
         </w:tc>
@@ -3847,7 +4211,7 @@
                 <w:rFonts w:ascii="Arial" w:hAnsi="Arial"/>
                 <w:sz w:val="18"/>
               </w:rPr>
-              <w:t>`TIMESTAMP`</w:t>
+              <w:t>`VARCHAR(100)`</w:t>
             </w:r>
           </w:p>
         </w:tc>
@@ -3898,7 +4262,94 @@
                 <w:rFonts w:ascii="Arial" w:hAnsi="Arial"/>
                 <w:sz w:val="18"/>
               </w:rPr>
-              <w:t>Thời điểm tải lên</w:t>
+              <w:t>Mã điểm đo cảm biến</w:t>
+            </w:r>
+          </w:p>
+        </w:tc>
+      </w:tr>
+      <w:tr>
+        <w:tc>
+          <w:tcPr>
+            <w:tcW w:type="dxa" w:w="1872"/>
+          </w:tcPr>
+          <w:p>
+            <w:pPr>
+              <w:spacing w:before="60" w:after="60"/>
+            </w:pPr>
+            <w:r>
+              <w:rPr>
+                <w:rFonts w:ascii="Arial" w:hAnsi="Arial"/>
+                <w:sz w:val="18"/>
+              </w:rPr>
+              <w:t>`Description`</w:t>
+            </w:r>
+          </w:p>
+        </w:tc>
+        <w:tc>
+          <w:tcPr>
+            <w:tcW w:type="dxa" w:w="1872"/>
+          </w:tcPr>
+          <w:p>
+            <w:pPr>
+              <w:spacing w:before="60" w:after="60"/>
+            </w:pPr>
+            <w:r>
+              <w:rPr>
+                <w:rFonts w:ascii="Arial" w:hAnsi="Arial"/>
+                <w:sz w:val="18"/>
+              </w:rPr>
+              <w:t>`VARCHAR(200)`</w:t>
+            </w:r>
+          </w:p>
+        </w:tc>
+        <w:tc>
+          <w:tcPr>
+            <w:tcW w:type="dxa" w:w="1872"/>
+          </w:tcPr>
+          <w:p>
+            <w:pPr>
+              <w:spacing w:before="60" w:after="60"/>
+            </w:pPr>
+            <w:r>
+              <w:rPr>
+                <w:rFonts w:ascii="Arial" w:hAnsi="Arial"/>
+                <w:sz w:val="18"/>
+              </w:rPr>
+              <w:t>-</w:t>
+            </w:r>
+          </w:p>
+        </w:tc>
+        <w:tc>
+          <w:tcPr>
+            <w:tcW w:type="dxa" w:w="1872"/>
+          </w:tcPr>
+          <w:p>
+            <w:pPr>
+              <w:spacing w:before="60" w:after="60"/>
+            </w:pPr>
+            <w:r>
+              <w:rPr>
+                <w:rFonts w:ascii="Arial" w:hAnsi="Arial"/>
+                <w:sz w:val="18"/>
+              </w:rPr>
+              <w:t>NULL</w:t>
+            </w:r>
+          </w:p>
+        </w:tc>
+        <w:tc>
+          <w:tcPr>
+            <w:tcW w:type="dxa" w:w="1872"/>
+          </w:tcPr>
+          <w:p>
+            <w:pPr>
+              <w:spacing w:before="60" w:after="60"/>
+            </w:pPr>
+            <w:r>
+              <w:rPr>
+                <w:rFonts w:ascii="Arial" w:hAnsi="Arial"/>
+                <w:sz w:val="18"/>
+              </w:rPr>
+              <w:t>Chú thích điểm liên kết</w:t>
             </w:r>
           </w:p>
         </w:tc>
@@ -3917,33 +4368,7 @@
           <w:color w:val="646464"/>
           <w:sz w:val="22"/>
         </w:rPr>
-        <w:t>6.5 Bảng `SldPoints` (Liên kết điểm đo với phần tử đồ họa SVG)</w:t>
-      </w:r>
-    </w:p>
-    <w:p>
-      <w:pPr>
-        <w:spacing w:before="120" w:after="120" w:line="276" w:lineRule="auto"/>
-        <w:ind w:left="576"/>
-      </w:pPr>
-      <w:r>
-        <w:rPr>
-          <w:rFonts w:ascii="Courier New" w:hAnsi="Courier New"/>
-          <w:color w:val="3C3C3C"/>
-          <w:sz w:val="18"/>
-        </w:rPr>
-        <w:t>CREATE TABLE "SldPoints" (</w:t>
-        <w:br/>
-        <w:t xml:space="preserve">    "Id" UUID PRIMARY KEY,</w:t>
-        <w:br/>
-        <w:t xml:space="preserve">    "SldFileId" UUID REFERENCES "SldFiles"("Id") ON DELETE CASCADE,</w:t>
-        <w:br/>
-        <w:t xml:space="preserve">    "ElementId" VARCHAR(100) NOT NULL,</w:t>
-        <w:br/>
-        <w:t xml:space="preserve">    "PointId" VARCHAR(100) NOT NULL,</w:t>
-        <w:br/>
-        <w:t xml:space="preserve">    "Description" VARCHAR(200) NULL</w:t>
-        <w:br/>
-        <w:t>);</w:t>
+        <w:t>6.6 Bảng `SensorReadings` (Dữ liệu tức thời của cảm biến)</w:t>
       </w:r>
     </w:p>
     <w:tbl>
@@ -4088,7 +4513,7 @@
                 <w:rFonts w:ascii="Arial" w:hAnsi="Arial"/>
                 <w:sz w:val="18"/>
               </w:rPr>
-              <w:t>`UUID`</w:t>
+              <w:t>`SERIAL`</w:t>
             </w:r>
           </w:p>
         </w:tc>
@@ -4139,7 +4564,7 @@
                 <w:rFonts w:ascii="Arial" w:hAnsi="Arial"/>
                 <w:sz w:val="18"/>
               </w:rPr>
-              <w:t>Khóa chính liên kết</w:t>
+              <w:t>Khóa tăng tự động</w:t>
             </w:r>
           </w:p>
         </w:tc>
@@ -4158,7 +4583,7 @@
                 <w:rFonts w:ascii="Arial" w:hAnsi="Arial"/>
                 <w:sz w:val="18"/>
               </w:rPr>
-              <w:t>`SldFileId`</w:t>
+              <w:t>`Time`</w:t>
             </w:r>
           </w:p>
         </w:tc>
@@ -4175,7 +4600,7 @@
                 <w:rFonts w:ascii="Arial" w:hAnsi="Arial"/>
                 <w:sz w:val="18"/>
               </w:rPr>
-              <w:t>`UUID`</w:t>
+              <w:t>`TIMESTAMP`</w:t>
             </w:r>
           </w:p>
         </w:tc>
@@ -4192,7 +4617,7 @@
                 <w:rFonts w:ascii="Arial" w:hAnsi="Arial"/>
                 <w:sz w:val="18"/>
               </w:rPr>
-              <w:t>FK</w:t>
+              <w:t>-</w:t>
             </w:r>
           </w:p>
         </w:tc>
@@ -4209,7 +4634,7 @@
                 <w:rFonts w:ascii="Arial" w:hAnsi="Arial"/>
                 <w:sz w:val="18"/>
               </w:rPr>
-              <w:t>REFERENCES SldFiles</w:t>
+              <w:t>NOT NULL</w:t>
             </w:r>
           </w:p>
         </w:tc>
@@ -4226,7 +4651,7 @@
                 <w:rFonts w:ascii="Arial" w:hAnsi="Arial"/>
                 <w:sz w:val="18"/>
               </w:rPr>
-              <w:t>Sơ đồ một sợi áp dụng</w:t>
+              <w:t>Thời gian lấy mẫu dữ liệu</w:t>
             </w:r>
           </w:p>
         </w:tc>
@@ -4245,7 +4670,7 @@
                 <w:rFonts w:ascii="Arial" w:hAnsi="Arial"/>
                 <w:sz w:val="18"/>
               </w:rPr>
-              <w:t>`ElementId`</w:t>
+              <w:t>`StationId`</w:t>
             </w:r>
           </w:p>
         </w:tc>
@@ -4262,7 +4687,7 @@
                 <w:rFonts w:ascii="Arial" w:hAnsi="Arial"/>
                 <w:sz w:val="18"/>
               </w:rPr>
-              <w:t>`VARCHAR(100)`</w:t>
+              <w:t>`UUID`</w:t>
             </w:r>
           </w:p>
         </w:tc>
@@ -4279,7 +4704,7 @@
                 <w:rFonts w:ascii="Arial" w:hAnsi="Arial"/>
                 <w:sz w:val="18"/>
               </w:rPr>
-              <w:t>-</w:t>
+              <w:t>FK</w:t>
             </w:r>
           </w:p>
         </w:tc>
@@ -4296,7 +4721,7 @@
                 <w:rFonts w:ascii="Arial" w:hAnsi="Arial"/>
                 <w:sz w:val="18"/>
               </w:rPr>
-              <w:t>NOT NULL</w:t>
+              <w:t>REFERENCES Stations</w:t>
             </w:r>
           </w:p>
         </w:tc>
@@ -4313,7 +4738,7 @@
                 <w:rFonts w:ascii="Arial" w:hAnsi="Arial"/>
                 <w:sz w:val="18"/>
               </w:rPr>
-              <w:t>ID thẻ DOM trong mã nguồn SVG</w:t>
+              <w:t>Trạm biến áp đo được</w:t>
             </w:r>
           </w:p>
         </w:tc>
@@ -4332,7 +4757,7 @@
                 <w:rFonts w:ascii="Arial" w:hAnsi="Arial"/>
                 <w:sz w:val="18"/>
               </w:rPr>
-              <w:t>`PointId`</w:t>
+              <w:t>`DeviceId`</w:t>
             </w:r>
           </w:p>
         </w:tc>
@@ -4349,7 +4774,7 @@
                 <w:rFonts w:ascii="Arial" w:hAnsi="Arial"/>
                 <w:sz w:val="18"/>
               </w:rPr>
-              <w:t>`VARCHAR(100)`</w:t>
+              <w:t>`UUID`</w:t>
             </w:r>
           </w:p>
         </w:tc>
@@ -4366,7 +4791,7 @@
                 <w:rFonts w:ascii="Arial" w:hAnsi="Arial"/>
                 <w:sz w:val="18"/>
               </w:rPr>
-              <w:t>-</w:t>
+              <w:t>FK</w:t>
             </w:r>
           </w:p>
         </w:tc>
@@ -4383,7 +4808,7 @@
                 <w:rFonts w:ascii="Arial" w:hAnsi="Arial"/>
                 <w:sz w:val="18"/>
               </w:rPr>
-              <w:t>NOT NULL</w:t>
+              <w:t>REFERENCES Devices</w:t>
             </w:r>
           </w:p>
         </w:tc>
@@ -4400,7 +4825,7 @@
                 <w:rFonts w:ascii="Arial" w:hAnsi="Arial"/>
                 <w:sz w:val="18"/>
               </w:rPr>
-              <w:t>Mã điểm đo cảm biến</w:t>
+              <w:t>Thiết bị thực hiện phép đo</w:t>
             </w:r>
           </w:p>
         </w:tc>
@@ -4419,7 +4844,7 @@
                 <w:rFonts w:ascii="Arial" w:hAnsi="Arial"/>
                 <w:sz w:val="18"/>
               </w:rPr>
-              <w:t>`Description`</w:t>
+              <w:t>`PointId`</w:t>
             </w:r>
           </w:p>
         </w:tc>
@@ -4436,7 +4861,7 @@
                 <w:rFonts w:ascii="Arial" w:hAnsi="Arial"/>
                 <w:sz w:val="18"/>
               </w:rPr>
-              <w:t>`VARCHAR(200)`</w:t>
+              <w:t>`VARCHAR(100)`</w:t>
             </w:r>
           </w:p>
         </w:tc>
@@ -4470,6 +4895,93 @@
                 <w:rFonts w:ascii="Arial" w:hAnsi="Arial"/>
                 <w:sz w:val="18"/>
               </w:rPr>
+              <w:t>NOT NULL</w:t>
+            </w:r>
+          </w:p>
+        </w:tc>
+        <w:tc>
+          <w:tcPr>
+            <w:tcW w:type="dxa" w:w="1872"/>
+          </w:tcPr>
+          <w:p>
+            <w:pPr>
+              <w:spacing w:before="60" w:after="60"/>
+            </w:pPr>
+            <w:r>
+              <w:rPr>
+                <w:rFonts w:ascii="Arial" w:hAnsi="Arial"/>
+                <w:sz w:val="18"/>
+              </w:rPr>
+              <w:t>Mã điểm đo (VD: `temp_pha_1`)</w:t>
+            </w:r>
+          </w:p>
+        </w:tc>
+      </w:tr>
+      <w:tr>
+        <w:tc>
+          <w:tcPr>
+            <w:tcW w:type="dxa" w:w="1872"/>
+          </w:tcPr>
+          <w:p>
+            <w:pPr>
+              <w:spacing w:before="60" w:after="60"/>
+            </w:pPr>
+            <w:r>
+              <w:rPr>
+                <w:rFonts w:ascii="Arial" w:hAnsi="Arial"/>
+                <w:sz w:val="18"/>
+              </w:rPr>
+              <w:t>`Value`</w:t>
+            </w:r>
+          </w:p>
+        </w:tc>
+        <w:tc>
+          <w:tcPr>
+            <w:tcW w:type="dxa" w:w="1872"/>
+          </w:tcPr>
+          <w:p>
+            <w:pPr>
+              <w:spacing w:before="60" w:after="60"/>
+            </w:pPr>
+            <w:r>
+              <w:rPr>
+                <w:rFonts w:ascii="Arial" w:hAnsi="Arial"/>
+                <w:sz w:val="18"/>
+              </w:rPr>
+              <w:t>`DOUBLE PRECISION`</w:t>
+            </w:r>
+          </w:p>
+        </w:tc>
+        <w:tc>
+          <w:tcPr>
+            <w:tcW w:type="dxa" w:w="1872"/>
+          </w:tcPr>
+          <w:p>
+            <w:pPr>
+              <w:spacing w:before="60" w:after="60"/>
+            </w:pPr>
+            <w:r>
+              <w:rPr>
+                <w:rFonts w:ascii="Arial" w:hAnsi="Arial"/>
+                <w:sz w:val="18"/>
+              </w:rPr>
+              <w:t>-</w:t>
+            </w:r>
+          </w:p>
+        </w:tc>
+        <w:tc>
+          <w:tcPr>
+            <w:tcW w:type="dxa" w:w="1872"/>
+          </w:tcPr>
+          <w:p>
+            <w:pPr>
+              <w:spacing w:before="60" w:after="60"/>
+            </w:pPr>
+            <w:r>
+              <w:rPr>
+                <w:rFonts w:ascii="Arial" w:hAnsi="Arial"/>
+                <w:sz w:val="18"/>
+              </w:rPr>
               <w:t>NULL</w:t>
             </w:r>
           </w:p>
@@ -4487,7 +4999,181 @@
                 <w:rFonts w:ascii="Arial" w:hAnsi="Arial"/>
                 <w:sz w:val="18"/>
               </w:rPr>
-              <w:t>Chú thích điểm liên kết</w:t>
+              <w:t>Giá trị số thực đo được</w:t>
+            </w:r>
+          </w:p>
+        </w:tc>
+      </w:tr>
+      <w:tr>
+        <w:tc>
+          <w:tcPr>
+            <w:tcW w:type="dxa" w:w="1872"/>
+          </w:tcPr>
+          <w:p>
+            <w:pPr>
+              <w:spacing w:before="60" w:after="60"/>
+            </w:pPr>
+            <w:r>
+              <w:rPr>
+                <w:rFonts w:ascii="Arial" w:hAnsi="Arial"/>
+                <w:sz w:val="18"/>
+              </w:rPr>
+              <w:t>`Unit`</w:t>
+            </w:r>
+          </w:p>
+        </w:tc>
+        <w:tc>
+          <w:tcPr>
+            <w:tcW w:type="dxa" w:w="1872"/>
+          </w:tcPr>
+          <w:p>
+            <w:pPr>
+              <w:spacing w:before="60" w:after="60"/>
+            </w:pPr>
+            <w:r>
+              <w:rPr>
+                <w:rFonts w:ascii="Arial" w:hAnsi="Arial"/>
+                <w:sz w:val="18"/>
+              </w:rPr>
+              <w:t>`VARCHAR(50)`</w:t>
+            </w:r>
+          </w:p>
+        </w:tc>
+        <w:tc>
+          <w:tcPr>
+            <w:tcW w:type="dxa" w:w="1872"/>
+          </w:tcPr>
+          <w:p>
+            <w:pPr>
+              <w:spacing w:before="60" w:after="60"/>
+            </w:pPr>
+            <w:r>
+              <w:rPr>
+                <w:rFonts w:ascii="Arial" w:hAnsi="Arial"/>
+                <w:sz w:val="18"/>
+              </w:rPr>
+              <w:t>-</w:t>
+            </w:r>
+          </w:p>
+        </w:tc>
+        <w:tc>
+          <w:tcPr>
+            <w:tcW w:type="dxa" w:w="1872"/>
+          </w:tcPr>
+          <w:p>
+            <w:pPr>
+              <w:spacing w:before="60" w:after="60"/>
+            </w:pPr>
+            <w:r>
+              <w:rPr>
+                <w:rFonts w:ascii="Arial" w:hAnsi="Arial"/>
+                <w:sz w:val="18"/>
+              </w:rPr>
+              <w:t>NULL</w:t>
+            </w:r>
+          </w:p>
+        </w:tc>
+        <w:tc>
+          <w:tcPr>
+            <w:tcW w:type="dxa" w:w="1872"/>
+          </w:tcPr>
+          <w:p>
+            <w:pPr>
+              <w:spacing w:before="60" w:after="60"/>
+            </w:pPr>
+            <w:r>
+              <w:rPr>
+                <w:rFonts w:ascii="Arial" w:hAnsi="Arial"/>
+                <w:sz w:val="18"/>
+              </w:rPr>
+              <w:t>Đơn vị đo (`°C`, `dB`...)</w:t>
+            </w:r>
+          </w:p>
+        </w:tc>
+      </w:tr>
+      <w:tr>
+        <w:tc>
+          <w:tcPr>
+            <w:tcW w:type="dxa" w:w="1872"/>
+          </w:tcPr>
+          <w:p>
+            <w:pPr>
+              <w:spacing w:before="60" w:after="60"/>
+            </w:pPr>
+            <w:r>
+              <w:rPr>
+                <w:rFonts w:ascii="Arial" w:hAnsi="Arial"/>
+                <w:sz w:val="18"/>
+              </w:rPr>
+              <w:t>`Quality`</w:t>
+            </w:r>
+          </w:p>
+        </w:tc>
+        <w:tc>
+          <w:tcPr>
+            <w:tcW w:type="dxa" w:w="1872"/>
+          </w:tcPr>
+          <w:p>
+            <w:pPr>
+              <w:spacing w:before="60" w:after="60"/>
+            </w:pPr>
+            <w:r>
+              <w:rPr>
+                <w:rFonts w:ascii="Arial" w:hAnsi="Arial"/>
+                <w:sz w:val="18"/>
+              </w:rPr>
+              <w:t>`INTEGER`</w:t>
+            </w:r>
+          </w:p>
+        </w:tc>
+        <w:tc>
+          <w:tcPr>
+            <w:tcW w:type="dxa" w:w="1872"/>
+          </w:tcPr>
+          <w:p>
+            <w:pPr>
+              <w:spacing w:before="60" w:after="60"/>
+            </w:pPr>
+            <w:r>
+              <w:rPr>
+                <w:rFonts w:ascii="Arial" w:hAnsi="Arial"/>
+                <w:sz w:val="18"/>
+              </w:rPr>
+              <w:t>-</w:t>
+            </w:r>
+          </w:p>
+        </w:tc>
+        <w:tc>
+          <w:tcPr>
+            <w:tcW w:type="dxa" w:w="1872"/>
+          </w:tcPr>
+          <w:p>
+            <w:pPr>
+              <w:spacing w:before="60" w:after="60"/>
+            </w:pPr>
+            <w:r>
+              <w:rPr>
+                <w:rFonts w:ascii="Arial" w:hAnsi="Arial"/>
+                <w:sz w:val="18"/>
+              </w:rPr>
+              <w:t>NOT NULL</w:t>
+            </w:r>
+          </w:p>
+        </w:tc>
+        <w:tc>
+          <w:tcPr>
+            <w:tcW w:type="dxa" w:w="1872"/>
+          </w:tcPr>
+          <w:p>
+            <w:pPr>
+              <w:spacing w:before="60" w:after="60"/>
+            </w:pPr>
+            <w:r>
+              <w:rPr>
+                <w:rFonts w:ascii="Arial" w:hAnsi="Arial"/>
+                <w:sz w:val="18"/>
+              </w:rPr>
+              <w:t>Chất lượng tín hiệu (`1`=Tốt, `2`=Mất kết nối)</w:t>
             </w:r>
           </w:p>
         </w:tc>
@@ -4506,39 +5192,7 @@
           <w:color w:val="646464"/>
           <w:sz w:val="22"/>
         </w:rPr>
-        <w:t>6.6 Bảng `SensorReadings` (Dữ liệu tức thời của cảm biến)</w:t>
-      </w:r>
-    </w:p>
-    <w:p>
-      <w:pPr>
-        <w:spacing w:before="120" w:after="120" w:line="276" w:lineRule="auto"/>
-        <w:ind w:left="576"/>
-      </w:pPr>
-      <w:r>
-        <w:rPr>
-          <w:rFonts w:ascii="Courier New" w:hAnsi="Courier New"/>
-          <w:color w:val="3C3C3C"/>
-          <w:sz w:val="18"/>
-        </w:rPr>
-        <w:t>CREATE TABLE "SensorReadings" (</w:t>
-        <w:br/>
-        <w:t xml:space="preserve">    "Id" SERIAL PRIMARY KEY,</w:t>
-        <w:br/>
-        <w:t xml:space="preserve">    "Time" TIMESTAMP NOT NULL,</w:t>
-        <w:br/>
-        <w:t xml:space="preserve">    "StationId" UUID REFERENCES "Stations"("Id") ON DELETE CASCADE,</w:t>
-        <w:br/>
-        <w:t xml:space="preserve">    "DeviceId" UUID REFERENCES "Devices"("Id") ON DELETE CASCADE,</w:t>
-        <w:br/>
-        <w:t xml:space="preserve">    "PointId" VARCHAR(100) NOT NULL,</w:t>
-        <w:br/>
-        <w:t xml:space="preserve">    "Value" DOUBLE PRECISION NULL,</w:t>
-        <w:br/>
-        <w:t xml:space="preserve">    "Unit" VARCHAR(50) NULL,</w:t>
-        <w:br/>
-        <w:t xml:space="preserve">    "Quality" INTEGER NOT NULL</w:t>
-        <w:br/>
-        <w:t>);</w:t>
+        <w:t>6.7 Bảng `Alerts` (Nhật ký cảnh báo sự cố đang xảy ra)</w:t>
       </w:r>
     </w:p>
     <w:tbl>
@@ -4683,7 +5337,7 @@
                 <w:rFonts w:ascii="Arial" w:hAnsi="Arial"/>
                 <w:sz w:val="18"/>
               </w:rPr>
-              <w:t>`SERIAL`</w:t>
+              <w:t>`UUID`</w:t>
             </w:r>
           </w:p>
         </w:tc>
@@ -4734,7 +5388,7 @@
                 <w:rFonts w:ascii="Arial" w:hAnsi="Arial"/>
                 <w:sz w:val="18"/>
               </w:rPr>
-              <w:t>Khóa tăng tự động</w:t>
+              <w:t>Khóa chính cảnh báo</w:t>
             </w:r>
           </w:p>
         </w:tc>
@@ -4753,7 +5407,7 @@
                 <w:rFonts w:ascii="Arial" w:hAnsi="Arial"/>
                 <w:sz w:val="18"/>
               </w:rPr>
-              <w:t>`Time`</w:t>
+              <w:t>`StationId`</w:t>
             </w:r>
           </w:p>
         </w:tc>
@@ -4770,7 +5424,7 @@
                 <w:rFonts w:ascii="Arial" w:hAnsi="Arial"/>
                 <w:sz w:val="18"/>
               </w:rPr>
-              <w:t>`TIMESTAMP`</w:t>
+              <w:t>`UUID`</w:t>
             </w:r>
           </w:p>
         </w:tc>
@@ -4787,7 +5441,7 @@
                 <w:rFonts w:ascii="Arial" w:hAnsi="Arial"/>
                 <w:sz w:val="18"/>
               </w:rPr>
-              <w:t>-</w:t>
+              <w:t>FK</w:t>
             </w:r>
           </w:p>
         </w:tc>
@@ -4804,7 +5458,7 @@
                 <w:rFonts w:ascii="Arial" w:hAnsi="Arial"/>
                 <w:sz w:val="18"/>
               </w:rPr>
-              <w:t>NOT NULL</w:t>
+              <w:t>REFERENCES Stations</w:t>
             </w:r>
           </w:p>
         </w:tc>
@@ -4821,7 +5475,7 @@
                 <w:rFonts w:ascii="Arial" w:hAnsi="Arial"/>
                 <w:sz w:val="18"/>
               </w:rPr>
-              <w:t>Thời gian lấy mẫu dữ liệu</w:t>
+              <w:t>Trạm xảy ra cảnh báo</w:t>
             </w:r>
           </w:p>
         </w:tc>
@@ -4840,7 +5494,7 @@
                 <w:rFonts w:ascii="Arial" w:hAnsi="Arial"/>
                 <w:sz w:val="18"/>
               </w:rPr>
-              <w:t>`StationId`</w:t>
+              <w:t>`PointId`</w:t>
             </w:r>
           </w:p>
         </w:tc>
@@ -4857,7 +5511,7 @@
                 <w:rFonts w:ascii="Arial" w:hAnsi="Arial"/>
                 <w:sz w:val="18"/>
               </w:rPr>
-              <w:t>`UUID`</w:t>
+              <w:t>`VARCHAR(100)`</w:t>
             </w:r>
           </w:p>
         </w:tc>
@@ -4874,7 +5528,7 @@
                 <w:rFonts w:ascii="Arial" w:hAnsi="Arial"/>
                 <w:sz w:val="18"/>
               </w:rPr>
-              <w:t>FK</w:t>
+              <w:t>-</w:t>
             </w:r>
           </w:p>
         </w:tc>
@@ -4891,7 +5545,7 @@
                 <w:rFonts w:ascii="Arial" w:hAnsi="Arial"/>
                 <w:sz w:val="18"/>
               </w:rPr>
-              <w:t>REFERENCES Stations</w:t>
+              <w:t>NOT NULL</w:t>
             </w:r>
           </w:p>
         </w:tc>
@@ -4908,7 +5562,7 @@
                 <w:rFonts w:ascii="Arial" w:hAnsi="Arial"/>
                 <w:sz w:val="18"/>
               </w:rPr>
-              <w:t>Trạm biến áp đo được</w:t>
+              <w:t>Điểm đo vượt ngưỡng</w:t>
             </w:r>
           </w:p>
         </w:tc>
@@ -4927,7 +5581,7 @@
                 <w:rFonts w:ascii="Arial" w:hAnsi="Arial"/>
                 <w:sz w:val="18"/>
               </w:rPr>
-              <w:t>`DeviceId`</w:t>
+              <w:t>`Message`</w:t>
             </w:r>
           </w:p>
         </w:tc>
@@ -4944,7 +5598,7 @@
                 <w:rFonts w:ascii="Arial" w:hAnsi="Arial"/>
                 <w:sz w:val="18"/>
               </w:rPr>
-              <w:t>`UUID`</w:t>
+              <w:t>`VARCHAR(500)`</w:t>
             </w:r>
           </w:p>
         </w:tc>
@@ -4961,7 +5615,7 @@
                 <w:rFonts w:ascii="Arial" w:hAnsi="Arial"/>
                 <w:sz w:val="18"/>
               </w:rPr>
-              <w:t>FK</w:t>
+              <w:t>-</w:t>
             </w:r>
           </w:p>
         </w:tc>
@@ -4978,7 +5632,7 @@
                 <w:rFonts w:ascii="Arial" w:hAnsi="Arial"/>
                 <w:sz w:val="18"/>
               </w:rPr>
-              <w:t>REFERENCES Devices</w:t>
+              <w:t>NOT NULL</w:t>
             </w:r>
           </w:p>
         </w:tc>
@@ -4995,7 +5649,7 @@
                 <w:rFonts w:ascii="Arial" w:hAnsi="Arial"/>
                 <w:sz w:val="18"/>
               </w:rPr>
-              <w:t>Thiết bị thực hiện phép đo</w:t>
+              <w:t>Nội dung cảnh báo</w:t>
             </w:r>
           </w:p>
         </w:tc>
@@ -5014,7 +5668,7 @@
                 <w:rFonts w:ascii="Arial" w:hAnsi="Arial"/>
                 <w:sz w:val="18"/>
               </w:rPr>
-              <w:t>`PointId`</w:t>
+              <w:t>`Severity`</w:t>
             </w:r>
           </w:p>
         </w:tc>
@@ -5031,7 +5685,7 @@
                 <w:rFonts w:ascii="Arial" w:hAnsi="Arial"/>
                 <w:sz w:val="18"/>
               </w:rPr>
-              <w:t>`VARCHAR(100)`</w:t>
+              <w:t>`VARCHAR(20)`</w:t>
             </w:r>
           </w:p>
         </w:tc>
@@ -5082,7 +5736,7 @@
                 <w:rFonts w:ascii="Arial" w:hAnsi="Arial"/>
                 <w:sz w:val="18"/>
               </w:rPr>
-              <w:t>Mã điểm đo (VD: `temp_pha_1`)</w:t>
+              <w:t>Mức độ nguy hiểm (`warning`/`danger`)</w:t>
             </w:r>
           </w:p>
         </w:tc>
@@ -5101,7 +5755,7 @@
                 <w:rFonts w:ascii="Arial" w:hAnsi="Arial"/>
                 <w:sz w:val="18"/>
               </w:rPr>
-              <w:t>`Value`</w:t>
+              <w:t>`ValueTrigger`</w:t>
             </w:r>
           </w:p>
         </w:tc>
@@ -5118,7 +5772,7 @@
                 <w:rFonts w:ascii="Arial" w:hAnsi="Arial"/>
                 <w:sz w:val="18"/>
               </w:rPr>
-              <w:t>`DOUBLE PRECISION`</w:t>
+              <w:t>`DOUBLE`</w:t>
             </w:r>
           </w:p>
         </w:tc>
@@ -5152,7 +5806,7 @@
                 <w:rFonts w:ascii="Arial" w:hAnsi="Arial"/>
                 <w:sz w:val="18"/>
               </w:rPr>
-              <w:t>NULL</w:t>
+              <w:t>NOT NULL</w:t>
             </w:r>
           </w:p>
         </w:tc>
@@ -5169,7 +5823,7 @@
                 <w:rFonts w:ascii="Arial" w:hAnsi="Arial"/>
                 <w:sz w:val="18"/>
               </w:rPr>
-              <w:t>Giá trị số thực đo được</w:t>
+              <w:t>Giá trị kích hoạt cảnh báo</w:t>
             </w:r>
           </w:p>
         </w:tc>
@@ -5188,7 +5842,7 @@
                 <w:rFonts w:ascii="Arial" w:hAnsi="Arial"/>
                 <w:sz w:val="18"/>
               </w:rPr>
-              <w:t>`Unit`</w:t>
+              <w:t>`RuleId`</w:t>
             </w:r>
           </w:p>
         </w:tc>
@@ -5205,7 +5859,7 @@
                 <w:rFonts w:ascii="Arial" w:hAnsi="Arial"/>
                 <w:sz w:val="18"/>
               </w:rPr>
-              <w:t>`VARCHAR(50)`</w:t>
+              <w:t>`UUID`</w:t>
             </w:r>
           </w:p>
         </w:tc>
@@ -5222,7 +5876,7 @@
                 <w:rFonts w:ascii="Arial" w:hAnsi="Arial"/>
                 <w:sz w:val="18"/>
               </w:rPr>
-              <w:t>-</w:t>
+              <w:t>FK</w:t>
             </w:r>
           </w:p>
         </w:tc>
@@ -5239,7 +5893,7 @@
                 <w:rFonts w:ascii="Arial" w:hAnsi="Arial"/>
                 <w:sz w:val="18"/>
               </w:rPr>
-              <w:t>NULL</w:t>
+              <w:t>REFERENCES Rules</w:t>
             </w:r>
           </w:p>
         </w:tc>
@@ -5256,7 +5910,7 @@
                 <w:rFonts w:ascii="Arial" w:hAnsi="Arial"/>
                 <w:sz w:val="18"/>
               </w:rPr>
-              <w:t>Đơn vị đo (`°C`, `dB`...)</w:t>
+              <w:t>Quy tắc được cấu hình áp dụng</w:t>
             </w:r>
           </w:p>
         </w:tc>
@@ -5275,7 +5929,7 @@
                 <w:rFonts w:ascii="Arial" w:hAnsi="Arial"/>
                 <w:sz w:val="18"/>
               </w:rPr>
-              <w:t>`Quality`</w:t>
+              <w:t>`Timestamp`</w:t>
             </w:r>
           </w:p>
         </w:tc>
@@ -5292,7 +5946,7 @@
                 <w:rFonts w:ascii="Arial" w:hAnsi="Arial"/>
                 <w:sz w:val="18"/>
               </w:rPr>
-              <w:t>`INTEGER`</w:t>
+              <w:t>`TIMESTAMP`</w:t>
             </w:r>
           </w:p>
         </w:tc>
@@ -5343,7 +5997,94 @@
                 <w:rFonts w:ascii="Arial" w:hAnsi="Arial"/>
                 <w:sz w:val="18"/>
               </w:rPr>
-              <w:t>Chất lượng tín hiệu (`1`=Tốt, `2`=Mất kết nối)</w:t>
+              <w:t>Thời gian xuất hiện sự cố</w:t>
+            </w:r>
+          </w:p>
+        </w:tc>
+      </w:tr>
+      <w:tr>
+        <w:tc>
+          <w:tcPr>
+            <w:tcW w:type="dxa" w:w="1872"/>
+          </w:tcPr>
+          <w:p>
+            <w:pPr>
+              <w:spacing w:before="60" w:after="60"/>
+            </w:pPr>
+            <w:r>
+              <w:rPr>
+                <w:rFonts w:ascii="Arial" w:hAnsi="Arial"/>
+                <w:sz w:val="18"/>
+              </w:rPr>
+              <w:t>`Acknowledged`</w:t>
+            </w:r>
+          </w:p>
+        </w:tc>
+        <w:tc>
+          <w:tcPr>
+            <w:tcW w:type="dxa" w:w="1872"/>
+          </w:tcPr>
+          <w:p>
+            <w:pPr>
+              <w:spacing w:before="60" w:after="60"/>
+            </w:pPr>
+            <w:r>
+              <w:rPr>
+                <w:rFonts w:ascii="Arial" w:hAnsi="Arial"/>
+                <w:sz w:val="18"/>
+              </w:rPr>
+              <w:t>`BOOLEAN`</w:t>
+            </w:r>
+          </w:p>
+        </w:tc>
+        <w:tc>
+          <w:tcPr>
+            <w:tcW w:type="dxa" w:w="1872"/>
+          </w:tcPr>
+          <w:p>
+            <w:pPr>
+              <w:spacing w:before="60" w:after="60"/>
+            </w:pPr>
+            <w:r>
+              <w:rPr>
+                <w:rFonts w:ascii="Arial" w:hAnsi="Arial"/>
+                <w:sz w:val="18"/>
+              </w:rPr>
+              <w:t>-</w:t>
+            </w:r>
+          </w:p>
+        </w:tc>
+        <w:tc>
+          <w:tcPr>
+            <w:tcW w:type="dxa" w:w="1872"/>
+          </w:tcPr>
+          <w:p>
+            <w:pPr>
+              <w:spacing w:before="60" w:after="60"/>
+            </w:pPr>
+            <w:r>
+              <w:rPr>
+                <w:rFonts w:ascii="Arial" w:hAnsi="Arial"/>
+                <w:sz w:val="18"/>
+              </w:rPr>
+              <w:t>NOT NULL</w:t>
+            </w:r>
+          </w:p>
+        </w:tc>
+        <w:tc>
+          <w:tcPr>
+            <w:tcW w:type="dxa" w:w="1872"/>
+          </w:tcPr>
+          <w:p>
+            <w:pPr>
+              <w:spacing w:before="60" w:after="60"/>
+            </w:pPr>
+            <w:r>
+              <w:rPr>
+                <w:rFonts w:ascii="Arial" w:hAnsi="Arial"/>
+                <w:sz w:val="18"/>
+              </w:rPr>
+              <w:t>Đã xác nhận cảnh báo chưa</w:t>
             </w:r>
           </w:p>
         </w:tc>
@@ -5362,45 +6103,7 @@
           <w:color w:val="646464"/>
           <w:sz w:val="22"/>
         </w:rPr>
-        <w:t>6.7 Bảng `Alerts` (Nhật ký cảnh báo sự cố đang xảy ra)</w:t>
-      </w:r>
-    </w:p>
-    <w:p>
-      <w:pPr>
-        <w:spacing w:before="120" w:after="120" w:line="276" w:lineRule="auto"/>
-        <w:ind w:left="576"/>
-      </w:pPr>
-      <w:r>
-        <w:rPr>
-          <w:rFonts w:ascii="Courier New" w:hAnsi="Courier New"/>
-          <w:color w:val="3C3C3C"/>
-          <w:sz w:val="18"/>
-        </w:rPr>
-        <w:t>CREATE TABLE "Alerts" (</w:t>
-        <w:br/>
-        <w:t xml:space="preserve">    "Id" UUID PRIMARY KEY,</w:t>
-        <w:br/>
-        <w:t xml:space="preserve">    "StationId" UUID REFERENCES "Stations"("Id") ON DELETE CASCADE,</w:t>
-        <w:br/>
-        <w:t xml:space="preserve">    "PointId" VARCHAR(100) NOT NULL,</w:t>
-        <w:br/>
-        <w:t xml:space="preserve">    "Message" VARCHAR(500) NOT NULL,</w:t>
-        <w:br/>
-        <w:t xml:space="preserve">    "Severity" VARCHAR(20) NOT NULL,</w:t>
-        <w:br/>
-        <w:t xml:space="preserve">    "ValueTrigger" DOUBLE PRECISION NOT NULL,</w:t>
-        <w:br/>
-        <w:t xml:space="preserve">    "RuleId" UUID REFERENCES "Rules"("Id") ON DELETE SET NULL,</w:t>
-        <w:br/>
-        <w:t xml:space="preserve">    "Timestamp" TIMESTAMP NOT NULL,</w:t>
-        <w:br/>
-        <w:t xml:space="preserve">    "Acknowledged" BOOLEAN NOT NULL DEFAULT false,</w:t>
-        <w:br/>
-        <w:t xml:space="preserve">    "AckBy" VARCHAR(100) NULL,</w:t>
-        <w:br/>
-        <w:t xml:space="preserve">    "AckAt" TIMESTAMP NULL</w:t>
-        <w:br/>
-        <w:t>);</w:t>
+        <w:t>6.8 Bảng `Rules` (Các quy tắc giám sát tự động)</w:t>
       </w:r>
     </w:p>
     <w:tbl>
@@ -5596,7 +6299,7 @@
                 <w:rFonts w:ascii="Arial" w:hAnsi="Arial"/>
                 <w:sz w:val="18"/>
               </w:rPr>
-              <w:t>Khóa chính cảnh báo</w:t>
+              <w:t>Khóa chính luật</w:t>
             </w:r>
           </w:p>
         </w:tc>
@@ -5683,7 +6386,7 @@
                 <w:rFonts w:ascii="Arial" w:hAnsi="Arial"/>
                 <w:sz w:val="18"/>
               </w:rPr>
-              <w:t>Trạm xảy ra cảnh báo</w:t>
+              <w:t>Trạm áp dụng luật</w:t>
             </w:r>
           </w:p>
         </w:tc>
@@ -5702,7 +6405,7 @@
                 <w:rFonts w:ascii="Arial" w:hAnsi="Arial"/>
                 <w:sz w:val="18"/>
               </w:rPr>
-              <w:t>`PointId`</w:t>
+              <w:t>`Name`</w:t>
             </w:r>
           </w:p>
         </w:tc>
@@ -5719,7 +6422,7 @@
                 <w:rFonts w:ascii="Arial" w:hAnsi="Arial"/>
                 <w:sz w:val="18"/>
               </w:rPr>
-              <w:t>`VARCHAR(100)`</w:t>
+              <w:t>`VARCHAR(200)`</w:t>
             </w:r>
           </w:p>
         </w:tc>
@@ -5770,7 +6473,7 @@
                 <w:rFonts w:ascii="Arial" w:hAnsi="Arial"/>
                 <w:sz w:val="18"/>
               </w:rPr>
-              <w:t>Điểm đo vượt ngưỡng</w:t>
+              <w:t>Tên quy tắc giám sát</w:t>
             </w:r>
           </w:p>
         </w:tc>
@@ -5789,7 +6492,7 @@
                 <w:rFonts w:ascii="Arial" w:hAnsi="Arial"/>
                 <w:sz w:val="18"/>
               </w:rPr>
-              <w:t>`Message`</w:t>
+              <w:t>`Condition`</w:t>
             </w:r>
           </w:p>
         </w:tc>
@@ -5806,7 +6509,7 @@
                 <w:rFonts w:ascii="Arial" w:hAnsi="Arial"/>
                 <w:sz w:val="18"/>
               </w:rPr>
-              <w:t>`VARCHAR(500)`</w:t>
+              <w:t>`TEXT`</w:t>
             </w:r>
           </w:p>
         </w:tc>
@@ -5857,7 +6560,7 @@
                 <w:rFonts w:ascii="Arial" w:hAnsi="Arial"/>
                 <w:sz w:val="18"/>
               </w:rPr>
-              <w:t>Nội dung cảnh báo</w:t>
+              <w:t>Biểu thức điều kiện logic dạng JSON</w:t>
             </w:r>
           </w:p>
         </w:tc>
@@ -5876,7 +6579,7 @@
                 <w:rFonts w:ascii="Arial" w:hAnsi="Arial"/>
                 <w:sz w:val="18"/>
               </w:rPr>
-              <w:t>`Severity`</w:t>
+              <w:t>`Actions`</w:t>
             </w:r>
           </w:p>
         </w:tc>
@@ -5893,7 +6596,7 @@
                 <w:rFonts w:ascii="Arial" w:hAnsi="Arial"/>
                 <w:sz w:val="18"/>
               </w:rPr>
-              <w:t>`VARCHAR(20)`</w:t>
+              <w:t>`TEXT`</w:t>
             </w:r>
           </w:p>
         </w:tc>
@@ -5944,7 +6647,7 @@
                 <w:rFonts w:ascii="Arial" w:hAnsi="Arial"/>
                 <w:sz w:val="18"/>
               </w:rPr>
-              <w:t>Mức độ nguy hiểm (`warning`/`danger`)</w:t>
+              <w:t>Biểu thức hành động xử lý dạng JSON</w:t>
             </w:r>
           </w:p>
         </w:tc>
@@ -5963,7 +6666,7 @@
                 <w:rFonts w:ascii="Arial" w:hAnsi="Arial"/>
                 <w:sz w:val="18"/>
               </w:rPr>
-              <w:t>`ValueTrigger`</w:t>
+              <w:t>`Enabled`</w:t>
             </w:r>
           </w:p>
         </w:tc>
@@ -5980,7 +6683,7 @@
                 <w:rFonts w:ascii="Arial" w:hAnsi="Arial"/>
                 <w:sz w:val="18"/>
               </w:rPr>
-              <w:t>`DOUBLE`</w:t>
+              <w:t>`BOOLEAN`</w:t>
             </w:r>
           </w:p>
         </w:tc>
@@ -6031,268 +6734,7 @@
                 <w:rFonts w:ascii="Arial" w:hAnsi="Arial"/>
                 <w:sz w:val="18"/>
               </w:rPr>
-              <w:t>Giá trị kích hoạt cảnh báo</w:t>
-            </w:r>
-          </w:p>
-        </w:tc>
-      </w:tr>
-      <w:tr>
-        <w:tc>
-          <w:tcPr>
-            <w:tcW w:type="dxa" w:w="1872"/>
-          </w:tcPr>
-          <w:p>
-            <w:pPr>
-              <w:spacing w:before="60" w:after="60"/>
-            </w:pPr>
-            <w:r>
-              <w:rPr>
-                <w:rFonts w:ascii="Arial" w:hAnsi="Arial"/>
-                <w:sz w:val="18"/>
-              </w:rPr>
-              <w:t>`RuleId`</w:t>
-            </w:r>
-          </w:p>
-        </w:tc>
-        <w:tc>
-          <w:tcPr>
-            <w:tcW w:type="dxa" w:w="1872"/>
-          </w:tcPr>
-          <w:p>
-            <w:pPr>
-              <w:spacing w:before="60" w:after="60"/>
-            </w:pPr>
-            <w:r>
-              <w:rPr>
-                <w:rFonts w:ascii="Arial" w:hAnsi="Arial"/>
-                <w:sz w:val="18"/>
-              </w:rPr>
-              <w:t>`UUID`</w:t>
-            </w:r>
-          </w:p>
-        </w:tc>
-        <w:tc>
-          <w:tcPr>
-            <w:tcW w:type="dxa" w:w="1872"/>
-          </w:tcPr>
-          <w:p>
-            <w:pPr>
-              <w:spacing w:before="60" w:after="60"/>
-            </w:pPr>
-            <w:r>
-              <w:rPr>
-                <w:rFonts w:ascii="Arial" w:hAnsi="Arial"/>
-                <w:sz w:val="18"/>
-              </w:rPr>
-              <w:t>FK</w:t>
-            </w:r>
-          </w:p>
-        </w:tc>
-        <w:tc>
-          <w:tcPr>
-            <w:tcW w:type="dxa" w:w="1872"/>
-          </w:tcPr>
-          <w:p>
-            <w:pPr>
-              <w:spacing w:before="60" w:after="60"/>
-            </w:pPr>
-            <w:r>
-              <w:rPr>
-                <w:rFonts w:ascii="Arial" w:hAnsi="Arial"/>
-                <w:sz w:val="18"/>
-              </w:rPr>
-              <w:t>REFERENCES Rules</w:t>
-            </w:r>
-          </w:p>
-        </w:tc>
-        <w:tc>
-          <w:tcPr>
-            <w:tcW w:type="dxa" w:w="1872"/>
-          </w:tcPr>
-          <w:p>
-            <w:pPr>
-              <w:spacing w:before="60" w:after="60"/>
-            </w:pPr>
-            <w:r>
-              <w:rPr>
-                <w:rFonts w:ascii="Arial" w:hAnsi="Arial"/>
-                <w:sz w:val="18"/>
-              </w:rPr>
-              <w:t>Quy tắc được cấu hình áp dụng</w:t>
-            </w:r>
-          </w:p>
-        </w:tc>
-      </w:tr>
-      <w:tr>
-        <w:tc>
-          <w:tcPr>
-            <w:tcW w:type="dxa" w:w="1872"/>
-          </w:tcPr>
-          <w:p>
-            <w:pPr>
-              <w:spacing w:before="60" w:after="60"/>
-            </w:pPr>
-            <w:r>
-              <w:rPr>
-                <w:rFonts w:ascii="Arial" w:hAnsi="Arial"/>
-                <w:sz w:val="18"/>
-              </w:rPr>
-              <w:t>`Timestamp`</w:t>
-            </w:r>
-          </w:p>
-        </w:tc>
-        <w:tc>
-          <w:tcPr>
-            <w:tcW w:type="dxa" w:w="1872"/>
-          </w:tcPr>
-          <w:p>
-            <w:pPr>
-              <w:spacing w:before="60" w:after="60"/>
-            </w:pPr>
-            <w:r>
-              <w:rPr>
-                <w:rFonts w:ascii="Arial" w:hAnsi="Arial"/>
-                <w:sz w:val="18"/>
-              </w:rPr>
-              <w:t>`TIMESTAMP`</w:t>
-            </w:r>
-          </w:p>
-        </w:tc>
-        <w:tc>
-          <w:tcPr>
-            <w:tcW w:type="dxa" w:w="1872"/>
-          </w:tcPr>
-          <w:p>
-            <w:pPr>
-              <w:spacing w:before="60" w:after="60"/>
-            </w:pPr>
-            <w:r>
-              <w:rPr>
-                <w:rFonts w:ascii="Arial" w:hAnsi="Arial"/>
-                <w:sz w:val="18"/>
-              </w:rPr>
-              <w:t>-</w:t>
-            </w:r>
-          </w:p>
-        </w:tc>
-        <w:tc>
-          <w:tcPr>
-            <w:tcW w:type="dxa" w:w="1872"/>
-          </w:tcPr>
-          <w:p>
-            <w:pPr>
-              <w:spacing w:before="60" w:after="60"/>
-            </w:pPr>
-            <w:r>
-              <w:rPr>
-                <w:rFonts w:ascii="Arial" w:hAnsi="Arial"/>
-                <w:sz w:val="18"/>
-              </w:rPr>
-              <w:t>NOT NULL</w:t>
-            </w:r>
-          </w:p>
-        </w:tc>
-        <w:tc>
-          <w:tcPr>
-            <w:tcW w:type="dxa" w:w="1872"/>
-          </w:tcPr>
-          <w:p>
-            <w:pPr>
-              <w:spacing w:before="60" w:after="60"/>
-            </w:pPr>
-            <w:r>
-              <w:rPr>
-                <w:rFonts w:ascii="Arial" w:hAnsi="Arial"/>
-                <w:sz w:val="18"/>
-              </w:rPr>
-              <w:t>Thời gian xuất hiện sự cố</w:t>
-            </w:r>
-          </w:p>
-        </w:tc>
-      </w:tr>
-      <w:tr>
-        <w:tc>
-          <w:tcPr>
-            <w:tcW w:type="dxa" w:w="1872"/>
-          </w:tcPr>
-          <w:p>
-            <w:pPr>
-              <w:spacing w:before="60" w:after="60"/>
-            </w:pPr>
-            <w:r>
-              <w:rPr>
-                <w:rFonts w:ascii="Arial" w:hAnsi="Arial"/>
-                <w:sz w:val="18"/>
-              </w:rPr>
-              <w:t>`Acknowledged`</w:t>
-            </w:r>
-          </w:p>
-        </w:tc>
-        <w:tc>
-          <w:tcPr>
-            <w:tcW w:type="dxa" w:w="1872"/>
-          </w:tcPr>
-          <w:p>
-            <w:pPr>
-              <w:spacing w:before="60" w:after="60"/>
-            </w:pPr>
-            <w:r>
-              <w:rPr>
-                <w:rFonts w:ascii="Arial" w:hAnsi="Arial"/>
-                <w:sz w:val="18"/>
-              </w:rPr>
-              <w:t>`BOOLEAN`</w:t>
-            </w:r>
-          </w:p>
-        </w:tc>
-        <w:tc>
-          <w:tcPr>
-            <w:tcW w:type="dxa" w:w="1872"/>
-          </w:tcPr>
-          <w:p>
-            <w:pPr>
-              <w:spacing w:before="60" w:after="60"/>
-            </w:pPr>
-            <w:r>
-              <w:rPr>
-                <w:rFonts w:ascii="Arial" w:hAnsi="Arial"/>
-                <w:sz w:val="18"/>
-              </w:rPr>
-              <w:t>-</w:t>
-            </w:r>
-          </w:p>
-        </w:tc>
-        <w:tc>
-          <w:tcPr>
-            <w:tcW w:type="dxa" w:w="1872"/>
-          </w:tcPr>
-          <w:p>
-            <w:pPr>
-              <w:spacing w:before="60" w:after="60"/>
-            </w:pPr>
-            <w:r>
-              <w:rPr>
-                <w:rFonts w:ascii="Arial" w:hAnsi="Arial"/>
-                <w:sz w:val="18"/>
-              </w:rPr>
-              <w:t>NOT NULL</w:t>
-            </w:r>
-          </w:p>
-        </w:tc>
-        <w:tc>
-          <w:tcPr>
-            <w:tcW w:type="dxa" w:w="1872"/>
-          </w:tcPr>
-          <w:p>
-            <w:pPr>
-              <w:spacing w:before="60" w:after="60"/>
-            </w:pPr>
-            <w:r>
-              <w:rPr>
-                <w:rFonts w:ascii="Arial" w:hAnsi="Arial"/>
-                <w:sz w:val="18"/>
-              </w:rPr>
-              <w:t>Đã xác nhận cảnh báo chưa</w:t>
+              <w:t>Quy tắc đang bật hay tắt</w:t>
             </w:r>
           </w:p>
         </w:tc>
@@ -6311,37 +6753,7 @@
           <w:color w:val="646464"/>
           <w:sz w:val="22"/>
         </w:rPr>
-        <w:t>6.8 Bảng `Rules` (Các quy tắc giám sát tự động)</w:t>
-      </w:r>
-    </w:p>
-    <w:p>
-      <w:pPr>
-        <w:spacing w:before="120" w:after="120" w:line="276" w:lineRule="auto"/>
-        <w:ind w:left="576"/>
-      </w:pPr>
-      <w:r>
-        <w:rPr>
-          <w:rFonts w:ascii="Courier New" w:hAnsi="Courier New"/>
-          <w:color w:val="3C3C3C"/>
-          <w:sz w:val="18"/>
-        </w:rPr>
-        <w:t>CREATE TABLE "Rules" (</w:t>
-        <w:br/>
-        <w:t xml:space="preserve">    "Id" UUID PRIMARY KEY,</w:t>
-        <w:br/>
-        <w:t xml:space="preserve">    "StationId" UUID REFERENCES "Stations"("Id") ON DELETE CASCADE,</w:t>
-        <w:br/>
-        <w:t xml:space="preserve">    "Name" VARCHAR(200) NOT NULL,</w:t>
-        <w:br/>
-        <w:t xml:space="preserve">    "RuleSet" TEXT NULL,</w:t>
-        <w:br/>
-        <w:t xml:space="preserve">    "Condition" TEXT NOT NULL,</w:t>
-        <w:br/>
-        <w:t xml:space="preserve">    "Actions" TEXT NOT NULL,</w:t>
-        <w:br/>
-        <w:t xml:space="preserve">    "Enabled" BOOLEAN NOT NULL DEFAULT true</w:t>
-        <w:br/>
-        <w:t>);</w:t>
+        <w:t>6.9 Bảng `SyncQueues` (Hàng đợi đồng bộ dữ liệu)</w:t>
       </w:r>
     </w:p>
     <w:tbl>
@@ -6486,7 +6898,7 @@
                 <w:rFonts w:ascii="Arial" w:hAnsi="Arial"/>
                 <w:sz w:val="18"/>
               </w:rPr>
-              <w:t>`UUID`</w:t>
+              <w:t>`BIGSERIAL`</w:t>
             </w:r>
           </w:p>
         </w:tc>
@@ -6537,7 +6949,7 @@
                 <w:rFonts w:ascii="Arial" w:hAnsi="Arial"/>
                 <w:sz w:val="18"/>
               </w:rPr>
-              <w:t>Khóa chính luật</w:t>
+              <w:t>Khóa tự tăng dạng số lớn</w:t>
             </w:r>
           </w:p>
         </w:tc>
@@ -6556,7 +6968,7 @@
                 <w:rFonts w:ascii="Arial" w:hAnsi="Arial"/>
                 <w:sz w:val="18"/>
               </w:rPr>
-              <w:t>`StationId`</w:t>
+              <w:t>`EntityType`</w:t>
             </w:r>
           </w:p>
         </w:tc>
@@ -6573,7 +6985,7 @@
                 <w:rFonts w:ascii="Arial" w:hAnsi="Arial"/>
                 <w:sz w:val="18"/>
               </w:rPr>
-              <w:t>`UUID`</w:t>
+              <w:t>`VARCHAR(50)`</w:t>
             </w:r>
           </w:p>
         </w:tc>
@@ -6590,7 +7002,7 @@
                 <w:rFonts w:ascii="Arial" w:hAnsi="Arial"/>
                 <w:sz w:val="18"/>
               </w:rPr>
-              <w:t>FK</w:t>
+              <w:t>-</w:t>
             </w:r>
           </w:p>
         </w:tc>
@@ -6607,7 +7019,7 @@
                 <w:rFonts w:ascii="Arial" w:hAnsi="Arial"/>
                 <w:sz w:val="18"/>
               </w:rPr>
-              <w:t>REFERENCES Stations</w:t>
+              <w:t>NOT NULL</w:t>
             </w:r>
           </w:p>
         </w:tc>
@@ -6624,7 +7036,7 @@
                 <w:rFonts w:ascii="Arial" w:hAnsi="Arial"/>
                 <w:sz w:val="18"/>
               </w:rPr>
-              <w:t>Trạm áp dụng luật</w:t>
+              <w:t>Loại thực thể đồng bộ (`SensorReading`, `Alert`)</w:t>
             </w:r>
           </w:p>
         </w:tc>
@@ -6643,7 +7055,7 @@
                 <w:rFonts w:ascii="Arial" w:hAnsi="Arial"/>
                 <w:sz w:val="18"/>
               </w:rPr>
-              <w:t>`Name`</w:t>
+              <w:t>`EntityId`</w:t>
             </w:r>
           </w:p>
         </w:tc>
@@ -6660,7 +7072,7 @@
                 <w:rFonts w:ascii="Arial" w:hAnsi="Arial"/>
                 <w:sz w:val="18"/>
               </w:rPr>
-              <w:t>`VARCHAR(200)`</w:t>
+              <w:t>`UUID`</w:t>
             </w:r>
           </w:p>
         </w:tc>
@@ -6711,7 +7123,7 @@
                 <w:rFonts w:ascii="Arial" w:hAnsi="Arial"/>
                 <w:sz w:val="18"/>
               </w:rPr>
-              <w:t>Tên quy tắc giám sát</w:t>
+              <w:t>Khóa chính của thực thể gốc</w:t>
             </w:r>
           </w:p>
         </w:tc>
@@ -6730,7 +7142,7 @@
                 <w:rFonts w:ascii="Arial" w:hAnsi="Arial"/>
                 <w:sz w:val="18"/>
               </w:rPr>
-              <w:t>`Condition`</w:t>
+              <w:t>`Payload`</w:t>
             </w:r>
           </w:p>
         </w:tc>
@@ -6798,7 +7210,7 @@
                 <w:rFonts w:ascii="Arial" w:hAnsi="Arial"/>
                 <w:sz w:val="18"/>
               </w:rPr>
-              <w:t>Biểu thức điều kiện logic dạng JSON</w:t>
+              <w:t>Dữ liệu dạng JSON của thực thể cần đồng bộ</w:t>
             </w:r>
           </w:p>
         </w:tc>
@@ -6817,7 +7229,7 @@
                 <w:rFonts w:ascii="Arial" w:hAnsi="Arial"/>
                 <w:sz w:val="18"/>
               </w:rPr>
-              <w:t>`Actions`</w:t>
+              <w:t>`Status`</w:t>
             </w:r>
           </w:p>
         </w:tc>
@@ -6834,7 +7246,7 @@
                 <w:rFonts w:ascii="Arial" w:hAnsi="Arial"/>
                 <w:sz w:val="18"/>
               </w:rPr>
-              <w:t>`TEXT`</w:t>
+              <w:t>`VARCHAR(20)`</w:t>
             </w:r>
           </w:p>
         </w:tc>
@@ -6885,7 +7297,7 @@
                 <w:rFonts w:ascii="Arial" w:hAnsi="Arial"/>
                 <w:sz w:val="18"/>
               </w:rPr>
-              <w:t>Biểu thức hành động xử lý dạng JSON</w:t>
+              <w:t>Trạng thái đồng bộ (`pending`/`sent`/`failed`)</w:t>
             </w:r>
           </w:p>
         </w:tc>
@@ -6904,7 +7316,7 @@
                 <w:rFonts w:ascii="Arial" w:hAnsi="Arial"/>
                 <w:sz w:val="18"/>
               </w:rPr>
-              <w:t>`Enabled`</w:t>
+              <w:t>`RetryCount`</w:t>
             </w:r>
           </w:p>
         </w:tc>
@@ -6921,7 +7333,7 @@
                 <w:rFonts w:ascii="Arial" w:hAnsi="Arial"/>
                 <w:sz w:val="18"/>
               </w:rPr>
-              <w:t>`BOOLEAN`</w:t>
+              <w:t>`INTEGER`</w:t>
             </w:r>
           </w:p>
         </w:tc>
@@ -6972,7 +7384,181 @@
                 <w:rFonts w:ascii="Arial" w:hAnsi="Arial"/>
                 <w:sz w:val="18"/>
               </w:rPr>
-              <w:t>Quy tắc đang bật hay tắt</w:t>
+              <w:t>Số lần thử lại nếu lỗi kết nối</w:t>
+            </w:r>
+          </w:p>
+        </w:tc>
+      </w:tr>
+      <w:tr>
+        <w:tc>
+          <w:tcPr>
+            <w:tcW w:type="dxa" w:w="1872"/>
+          </w:tcPr>
+          <w:p>
+            <w:pPr>
+              <w:spacing w:before="60" w:after="60"/>
+            </w:pPr>
+            <w:r>
+              <w:rPr>
+                <w:rFonts w:ascii="Arial" w:hAnsi="Arial"/>
+                <w:sz w:val="18"/>
+              </w:rPr>
+              <w:t>`CreatedAt`</w:t>
+            </w:r>
+          </w:p>
+        </w:tc>
+        <w:tc>
+          <w:tcPr>
+            <w:tcW w:type="dxa" w:w="1872"/>
+          </w:tcPr>
+          <w:p>
+            <w:pPr>
+              <w:spacing w:before="60" w:after="60"/>
+            </w:pPr>
+            <w:r>
+              <w:rPr>
+                <w:rFonts w:ascii="Arial" w:hAnsi="Arial"/>
+                <w:sz w:val="18"/>
+              </w:rPr>
+              <w:t>`TIMESTAMP`</w:t>
+            </w:r>
+          </w:p>
+        </w:tc>
+        <w:tc>
+          <w:tcPr>
+            <w:tcW w:type="dxa" w:w="1872"/>
+          </w:tcPr>
+          <w:p>
+            <w:pPr>
+              <w:spacing w:before="60" w:after="60"/>
+            </w:pPr>
+            <w:r>
+              <w:rPr>
+                <w:rFonts w:ascii="Arial" w:hAnsi="Arial"/>
+                <w:sz w:val="18"/>
+              </w:rPr>
+              <w:t>-</w:t>
+            </w:r>
+          </w:p>
+        </w:tc>
+        <w:tc>
+          <w:tcPr>
+            <w:tcW w:type="dxa" w:w="1872"/>
+          </w:tcPr>
+          <w:p>
+            <w:pPr>
+              <w:spacing w:before="60" w:after="60"/>
+            </w:pPr>
+            <w:r>
+              <w:rPr>
+                <w:rFonts w:ascii="Arial" w:hAnsi="Arial"/>
+                <w:sz w:val="18"/>
+              </w:rPr>
+              <w:t>NOT NULL</w:t>
+            </w:r>
+          </w:p>
+        </w:tc>
+        <w:tc>
+          <w:tcPr>
+            <w:tcW w:type="dxa" w:w="1872"/>
+          </w:tcPr>
+          <w:p>
+            <w:pPr>
+              <w:spacing w:before="60" w:after="60"/>
+            </w:pPr>
+            <w:r>
+              <w:rPr>
+                <w:rFonts w:ascii="Arial" w:hAnsi="Arial"/>
+                <w:sz w:val="18"/>
+              </w:rPr>
+              <w:t>Thời gian tạo hàng đợi</w:t>
+            </w:r>
+          </w:p>
+        </w:tc>
+      </w:tr>
+      <w:tr>
+        <w:tc>
+          <w:tcPr>
+            <w:tcW w:type="dxa" w:w="1872"/>
+          </w:tcPr>
+          <w:p>
+            <w:pPr>
+              <w:spacing w:before="60" w:after="60"/>
+            </w:pPr>
+            <w:r>
+              <w:rPr>
+                <w:rFonts w:ascii="Arial" w:hAnsi="Arial"/>
+                <w:sz w:val="18"/>
+              </w:rPr>
+              <w:t>`SentAt`</w:t>
+            </w:r>
+          </w:p>
+        </w:tc>
+        <w:tc>
+          <w:tcPr>
+            <w:tcW w:type="dxa" w:w="1872"/>
+          </w:tcPr>
+          <w:p>
+            <w:pPr>
+              <w:spacing w:before="60" w:after="60"/>
+            </w:pPr>
+            <w:r>
+              <w:rPr>
+                <w:rFonts w:ascii="Arial" w:hAnsi="Arial"/>
+                <w:sz w:val="18"/>
+              </w:rPr>
+              <w:t>`TIMESTAMP`</w:t>
+            </w:r>
+          </w:p>
+        </w:tc>
+        <w:tc>
+          <w:tcPr>
+            <w:tcW w:type="dxa" w:w="1872"/>
+          </w:tcPr>
+          <w:p>
+            <w:pPr>
+              <w:spacing w:before="60" w:after="60"/>
+            </w:pPr>
+            <w:r>
+              <w:rPr>
+                <w:rFonts w:ascii="Arial" w:hAnsi="Arial"/>
+                <w:sz w:val="18"/>
+              </w:rPr>
+              <w:t>-</w:t>
+            </w:r>
+          </w:p>
+        </w:tc>
+        <w:tc>
+          <w:tcPr>
+            <w:tcW w:type="dxa" w:w="1872"/>
+          </w:tcPr>
+          <w:p>
+            <w:pPr>
+              <w:spacing w:before="60" w:after="60"/>
+            </w:pPr>
+            <w:r>
+              <w:rPr>
+                <w:rFonts w:ascii="Arial" w:hAnsi="Arial"/>
+                <w:sz w:val="18"/>
+              </w:rPr>
+              <w:t>NULL</w:t>
+            </w:r>
+          </w:p>
+        </w:tc>
+        <w:tc>
+          <w:tcPr>
+            <w:tcW w:type="dxa" w:w="1872"/>
+          </w:tcPr>
+          <w:p>
+            <w:pPr>
+              <w:spacing w:before="60" w:after="60"/>
+            </w:pPr>
+            <w:r>
+              <w:rPr>
+                <w:rFonts w:ascii="Arial" w:hAnsi="Arial"/>
+                <w:sz w:val="18"/>
+              </w:rPr>
+              <w:t>Thời gian gửi thành công</w:t>
             </w:r>
           </w:p>
         </w:tc>
@@ -6991,39 +7577,7 @@
           <w:color w:val="646464"/>
           <w:sz w:val="22"/>
         </w:rPr>
-        <w:t>6.9 Bảng `SyncQueues` (Hàng đợi đồng bộ dữ liệu)</w:t>
-      </w:r>
-    </w:p>
-    <w:p>
-      <w:pPr>
-        <w:spacing w:before="120" w:after="120" w:line="276" w:lineRule="auto"/>
-        <w:ind w:left="576"/>
-      </w:pPr>
-      <w:r>
-        <w:rPr>
-          <w:rFonts w:ascii="Courier New" w:hAnsi="Courier New"/>
-          <w:color w:val="3C3C3C"/>
-          <w:sz w:val="18"/>
-        </w:rPr>
-        <w:t>CREATE TABLE "SyncQueues" (</w:t>
-        <w:br/>
-        <w:t xml:space="preserve">    "Id" BIGSERIAL PRIMARY KEY,</w:t>
-        <w:br/>
-        <w:t xml:space="preserve">    "EntityType" VARCHAR(50) NOT NULL,</w:t>
-        <w:br/>
-        <w:t xml:space="preserve">    "EntityId" UUID NOT NULL,</w:t>
-        <w:br/>
-        <w:t xml:space="preserve">    "Payload" TEXT NOT NULL,</w:t>
-        <w:br/>
-        <w:t xml:space="preserve">    "Status" VARCHAR(20) NOT NULL DEFAULT 'pending',</w:t>
-        <w:br/>
-        <w:t xml:space="preserve">    "RetryCount" INTEGER NOT NULL DEFAULT 0,</w:t>
-        <w:br/>
-        <w:t xml:space="preserve">    "CreatedAt" TIMESTAMP NOT NULL DEFAULT CURRENT_TIMESTAMP,</w:t>
-        <w:br/>
-        <w:t xml:space="preserve">    "SentAt" TIMESTAMP NULL</w:t>
-        <w:br/>
-        <w:t>);</w:t>
+        <w:t>6.10 Bảng `MaintenanceTasks` (Lịch bảo trì thiết bị sinh tự động)</w:t>
       </w:r>
     </w:p>
     <w:tbl>
@@ -7168,7 +7722,7 @@
                 <w:rFonts w:ascii="Arial" w:hAnsi="Arial"/>
                 <w:sz w:val="18"/>
               </w:rPr>
-              <w:t>`BIGSERIAL`</w:t>
+              <w:t>`UUID`</w:t>
             </w:r>
           </w:p>
         </w:tc>
@@ -7219,7 +7773,7 @@
                 <w:rFonts w:ascii="Arial" w:hAnsi="Arial"/>
                 <w:sz w:val="18"/>
               </w:rPr>
-              <w:t>Khóa tự tăng dạng số lớn</w:t>
+              <w:t>Khóa chính nhiệm vụ</w:t>
             </w:r>
           </w:p>
         </w:tc>
@@ -7238,7 +7792,7 @@
                 <w:rFonts w:ascii="Arial" w:hAnsi="Arial"/>
                 <w:sz w:val="18"/>
               </w:rPr>
-              <w:t>`EntityType`</w:t>
+              <w:t>`StationId`</w:t>
             </w:r>
           </w:p>
         </w:tc>
@@ -7255,7 +7809,7 @@
                 <w:rFonts w:ascii="Arial" w:hAnsi="Arial"/>
                 <w:sz w:val="18"/>
               </w:rPr>
-              <w:t>`VARCHAR(50)`</w:t>
+              <w:t>`UUID`</w:t>
             </w:r>
           </w:p>
         </w:tc>
@@ -7272,7 +7826,7 @@
                 <w:rFonts w:ascii="Arial" w:hAnsi="Arial"/>
                 <w:sz w:val="18"/>
               </w:rPr>
-              <w:t>-</w:t>
+              <w:t>FK</w:t>
             </w:r>
           </w:p>
         </w:tc>
@@ -7289,7 +7843,7 @@
                 <w:rFonts w:ascii="Arial" w:hAnsi="Arial"/>
                 <w:sz w:val="18"/>
               </w:rPr>
-              <w:t>NOT NULL</w:t>
+              <w:t>REFERENCES Stations</w:t>
             </w:r>
           </w:p>
         </w:tc>
@@ -7306,7 +7860,7 @@
                 <w:rFonts w:ascii="Arial" w:hAnsi="Arial"/>
                 <w:sz w:val="18"/>
               </w:rPr>
-              <w:t>Loại thực thể đồng bộ (`SensorReading`, `Alert`)</w:t>
+              <w:t>Trạm biến áp cần bảo trì</w:t>
             </w:r>
           </w:p>
         </w:tc>
@@ -7325,7 +7879,7 @@
                 <w:rFonts w:ascii="Arial" w:hAnsi="Arial"/>
                 <w:sz w:val="18"/>
               </w:rPr>
-              <w:t>`EntityId`</w:t>
+              <w:t>`Title`</w:t>
             </w:r>
           </w:p>
         </w:tc>
@@ -7342,7 +7896,7 @@
                 <w:rFonts w:ascii="Arial" w:hAnsi="Arial"/>
                 <w:sz w:val="18"/>
               </w:rPr>
-              <w:t>`UUID`</w:t>
+              <w:t>`VARCHAR(250)`</w:t>
             </w:r>
           </w:p>
         </w:tc>
@@ -7393,7 +7947,7 @@
                 <w:rFonts w:ascii="Arial" w:hAnsi="Arial"/>
                 <w:sz w:val="18"/>
               </w:rPr>
-              <w:t>Khóa chính của thực thể gốc</w:t>
+              <w:t>Tên công việc cần thực hiện</w:t>
             </w:r>
           </w:p>
         </w:tc>
@@ -7412,7 +7966,7 @@
                 <w:rFonts w:ascii="Arial" w:hAnsi="Arial"/>
                 <w:sz w:val="18"/>
               </w:rPr>
-              <w:t>`Payload`</w:t>
+              <w:t>`Type`</w:t>
             </w:r>
           </w:p>
         </w:tc>
@@ -7429,7 +7983,7 @@
                 <w:rFonts w:ascii="Arial" w:hAnsi="Arial"/>
                 <w:sz w:val="18"/>
               </w:rPr>
-              <w:t>`TEXT`</w:t>
+              <w:t>`VARCHAR(50)`</w:t>
             </w:r>
           </w:p>
         </w:tc>
@@ -7480,7 +8034,7 @@
                 <w:rFonts w:ascii="Arial" w:hAnsi="Arial"/>
                 <w:sz w:val="18"/>
               </w:rPr>
-              <w:t>Dữ liệu dạng JSON của thực thể cần đồng bộ</w:t>
+              <w:t>Phân loại bảo trì (`inspection`/`repair`)</w:t>
             </w:r>
           </w:p>
         </w:tc>
@@ -7516,7 +8070,7 @@
                 <w:rFonts w:ascii="Arial" w:hAnsi="Arial"/>
                 <w:sz w:val="18"/>
               </w:rPr>
-              <w:t>`VARCHAR(20)`</w:t>
+              <w:t>`VARCHAR(50)`</w:t>
             </w:r>
           </w:p>
         </w:tc>
@@ -7567,7 +8121,7 @@
                 <w:rFonts w:ascii="Arial" w:hAnsi="Arial"/>
                 <w:sz w:val="18"/>
               </w:rPr>
-              <w:t>Trạng thái đồng bộ (`pending`/`sent`/`failed`)</w:t>
+              <w:t>Trạng thái công việc (`pending`/`completed`)</w:t>
             </w:r>
           </w:p>
         </w:tc>
@@ -7586,7 +8140,7 @@
                 <w:rFonts w:ascii="Arial" w:hAnsi="Arial"/>
                 <w:sz w:val="18"/>
               </w:rPr>
-              <w:t>`RetryCount`</w:t>
+              <w:t>`AssignedTo`</w:t>
             </w:r>
           </w:p>
         </w:tc>
@@ -7603,7 +8157,7 @@
                 <w:rFonts w:ascii="Arial" w:hAnsi="Arial"/>
                 <w:sz w:val="18"/>
               </w:rPr>
-              <w:t>`INTEGER`</w:t>
+              <w:t>`VARCHAR(100)`</w:t>
             </w:r>
           </w:p>
         </w:tc>
@@ -7637,7 +8191,7 @@
                 <w:rFonts w:ascii="Arial" w:hAnsi="Arial"/>
                 <w:sz w:val="18"/>
               </w:rPr>
-              <w:t>NOT NULL</w:t>
+              <w:t>NULL</w:t>
             </w:r>
           </w:p>
         </w:tc>
@@ -7654,7 +8208,7 @@
                 <w:rFonts w:ascii="Arial" w:hAnsi="Arial"/>
                 <w:sz w:val="18"/>
               </w:rPr>
-              <w:t>Số lần thử lại nếu lỗi kết nối</w:t>
+              <w:t>Người chịu trách nhiệm thực hiện</w:t>
             </w:r>
           </w:p>
         </w:tc>
@@ -7673,7 +8227,7 @@
                 <w:rFonts w:ascii="Arial" w:hAnsi="Arial"/>
                 <w:sz w:val="18"/>
               </w:rPr>
-              <w:t>`CreatedAt`</w:t>
+              <w:t>`ScheduledDate`</w:t>
             </w:r>
           </w:p>
         </w:tc>
@@ -7724,7 +8278,7 @@
                 <w:rFonts w:ascii="Arial" w:hAnsi="Arial"/>
                 <w:sz w:val="18"/>
               </w:rPr>
-              <w:t>NOT NULL</w:t>
+              <w:t>NULL</w:t>
             </w:r>
           </w:p>
         </w:tc>
@@ -7741,94 +8295,7 @@
                 <w:rFonts w:ascii="Arial" w:hAnsi="Arial"/>
                 <w:sz w:val="18"/>
               </w:rPr>
-              <w:t>Thời gian tạo hàng đợi</w:t>
-            </w:r>
-          </w:p>
-        </w:tc>
-      </w:tr>
-      <w:tr>
-        <w:tc>
-          <w:tcPr>
-            <w:tcW w:type="dxa" w:w="1872"/>
-          </w:tcPr>
-          <w:p>
-            <w:pPr>
-              <w:spacing w:before="60" w:after="60"/>
-            </w:pPr>
-            <w:r>
-              <w:rPr>
-                <w:rFonts w:ascii="Arial" w:hAnsi="Arial"/>
-                <w:sz w:val="18"/>
-              </w:rPr>
-              <w:t>`SentAt`</w:t>
-            </w:r>
-          </w:p>
-        </w:tc>
-        <w:tc>
-          <w:tcPr>
-            <w:tcW w:type="dxa" w:w="1872"/>
-          </w:tcPr>
-          <w:p>
-            <w:pPr>
-              <w:spacing w:before="60" w:after="60"/>
-            </w:pPr>
-            <w:r>
-              <w:rPr>
-                <w:rFonts w:ascii="Arial" w:hAnsi="Arial"/>
-                <w:sz w:val="18"/>
-              </w:rPr>
-              <w:t>`TIMESTAMP`</w:t>
-            </w:r>
-          </w:p>
-        </w:tc>
-        <w:tc>
-          <w:tcPr>
-            <w:tcW w:type="dxa" w:w="1872"/>
-          </w:tcPr>
-          <w:p>
-            <w:pPr>
-              <w:spacing w:before="60" w:after="60"/>
-            </w:pPr>
-            <w:r>
-              <w:rPr>
-                <w:rFonts w:ascii="Arial" w:hAnsi="Arial"/>
-                <w:sz w:val="18"/>
-              </w:rPr>
-              <w:t>-</w:t>
-            </w:r>
-          </w:p>
-        </w:tc>
-        <w:tc>
-          <w:tcPr>
-            <w:tcW w:type="dxa" w:w="1872"/>
-          </w:tcPr>
-          <w:p>
-            <w:pPr>
-              <w:spacing w:before="60" w:after="60"/>
-            </w:pPr>
-            <w:r>
-              <w:rPr>
-                <w:rFonts w:ascii="Arial" w:hAnsi="Arial"/>
-                <w:sz w:val="18"/>
-              </w:rPr>
-              <w:t>NULL</w:t>
-            </w:r>
-          </w:p>
-        </w:tc>
-        <w:tc>
-          <w:tcPr>
-            <w:tcW w:type="dxa" w:w="1872"/>
-          </w:tcPr>
-          <w:p>
-            <w:pPr>
-              <w:spacing w:before="60" w:after="60"/>
-            </w:pPr>
-            <w:r>
-              <w:rPr>
-                <w:rFonts w:ascii="Arial" w:hAnsi="Arial"/>
-                <w:sz w:val="18"/>
-              </w:rPr>
-              <w:t>Thời gian gửi thành công</w:t>
+              <w:t>Ngày dự kiến thực hiện</w:t>
             </w:r>
           </w:p>
         </w:tc>
@@ -7847,804 +8314,7 @@
           <w:color w:val="646464"/>
           <w:sz w:val="22"/>
         </w:rPr>
-        <w:t>6.10 Bảng `MaintenanceTasks` (Lịch bảo trì thiết bị sinh tự động)</w:t>
-      </w:r>
-    </w:p>
-    <w:p>
-      <w:pPr>
-        <w:spacing w:before="120" w:after="120" w:line="276" w:lineRule="auto"/>
-        <w:ind w:left="576"/>
-      </w:pPr>
-      <w:r>
-        <w:rPr>
-          <w:rFonts w:ascii="Courier New" w:hAnsi="Courier New"/>
-          <w:color w:val="3C3C3C"/>
-          <w:sz w:val="18"/>
-        </w:rPr>
-        <w:t>CREATE TABLE "MaintenanceTasks" (</w:t>
-        <w:br/>
-        <w:t xml:space="preserve">    "Id" UUID PRIMARY KEY,</w:t>
-        <w:br/>
-        <w:t xml:space="preserve">    "StationId" UUID REFERENCES "Stations"("Id") ON DELETE CASCADE,</w:t>
-        <w:br/>
-        <w:t xml:space="preserve">    "Title" VARCHAR(250) NOT NULL,</w:t>
-        <w:br/>
-        <w:t xml:space="preserve">    "Type" VARCHAR(50) NOT NULL,</w:t>
-        <w:br/>
-        <w:t xml:space="preserve">    "Status" VARCHAR(50) NOT NULL,</w:t>
-        <w:br/>
-        <w:t xml:space="preserve">    "AssignedTo" VARCHAR(100) NULL,</w:t>
-        <w:br/>
-        <w:t xml:space="preserve">    "ScheduledDate" TIMESTAMP NULL,</w:t>
-        <w:br/>
-        <w:t xml:space="preserve">    "Notes" TEXT NULL,</w:t>
-        <w:br/>
-        <w:t xml:space="preserve">    "CreatedAt" TIMESTAMP NOT NULL DEFAULT CURRENT_TIMESTAMP</w:t>
-        <w:br/>
-        <w:t>);</w:t>
-      </w:r>
-    </w:p>
-    <w:tbl>
-      <w:tblPr>
-        <w:tblStyle w:val="TableGrid"/>
-        <w:tblW w:type="auto" w:w="0"/>
-        <w:tblLayout w:type="autofit"/>
-        <w:tblLook w:firstColumn="1" w:firstRow="1" w:lastColumn="0" w:lastRow="0" w:noHBand="0" w:noVBand="1" w:val="04A0"/>
-      </w:tblPr>
-      <w:tblGrid>
-        <w:gridCol w:w="1872"/>
-        <w:gridCol w:w="1872"/>
-        <w:gridCol w:w="1872"/>
-        <w:gridCol w:w="1872"/>
-        <w:gridCol w:w="1872"/>
-      </w:tblGrid>
-      <w:tr>
-        <w:tc>
-          <w:tcPr>
-            <w:tcW w:type="dxa" w:w="1872"/>
-            <w:shd w:fill="E2E8F0"/>
-          </w:tcPr>
-          <w:p>
-            <w:pPr>
-              <w:spacing w:before="80" w:after="80"/>
-            </w:pPr>
-            <w:r>
-              <w:rPr>
-                <w:rFonts w:ascii="Arial" w:hAnsi="Arial"/>
-                <w:b/>
-                <w:sz w:val="19"/>
-              </w:rPr>
-              <w:t>Tên trường</w:t>
-            </w:r>
-          </w:p>
-        </w:tc>
-        <w:tc>
-          <w:tcPr>
-            <w:tcW w:type="dxa" w:w="1872"/>
-            <w:shd w:fill="E2E8F0"/>
-          </w:tcPr>
-          <w:p>
-            <w:pPr>
-              <w:spacing w:before="80" w:after="80"/>
-            </w:pPr>
-            <w:r>
-              <w:rPr>
-                <w:rFonts w:ascii="Arial" w:hAnsi="Arial"/>
-                <w:b/>
-                <w:sz w:val="19"/>
-              </w:rPr>
-              <w:t>Kiểu dữ liệu</w:t>
-            </w:r>
-          </w:p>
-        </w:tc>
-        <w:tc>
-          <w:tcPr>
-            <w:tcW w:type="dxa" w:w="1872"/>
-            <w:shd w:fill="E2E8F0"/>
-          </w:tcPr>
-          <w:p>
-            <w:pPr>
-              <w:spacing w:before="80" w:after="80"/>
-            </w:pPr>
-            <w:r>
-              <w:rPr>
-                <w:rFonts w:ascii="Arial" w:hAnsi="Arial"/>
-                <w:b/>
-                <w:sz w:val="19"/>
-              </w:rPr>
-              <w:t>Khóa</w:t>
-            </w:r>
-          </w:p>
-        </w:tc>
-        <w:tc>
-          <w:tcPr>
-            <w:tcW w:type="dxa" w:w="1872"/>
-            <w:shd w:fill="E2E8F0"/>
-          </w:tcPr>
-          <w:p>
-            <w:pPr>
-              <w:spacing w:before="80" w:after="80"/>
-            </w:pPr>
-            <w:r>
-              <w:rPr>
-                <w:rFonts w:ascii="Arial" w:hAnsi="Arial"/>
-                <w:b/>
-                <w:sz w:val="19"/>
-              </w:rPr>
-              <w:t>Ràng buộc</w:t>
-            </w:r>
-          </w:p>
-        </w:tc>
-        <w:tc>
-          <w:tcPr>
-            <w:tcW w:type="dxa" w:w="1872"/>
-            <w:shd w:fill="E2E8F0"/>
-          </w:tcPr>
-          <w:p>
-            <w:pPr>
-              <w:spacing w:before="80" w:after="80"/>
-            </w:pPr>
-            <w:r>
-              <w:rPr>
-                <w:rFonts w:ascii="Arial" w:hAnsi="Arial"/>
-                <w:b/>
-                <w:sz w:val="19"/>
-              </w:rPr>
-              <w:t>Mô tả</w:t>
-            </w:r>
-          </w:p>
-        </w:tc>
-      </w:tr>
-      <w:tr>
-        <w:tc>
-          <w:tcPr>
-            <w:tcW w:type="dxa" w:w="1872"/>
-          </w:tcPr>
-          <w:p>
-            <w:pPr>
-              <w:spacing w:before="60" w:after="60"/>
-            </w:pPr>
-            <w:r>
-              <w:rPr>
-                <w:rFonts w:ascii="Arial" w:hAnsi="Arial"/>
-                <w:sz w:val="18"/>
-              </w:rPr>
-              <w:t>`Id`</w:t>
-            </w:r>
-          </w:p>
-        </w:tc>
-        <w:tc>
-          <w:tcPr>
-            <w:tcW w:type="dxa" w:w="1872"/>
-          </w:tcPr>
-          <w:p>
-            <w:pPr>
-              <w:spacing w:before="60" w:after="60"/>
-            </w:pPr>
-            <w:r>
-              <w:rPr>
-                <w:rFonts w:ascii="Arial" w:hAnsi="Arial"/>
-                <w:sz w:val="18"/>
-              </w:rPr>
-              <w:t>`UUID`</w:t>
-            </w:r>
-          </w:p>
-        </w:tc>
-        <w:tc>
-          <w:tcPr>
-            <w:tcW w:type="dxa" w:w="1872"/>
-          </w:tcPr>
-          <w:p>
-            <w:pPr>
-              <w:spacing w:before="60" w:after="60"/>
-            </w:pPr>
-            <w:r>
-              <w:rPr>
-                <w:rFonts w:ascii="Arial" w:hAnsi="Arial"/>
-                <w:sz w:val="18"/>
-              </w:rPr>
-              <w:t>PK</w:t>
-            </w:r>
-          </w:p>
-        </w:tc>
-        <w:tc>
-          <w:tcPr>
-            <w:tcW w:type="dxa" w:w="1872"/>
-          </w:tcPr>
-          <w:p>
-            <w:pPr>
-              <w:spacing w:before="60" w:after="60"/>
-            </w:pPr>
-            <w:r>
-              <w:rPr>
-                <w:rFonts w:ascii="Arial" w:hAnsi="Arial"/>
-                <w:sz w:val="18"/>
-              </w:rPr>
-              <w:t>NOT NULL</w:t>
-            </w:r>
-          </w:p>
-        </w:tc>
-        <w:tc>
-          <w:tcPr>
-            <w:tcW w:type="dxa" w:w="1872"/>
-          </w:tcPr>
-          <w:p>
-            <w:pPr>
-              <w:spacing w:before="60" w:after="60"/>
-            </w:pPr>
-            <w:r>
-              <w:rPr>
-                <w:rFonts w:ascii="Arial" w:hAnsi="Arial"/>
-                <w:sz w:val="18"/>
-              </w:rPr>
-              <w:t>Khóa chính nhiệm vụ</w:t>
-            </w:r>
-          </w:p>
-        </w:tc>
-      </w:tr>
-      <w:tr>
-        <w:tc>
-          <w:tcPr>
-            <w:tcW w:type="dxa" w:w="1872"/>
-          </w:tcPr>
-          <w:p>
-            <w:pPr>
-              <w:spacing w:before="60" w:after="60"/>
-            </w:pPr>
-            <w:r>
-              <w:rPr>
-                <w:rFonts w:ascii="Arial" w:hAnsi="Arial"/>
-                <w:sz w:val="18"/>
-              </w:rPr>
-              <w:t>`StationId`</w:t>
-            </w:r>
-          </w:p>
-        </w:tc>
-        <w:tc>
-          <w:tcPr>
-            <w:tcW w:type="dxa" w:w="1872"/>
-          </w:tcPr>
-          <w:p>
-            <w:pPr>
-              <w:spacing w:before="60" w:after="60"/>
-            </w:pPr>
-            <w:r>
-              <w:rPr>
-                <w:rFonts w:ascii="Arial" w:hAnsi="Arial"/>
-                <w:sz w:val="18"/>
-              </w:rPr>
-              <w:t>`UUID`</w:t>
-            </w:r>
-          </w:p>
-        </w:tc>
-        <w:tc>
-          <w:tcPr>
-            <w:tcW w:type="dxa" w:w="1872"/>
-          </w:tcPr>
-          <w:p>
-            <w:pPr>
-              <w:spacing w:before="60" w:after="60"/>
-            </w:pPr>
-            <w:r>
-              <w:rPr>
-                <w:rFonts w:ascii="Arial" w:hAnsi="Arial"/>
-                <w:sz w:val="18"/>
-              </w:rPr>
-              <w:t>FK</w:t>
-            </w:r>
-          </w:p>
-        </w:tc>
-        <w:tc>
-          <w:tcPr>
-            <w:tcW w:type="dxa" w:w="1872"/>
-          </w:tcPr>
-          <w:p>
-            <w:pPr>
-              <w:spacing w:before="60" w:after="60"/>
-            </w:pPr>
-            <w:r>
-              <w:rPr>
-                <w:rFonts w:ascii="Arial" w:hAnsi="Arial"/>
-                <w:sz w:val="18"/>
-              </w:rPr>
-              <w:t>REFERENCES Stations</w:t>
-            </w:r>
-          </w:p>
-        </w:tc>
-        <w:tc>
-          <w:tcPr>
-            <w:tcW w:type="dxa" w:w="1872"/>
-          </w:tcPr>
-          <w:p>
-            <w:pPr>
-              <w:spacing w:before="60" w:after="60"/>
-            </w:pPr>
-            <w:r>
-              <w:rPr>
-                <w:rFonts w:ascii="Arial" w:hAnsi="Arial"/>
-                <w:sz w:val="18"/>
-              </w:rPr>
-              <w:t>Trạm biến áp cần bảo trì</w:t>
-            </w:r>
-          </w:p>
-        </w:tc>
-      </w:tr>
-      <w:tr>
-        <w:tc>
-          <w:tcPr>
-            <w:tcW w:type="dxa" w:w="1872"/>
-          </w:tcPr>
-          <w:p>
-            <w:pPr>
-              <w:spacing w:before="60" w:after="60"/>
-            </w:pPr>
-            <w:r>
-              <w:rPr>
-                <w:rFonts w:ascii="Arial" w:hAnsi="Arial"/>
-                <w:sz w:val="18"/>
-              </w:rPr>
-              <w:t>`Title`</w:t>
-            </w:r>
-          </w:p>
-        </w:tc>
-        <w:tc>
-          <w:tcPr>
-            <w:tcW w:type="dxa" w:w="1872"/>
-          </w:tcPr>
-          <w:p>
-            <w:pPr>
-              <w:spacing w:before="60" w:after="60"/>
-            </w:pPr>
-            <w:r>
-              <w:rPr>
-                <w:rFonts w:ascii="Arial" w:hAnsi="Arial"/>
-                <w:sz w:val="18"/>
-              </w:rPr>
-              <w:t>`VARCHAR(250)`</w:t>
-            </w:r>
-          </w:p>
-        </w:tc>
-        <w:tc>
-          <w:tcPr>
-            <w:tcW w:type="dxa" w:w="1872"/>
-          </w:tcPr>
-          <w:p>
-            <w:pPr>
-              <w:spacing w:before="60" w:after="60"/>
-            </w:pPr>
-            <w:r>
-              <w:rPr>
-                <w:rFonts w:ascii="Arial" w:hAnsi="Arial"/>
-                <w:sz w:val="18"/>
-              </w:rPr>
-              <w:t>-</w:t>
-            </w:r>
-          </w:p>
-        </w:tc>
-        <w:tc>
-          <w:tcPr>
-            <w:tcW w:type="dxa" w:w="1872"/>
-          </w:tcPr>
-          <w:p>
-            <w:pPr>
-              <w:spacing w:before="60" w:after="60"/>
-            </w:pPr>
-            <w:r>
-              <w:rPr>
-                <w:rFonts w:ascii="Arial" w:hAnsi="Arial"/>
-                <w:sz w:val="18"/>
-              </w:rPr>
-              <w:t>NOT NULL</w:t>
-            </w:r>
-          </w:p>
-        </w:tc>
-        <w:tc>
-          <w:tcPr>
-            <w:tcW w:type="dxa" w:w="1872"/>
-          </w:tcPr>
-          <w:p>
-            <w:pPr>
-              <w:spacing w:before="60" w:after="60"/>
-            </w:pPr>
-            <w:r>
-              <w:rPr>
-                <w:rFonts w:ascii="Arial" w:hAnsi="Arial"/>
-                <w:sz w:val="18"/>
-              </w:rPr>
-              <w:t>Tên công việc cần thực hiện</w:t>
-            </w:r>
-          </w:p>
-        </w:tc>
-      </w:tr>
-      <w:tr>
-        <w:tc>
-          <w:tcPr>
-            <w:tcW w:type="dxa" w:w="1872"/>
-          </w:tcPr>
-          <w:p>
-            <w:pPr>
-              <w:spacing w:before="60" w:after="60"/>
-            </w:pPr>
-            <w:r>
-              <w:rPr>
-                <w:rFonts w:ascii="Arial" w:hAnsi="Arial"/>
-                <w:sz w:val="18"/>
-              </w:rPr>
-              <w:t>`Type`</w:t>
-            </w:r>
-          </w:p>
-        </w:tc>
-        <w:tc>
-          <w:tcPr>
-            <w:tcW w:type="dxa" w:w="1872"/>
-          </w:tcPr>
-          <w:p>
-            <w:pPr>
-              <w:spacing w:before="60" w:after="60"/>
-            </w:pPr>
-            <w:r>
-              <w:rPr>
-                <w:rFonts w:ascii="Arial" w:hAnsi="Arial"/>
-                <w:sz w:val="18"/>
-              </w:rPr>
-              <w:t>`VARCHAR(50)`</w:t>
-            </w:r>
-          </w:p>
-        </w:tc>
-        <w:tc>
-          <w:tcPr>
-            <w:tcW w:type="dxa" w:w="1872"/>
-          </w:tcPr>
-          <w:p>
-            <w:pPr>
-              <w:spacing w:before="60" w:after="60"/>
-            </w:pPr>
-            <w:r>
-              <w:rPr>
-                <w:rFonts w:ascii="Arial" w:hAnsi="Arial"/>
-                <w:sz w:val="18"/>
-              </w:rPr>
-              <w:t>-</w:t>
-            </w:r>
-          </w:p>
-        </w:tc>
-        <w:tc>
-          <w:tcPr>
-            <w:tcW w:type="dxa" w:w="1872"/>
-          </w:tcPr>
-          <w:p>
-            <w:pPr>
-              <w:spacing w:before="60" w:after="60"/>
-            </w:pPr>
-            <w:r>
-              <w:rPr>
-                <w:rFonts w:ascii="Arial" w:hAnsi="Arial"/>
-                <w:sz w:val="18"/>
-              </w:rPr>
-              <w:t>NOT NULL</w:t>
-            </w:r>
-          </w:p>
-        </w:tc>
-        <w:tc>
-          <w:tcPr>
-            <w:tcW w:type="dxa" w:w="1872"/>
-          </w:tcPr>
-          <w:p>
-            <w:pPr>
-              <w:spacing w:before="60" w:after="60"/>
-            </w:pPr>
-            <w:r>
-              <w:rPr>
-                <w:rFonts w:ascii="Arial" w:hAnsi="Arial"/>
-                <w:sz w:val="18"/>
-              </w:rPr>
-              <w:t>Phân loại bảo trì (`inspection`/`repair`)</w:t>
-            </w:r>
-          </w:p>
-        </w:tc>
-      </w:tr>
-      <w:tr>
-        <w:tc>
-          <w:tcPr>
-            <w:tcW w:type="dxa" w:w="1872"/>
-          </w:tcPr>
-          <w:p>
-            <w:pPr>
-              <w:spacing w:before="60" w:after="60"/>
-            </w:pPr>
-            <w:r>
-              <w:rPr>
-                <w:rFonts w:ascii="Arial" w:hAnsi="Arial"/>
-                <w:sz w:val="18"/>
-              </w:rPr>
-              <w:t>`Status`</w:t>
-            </w:r>
-          </w:p>
-        </w:tc>
-        <w:tc>
-          <w:tcPr>
-            <w:tcW w:type="dxa" w:w="1872"/>
-          </w:tcPr>
-          <w:p>
-            <w:pPr>
-              <w:spacing w:before="60" w:after="60"/>
-            </w:pPr>
-            <w:r>
-              <w:rPr>
-                <w:rFonts w:ascii="Arial" w:hAnsi="Arial"/>
-                <w:sz w:val="18"/>
-              </w:rPr>
-              <w:t>`VARCHAR(50)`</w:t>
-            </w:r>
-          </w:p>
-        </w:tc>
-        <w:tc>
-          <w:tcPr>
-            <w:tcW w:type="dxa" w:w="1872"/>
-          </w:tcPr>
-          <w:p>
-            <w:pPr>
-              <w:spacing w:before="60" w:after="60"/>
-            </w:pPr>
-            <w:r>
-              <w:rPr>
-                <w:rFonts w:ascii="Arial" w:hAnsi="Arial"/>
-                <w:sz w:val="18"/>
-              </w:rPr>
-              <w:t>-</w:t>
-            </w:r>
-          </w:p>
-        </w:tc>
-        <w:tc>
-          <w:tcPr>
-            <w:tcW w:type="dxa" w:w="1872"/>
-          </w:tcPr>
-          <w:p>
-            <w:pPr>
-              <w:spacing w:before="60" w:after="60"/>
-            </w:pPr>
-            <w:r>
-              <w:rPr>
-                <w:rFonts w:ascii="Arial" w:hAnsi="Arial"/>
-                <w:sz w:val="18"/>
-              </w:rPr>
-              <w:t>NOT NULL</w:t>
-            </w:r>
-          </w:p>
-        </w:tc>
-        <w:tc>
-          <w:tcPr>
-            <w:tcW w:type="dxa" w:w="1872"/>
-          </w:tcPr>
-          <w:p>
-            <w:pPr>
-              <w:spacing w:before="60" w:after="60"/>
-            </w:pPr>
-            <w:r>
-              <w:rPr>
-                <w:rFonts w:ascii="Arial" w:hAnsi="Arial"/>
-                <w:sz w:val="18"/>
-              </w:rPr>
-              <w:t>Trạng thái công việc (`pending`/`completed`)</w:t>
-            </w:r>
-          </w:p>
-        </w:tc>
-      </w:tr>
-      <w:tr>
-        <w:tc>
-          <w:tcPr>
-            <w:tcW w:type="dxa" w:w="1872"/>
-          </w:tcPr>
-          <w:p>
-            <w:pPr>
-              <w:spacing w:before="60" w:after="60"/>
-            </w:pPr>
-            <w:r>
-              <w:rPr>
-                <w:rFonts w:ascii="Arial" w:hAnsi="Arial"/>
-                <w:sz w:val="18"/>
-              </w:rPr>
-              <w:t>`AssignedTo`</w:t>
-            </w:r>
-          </w:p>
-        </w:tc>
-        <w:tc>
-          <w:tcPr>
-            <w:tcW w:type="dxa" w:w="1872"/>
-          </w:tcPr>
-          <w:p>
-            <w:pPr>
-              <w:spacing w:before="60" w:after="60"/>
-            </w:pPr>
-            <w:r>
-              <w:rPr>
-                <w:rFonts w:ascii="Arial" w:hAnsi="Arial"/>
-                <w:sz w:val="18"/>
-              </w:rPr>
-              <w:t>`VARCHAR(100)`</w:t>
-            </w:r>
-          </w:p>
-        </w:tc>
-        <w:tc>
-          <w:tcPr>
-            <w:tcW w:type="dxa" w:w="1872"/>
-          </w:tcPr>
-          <w:p>
-            <w:pPr>
-              <w:spacing w:before="60" w:after="60"/>
-            </w:pPr>
-            <w:r>
-              <w:rPr>
-                <w:rFonts w:ascii="Arial" w:hAnsi="Arial"/>
-                <w:sz w:val="18"/>
-              </w:rPr>
-              <w:t>-</w:t>
-            </w:r>
-          </w:p>
-        </w:tc>
-        <w:tc>
-          <w:tcPr>
-            <w:tcW w:type="dxa" w:w="1872"/>
-          </w:tcPr>
-          <w:p>
-            <w:pPr>
-              <w:spacing w:before="60" w:after="60"/>
-            </w:pPr>
-            <w:r>
-              <w:rPr>
-                <w:rFonts w:ascii="Arial" w:hAnsi="Arial"/>
-                <w:sz w:val="18"/>
-              </w:rPr>
-              <w:t>NULL</w:t>
-            </w:r>
-          </w:p>
-        </w:tc>
-        <w:tc>
-          <w:tcPr>
-            <w:tcW w:type="dxa" w:w="1872"/>
-          </w:tcPr>
-          <w:p>
-            <w:pPr>
-              <w:spacing w:before="60" w:after="60"/>
-            </w:pPr>
-            <w:r>
-              <w:rPr>
-                <w:rFonts w:ascii="Arial" w:hAnsi="Arial"/>
-                <w:sz w:val="18"/>
-              </w:rPr>
-              <w:t>Người chịu trách nhiệm thực hiện</w:t>
-            </w:r>
-          </w:p>
-        </w:tc>
-      </w:tr>
-      <w:tr>
-        <w:tc>
-          <w:tcPr>
-            <w:tcW w:type="dxa" w:w="1872"/>
-          </w:tcPr>
-          <w:p>
-            <w:pPr>
-              <w:spacing w:before="60" w:after="60"/>
-            </w:pPr>
-            <w:r>
-              <w:rPr>
-                <w:rFonts w:ascii="Arial" w:hAnsi="Arial"/>
-                <w:sz w:val="18"/>
-              </w:rPr>
-              <w:t>`ScheduledDate`</w:t>
-            </w:r>
-          </w:p>
-        </w:tc>
-        <w:tc>
-          <w:tcPr>
-            <w:tcW w:type="dxa" w:w="1872"/>
-          </w:tcPr>
-          <w:p>
-            <w:pPr>
-              <w:spacing w:before="60" w:after="60"/>
-            </w:pPr>
-            <w:r>
-              <w:rPr>
-                <w:rFonts w:ascii="Arial" w:hAnsi="Arial"/>
-                <w:sz w:val="18"/>
-              </w:rPr>
-              <w:t>`TIMESTAMP`</w:t>
-            </w:r>
-          </w:p>
-        </w:tc>
-        <w:tc>
-          <w:tcPr>
-            <w:tcW w:type="dxa" w:w="1872"/>
-          </w:tcPr>
-          <w:p>
-            <w:pPr>
-              <w:spacing w:before="60" w:after="60"/>
-            </w:pPr>
-            <w:r>
-              <w:rPr>
-                <w:rFonts w:ascii="Arial" w:hAnsi="Arial"/>
-                <w:sz w:val="18"/>
-              </w:rPr>
-              <w:t>-</w:t>
-            </w:r>
-          </w:p>
-        </w:tc>
-        <w:tc>
-          <w:tcPr>
-            <w:tcW w:type="dxa" w:w="1872"/>
-          </w:tcPr>
-          <w:p>
-            <w:pPr>
-              <w:spacing w:before="60" w:after="60"/>
-            </w:pPr>
-            <w:r>
-              <w:rPr>
-                <w:rFonts w:ascii="Arial" w:hAnsi="Arial"/>
-                <w:sz w:val="18"/>
-              </w:rPr>
-              <w:t>NULL</w:t>
-            </w:r>
-          </w:p>
-        </w:tc>
-        <w:tc>
-          <w:tcPr>
-            <w:tcW w:type="dxa" w:w="1872"/>
-          </w:tcPr>
-          <w:p>
-            <w:pPr>
-              <w:spacing w:before="60" w:after="60"/>
-            </w:pPr>
-            <w:r>
-              <w:rPr>
-                <w:rFonts w:ascii="Arial" w:hAnsi="Arial"/>
-                <w:sz w:val="18"/>
-              </w:rPr>
-              <w:t>Ngày dự kiến thực hiện</w:t>
-            </w:r>
-          </w:p>
-        </w:tc>
-      </w:tr>
-    </w:tbl>
-    <w:p/>
-    <w:p>
-      <w:pPr>
-        <w:spacing w:before="160" w:after="40" w:line="276" w:lineRule="auto"/>
-      </w:pPr>
-      <w:r>
-        <w:rPr>
-          <w:rFonts w:ascii="Arial" w:hAnsi="Arial"/>
-          <w:b/>
-          <w:i/>
-          <w:color w:val="646464"/>
-          <w:sz w:val="22"/>
-        </w:rPr>
         <w:t>6.11 Bảng `Boundaries` (Định nghĩa các vùng biên nhiệt độ camera)</w:t>
-      </w:r>
-    </w:p>
-    <w:p>
-      <w:pPr>
-        <w:spacing w:before="120" w:after="120" w:line="276" w:lineRule="auto"/>
-        <w:ind w:left="576"/>
-      </w:pPr>
-      <w:r>
-        <w:rPr>
-          <w:rFonts w:ascii="Courier New" w:hAnsi="Courier New"/>
-          <w:color w:val="3C3C3C"/>
-          <w:sz w:val="18"/>
-        </w:rPr>
-        <w:t>CREATE TABLE "Boundaries" (</w:t>
-        <w:br/>
-        <w:t xml:space="preserve">    "Id" UUID PRIMARY KEY,</w:t>
-        <w:br/>
-        <w:t xml:space="preserve">    "DeviceId" UUID REFERENCES "Devices"("Id") ON DELETE CASCADE,</w:t>
-        <w:br/>
-        <w:t xml:space="preserve">    "PointId" VARCHAR(100) NOT NULL,</w:t>
-        <w:br/>
-        <w:t xml:space="preserve">    "PolygonCoordinates" TEXT NOT NULL,</w:t>
-        <w:br/>
-        <w:t xml:space="preserve">    "Label" VARCHAR(100) NULL</w:t>
-        <w:br/>
-        <w:t>);</w:t>
       </w:r>
     </w:p>
     <w:tbl>

</xml_diff>

<commit_message>
docs: sync all 223 git commits to technical documentation
</commit_message>
<xml_diff>
--- a/HO_SO_KY_THUAT.docx
+++ b/HO_SO_KY_THUAT.docx
@@ -8941,14 +8941,14 @@
           <w:b/>
           <w:sz w:val="22"/>
         </w:rPr>
-        <w:t>`719d13a`</w:t>
-      </w:r>
-      <w:r>
-        <w:rPr>
-          <w:rFonts w:ascii="Arial" w:hAnsi="Arial"/>
-          <w:sz w:val="22"/>
-        </w:rPr>
-        <w:t xml:space="preserve"> - *kennhope13*: `chore: bump version to v3.0.51 and fix camera dropdown text visibility &amp; seed SVG path`</w:t>
+        <w:t>`f38daf2`</w:t>
+      </w:r>
+      <w:r>
+        <w:rPr>
+          <w:rFonts w:ascii="Arial" w:hAnsi="Arial"/>
+          <w:sz w:val="22"/>
+        </w:rPr>
+        <w:t xml:space="preserve"> - *kennhope13*: `docs: remove SQL CREATE TABLE blocks from DB schema section`</w:t>
       </w:r>
     </w:p>
     <w:p>
@@ -8969,14 +8969,14 @@
           <w:b/>
           <w:sz w:val="22"/>
         </w:rPr>
-        <w:t>`e1a0591`</w:t>
-      </w:r>
-      <w:r>
-        <w:rPr>
-          <w:rFonts w:ascii="Arial" w:hAnsi="Arial"/>
-          <w:sz w:val="22"/>
-        </w:rPr>
-        <w:t xml:space="preserve"> - *kennhope13*: `chore: bump version to v3.0.50`</w:t>
+        <w:t>`8e682bd`</w:t>
+      </w:r>
+      <w:r>
+        <w:rPr>
+          <w:rFonts w:ascii="Arial" w:hAnsi="Arial"/>
+          <w:sz w:val="22"/>
+        </w:rPr>
+        <w:t xml:space="preserve"> - *kennhope13*: `docs: rename StationOS references to POWER MONITOR in document and diagrams`</w:t>
       </w:r>
     </w:p>
     <w:p>
@@ -8997,14 +8997,14 @@
           <w:b/>
           <w:sz w:val="22"/>
         </w:rPr>
-        <w:t>`a51f2b8`</w:t>
-      </w:r>
-      <w:r>
-        <w:rPr>
-          <w:rFonts w:ascii="Arial" w:hAnsi="Arial"/>
-          <w:sz w:val="22"/>
-        </w:rPr>
-        <w:t xml:space="preserve"> - *kennhope13*: `fix: instantiate builder with WebApplicationOptions to configure WebRootPath, avoiding NotSupportedException`</w:t>
+        <w:t>`40499d2`</w:t>
+      </w:r>
+      <w:r>
+        <w:rPr>
+          <w:rFonts w:ascii="Arial" w:hAnsi="Arial"/>
+          <w:sz w:val="22"/>
+        </w:rPr>
+        <w:t xml:space="preserve"> - *kennhope13*: `docs: expand technical structure to fully document all UI pages and AI modules`</w:t>
       </w:r>
     </w:p>
     <w:p>
@@ -9025,14 +9025,14 @@
           <w:b/>
           <w:sz w:val="22"/>
         </w:rPr>
-        <w:t>`969adf6`</w:t>
-      </w:r>
-      <w:r>
-        <w:rPr>
-          <w:rFonts w:ascii="Arial" w:hAnsi="Arial"/>
-          <w:sz w:val="22"/>
-        </w:rPr>
-        <w:t xml:space="preserve"> - *kennhope13*: `fix: set offline simulated values to null and quality to 2 to display ----- on UI`</w:t>
+        <w:t>`16da6e0`</w:t>
+      </w:r>
+      <w:r>
+        <w:rPr>
+          <w:rFonts w:ascii="Arial" w:hAnsi="Arial"/>
+          <w:sz w:val="22"/>
+        </w:rPr>
+        <w:t xml:space="preserve"> - *kennhope13*: `docs: improve state diagram symmetry and center box text alignment`</w:t>
       </w:r>
     </w:p>
     <w:p>
@@ -9053,14 +9053,14 @@
           <w:b/>
           <w:sz w:val="22"/>
         </w:rPr>
-        <w:t>`ecebe38`</w:t>
-      </w:r>
-      <w:r>
-        <w:rPr>
-          <w:rFonts w:ascii="Arial" w:hAnsi="Arial"/>
-          <w:sz w:val="22"/>
-        </w:rPr>
-        <w:t xml:space="preserve"> - *kennhope13*: `fix: redirect backend wwwroot to AppData to resolve write permissions error`</w:t>
+        <w:t>`689ddb9`</w:t>
+      </w:r>
+      <w:r>
+        <w:rPr>
+          <w:rFonts w:ascii="Arial" w:hAnsi="Arial"/>
+          <w:sz w:val="22"/>
+        </w:rPr>
+        <w:t xml:space="preserve"> - *kennhope13*: `docs: replace Trạm Tổng with Trạm Trung tâm in document and diagrams`</w:t>
       </w:r>
     </w:p>
     <w:p>
@@ -9081,14 +9081,14 @@
           <w:b/>
           <w:sz w:val="22"/>
         </w:rPr>
-        <w:t>`05389ab`</w:t>
-      </w:r>
-      <w:r>
-        <w:rPr>
-          <w:rFonts w:ascii="Arial" w:hAnsi="Arial"/>
-          <w:sz w:val="22"/>
-        </w:rPr>
-        <w:t xml:space="preserve"> - *kennhope13*: `fix: prevent sidebar theme selection popover text wrapping`</w:t>
+        <w:t>`8c7b39f`</w:t>
+      </w:r>
+      <w:r>
+        <w:rPr>
+          <w:rFonts w:ascii="Arial" w:hAnsi="Arial"/>
+          <w:sz w:val="22"/>
+        </w:rPr>
+        <w:t xml:space="preserve"> - *kennhope13*: `docs: adjust diagram box sizes and center text alignment to prevent text clipping`</w:t>
       </w:r>
     </w:p>
     <w:p>
@@ -9109,14 +9109,14 @@
           <w:b/>
           <w:sz w:val="22"/>
         </w:rPr>
-        <w:t>`63ec2c6`</w:t>
-      </w:r>
-      <w:r>
-        <w:rPr>
-          <w:rFonts w:ascii="Arial" w:hAnsi="Arial"/>
-          <w:sz w:val="22"/>
-        </w:rPr>
-        <w:t xml:space="preserve"> - *kennhope13*: `chore: license root configuration, sensor limit fixes, UI warnings removal, and bump version to v3.0.49`</w:t>
+        <w:t>`7292e48`</w:t>
+      </w:r>
+      <w:r>
+        <w:rPr>
+          <w:rFonts w:ascii="Arial" w:hAnsi="Arial"/>
+          <w:sz w:val="22"/>
+        </w:rPr>
+        <w:t xml:space="preserve"> - *kennhope13*: `docs: integrate PIL-based technical diagram generation and embed PNG images in md and docx`</w:t>
       </w:r>
     </w:p>
     <w:p>
@@ -9137,14 +9137,14 @@
           <w:b/>
           <w:sz w:val="22"/>
         </w:rPr>
-        <w:t>`8f583dc`</w:t>
-      </w:r>
-      <w:r>
-        <w:rPr>
-          <w:rFonts w:ascii="Arial" w:hAnsi="Arial"/>
-          <w:sz w:val="22"/>
-        </w:rPr>
-        <w:t xml:space="preserve"> - *kennhope13*: `fix: prevent local loops from resolving server_ip config in env.ts, and bump to v3.0.48`</w:t>
+        <w:t>`d7bf03f`</w:t>
+      </w:r>
+      <w:r>
+        <w:rPr>
+          <w:rFonts w:ascii="Arial" w:hAnsi="Arial"/>
+          <w:sz w:val="22"/>
+        </w:rPr>
+        <w:t xml:space="preserve"> - *kennhope13*: `docs: integrate 5 ASCII diagrams, complete git commit history, detailed bug reports, and remove raw source code blocks`</w:t>
       </w:r>
     </w:p>
     <w:p>
@@ -9165,14 +9165,14 @@
           <w:b/>
           <w:sz w:val="22"/>
         </w:rPr>
-        <w:t>`a903a85`</w:t>
-      </w:r>
-      <w:r>
-        <w:rPr>
-          <w:rFonts w:ascii="Arial" w:hAnsi="Arial"/>
-          <w:sz w:val="22"/>
-        </w:rPr>
-        <w:t xml:space="preserve"> - *kennhope13*: `fix: catch socket errors to prevent ECONNRESET crash and deduplicate service shutdown hooks, and bump to v3.0.47`</w:t>
+        <w:t>`3013640`</w:t>
+      </w:r>
+      <w:r>
+        <w:rPr>
+          <w:rFonts w:ascii="Arial" w:hAnsi="Arial"/>
+          <w:sz w:val="22"/>
+        </w:rPr>
+        <w:t xml:space="preserve"> - *kennhope13*: `docs: finalize technical docs with 12 structured word tables and beautiful layout`</w:t>
       </w:r>
     </w:p>
     <w:p>
@@ -9193,14 +9193,14 @@
           <w:b/>
           <w:sz w:val="22"/>
         </w:rPr>
-        <w:t>`87ab8bc`</w:t>
-      </w:r>
-      <w:r>
-        <w:rPr>
-          <w:rFonts w:ascii="Arial" w:hAnsi="Arial"/>
-          <w:sz w:val="22"/>
-        </w:rPr>
-        <w:t xml:space="preserve"> - *kennhope13*: `feat: ignore localhost/127.0.0.1 in getTargetHostname, proxy /sld/ requests, and bump to v3.0.46`</w:t>
+        <w:t>`a15c4b4`</w:t>
+      </w:r>
+      <w:r>
+        <w:rPr>
+          <w:rFonts w:ascii="Arial" w:hAnsi="Arial"/>
+          <w:sz w:val="22"/>
+        </w:rPr>
+        <w:t xml:space="preserve"> - *kennhope13*: `docs: update detailed technical documentation with comprehensive schemas and code snippets`</w:t>
       </w:r>
     </w:p>
     <w:p>
@@ -9221,14 +9221,14 @@
           <w:b/>
           <w:sz w:val="22"/>
         </w:rPr>
-        <w:t>`1d0372c`</w:t>
-      </w:r>
-      <w:r>
-        <w:rPr>
-          <w:rFonts w:ascii="Arial" w:hAnsi="Arial"/>
-          <w:sz w:val="22"/>
-        </w:rPr>
-        <w:t xml:space="preserve"> - *kennhope13*: `feat: shut down postgres and backend on exit, retain go2rtc in background, and bump to v3.0.45`</w:t>
+        <w:t>`500966a`</w:t>
+      </w:r>
+      <w:r>
+        <w:rPr>
+          <w:rFonts w:ascii="Arial" w:hAnsi="Arial"/>
+          <w:sz w:val="22"/>
+        </w:rPr>
+        <w:t xml:space="preserve"> - *kennhope13*: `docs: add detailed technical documentation in markdown and word docx formats`</w:t>
       </w:r>
     </w:p>
     <w:p>
@@ -9249,14 +9249,14 @@
           <w:b/>
           <w:sz w:val="22"/>
         </w:rPr>
-        <w:t>`3d6c068`</w:t>
-      </w:r>
-      <w:r>
-        <w:rPr>
-          <w:rFonts w:ascii="Arial" w:hAnsi="Arial"/>
-          <w:sz w:val="22"/>
-        </w:rPr>
-        <w:t xml:space="preserve"> - *kennhope13*: `chore: stabilize SignalR connection using relative proxy and bump to v3.0.44`</w:t>
+        <w:t>`719d13a`</w:t>
+      </w:r>
+      <w:r>
+        <w:rPr>
+          <w:rFonts w:ascii="Arial" w:hAnsi="Arial"/>
+          <w:sz w:val="22"/>
+        </w:rPr>
+        <w:t xml:space="preserve"> - *kennhope13*: `chore: bump version to v3.0.51 and fix camera dropdown text visibility &amp; seed SVG path`</w:t>
       </w:r>
     </w:p>
     <w:p>
@@ -9277,14 +9277,14 @@
           <w:b/>
           <w:sz w:val="22"/>
         </w:rPr>
-        <w:t>`a12493c`</w:t>
-      </w:r>
-      <w:r>
-        <w:rPr>
-          <w:rFonts w:ascii="Arial" w:hAnsi="Arial"/>
-          <w:sz w:val="22"/>
-        </w:rPr>
-        <w:t xml:space="preserve"> - *kennhope13*: `fix: removed using on GetDbConnection which caused EF Core connection disposal and hanging`</w:t>
+        <w:t>`e1a0591`</w:t>
+      </w:r>
+      <w:r>
+        <w:rPr>
+          <w:rFonts w:ascii="Arial" w:hAnsi="Arial"/>
+          <w:sz w:val="22"/>
+        </w:rPr>
+        <w:t xml:space="preserve"> - *kennhope13*: `chore: bump version to v3.0.50`</w:t>
       </w:r>
     </w:p>
     <w:p>
@@ -9305,14 +9305,14 @@
           <w:b/>
           <w:sz w:val="22"/>
         </w:rPr>
-        <w:t>`6208d64`</w:t>
-      </w:r>
-      <w:r>
-        <w:rPr>
-          <w:rFonts w:ascii="Arial" w:hAnsi="Arial"/>
-          <w:sz w:val="22"/>
-        </w:rPr>
-        <w:t xml:space="preserve"> - *kennhope13*: `chore: silence EF Core TimescaleDB fake errors to avoid confusing users`</w:t>
+        <w:t>`a51f2b8`</w:t>
+      </w:r>
+      <w:r>
+        <w:rPr>
+          <w:rFonts w:ascii="Arial" w:hAnsi="Arial"/>
+          <w:sz w:val="22"/>
+        </w:rPr>
+        <w:t xml:space="preserve"> - *kennhope13*: `fix: instantiate builder with WebApplicationOptions to configure WebRootPath, avoiding NotSupportedException`</w:t>
       </w:r>
     </w:p>
     <w:p>
@@ -9333,14 +9333,14 @@
           <w:b/>
           <w:sz w:val="22"/>
         </w:rPr>
-        <w:t>`02a063b`</w:t>
-      </w:r>
-      <w:r>
-        <w:rPr>
-          <w:rFonts w:ascii="Arial" w:hAnsi="Arial"/>
-          <w:sz w:val="22"/>
-        </w:rPr>
-        <w:t xml:space="preserve"> - *kennhope13*: `chore: default installer to perMachine and bump version to 3.0.41`</w:t>
+        <w:t>`969adf6`</w:t>
+      </w:r>
+      <w:r>
+        <w:rPr>
+          <w:rFonts w:ascii="Arial" w:hAnsi="Arial"/>
+          <w:sz w:val="22"/>
+        </w:rPr>
+        <w:t xml:space="preserve"> - *kennhope13*: `fix: set offline simulated values to null and quality to 2 to display ----- on UI`</w:t>
       </w:r>
     </w:p>
     <w:p>
@@ -9361,14 +9361,14 @@
           <w:b/>
           <w:sz w:val="22"/>
         </w:rPr>
-        <w:t>`01a675c`</w:t>
-      </w:r>
-      <w:r>
-        <w:rPr>
-          <w:rFonts w:ascii="Arial" w:hAnsi="Arial"/>
-          <w:sz w:val="22"/>
-        </w:rPr>
-        <w:t xml:space="preserve"> - *kennhope13*: `chore: bump version to 3.0.40 and fix postgres restart issue`</w:t>
+        <w:t>`ecebe38`</w:t>
+      </w:r>
+      <w:r>
+        <w:rPr>
+          <w:rFonts w:ascii="Arial" w:hAnsi="Arial"/>
+          <w:sz w:val="22"/>
+        </w:rPr>
+        <w:t xml:space="preserve"> - *kennhope13*: `fix: redirect backend wwwroot to AppData to resolve write permissions error`</w:t>
       </w:r>
     </w:p>
     <w:p>
@@ -9389,14 +9389,14 @@
           <w:b/>
           <w:sz w:val="22"/>
         </w:rPr>
-        <w:t>`71898c8`</w:t>
-      </w:r>
-      <w:r>
-        <w:rPr>
-          <w:rFonts w:ascii="Arial" w:hAnsi="Arial"/>
-          <w:sz w:val="22"/>
-        </w:rPr>
-        <w:t xml:space="preserve"> - *kennhope13*: `fix(backend): fix compiler error in AuthController from LicenseService async refactor`</w:t>
+        <w:t>`05389ab`</w:t>
+      </w:r>
+      <w:r>
+        <w:rPr>
+          <w:rFonts w:ascii="Arial" w:hAnsi="Arial"/>
+          <w:sz w:val="22"/>
+        </w:rPr>
+        <w:t xml:space="preserve"> - *kennhope13*: `fix: prevent sidebar theme selection popover text wrapping`</w:t>
       </w:r>
     </w:p>
     <w:p>
@@ -9417,14 +9417,14 @@
           <w:b/>
           <w:sz w:val="22"/>
         </w:rPr>
-        <w:t>`9ed842e`</w:t>
-      </w:r>
-      <w:r>
-        <w:rPr>
-          <w:rFonts w:ascii="Arial" w:hAnsi="Arial"/>
-          <w:sz w:val="22"/>
-        </w:rPr>
-        <w:t xml:space="preserve"> - *kennhope13*: `fix(backend): Resolve SignalR connection timeouts by eliminating ThreadPool starvation in LicenseService; disable CentralSync polling by default`</w:t>
+        <w:t>`63ec2c6`</w:t>
+      </w:r>
+      <w:r>
+        <w:rPr>
+          <w:rFonts w:ascii="Arial" w:hAnsi="Arial"/>
+          <w:sz w:val="22"/>
+        </w:rPr>
+        <w:t xml:space="preserve"> - *kennhope13*: `chore: license root configuration, sensor limit fixes, UI warnings removal, and bump version to v3.0.49`</w:t>
       </w:r>
     </w:p>
     <w:p>
@@ -9445,14 +9445,14 @@
           <w:b/>
           <w:sz w:val="22"/>
         </w:rPr>
-        <w:t>`4f6f97f`</w:t>
-      </w:r>
-      <w:r>
-        <w:rPr>
-          <w:rFonts w:ascii="Arial" w:hAnsi="Arial"/>
-          <w:sz w:val="22"/>
-        </w:rPr>
-        <w:t xml:space="preserve"> - *kennhope13*: `chore: release v3.0.37 with latest fixes`</w:t>
+        <w:t>`8f583dc`</w:t>
+      </w:r>
+      <w:r>
+        <w:rPr>
+          <w:rFonts w:ascii="Arial" w:hAnsi="Arial"/>
+          <w:sz w:val="22"/>
+        </w:rPr>
+        <w:t xml:space="preserve"> - *kennhope13*: `fix: prevent local loops from resolving server_ip config in env.ts, and bump to v3.0.48`</w:t>
       </w:r>
     </w:p>
     <w:p>
@@ -9473,14 +9473,14 @@
           <w:b/>
           <w:sz w:val="22"/>
         </w:rPr>
-        <w:t>`43a6e7e`</w:t>
-      </w:r>
-      <w:r>
-        <w:rPr>
-          <w:rFonts w:ascii="Arial" w:hAnsi="Arial"/>
-          <w:sz w:val="22"/>
-        </w:rPr>
-        <w:t xml:space="preserve"> - *kennhope13*: `fix(realtime): use shared SignalR hub to prevent concurrent negotiate timeouts and session dropping`</w:t>
+        <w:t>`a903a85`</w:t>
+      </w:r>
+      <w:r>
+        <w:rPr>
+          <w:rFonts w:ascii="Arial" w:hAnsi="Arial"/>
+          <w:sz w:val="22"/>
+        </w:rPr>
+        <w:t xml:space="preserve"> - *kennhope13*: `fix: catch socket errors to prevent ECONNRESET crash and deduplicate service shutdown hooks, and bump to v3.0.47`</w:t>
       </w:r>
     </w:p>
     <w:p>
@@ -9501,14 +9501,14 @@
           <w:b/>
           <w:sz w:val="22"/>
         </w:rPr>
-        <w:t>`25fea65`</w:t>
-      </w:r>
-      <w:r>
-        <w:rPr>
-          <w:rFonts w:ascii="Arial" w:hAnsi="Arial"/>
-          <w:sz w:val="22"/>
-        </w:rPr>
-        <w:t xml:space="preserve"> - *kennhope13*: `style(license): center license limit boxes by using 2-column grid`</w:t>
+        <w:t>`87ab8bc`</w:t>
+      </w:r>
+      <w:r>
+        <w:rPr>
+          <w:rFonts w:ascii="Arial" w:hAnsi="Arial"/>
+          <w:sz w:val="22"/>
+        </w:rPr>
+        <w:t xml:space="preserve"> - *kennhope13*: `feat: ignore localhost/127.0.0.1 in getTargetHostname, proxy /sld/ requests, and bump to v3.0.46`</w:t>
       </w:r>
     </w:p>
     <w:p>
@@ -9529,14 +9529,14 @@
           <w:b/>
           <w:sz w:val="22"/>
         </w:rPr>
-        <w:t>`9c11cc1`</w:t>
-      </w:r>
-      <w:r>
-        <w:rPr>
-          <w:rFonts w:ascii="Arial" w:hAnsi="Arial"/>
-          <w:sz w:val="22"/>
-        </w:rPr>
-        <w:t xml:space="preserve"> - *kennhope13*: `feat(license): hide station limit item from LicensePage`</w:t>
+        <w:t>`1d0372c`</w:t>
+      </w:r>
+      <w:r>
+        <w:rPr>
+          <w:rFonts w:ascii="Arial" w:hAnsi="Arial"/>
+          <w:sz w:val="22"/>
+        </w:rPr>
+        <w:t xml:space="preserve"> - *kennhope13*: `feat: shut down postgres and backend on exit, retain go2rtc in background, and bump to v3.0.45`</w:t>
       </w:r>
     </w:p>
     <w:p>
@@ -9557,14 +9557,14 @@
           <w:b/>
           <w:sz w:val="22"/>
         </w:rPr>
-        <w:t>`fd7789c`</w:t>
-      </w:r>
-      <w:r>
-        <w:rPr>
-          <w:rFonts w:ascii="Arial" w:hAnsi="Arial"/>
-          <w:sz w:val="22"/>
-        </w:rPr>
-        <w:t xml:space="preserve"> - *kennhope13*: `fix(thermal,startup): resolve thermal UnboundLocalError and reuse running background services on app reopen`</w:t>
+        <w:t>`3d6c068`</w:t>
+      </w:r>
+      <w:r>
+        <w:rPr>
+          <w:rFonts w:ascii="Arial" w:hAnsi="Arial"/>
+          <w:sz w:val="22"/>
+        </w:rPr>
+        <w:t xml:space="preserve"> - *kennhope13*: `chore: stabilize SignalR connection using relative proxy and bump to v3.0.44`</w:t>
       </w:r>
     </w:p>
     <w:p>
@@ -9585,14 +9585,14 @@
           <w:b/>
           <w:sz w:val="22"/>
         </w:rPr>
-        <w:t>`a8206b7`</w:t>
-      </w:r>
-      <w:r>
-        <w:rPr>
-          <w:rFonts w:ascii="Arial" w:hAnsi="Arial"/>
-          <w:sz w:val="22"/>
-        </w:rPr>
-        <w:t xml:space="preserve"> - *kennhope13*: `Keep services running on close, watch backend health, bump to 3.0.32`</w:t>
+        <w:t>`a12493c`</w:t>
+      </w:r>
+      <w:r>
+        <w:rPr>
+          <w:rFonts w:ascii="Arial" w:hAnsi="Arial"/>
+          <w:sz w:val="22"/>
+        </w:rPr>
+        <w:t xml:space="preserve"> - *kennhope13*: `fix: removed using on GetDbConnection which caused EF Core connection disposal and hanging`</w:t>
       </w:r>
     </w:p>
     <w:p>
@@ -9613,14 +9613,14 @@
           <w:b/>
           <w:sz w:val="22"/>
         </w:rPr>
-        <w:t>`d6caf3c`</w:t>
-      </w:r>
-      <w:r>
-        <w:rPr>
-          <w:rFonts w:ascii="Arial" w:hAnsi="Arial"/>
-          <w:sz w:val="22"/>
-        </w:rPr>
-        <w:t xml:space="preserve"> - *kennhope13*: `Bump version to 3.0.31`</w:t>
+        <w:t>`6208d64`</w:t>
+      </w:r>
+      <w:r>
+        <w:rPr>
+          <w:rFonts w:ascii="Arial" w:hAnsi="Arial"/>
+          <w:sz w:val="22"/>
+        </w:rPr>
+        <w:t xml:space="preserve"> - *kennhope13*: `chore: silence EF Core TimescaleDB fake errors to avoid confusing users`</w:t>
       </w:r>
     </w:p>
     <w:p>
@@ -9641,14 +9641,14 @@
           <w:b/>
           <w:sz w:val="22"/>
         </w:rPr>
-        <w:t>`8dd7bd5`</w:t>
-      </w:r>
-      <w:r>
-        <w:rPr>
-          <w:rFonts w:ascii="Arial" w:hAnsi="Arial"/>
-          <w:sz w:val="22"/>
-        </w:rPr>
-        <w:t xml:space="preserve"> - *kennhope13*: `Keep services running in background on app close - instant relaunch`</w:t>
+        <w:t>`02a063b`</w:t>
+      </w:r>
+      <w:r>
+        <w:rPr>
+          <w:rFonts w:ascii="Arial" w:hAnsi="Arial"/>
+          <w:sz w:val="22"/>
+        </w:rPr>
+        <w:t xml:space="preserve"> - *kennhope13*: `chore: default installer to perMachine and bump version to 3.0.41`</w:t>
       </w:r>
     </w:p>
     <w:p>
@@ -9669,14 +9669,14 @@
           <w:b/>
           <w:sz w:val="22"/>
         </w:rPr>
-        <w:t>`2fc4b23`</w:t>
-      </w:r>
-      <w:r>
-        <w:rPr>
-          <w:rFonts w:ascii="Arial" w:hAnsi="Arial"/>
-          <w:sz w:val="22"/>
-        </w:rPr>
-        <w:t xml:space="preserve"> - *kennhope13*: `Fix startup race: health returns 503 until DB ready, bump v3.0.30`</w:t>
+        <w:t>`01a675c`</w:t>
+      </w:r>
+      <w:r>
+        <w:rPr>
+          <w:rFonts w:ascii="Arial" w:hAnsi="Arial"/>
+          <w:sz w:val="22"/>
+        </w:rPr>
+        <w:t xml:space="preserve"> - *kennhope13*: `chore: bump version to 3.0.40 and fix postgres restart issue`</w:t>
       </w:r>
     </w:p>
     <w:p>
@@ -9697,14 +9697,14 @@
           <w:b/>
           <w:sz w:val="22"/>
         </w:rPr>
-        <w:t>`d927859`</w:t>
-      </w:r>
-      <w:r>
-        <w:rPr>
-          <w:rFonts w:ascii="Arial" w:hAnsi="Arial"/>
-          <w:sz w:val="22"/>
-        </w:rPr>
-        <w:t xml:space="preserve"> - *kennhope13*: `Fix Windows zombie backend and port 5000, bump version to 3.0.30`</w:t>
+        <w:t>`71898c8`</w:t>
+      </w:r>
+      <w:r>
+        <w:rPr>
+          <w:rFonts w:ascii="Arial" w:hAnsi="Arial"/>
+          <w:sz w:val="22"/>
+        </w:rPr>
+        <w:t xml:space="preserve"> - *kennhope13*: `fix(backend): fix compiler error in AuthController from LicenseService async refactor`</w:t>
       </w:r>
     </w:p>
     <w:p>
@@ -9725,14 +9725,14 @@
           <w:b/>
           <w:sz w:val="22"/>
         </w:rPr>
-        <w:t>`a7d9cfc`</w:t>
-      </w:r>
-      <w:r>
-        <w:rPr>
-          <w:rFonts w:ascii="Arial" w:hAnsi="Arial"/>
-          <w:sz w:val="22"/>
-        </w:rPr>
-        <w:t xml:space="preserve"> - *kennhope13*: `Fix license flat payload validation, revert port to 5000, and remove postgres pid on Windows restart`</w:t>
+        <w:t>`9ed842e`</w:t>
+      </w:r>
+      <w:r>
+        <w:rPr>
+          <w:rFonts w:ascii="Arial" w:hAnsi="Arial"/>
+          <w:sz w:val="22"/>
+        </w:rPr>
+        <w:t xml:space="preserve"> - *kennhope13*: `fix(backend): Resolve SignalR connection timeouts by eliminating ThreadPool starvation in LicenseService; disable CentralSync polling by default`</w:t>
       </w:r>
     </w:p>
     <w:p>
@@ -9753,14 +9753,14 @@
           <w:b/>
           <w:sz w:val="22"/>
         </w:rPr>
-        <w:t>`47a71bb`</w:t>
-      </w:r>
-      <w:r>
-        <w:rPr>
-          <w:rFonts w:ascii="Arial" w:hAnsi="Arial"/>
-          <w:sz w:val="22"/>
-        </w:rPr>
-        <w:t xml:space="preserve"> - *kennhope13*: `fix(workflow): sync VITE_API_URL to 5050 in github actions`</w:t>
+        <w:t>`4f6f97f`</w:t>
+      </w:r>
+      <w:r>
+        <w:rPr>
+          <w:rFonts w:ascii="Arial" w:hAnsi="Arial"/>
+          <w:sz w:val="22"/>
+        </w:rPr>
+        <w:t xml:space="preserve"> - *kennhope13*: `chore: release v3.0.37 with latest fixes`</w:t>
       </w:r>
     </w:p>
     <w:p>
@@ -9781,14 +9781,14 @@
           <w:b/>
           <w:sz w:val="22"/>
         </w:rPr>
-        <w:t>`ec14139`</w:t>
-      </w:r>
-      <w:r>
-        <w:rPr>
-          <w:rFonts w:ascii="Arial" w:hAnsi="Arial"/>
-          <w:sz w:val="22"/>
-        </w:rPr>
-        <w:t xml:space="preserve"> - *kennhope13*: `fix(desktop): change backend port from 5000 to 5050 to resolve silent background port collision on second run`</w:t>
+        <w:t>`43a6e7e`</w:t>
+      </w:r>
+      <w:r>
+        <w:rPr>
+          <w:rFonts w:ascii="Arial" w:hAnsi="Arial"/>
+          <w:sz w:val="22"/>
+        </w:rPr>
+        <w:t xml:space="preserve"> - *kennhope13*: `fix(realtime): use shared SignalR hub to prevent concurrent negotiate timeouts and session dropping`</w:t>
       </w:r>
     </w:p>
     <w:p>
@@ -9809,14 +9809,14 @@
           <w:b/>
           <w:sz w:val="22"/>
         </w:rPr>
-        <w:t>`9096a82`</w:t>
-      </w:r>
-      <w:r>
-        <w:rPr>
-          <w:rFonts w:ascii="Arial" w:hAnsi="Arial"/>
-          <w:sz w:val="22"/>
-        </w:rPr>
-        <w:t xml:space="preserve"> - *kennhope13*: `fix: read platform and machineGuid in flat license parsing`</w:t>
+        <w:t>`25fea65`</w:t>
+      </w:r>
+      <w:r>
+        <w:rPr>
+          <w:rFonts w:ascii="Arial" w:hAnsi="Arial"/>
+          <w:sz w:val="22"/>
+        </w:rPr>
+        <w:t xml:space="preserve"> - *kennhope13*: `style(license): center license limit boxes by using 2-column grid`</w:t>
       </w:r>
     </w:p>
     <w:p>
@@ -9837,14 +9837,14 @@
           <w:b/>
           <w:sz w:val="22"/>
         </w:rPr>
-        <w:t>`969a655`</w:t>
-      </w:r>
-      <w:r>
-        <w:rPr>
-          <w:rFonts w:ascii="Arial" w:hAnsi="Arial"/>
-          <w:sz w:val="22"/>
-        </w:rPr>
-        <w:t xml:space="preserve"> - *kennhope13*: `fix: db initialization transaction aborted error and license macAddress support`</w:t>
+        <w:t>`9c11cc1`</w:t>
+      </w:r>
+      <w:r>
+        <w:rPr>
+          <w:rFonts w:ascii="Arial" w:hAnsi="Arial"/>
+          <w:sz w:val="22"/>
+        </w:rPr>
+        <w:t xml:space="preserve"> - *kennhope13*: `feat(license): hide station limit item from LicensePage`</w:t>
       </w:r>
     </w:p>
     <w:p>
@@ -9865,14 +9865,14 @@
           <w:b/>
           <w:sz w:val="22"/>
         </w:rPr>
-        <w:t>`acab09c`</w:t>
-      </w:r>
-      <w:r>
-        <w:rPr>
-          <w:rFonts w:ascii="Arial" w:hAnsi="Arial"/>
-          <w:sz w:val="22"/>
-        </w:rPr>
-        <w:t xml:space="preserve"> - *kennhope13*: `fix: auto cleanup zombie processes and handle 42P07 db migration conflict`</w:t>
+        <w:t>`fd7789c`</w:t>
+      </w:r>
+      <w:r>
+        <w:rPr>
+          <w:rFonts w:ascii="Arial" w:hAnsi="Arial"/>
+          <w:sz w:val="22"/>
+        </w:rPr>
+        <w:t xml:space="preserve"> - *kennhope13*: `fix(thermal,startup): resolve thermal UnboundLocalError and reuse running background services on app reopen`</w:t>
       </w:r>
     </w:p>
     <w:p>
@@ -9893,14 +9893,14 @@
           <w:b/>
           <w:sz w:val="22"/>
         </w:rPr>
-        <w:t>`16af573`</w:t>
-      </w:r>
-      <w:r>
-        <w:rPr>
-          <w:rFonts w:ascii="Arial" w:hAnsi="Arial"/>
-          <w:sz w:val="22"/>
-        </w:rPr>
-        <w:t xml:space="preserve"> - *kennhope13*: `Fix hardware match failure due to special characters like dots and commas on Windows`</w:t>
+        <w:t>`a8206b7`</w:t>
+      </w:r>
+      <w:r>
+        <w:rPr>
+          <w:rFonts w:ascii="Arial" w:hAnsi="Arial"/>
+          <w:sz w:val="22"/>
+        </w:rPr>
+        <w:t xml:space="preserve"> - *kennhope13*: `Keep services running on close, watch backend health, bump to 3.0.32`</w:t>
       </w:r>
     </w:p>
     <w:p>
@@ -9921,14 +9921,14 @@
           <w:b/>
           <w:sz w:val="22"/>
         </w:rPr>
-        <w:t>`67bf4ee`</w:t>
-      </w:r>
-      <w:r>
-        <w:rPr>
-          <w:rFonts w:ascii="Arial" w:hAnsi="Arial"/>
-          <w:sz w:val="22"/>
-        </w:rPr>
-        <w:t xml:space="preserve"> - *kennhope13*: `Fix hardware_mismatch caused by Fingerprint check on Windows`</w:t>
+        <w:t>`d6caf3c`</w:t>
+      </w:r>
+      <w:r>
+        <w:rPr>
+          <w:rFonts w:ascii="Arial" w:hAnsi="Arial"/>
+          <w:sz w:val="22"/>
+        </w:rPr>
+        <w:t xml:space="preserve"> - *kennhope13*: `Bump version to 3.0.31`</w:t>
       </w:r>
     </w:p>
     <w:p>
@@ -9949,14 +9949,14 @@
           <w:b/>
           <w:sz w:val="22"/>
         </w:rPr>
-        <w:t>`5a7fa2b`</w:t>
-      </w:r>
-      <w:r>
-        <w:rPr>
-          <w:rFonts w:ascii="Arial" w:hAnsi="Arial"/>
-          <w:sz w:val="22"/>
-        </w:rPr>
-        <w:t xml:space="preserve"> - *kennhope13*: `Fix CS0136 compile error in LicenseService after merge and bump version to 3.0.22`</w:t>
+        <w:t>`8dd7bd5`</w:t>
+      </w:r>
+      <w:r>
+        <w:rPr>
+          <w:rFonts w:ascii="Arial" w:hAnsi="Arial"/>
+          <w:sz w:val="22"/>
+        </w:rPr>
+        <w:t xml:space="preserve"> - *kennhope13*: `Keep services running in background on app close - instant relaunch`</w:t>
       </w:r>
     </w:p>
     <w:p>
@@ -9977,14 +9977,14 @@
           <w:b/>
           <w:sz w:val="22"/>
         </w:rPr>
-        <w:t>`5a51627`</w:t>
-      </w:r>
-      <w:r>
-        <w:rPr>
-          <w:rFonts w:ascii="Arial" w:hAnsi="Arial"/>
-          <w:sz w:val="22"/>
-        </w:rPr>
-        <w:t xml:space="preserve"> - *kennhope13*: `Bump version to 3.0.21`</w:t>
+        <w:t>`2fc4b23`</w:t>
+      </w:r>
+      <w:r>
+        <w:rPr>
+          <w:rFonts w:ascii="Arial" w:hAnsi="Arial"/>
+          <w:sz w:val="22"/>
+        </w:rPr>
+        <w:t xml:space="preserve"> - *kennhope13*: `Fix startup race: health returns 503 until DB ready, bump v3.0.30`</w:t>
       </w:r>
     </w:p>
     <w:p>
@@ -10005,14 +10005,14 @@
           <w:b/>
           <w:sz w:val="22"/>
         </w:rPr>
-        <w:t>`e8e1be7`</w:t>
-      </w:r>
-      <w:r>
-        <w:rPr>
-          <w:rFonts w:ascii="Arial" w:hAnsi="Arial"/>
-          <w:sz w:val="22"/>
-        </w:rPr>
-        <w:t xml:space="preserve"> - *kennhope13*: `Merge license fixes and thermal camera fixes`</w:t>
+        <w:t>`d927859`</w:t>
+      </w:r>
+      <w:r>
+        <w:rPr>
+          <w:rFonts w:ascii="Arial" w:hAnsi="Arial"/>
+          <w:sz w:val="22"/>
+        </w:rPr>
+        <w:t xml:space="preserve"> - *kennhope13*: `Fix Windows zombie backend and port 5000, bump version to 3.0.30`</w:t>
       </w:r>
     </w:p>
     <w:p>
@@ -10033,6 +10033,314 @@
           <w:b/>
           <w:sz w:val="22"/>
         </w:rPr>
+        <w:t>`a7d9cfc`</w:t>
+      </w:r>
+      <w:r>
+        <w:rPr>
+          <w:rFonts w:ascii="Arial" w:hAnsi="Arial"/>
+          <w:sz w:val="22"/>
+        </w:rPr>
+        <w:t xml:space="preserve"> - *kennhope13*: `Fix license flat payload validation, revert port to 5000, and remove postgres pid on Windows restart`</w:t>
+      </w:r>
+    </w:p>
+    <w:p>
+      <w:pPr>
+        <w:pStyle w:val="ListBullet"/>
+        <w:spacing w:before="40" w:after="40" w:line="276" w:lineRule="auto"/>
+        <w:ind w:left="360"/>
+      </w:pPr>
+      <w:r>
+        <w:rPr>
+          <w:rFonts w:ascii="Arial" w:hAnsi="Arial"/>
+          <w:sz w:val="22"/>
+        </w:rPr>
+      </w:r>
+      <w:r>
+        <w:rPr>
+          <w:rFonts w:ascii="Arial" w:hAnsi="Arial"/>
+          <w:b/>
+          <w:sz w:val="22"/>
+        </w:rPr>
+        <w:t>`47a71bb`</w:t>
+      </w:r>
+      <w:r>
+        <w:rPr>
+          <w:rFonts w:ascii="Arial" w:hAnsi="Arial"/>
+          <w:sz w:val="22"/>
+        </w:rPr>
+        <w:t xml:space="preserve"> - *kennhope13*: `fix(workflow): sync VITE_API_URL to 5050 in github actions`</w:t>
+      </w:r>
+    </w:p>
+    <w:p>
+      <w:pPr>
+        <w:pStyle w:val="ListBullet"/>
+        <w:spacing w:before="40" w:after="40" w:line="276" w:lineRule="auto"/>
+        <w:ind w:left="360"/>
+      </w:pPr>
+      <w:r>
+        <w:rPr>
+          <w:rFonts w:ascii="Arial" w:hAnsi="Arial"/>
+          <w:sz w:val="22"/>
+        </w:rPr>
+      </w:r>
+      <w:r>
+        <w:rPr>
+          <w:rFonts w:ascii="Arial" w:hAnsi="Arial"/>
+          <w:b/>
+          <w:sz w:val="22"/>
+        </w:rPr>
+        <w:t>`ec14139`</w:t>
+      </w:r>
+      <w:r>
+        <w:rPr>
+          <w:rFonts w:ascii="Arial" w:hAnsi="Arial"/>
+          <w:sz w:val="22"/>
+        </w:rPr>
+        <w:t xml:space="preserve"> - *kennhope13*: `fix(desktop): change backend port from 5000 to 5050 to resolve silent background port collision on second run`</w:t>
+      </w:r>
+    </w:p>
+    <w:p>
+      <w:pPr>
+        <w:pStyle w:val="ListBullet"/>
+        <w:spacing w:before="40" w:after="40" w:line="276" w:lineRule="auto"/>
+        <w:ind w:left="360"/>
+      </w:pPr>
+      <w:r>
+        <w:rPr>
+          <w:rFonts w:ascii="Arial" w:hAnsi="Arial"/>
+          <w:sz w:val="22"/>
+        </w:rPr>
+      </w:r>
+      <w:r>
+        <w:rPr>
+          <w:rFonts w:ascii="Arial" w:hAnsi="Arial"/>
+          <w:b/>
+          <w:sz w:val="22"/>
+        </w:rPr>
+        <w:t>`9096a82`</w:t>
+      </w:r>
+      <w:r>
+        <w:rPr>
+          <w:rFonts w:ascii="Arial" w:hAnsi="Arial"/>
+          <w:sz w:val="22"/>
+        </w:rPr>
+        <w:t xml:space="preserve"> - *kennhope13*: `fix: read platform and machineGuid in flat license parsing`</w:t>
+      </w:r>
+    </w:p>
+    <w:p>
+      <w:pPr>
+        <w:pStyle w:val="ListBullet"/>
+        <w:spacing w:before="40" w:after="40" w:line="276" w:lineRule="auto"/>
+        <w:ind w:left="360"/>
+      </w:pPr>
+      <w:r>
+        <w:rPr>
+          <w:rFonts w:ascii="Arial" w:hAnsi="Arial"/>
+          <w:sz w:val="22"/>
+        </w:rPr>
+      </w:r>
+      <w:r>
+        <w:rPr>
+          <w:rFonts w:ascii="Arial" w:hAnsi="Arial"/>
+          <w:b/>
+          <w:sz w:val="22"/>
+        </w:rPr>
+        <w:t>`969a655`</w:t>
+      </w:r>
+      <w:r>
+        <w:rPr>
+          <w:rFonts w:ascii="Arial" w:hAnsi="Arial"/>
+          <w:sz w:val="22"/>
+        </w:rPr>
+        <w:t xml:space="preserve"> - *kennhope13*: `fix: db initialization transaction aborted error and license macAddress support`</w:t>
+      </w:r>
+    </w:p>
+    <w:p>
+      <w:pPr>
+        <w:pStyle w:val="ListBullet"/>
+        <w:spacing w:before="40" w:after="40" w:line="276" w:lineRule="auto"/>
+        <w:ind w:left="360"/>
+      </w:pPr>
+      <w:r>
+        <w:rPr>
+          <w:rFonts w:ascii="Arial" w:hAnsi="Arial"/>
+          <w:sz w:val="22"/>
+        </w:rPr>
+      </w:r>
+      <w:r>
+        <w:rPr>
+          <w:rFonts w:ascii="Arial" w:hAnsi="Arial"/>
+          <w:b/>
+          <w:sz w:val="22"/>
+        </w:rPr>
+        <w:t>`acab09c`</w:t>
+      </w:r>
+      <w:r>
+        <w:rPr>
+          <w:rFonts w:ascii="Arial" w:hAnsi="Arial"/>
+          <w:sz w:val="22"/>
+        </w:rPr>
+        <w:t xml:space="preserve"> - *kennhope13*: `fix: auto cleanup zombie processes and handle 42P07 db migration conflict`</w:t>
+      </w:r>
+    </w:p>
+    <w:p>
+      <w:pPr>
+        <w:pStyle w:val="ListBullet"/>
+        <w:spacing w:before="40" w:after="40" w:line="276" w:lineRule="auto"/>
+        <w:ind w:left="360"/>
+      </w:pPr>
+      <w:r>
+        <w:rPr>
+          <w:rFonts w:ascii="Arial" w:hAnsi="Arial"/>
+          <w:sz w:val="22"/>
+        </w:rPr>
+      </w:r>
+      <w:r>
+        <w:rPr>
+          <w:rFonts w:ascii="Arial" w:hAnsi="Arial"/>
+          <w:b/>
+          <w:sz w:val="22"/>
+        </w:rPr>
+        <w:t>`16af573`</w:t>
+      </w:r>
+      <w:r>
+        <w:rPr>
+          <w:rFonts w:ascii="Arial" w:hAnsi="Arial"/>
+          <w:sz w:val="22"/>
+        </w:rPr>
+        <w:t xml:space="preserve"> - *kennhope13*: `Fix hardware match failure due to special characters like dots and commas on Windows`</w:t>
+      </w:r>
+    </w:p>
+    <w:p>
+      <w:pPr>
+        <w:pStyle w:val="ListBullet"/>
+        <w:spacing w:before="40" w:after="40" w:line="276" w:lineRule="auto"/>
+        <w:ind w:left="360"/>
+      </w:pPr>
+      <w:r>
+        <w:rPr>
+          <w:rFonts w:ascii="Arial" w:hAnsi="Arial"/>
+          <w:sz w:val="22"/>
+        </w:rPr>
+      </w:r>
+      <w:r>
+        <w:rPr>
+          <w:rFonts w:ascii="Arial" w:hAnsi="Arial"/>
+          <w:b/>
+          <w:sz w:val="22"/>
+        </w:rPr>
+        <w:t>`67bf4ee`</w:t>
+      </w:r>
+      <w:r>
+        <w:rPr>
+          <w:rFonts w:ascii="Arial" w:hAnsi="Arial"/>
+          <w:sz w:val="22"/>
+        </w:rPr>
+        <w:t xml:space="preserve"> - *kennhope13*: `Fix hardware_mismatch caused by Fingerprint check on Windows`</w:t>
+      </w:r>
+    </w:p>
+    <w:p>
+      <w:pPr>
+        <w:pStyle w:val="ListBullet"/>
+        <w:spacing w:before="40" w:after="40" w:line="276" w:lineRule="auto"/>
+        <w:ind w:left="360"/>
+      </w:pPr>
+      <w:r>
+        <w:rPr>
+          <w:rFonts w:ascii="Arial" w:hAnsi="Arial"/>
+          <w:sz w:val="22"/>
+        </w:rPr>
+      </w:r>
+      <w:r>
+        <w:rPr>
+          <w:rFonts w:ascii="Arial" w:hAnsi="Arial"/>
+          <w:b/>
+          <w:sz w:val="22"/>
+        </w:rPr>
+        <w:t>`5a7fa2b`</w:t>
+      </w:r>
+      <w:r>
+        <w:rPr>
+          <w:rFonts w:ascii="Arial" w:hAnsi="Arial"/>
+          <w:sz w:val="22"/>
+        </w:rPr>
+        <w:t xml:space="preserve"> - *kennhope13*: `Fix CS0136 compile error in LicenseService after merge and bump version to 3.0.22`</w:t>
+      </w:r>
+    </w:p>
+    <w:p>
+      <w:pPr>
+        <w:pStyle w:val="ListBullet"/>
+        <w:spacing w:before="40" w:after="40" w:line="276" w:lineRule="auto"/>
+        <w:ind w:left="360"/>
+      </w:pPr>
+      <w:r>
+        <w:rPr>
+          <w:rFonts w:ascii="Arial" w:hAnsi="Arial"/>
+          <w:sz w:val="22"/>
+        </w:rPr>
+      </w:r>
+      <w:r>
+        <w:rPr>
+          <w:rFonts w:ascii="Arial" w:hAnsi="Arial"/>
+          <w:b/>
+          <w:sz w:val="22"/>
+        </w:rPr>
+        <w:t>`5a51627`</w:t>
+      </w:r>
+      <w:r>
+        <w:rPr>
+          <w:rFonts w:ascii="Arial" w:hAnsi="Arial"/>
+          <w:sz w:val="22"/>
+        </w:rPr>
+        <w:t xml:space="preserve"> - *kennhope13*: `Bump version to 3.0.21`</w:t>
+      </w:r>
+    </w:p>
+    <w:p>
+      <w:pPr>
+        <w:pStyle w:val="ListBullet"/>
+        <w:spacing w:before="40" w:after="40" w:line="276" w:lineRule="auto"/>
+        <w:ind w:left="360"/>
+      </w:pPr>
+      <w:r>
+        <w:rPr>
+          <w:rFonts w:ascii="Arial" w:hAnsi="Arial"/>
+          <w:sz w:val="22"/>
+        </w:rPr>
+      </w:r>
+      <w:r>
+        <w:rPr>
+          <w:rFonts w:ascii="Arial" w:hAnsi="Arial"/>
+          <w:b/>
+          <w:sz w:val="22"/>
+        </w:rPr>
+        <w:t>`e8e1be7`</w:t>
+      </w:r>
+      <w:r>
+        <w:rPr>
+          <w:rFonts w:ascii="Arial" w:hAnsi="Arial"/>
+          <w:sz w:val="22"/>
+        </w:rPr>
+        <w:t xml:space="preserve"> - *kennhope13*: `Merge license fixes and thermal camera fixes`</w:t>
+      </w:r>
+    </w:p>
+    <w:p>
+      <w:pPr>
+        <w:pStyle w:val="ListBullet"/>
+        <w:spacing w:before="40" w:after="40" w:line="276" w:lineRule="auto"/>
+        <w:ind w:left="360"/>
+      </w:pPr>
+      <w:r>
+        <w:rPr>
+          <w:rFonts w:ascii="Arial" w:hAnsi="Arial"/>
+          <w:sz w:val="22"/>
+        </w:rPr>
+      </w:r>
+      <w:r>
+        <w:rPr>
+          <w:rFonts w:ascii="Arial" w:hAnsi="Arial"/>
+          <w:b/>
+          <w:sz w:val="22"/>
+        </w:rPr>
         <w:t>`dc4784d`</w:t>
       </w:r>
       <w:r>
@@ -10041,6 +10349,2610 @@
           <w:sz w:val="22"/>
         </w:rPr>
         <w:t xml:space="preserve"> - *kennhope13*: `Bump version to 3.0.20`</w:t>
+      </w:r>
+    </w:p>
+    <w:p>
+      <w:pPr>
+        <w:pStyle w:val="ListBullet"/>
+        <w:spacing w:before="40" w:after="40" w:line="276" w:lineRule="auto"/>
+        <w:ind w:left="360"/>
+      </w:pPr>
+      <w:r>
+        <w:rPr>
+          <w:rFonts w:ascii="Arial" w:hAnsi="Arial"/>
+          <w:sz w:val="22"/>
+        </w:rPr>
+      </w:r>
+      <w:r>
+        <w:rPr>
+          <w:rFonts w:ascii="Arial" w:hAnsi="Arial"/>
+          <w:b/>
+          <w:sz w:val="22"/>
+        </w:rPr>
+        <w:t>`bfb4c3e`</w:t>
+      </w:r>
+      <w:r>
+        <w:rPr>
+          <w:rFonts w:ascii="Arial" w:hAnsi="Arial"/>
+          <w:sz w:val="22"/>
+        </w:rPr>
+        <w:t xml:space="preserve"> - *kennhope13*: `Fix EF Core migration failure caused by EnsureCreated`</w:t>
+      </w:r>
+    </w:p>
+    <w:p>
+      <w:pPr>
+        <w:pStyle w:val="ListBullet"/>
+        <w:spacing w:before="40" w:after="40" w:line="276" w:lineRule="auto"/>
+        <w:ind w:left="360"/>
+      </w:pPr>
+      <w:r>
+        <w:rPr>
+          <w:rFonts w:ascii="Arial" w:hAnsi="Arial"/>
+          <w:sz w:val="22"/>
+        </w:rPr>
+      </w:r>
+      <w:r>
+        <w:rPr>
+          <w:rFonts w:ascii="Arial" w:hAnsi="Arial"/>
+          <w:b/>
+          <w:sz w:val="22"/>
+        </w:rPr>
+        <w:t>`3e4057c`</w:t>
+      </w:r>
+      <w:r>
+        <w:rPr>
+          <w:rFonts w:ascii="Arial" w:hAnsi="Arial"/>
+          <w:sz w:val="22"/>
+        </w:rPr>
+        <w:t xml:space="preserve"> - *kennhope13*: `Fix database init on Windows`</w:t>
+      </w:r>
+    </w:p>
+    <w:p>
+      <w:pPr>
+        <w:pStyle w:val="ListBullet"/>
+        <w:spacing w:before="40" w:after="40" w:line="276" w:lineRule="auto"/>
+        <w:ind w:left="360"/>
+      </w:pPr>
+      <w:r>
+        <w:rPr>
+          <w:rFonts w:ascii="Arial" w:hAnsi="Arial"/>
+          <w:sz w:val="22"/>
+        </w:rPr>
+      </w:r>
+      <w:r>
+        <w:rPr>
+          <w:rFonts w:ascii="Arial" w:hAnsi="Arial"/>
+          <w:b/>
+          <w:sz w:val="22"/>
+        </w:rPr>
+        <w:t>`591f6c1`</w:t>
+      </w:r>
+      <w:r>
+        <w:rPr>
+          <w:rFonts w:ascii="Arial" w:hAnsi="Arial"/>
+          <w:sz w:val="22"/>
+        </w:rPr>
+        <w:t xml:space="preserve"> - *kennhope13*: `feat: update license UI and desktop build fixes`</w:t>
+      </w:r>
+    </w:p>
+    <w:p>
+      <w:pPr>
+        <w:pStyle w:val="ListBullet"/>
+        <w:spacing w:before="40" w:after="40" w:line="276" w:lineRule="auto"/>
+        <w:ind w:left="360"/>
+      </w:pPr>
+      <w:r>
+        <w:rPr>
+          <w:rFonts w:ascii="Arial" w:hAnsi="Arial"/>
+          <w:sz w:val="22"/>
+        </w:rPr>
+      </w:r>
+      <w:r>
+        <w:rPr>
+          <w:rFonts w:ascii="Arial" w:hAnsi="Arial"/>
+          <w:b/>
+          <w:sz w:val="22"/>
+        </w:rPr>
+        <w:t>`b3abdd0`</w:t>
+      </w:r>
+      <w:r>
+        <w:rPr>
+          <w:rFonts w:ascii="Arial" w:hAnsi="Arial"/>
+          <w:sz w:val="22"/>
+        </w:rPr>
+        <w:t xml:space="preserve"> - *kennhope13*: `Fix license flat JSON parsing and signature verification`</w:t>
+      </w:r>
+    </w:p>
+    <w:p>
+      <w:pPr>
+        <w:pStyle w:val="ListBullet"/>
+        <w:spacing w:before="40" w:after="40" w:line="276" w:lineRule="auto"/>
+        <w:ind w:left="360"/>
+      </w:pPr>
+      <w:r>
+        <w:rPr>
+          <w:rFonts w:ascii="Arial" w:hAnsi="Arial"/>
+          <w:sz w:val="22"/>
+        </w:rPr>
+      </w:r>
+      <w:r>
+        <w:rPr>
+          <w:rFonts w:ascii="Arial" w:hAnsi="Arial"/>
+          <w:b/>
+          <w:sz w:val="22"/>
+        </w:rPr>
+        <w:t>`d4fcc25`</w:t>
+      </w:r>
+      <w:r>
+        <w:rPr>
+          <w:rFonts w:ascii="Arial" w:hAnsi="Arial"/>
+          <w:sz w:val="22"/>
+        </w:rPr>
+        <w:t xml:space="preserve"> - *kennhope13*: `Fix thermal telemetry ingestion for Camera 152 and stability improvements`</w:t>
+      </w:r>
+    </w:p>
+    <w:p>
+      <w:pPr>
+        <w:pStyle w:val="ListBullet"/>
+        <w:spacing w:before="40" w:after="40" w:line="276" w:lineRule="auto"/>
+        <w:ind w:left="360"/>
+      </w:pPr>
+      <w:r>
+        <w:rPr>
+          <w:rFonts w:ascii="Arial" w:hAnsi="Arial"/>
+          <w:sz w:val="22"/>
+        </w:rPr>
+      </w:r>
+      <w:r>
+        <w:rPr>
+          <w:rFonts w:ascii="Arial" w:hAnsi="Arial"/>
+          <w:b/>
+          <w:sz w:val="22"/>
+        </w:rPr>
+        <w:t>`559afba`</w:t>
+      </w:r>
+      <w:r>
+        <w:rPr>
+          <w:rFonts w:ascii="Arial" w:hAnsi="Arial"/>
+          <w:sz w:val="22"/>
+        </w:rPr>
+        <w:t xml:space="preserve"> - *kennhope13*: `fix: explicit port 5000 binding for backend on Windows and fallback to 127.0.0.1 in frontend to resolve localhost resolution issues`</w:t>
+      </w:r>
+    </w:p>
+    <w:p>
+      <w:pPr>
+        <w:pStyle w:val="ListBullet"/>
+        <w:spacing w:before="40" w:after="40" w:line="276" w:lineRule="auto"/>
+        <w:ind w:left="360"/>
+      </w:pPr>
+      <w:r>
+        <w:rPr>
+          <w:rFonts w:ascii="Arial" w:hAnsi="Arial"/>
+          <w:sz w:val="22"/>
+        </w:rPr>
+      </w:r>
+      <w:r>
+        <w:rPr>
+          <w:rFonts w:ascii="Arial" w:hAnsi="Arial"/>
+          <w:b/>
+          <w:sz w:val="22"/>
+        </w:rPr>
+        <w:t>`ccc0b47`</w:t>
+      </w:r>
+      <w:r>
+        <w:rPr>
+          <w:rFonts w:ascii="Arial" w:hAnsi="Arial"/>
+          <w:sz w:val="22"/>
+        </w:rPr>
+        <w:t xml:space="preserve"> - *kennhope13*: `fix: fallback to local UI server on port 4173 in Electron if Vite is not running`</w:t>
+      </w:r>
+    </w:p>
+    <w:p>
+      <w:pPr>
+        <w:pStyle w:val="ListBullet"/>
+        <w:spacing w:before="40" w:after="40" w:line="276" w:lineRule="auto"/>
+        <w:ind w:left="360"/>
+      </w:pPr>
+      <w:r>
+        <w:rPr>
+          <w:rFonts w:ascii="Arial" w:hAnsi="Arial"/>
+          <w:sz w:val="22"/>
+        </w:rPr>
+      </w:r>
+      <w:r>
+        <w:rPr>
+          <w:rFonts w:ascii="Arial" w:hAnsi="Arial"/>
+          <w:b/>
+          <w:sz w:val="22"/>
+        </w:rPr>
+        <w:t>`9b49718`</w:t>
+      </w:r>
+      <w:r>
+        <w:rPr>
+          <w:rFonts w:ascii="Arial" w:hAnsi="Arial"/>
+          <w:sz w:val="22"/>
+        </w:rPr>
+        <w:t xml:space="preserve"> - *kennhope13*: `fix: Windows startup crash - DB not created, UTF8 encoding, race condition`</w:t>
+      </w:r>
+    </w:p>
+    <w:p>
+      <w:pPr>
+        <w:pStyle w:val="ListBullet"/>
+        <w:spacing w:before="40" w:after="40" w:line="276" w:lineRule="auto"/>
+        <w:ind w:left="360"/>
+      </w:pPr>
+      <w:r>
+        <w:rPr>
+          <w:rFonts w:ascii="Arial" w:hAnsi="Arial"/>
+          <w:sz w:val="22"/>
+        </w:rPr>
+      </w:r>
+      <w:r>
+        <w:rPr>
+          <w:rFonts w:ascii="Arial" w:hAnsi="Arial"/>
+          <w:b/>
+          <w:sz w:val="22"/>
+        </w:rPr>
+        <w:t>`24b3fc7`</w:t>
+      </w:r>
+      <w:r>
+        <w:rPr>
+          <w:rFonts w:ascii="Arial" w:hAnsi="Arial"/>
+          <w:sz w:val="22"/>
+        </w:rPr>
+        <w:t xml:space="preserve"> - *kennhope13*: `fix(desktop): bind ASPNETCORE_URLS to 0.0.0.0 instead of 127.0.0.1, bump to 3.0.18`</w:t>
+      </w:r>
+    </w:p>
+    <w:p>
+      <w:pPr>
+        <w:pStyle w:val="ListBullet"/>
+        <w:spacing w:before="40" w:after="40" w:line="276" w:lineRule="auto"/>
+        <w:ind w:left="360"/>
+      </w:pPr>
+      <w:r>
+        <w:rPr>
+          <w:rFonts w:ascii="Arial" w:hAnsi="Arial"/>
+          <w:sz w:val="22"/>
+        </w:rPr>
+      </w:r>
+      <w:r>
+        <w:rPr>
+          <w:rFonts w:ascii="Arial" w:hAnsi="Arial"/>
+          <w:b/>
+          <w:sz w:val="22"/>
+        </w:rPr>
+        <w:t>`6c6b6c8`</w:t>
+      </w:r>
+      <w:r>
+        <w:rPr>
+          <w:rFonts w:ascii="Arial" w:hAnsi="Arial"/>
+          <w:sz w:val="22"/>
+        </w:rPr>
+        <w:t xml:space="preserve"> - *kennhope13*: `fix(desktop): split stdout and stderr redirects in spawnHiddenWin32 to prevent file sharing violations, bump to 3.0.17`</w:t>
+      </w:r>
+    </w:p>
+    <w:p>
+      <w:pPr>
+        <w:pStyle w:val="ListBullet"/>
+        <w:spacing w:before="40" w:after="40" w:line="276" w:lineRule="auto"/>
+        <w:ind w:left="360"/>
+      </w:pPr>
+      <w:r>
+        <w:rPr>
+          <w:rFonts w:ascii="Arial" w:hAnsi="Arial"/>
+          <w:sz w:val="22"/>
+        </w:rPr>
+      </w:r>
+      <w:r>
+        <w:rPr>
+          <w:rFonts w:ascii="Arial" w:hAnsi="Arial"/>
+          <w:b/>
+          <w:sz w:val="22"/>
+        </w:rPr>
+        <w:t>`cbf37a0`</w:t>
+      </w:r>
+      <w:r>
+        <w:rPr>
+          <w:rFonts w:ascii="Arial" w:hAnsi="Arial"/>
+          <w:sz w:val="22"/>
+        </w:rPr>
+        <w:t xml:space="preserve"> - *kennhope13*: `fix(desktop): set WinExe OutputType and use spawnHiddenWin32 for silent startup, bump to 3.0.16`</w:t>
+      </w:r>
+    </w:p>
+    <w:p>
+      <w:pPr>
+        <w:pStyle w:val="ListBullet"/>
+        <w:spacing w:before="40" w:after="40" w:line="276" w:lineRule="auto"/>
+        <w:ind w:left="360"/>
+      </w:pPr>
+      <w:r>
+        <w:rPr>
+          <w:rFonts w:ascii="Arial" w:hAnsi="Arial"/>
+          <w:sz w:val="22"/>
+        </w:rPr>
+      </w:r>
+      <w:r>
+        <w:rPr>
+          <w:rFonts w:ascii="Arial" w:hAnsi="Arial"/>
+          <w:b/>
+          <w:sz w:val="22"/>
+        </w:rPr>
+        <w:t>`c060a17`</w:t>
+      </w:r>
+      <w:r>
+        <w:rPr>
+          <w:rFonts w:ascii="Arial" w:hAnsi="Arial"/>
+          <w:sz w:val="22"/>
+        </w:rPr>
+        <w:t xml:space="preserve"> - *kennhope13*: `fix(station-setup): correctly normalize Vietnamese 'Đ/đ' characters to fix default station detection and hide cmd window on Windows`</w:t>
+      </w:r>
+    </w:p>
+    <w:p>
+      <w:pPr>
+        <w:pStyle w:val="ListBullet"/>
+        <w:spacing w:before="40" w:after="40" w:line="276" w:lineRule="auto"/>
+        <w:ind w:left="360"/>
+      </w:pPr>
+      <w:r>
+        <w:rPr>
+          <w:rFonts w:ascii="Arial" w:hAnsi="Arial"/>
+          <w:sz w:val="22"/>
+        </w:rPr>
+      </w:r>
+      <w:r>
+        <w:rPr>
+          <w:rFonts w:ascii="Arial" w:hAnsi="Arial"/>
+          <w:b/>
+          <w:sz w:val="22"/>
+        </w:rPr>
+        <w:t>`45954f4`</w:t>
+      </w:r>
+      <w:r>
+        <w:rPr>
+          <w:rFonts w:ascii="Arial" w:hAnsi="Arial"/>
+          <w:sz w:val="22"/>
+        </w:rPr>
+        <w:t xml:space="preserve"> - *kennhope13*: `build(cleanup): remove obsolete build-thin-client.bat and thin-client-ui directory`</w:t>
+      </w:r>
+    </w:p>
+    <w:p>
+      <w:pPr>
+        <w:pStyle w:val="ListBullet"/>
+        <w:spacing w:before="40" w:after="40" w:line="276" w:lineRule="auto"/>
+        <w:ind w:left="360"/>
+      </w:pPr>
+      <w:r>
+        <w:rPr>
+          <w:rFonts w:ascii="Arial" w:hAnsi="Arial"/>
+          <w:sz w:val="22"/>
+        </w:rPr>
+      </w:r>
+      <w:r>
+        <w:rPr>
+          <w:rFonts w:ascii="Arial" w:hAnsi="Arial"/>
+          <w:b/>
+          <w:sz w:val="22"/>
+        </w:rPr>
+        <w:t>`aba972d`</w:t>
+      </w:r>
+      <w:r>
+        <w:rPr>
+          <w:rFonts w:ascii="Arial" w:hAnsi="Arial"/>
+          <w:sz w:val="22"/>
+        </w:rPr>
+        <w:t xml:space="preserve"> - *kennhope13*: `build(win): bump version to 3.0.15, hide cmd windows, optimize installer size, and fix compiler errors`</w:t>
+      </w:r>
+    </w:p>
+    <w:p>
+      <w:pPr>
+        <w:pStyle w:val="ListBullet"/>
+        <w:spacing w:before="40" w:after="40" w:line="276" w:lineRule="auto"/>
+        <w:ind w:left="360"/>
+      </w:pPr>
+      <w:r>
+        <w:rPr>
+          <w:rFonts w:ascii="Arial" w:hAnsi="Arial"/>
+          <w:sz w:val="22"/>
+        </w:rPr>
+      </w:r>
+      <w:r>
+        <w:rPr>
+          <w:rFonts w:ascii="Arial" w:hAnsi="Arial"/>
+          <w:b/>
+          <w:sz w:val="22"/>
+        </w:rPr>
+        <w:t>`ca5723e`</w:t>
+      </w:r>
+      <w:r>
+        <w:rPr>
+          <w:rFonts w:ascii="Arial" w:hAnsi="Arial"/>
+          <w:sz w:val="22"/>
+        </w:rPr>
+        <w:t xml:space="preserve"> - *kennhope13*: `fix(frontend): resolve TS2532 compilation error in GeneralTab`</w:t>
+      </w:r>
+    </w:p>
+    <w:p>
+      <w:pPr>
+        <w:pStyle w:val="ListBullet"/>
+        <w:spacing w:before="40" w:after="40" w:line="276" w:lineRule="auto"/>
+        <w:ind w:left="360"/>
+      </w:pPr>
+      <w:r>
+        <w:rPr>
+          <w:rFonts w:ascii="Arial" w:hAnsi="Arial"/>
+          <w:sz w:val="22"/>
+        </w:rPr>
+      </w:r>
+      <w:r>
+        <w:rPr>
+          <w:rFonts w:ascii="Arial" w:hAnsi="Arial"/>
+          <w:b/>
+          <w:sz w:val="22"/>
+        </w:rPr>
+        <w:t>`c2f19a1`</w:t>
+      </w:r>
+      <w:r>
+        <w:rPr>
+          <w:rFonts w:ascii="Arial" w:hAnsi="Arial"/>
+          <w:sz w:val="22"/>
+        </w:rPr>
+        <w:t xml:space="preserve"> - *kennhope13*: `build(electron): remove debug UI logs and hide CMD windows for production release`</w:t>
+      </w:r>
+    </w:p>
+    <w:p>
+      <w:pPr>
+        <w:pStyle w:val="ListBullet"/>
+        <w:spacing w:before="40" w:after="40" w:line="276" w:lineRule="auto"/>
+        <w:ind w:left="360"/>
+      </w:pPr>
+      <w:r>
+        <w:rPr>
+          <w:rFonts w:ascii="Arial" w:hAnsi="Arial"/>
+          <w:sz w:val="22"/>
+        </w:rPr>
+      </w:r>
+      <w:r>
+        <w:rPr>
+          <w:rFonts w:ascii="Arial" w:hAnsi="Arial"/>
+          <w:b/>
+          <w:sz w:val="22"/>
+        </w:rPr>
+        <w:t>`85e0647`</w:t>
+      </w:r>
+      <w:r>
+        <w:rPr>
+          <w:rFonts w:ascii="Arial" w:hAnsi="Arial"/>
+          <w:sz w:val="22"/>
+        </w:rPr>
+        <w:t xml:space="preserve"> - *kennhope13*: `style(login): update nomenclature from server to station for standalone mode`</w:t>
+      </w:r>
+    </w:p>
+    <w:p>
+      <w:pPr>
+        <w:pStyle w:val="ListBullet"/>
+        <w:spacing w:before="40" w:after="40" w:line="276" w:lineRule="auto"/>
+        <w:ind w:left="360"/>
+      </w:pPr>
+      <w:r>
+        <w:rPr>
+          <w:rFonts w:ascii="Arial" w:hAnsi="Arial"/>
+          <w:sz w:val="22"/>
+        </w:rPr>
+      </w:r>
+      <w:r>
+        <w:rPr>
+          <w:rFonts w:ascii="Arial" w:hAnsi="Arial"/>
+          <w:b/>
+          <w:sz w:val="22"/>
+        </w:rPr>
+        <w:t>`515ac06`</w:t>
+      </w:r>
+      <w:r>
+        <w:rPr>
+          <w:rFonts w:ascii="Arial" w:hAnsi="Arial"/>
+          <w:sz w:val="22"/>
+        </w:rPr>
+        <w:t xml:space="preserve"> - *kennhope13*: `feat(frontend): allow renaming station from General Settings tab`</w:t>
+      </w:r>
+    </w:p>
+    <w:p>
+      <w:pPr>
+        <w:pStyle w:val="ListBullet"/>
+        <w:spacing w:before="40" w:after="40" w:line="276" w:lineRule="auto"/>
+        <w:ind w:left="360"/>
+      </w:pPr>
+      <w:r>
+        <w:rPr>
+          <w:rFonts w:ascii="Arial" w:hAnsi="Arial"/>
+          <w:sz w:val="22"/>
+        </w:rPr>
+      </w:r>
+      <w:r>
+        <w:rPr>
+          <w:rFonts w:ascii="Arial" w:hAnsi="Arial"/>
+          <w:b/>
+          <w:sz w:val="22"/>
+        </w:rPr>
+        <w:t>`80f105d`</w:t>
+      </w:r>
+      <w:r>
+        <w:rPr>
+          <w:rFonts w:ascii="Arial" w:hAnsi="Arial"/>
+          <w:sz w:val="22"/>
+        </w:rPr>
+        <w:t xml:space="preserve"> - *kennhope13*: `fix(backend): remove hardcoded Long An station and devices from default seed data`</w:t>
+      </w:r>
+    </w:p>
+    <w:p>
+      <w:pPr>
+        <w:pStyle w:val="ListBullet"/>
+        <w:spacing w:before="40" w:after="40" w:line="276" w:lineRule="auto"/>
+        <w:ind w:left="360"/>
+      </w:pPr>
+      <w:r>
+        <w:rPr>
+          <w:rFonts w:ascii="Arial" w:hAnsi="Arial"/>
+          <w:sz w:val="22"/>
+        </w:rPr>
+      </w:r>
+      <w:r>
+        <w:rPr>
+          <w:rFonts w:ascii="Arial" w:hAnsi="Arial"/>
+          <w:b/>
+          <w:sz w:val="22"/>
+        </w:rPr>
+        <w:t>`474c5d3`</w:t>
+      </w:r>
+      <w:r>
+        <w:rPr>
+          <w:rFonts w:ascii="Arial" w:hAnsi="Arial"/>
+          <w:sz w:val="22"/>
+        </w:rPr>
+        <w:t xml:space="preserve"> - *kennhope13*: `fix(backend): generate missing migration for Permissions column in User entity`</w:t>
+      </w:r>
+    </w:p>
+    <w:p>
+      <w:pPr>
+        <w:pStyle w:val="ListBullet"/>
+        <w:spacing w:before="40" w:after="40" w:line="276" w:lineRule="auto"/>
+        <w:ind w:left="360"/>
+      </w:pPr>
+      <w:r>
+        <w:rPr>
+          <w:rFonts w:ascii="Arial" w:hAnsi="Arial"/>
+          <w:sz w:val="22"/>
+        </w:rPr>
+      </w:r>
+      <w:r>
+        <w:rPr>
+          <w:rFonts w:ascii="Arial" w:hAnsi="Arial"/>
+          <w:b/>
+          <w:sz w:val="22"/>
+        </w:rPr>
+        <w:t>`9079e34`</w:t>
+      </w:r>
+      <w:r>
+        <w:rPr>
+          <w:rFonts w:ascii="Arial" w:hAnsi="Arial"/>
+          <w:sz w:val="22"/>
+        </w:rPr>
+        <w:t xml:space="preserve"> - *kennhope13*: `fix(electron): force initdb to use UTF8 encoding to prevent WIN1252 character errors during DB seeding`</w:t>
+      </w:r>
+    </w:p>
+    <w:p>
+      <w:pPr>
+        <w:pStyle w:val="ListBullet"/>
+        <w:spacing w:before="40" w:after="40" w:line="276" w:lineRule="auto"/>
+        <w:ind w:left="360"/>
+      </w:pPr>
+      <w:r>
+        <w:rPr>
+          <w:rFonts w:ascii="Arial" w:hAnsi="Arial"/>
+          <w:sz w:val="22"/>
+        </w:rPr>
+      </w:r>
+      <w:r>
+        <w:rPr>
+          <w:rFonts w:ascii="Arial" w:hAnsi="Arial"/>
+          <w:b/>
+          <w:sz w:val="22"/>
+        </w:rPr>
+        <w:t>`cf7b975`</w:t>
+      </w:r>
+      <w:r>
+        <w:rPr>
+          <w:rFonts w:ascii="Arial" w:hAnsi="Arial"/>
+          <w:sz w:val="22"/>
+        </w:rPr>
+        <w:t xml:space="preserve"> - *kennhope13*: `fix(backend): initialize database before Hangfire dashboard to prevent database not exist error`</w:t>
+      </w:r>
+    </w:p>
+    <w:p>
+      <w:pPr>
+        <w:pStyle w:val="ListBullet"/>
+        <w:spacing w:before="40" w:after="40" w:line="276" w:lineRule="auto"/>
+        <w:ind w:left="360"/>
+      </w:pPr>
+      <w:r>
+        <w:rPr>
+          <w:rFonts w:ascii="Arial" w:hAnsi="Arial"/>
+          <w:sz w:val="22"/>
+        </w:rPr>
+      </w:r>
+      <w:r>
+        <w:rPr>
+          <w:rFonts w:ascii="Arial" w:hAnsi="Arial"/>
+          <w:b/>
+          <w:sz w:val="22"/>
+        </w:rPr>
+        <w:t>`5009cd0`</w:t>
+      </w:r>
+      <w:r>
+        <w:rPr>
+          <w:rFonts w:ascii="Arial" w:hAnsi="Arial"/>
+          <w:sz w:val="22"/>
+        </w:rPr>
+        <w:t xml:space="preserve"> - *kennhope13*: `feat(electron): show backend and frontend logs directly on the loading screen`</w:t>
+      </w:r>
+    </w:p>
+    <w:p>
+      <w:pPr>
+        <w:pStyle w:val="ListBullet"/>
+        <w:spacing w:before="40" w:after="40" w:line="276" w:lineRule="auto"/>
+        <w:ind w:left="360"/>
+      </w:pPr>
+      <w:r>
+        <w:rPr>
+          <w:rFonts w:ascii="Arial" w:hAnsi="Arial"/>
+          <w:sz w:val="22"/>
+        </w:rPr>
+      </w:r>
+      <w:r>
+        <w:rPr>
+          <w:rFonts w:ascii="Arial" w:hAnsi="Arial"/>
+          <w:b/>
+          <w:sz w:val="22"/>
+        </w:rPr>
+        <w:t>`b3681ae`</w:t>
+      </w:r>
+      <w:r>
+        <w:rPr>
+          <w:rFonts w:ascii="Arial" w:hAnsi="Arial"/>
+          <w:sz w:val="22"/>
+        </w:rPr>
+        <w:t xml:space="preserve"> - *kennhope13*: `fix(electron): force .NET backend to listen on port 5000 instead of default 8080`</w:t>
+      </w:r>
+    </w:p>
+    <w:p>
+      <w:pPr>
+        <w:pStyle w:val="ListBullet"/>
+        <w:spacing w:before="40" w:after="40" w:line="276" w:lineRule="auto"/>
+        <w:ind w:left="360"/>
+      </w:pPr>
+      <w:r>
+        <w:rPr>
+          <w:rFonts w:ascii="Arial" w:hAnsi="Arial"/>
+          <w:sz w:val="22"/>
+        </w:rPr>
+      </w:r>
+      <w:r>
+        <w:rPr>
+          <w:rFonts w:ascii="Arial" w:hAnsi="Arial"/>
+          <w:b/>
+          <w:sz w:val="22"/>
+        </w:rPr>
+        <w:t>`848d327`</w:t>
+      </w:r>
+      <w:r>
+        <w:rPr>
+          <w:rFonts w:ascii="Arial" w:hAnsi="Arial"/>
+          <w:sz w:val="22"/>
+        </w:rPr>
+        <w:t xml:space="preserve"> - *kennhope13*: `fix(backend): retry database migration on startup to wait for PostgreSQL`</w:t>
+      </w:r>
+    </w:p>
+    <w:p>
+      <w:pPr>
+        <w:pStyle w:val="ListBullet"/>
+        <w:spacing w:before="40" w:after="40" w:line="276" w:lineRule="auto"/>
+        <w:ind w:left="360"/>
+      </w:pPr>
+      <w:r>
+        <w:rPr>
+          <w:rFonts w:ascii="Arial" w:hAnsi="Arial"/>
+          <w:sz w:val="22"/>
+        </w:rPr>
+      </w:r>
+      <w:r>
+        <w:rPr>
+          <w:rFonts w:ascii="Arial" w:hAnsi="Arial"/>
+          <w:b/>
+          <w:sz w:val="22"/>
+        </w:rPr>
+        <w:t>`718bd28`</w:t>
+      </w:r>
+      <w:r>
+        <w:rPr>
+          <w:rFonts w:ascii="Arial" w:hAnsi="Arial"/>
+          <w:sz w:val="22"/>
+        </w:rPr>
+        <w:t xml:space="preserve"> - *kennhope13*: `fix(electron): move postgres data dir to userData to avoid permission error on Windows`</w:t>
+      </w:r>
+    </w:p>
+    <w:p>
+      <w:pPr>
+        <w:pStyle w:val="ListBullet"/>
+        <w:spacing w:before="40" w:after="40" w:line="276" w:lineRule="auto"/>
+        <w:ind w:left="360"/>
+      </w:pPr>
+      <w:r>
+        <w:rPr>
+          <w:rFonts w:ascii="Arial" w:hAnsi="Arial"/>
+          <w:sz w:val="22"/>
+        </w:rPr>
+      </w:r>
+      <w:r>
+        <w:rPr>
+          <w:rFonts w:ascii="Arial" w:hAnsi="Arial"/>
+          <w:b/>
+          <w:sz w:val="22"/>
+        </w:rPr>
+        <w:t>`7e82c9e`</w:t>
+      </w:r>
+      <w:r>
+        <w:rPr>
+          <w:rFonts w:ascii="Arial" w:hAnsi="Arial"/>
+          <w:sz w:val="22"/>
+        </w:rPr>
+        <w:t xml:space="preserve"> - *kennhope13*: `feat: convert windows app to thick client (master station) with bundled backend, pg_portable, go2rtc`</w:t>
+      </w:r>
+    </w:p>
+    <w:p>
+      <w:pPr>
+        <w:pStyle w:val="ListBullet"/>
+        <w:spacing w:before="40" w:after="40" w:line="276" w:lineRule="auto"/>
+        <w:ind w:left="360"/>
+      </w:pPr>
+      <w:r>
+        <w:rPr>
+          <w:rFonts w:ascii="Arial" w:hAnsi="Arial"/>
+          <w:sz w:val="22"/>
+        </w:rPr>
+      </w:r>
+      <w:r>
+        <w:rPr>
+          <w:rFonts w:ascii="Arial" w:hAnsi="Arial"/>
+          <w:b/>
+          <w:sz w:val="22"/>
+        </w:rPr>
+        <w:t>`f7638cd`</w:t>
+      </w:r>
+      <w:r>
+        <w:rPr>
+          <w:rFonts w:ascii="Arial" w:hAnsi="Arial"/>
+          <w:sz w:val="22"/>
+        </w:rPr>
+        <w:t xml:space="preserve"> - *kennhope13*: `fix: use correct logo.svg for windows shortcut icon`</w:t>
+      </w:r>
+    </w:p>
+    <w:p>
+      <w:pPr>
+        <w:pStyle w:val="ListBullet"/>
+        <w:spacing w:before="40" w:after="40" w:line="276" w:lineRule="auto"/>
+        <w:ind w:left="360"/>
+      </w:pPr>
+      <w:r>
+        <w:rPr>
+          <w:rFonts w:ascii="Arial" w:hAnsi="Arial"/>
+          <w:sz w:val="22"/>
+        </w:rPr>
+      </w:r>
+      <w:r>
+        <w:rPr>
+          <w:rFonts w:ascii="Arial" w:hAnsi="Arial"/>
+          <w:b/>
+          <w:sz w:val="22"/>
+        </w:rPr>
+        <w:t>`16dd331`</w:t>
+      </w:r>
+      <w:r>
+        <w:rPr>
+          <w:rFonts w:ascii="Arial" w:hAnsi="Arial"/>
+          <w:sz w:val="22"/>
+        </w:rPr>
+        <w:t xml:space="preserve"> - *kennhope13*: `fix: use high-res 512x512 png icon to let electron-builder auto convert`</w:t>
+      </w:r>
+    </w:p>
+    <w:p>
+      <w:pPr>
+        <w:pStyle w:val="ListBullet"/>
+        <w:spacing w:before="40" w:after="40" w:line="276" w:lineRule="auto"/>
+        <w:ind w:left="360"/>
+      </w:pPr>
+      <w:r>
+        <w:rPr>
+          <w:rFonts w:ascii="Arial" w:hAnsi="Arial"/>
+          <w:sz w:val="22"/>
+        </w:rPr>
+      </w:r>
+      <w:r>
+        <w:rPr>
+          <w:rFonts w:ascii="Arial" w:hAnsi="Arial"/>
+          <w:b/>
+          <w:sz w:val="22"/>
+        </w:rPr>
+        <w:t>`062bbe7`</w:t>
+      </w:r>
+      <w:r>
+        <w:rPr>
+          <w:rFonts w:ascii="Arial" w:hAnsi="Arial"/>
+          <w:sz w:val="22"/>
+        </w:rPr>
+        <w:t xml:space="preserve"> - *kennhope13*: `fix: update windows icon to .ico format`</w:t>
+      </w:r>
+    </w:p>
+    <w:p>
+      <w:pPr>
+        <w:pStyle w:val="ListBullet"/>
+        <w:spacing w:before="40" w:after="40" w:line="276" w:lineRule="auto"/>
+        <w:ind w:left="360"/>
+      </w:pPr>
+      <w:r>
+        <w:rPr>
+          <w:rFonts w:ascii="Arial" w:hAnsi="Arial"/>
+          <w:sz w:val="22"/>
+        </w:rPr>
+      </w:r>
+      <w:r>
+        <w:rPr>
+          <w:rFonts w:ascii="Arial" w:hAnsi="Arial"/>
+          <w:b/>
+          <w:sz w:val="22"/>
+        </w:rPr>
+        <w:t>`4df82c0`</w:t>
+      </w:r>
+      <w:r>
+        <w:rPr>
+          <w:rFonts w:ascii="Arial" w:hAnsi="Arial"/>
+          <w:sz w:val="22"/>
+        </w:rPr>
+        <w:t xml:space="preserve"> - *kennhope13*: `fix: make windows desktop app run properly as a thin client`</w:t>
+      </w:r>
+    </w:p>
+    <w:p>
+      <w:pPr>
+        <w:pStyle w:val="ListBullet"/>
+        <w:spacing w:before="40" w:after="40" w:line="276" w:lineRule="auto"/>
+        <w:ind w:left="360"/>
+      </w:pPr>
+      <w:r>
+        <w:rPr>
+          <w:rFonts w:ascii="Arial" w:hAnsi="Arial"/>
+          <w:sz w:val="22"/>
+        </w:rPr>
+      </w:r>
+      <w:r>
+        <w:rPr>
+          <w:rFonts w:ascii="Arial" w:hAnsi="Arial"/>
+          <w:b/>
+          <w:sz w:val="22"/>
+        </w:rPr>
+        <w:t>`25f2167`</w:t>
+      </w:r>
+      <w:r>
+        <w:rPr>
+          <w:rFonts w:ascii="Arial" w:hAnsi="Arial"/>
+          <w:sz w:val="22"/>
+        </w:rPr>
+        <w:t xml:space="preserve"> - *kennhope13*: `fix: add write permission for gh release`</w:t>
+      </w:r>
+    </w:p>
+    <w:p>
+      <w:pPr>
+        <w:pStyle w:val="ListBullet"/>
+        <w:spacing w:before="40" w:after="40" w:line="276" w:lineRule="auto"/>
+        <w:ind w:left="360"/>
+      </w:pPr>
+      <w:r>
+        <w:rPr>
+          <w:rFonts w:ascii="Arial" w:hAnsi="Arial"/>
+          <w:sz w:val="22"/>
+        </w:rPr>
+      </w:r>
+      <w:r>
+        <w:rPr>
+          <w:rFonts w:ascii="Arial" w:hAnsi="Arial"/>
+          <w:b/>
+          <w:sz w:val="22"/>
+        </w:rPr>
+        <w:t>`8202435`</w:t>
+      </w:r>
+      <w:r>
+        <w:rPr>
+          <w:rFonts w:ascii="Arial" w:hAnsi="Arial"/>
+          <w:sz w:val="22"/>
+        </w:rPr>
+        <w:t xml:space="preserve"> - *kennhope13*: `fix: update github action to use electron builder`</w:t>
+      </w:r>
+    </w:p>
+    <w:p>
+      <w:pPr>
+        <w:pStyle w:val="ListBullet"/>
+        <w:spacing w:before="40" w:after="40" w:line="276" w:lineRule="auto"/>
+        <w:ind w:left="360"/>
+      </w:pPr>
+      <w:r>
+        <w:rPr>
+          <w:rFonts w:ascii="Arial" w:hAnsi="Arial"/>
+          <w:sz w:val="22"/>
+        </w:rPr>
+      </w:r>
+      <w:r>
+        <w:rPr>
+          <w:rFonts w:ascii="Arial" w:hAnsi="Arial"/>
+          <w:b/>
+          <w:sz w:val="22"/>
+        </w:rPr>
+        <w:t>`0b4338c`</w:t>
+      </w:r>
+      <w:r>
+        <w:rPr>
+          <w:rFonts w:ascii="Arial" w:hAnsi="Arial"/>
+          <w:sz w:val="22"/>
+        </w:rPr>
+        <w:t xml:space="preserve"> - *kennhope13*: `fix: resolve TS build errors and update desktop shortcut script`</w:t>
+      </w:r>
+    </w:p>
+    <w:p>
+      <w:pPr>
+        <w:pStyle w:val="ListBullet"/>
+        <w:spacing w:before="40" w:after="40" w:line="276" w:lineRule="auto"/>
+        <w:ind w:left="360"/>
+      </w:pPr>
+      <w:r>
+        <w:rPr>
+          <w:rFonts w:ascii="Arial" w:hAnsi="Arial"/>
+          <w:sz w:val="22"/>
+        </w:rPr>
+      </w:r>
+      <w:r>
+        <w:rPr>
+          <w:rFonts w:ascii="Arial" w:hAnsi="Arial"/>
+          <w:b/>
+          <w:sz w:val="22"/>
+        </w:rPr>
+        <w:t>`b0f4ea2`</w:t>
+      </w:r>
+      <w:r>
+        <w:rPr>
+          <w:rFonts w:ascii="Arial" w:hAnsi="Arial"/>
+          <w:sz w:val="22"/>
+        </w:rPr>
+        <w:t xml:space="preserve"> - *kennhope13*: `fix: plc integration and UI updates`</w:t>
+      </w:r>
+    </w:p>
+    <w:p>
+      <w:pPr>
+        <w:pStyle w:val="ListBullet"/>
+        <w:spacing w:before="40" w:after="40" w:line="276" w:lineRule="auto"/>
+        <w:ind w:left="360"/>
+      </w:pPr>
+      <w:r>
+        <w:rPr>
+          <w:rFonts w:ascii="Arial" w:hAnsi="Arial"/>
+          <w:sz w:val="22"/>
+        </w:rPr>
+      </w:r>
+      <w:r>
+        <w:rPr>
+          <w:rFonts w:ascii="Arial" w:hAnsi="Arial"/>
+          <w:b/>
+          <w:sz w:val="22"/>
+        </w:rPr>
+        <w:t>`b61e9a6`</w:t>
+      </w:r>
+      <w:r>
+        <w:rPr>
+          <w:rFonts w:ascii="Arial" w:hAnsi="Arial"/>
+          <w:sz w:val="22"/>
+        </w:rPr>
+        <w:t xml:space="preserve"> - *kennhope13*: `23:39 01-07-2026 thêm tủ mới plc`</w:t>
+      </w:r>
+    </w:p>
+    <w:p>
+      <w:pPr>
+        <w:pStyle w:val="ListBullet"/>
+        <w:spacing w:before="40" w:after="40" w:line="276" w:lineRule="auto"/>
+        <w:ind w:left="360"/>
+      </w:pPr>
+      <w:r>
+        <w:rPr>
+          <w:rFonts w:ascii="Arial" w:hAnsi="Arial"/>
+          <w:sz w:val="22"/>
+        </w:rPr>
+      </w:r>
+      <w:r>
+        <w:rPr>
+          <w:rFonts w:ascii="Arial" w:hAnsi="Arial"/>
+          <w:b/>
+          <w:sz w:val="22"/>
+        </w:rPr>
+        <w:t>`baadf49`</w:t>
+      </w:r>
+      <w:r>
+        <w:rPr>
+          <w:rFonts w:ascii="Arial" w:hAnsi="Arial"/>
+          <w:sz w:val="22"/>
+        </w:rPr>
+        <w:t xml:space="preserve"> - *kennhope13*: `Add desktop shortcut creation script (2026-06-30)`</w:t>
+      </w:r>
+    </w:p>
+    <w:p>
+      <w:pPr>
+        <w:pStyle w:val="ListBullet"/>
+        <w:spacing w:before="40" w:after="40" w:line="276" w:lineRule="auto"/>
+        <w:ind w:left="360"/>
+      </w:pPr>
+      <w:r>
+        <w:rPr>
+          <w:rFonts w:ascii="Arial" w:hAnsi="Arial"/>
+          <w:sz w:val="22"/>
+        </w:rPr>
+      </w:r>
+      <w:r>
+        <w:rPr>
+          <w:rFonts w:ascii="Arial" w:hAnsi="Arial"/>
+          <w:b/>
+          <w:sz w:val="22"/>
+        </w:rPr>
+        <w:t>`e911411`</w:t>
+      </w:r>
+      <w:r>
+        <w:rPr>
+          <w:rFonts w:ascii="Arial" w:hAnsi="Arial"/>
+          <w:sz w:val="22"/>
+        </w:rPr>
+        <w:t xml:space="preserve"> - *kennhope13*: `Fix desktop shortcut startup freeze and optimize health check orchestration`</w:t>
+      </w:r>
+    </w:p>
+    <w:p>
+      <w:pPr>
+        <w:pStyle w:val="ListBullet"/>
+        <w:spacing w:before="40" w:after="40" w:line="276" w:lineRule="auto"/>
+        <w:ind w:left="360"/>
+      </w:pPr>
+      <w:r>
+        <w:rPr>
+          <w:rFonts w:ascii="Arial" w:hAnsi="Arial"/>
+          <w:sz w:val="22"/>
+        </w:rPr>
+      </w:r>
+      <w:r>
+        <w:rPr>
+          <w:rFonts w:ascii="Arial" w:hAnsi="Arial"/>
+          <w:b/>
+          <w:sz w:val="22"/>
+        </w:rPr>
+        <w:t>`23fcd89`</w:t>
+      </w:r>
+      <w:r>
+        <w:rPr>
+          <w:rFonts w:ascii="Arial" w:hAnsi="Arial"/>
+          <w:sz w:val="22"/>
+        </w:rPr>
+        <w:t xml:space="preserve"> - *kennhope13*: `Performance boost: compiled queries, 60‑s cache, pagination, compiled camera query`</w:t>
+      </w:r>
+    </w:p>
+    <w:p>
+      <w:pPr>
+        <w:pStyle w:val="ListBullet"/>
+        <w:spacing w:before="40" w:after="40" w:line="276" w:lineRule="auto"/>
+        <w:ind w:left="360"/>
+      </w:pPr>
+      <w:r>
+        <w:rPr>
+          <w:rFonts w:ascii="Arial" w:hAnsi="Arial"/>
+          <w:sz w:val="22"/>
+        </w:rPr>
+      </w:r>
+      <w:r>
+        <w:rPr>
+          <w:rFonts w:ascii="Arial" w:hAnsi="Arial"/>
+          <w:b/>
+          <w:sz w:val="22"/>
+        </w:rPr>
+        <w:t>`e86305a`</w:t>
+      </w:r>
+      <w:r>
+        <w:rPr>
+          <w:rFonts w:ascii="Arial" w:hAnsi="Arial"/>
+          <w:sz w:val="22"/>
+        </w:rPr>
+        <w:t xml:space="preserve"> - *kennhope13*: `Fix station ID and province mismatch, clean up mock stations, and support dynamic local station seed`</w:t>
+      </w:r>
+    </w:p>
+    <w:p>
+      <w:pPr>
+        <w:pStyle w:val="ListBullet"/>
+        <w:spacing w:before="40" w:after="40" w:line="276" w:lineRule="auto"/>
+        <w:ind w:left="360"/>
+      </w:pPr>
+      <w:r>
+        <w:rPr>
+          <w:rFonts w:ascii="Arial" w:hAnsi="Arial"/>
+          <w:sz w:val="22"/>
+        </w:rPr>
+      </w:r>
+      <w:r>
+        <w:rPr>
+          <w:rFonts w:ascii="Arial" w:hAnsi="Arial"/>
+          <w:b/>
+          <w:sz w:val="22"/>
+        </w:rPr>
+        <w:t>`54b888b`</w:t>
+      </w:r>
+      <w:r>
+        <w:rPr>
+          <w:rFonts w:ascii="Arial" w:hAnsi="Arial"/>
+          <w:sz w:val="22"/>
+        </w:rPr>
+        <w:t xml:space="preserve"> - *kennhope13*: `feat: lock maintenance task creation on sub-stations and configure hierarchical rbac`</w:t>
+      </w:r>
+    </w:p>
+    <w:p>
+      <w:pPr>
+        <w:pStyle w:val="ListBullet"/>
+        <w:spacing w:before="40" w:after="40" w:line="276" w:lineRule="auto"/>
+        <w:ind w:left="360"/>
+      </w:pPr>
+      <w:r>
+        <w:rPr>
+          <w:rFonts w:ascii="Arial" w:hAnsi="Arial"/>
+          <w:sz w:val="22"/>
+        </w:rPr>
+      </w:r>
+      <w:r>
+        <w:rPr>
+          <w:rFonts w:ascii="Arial" w:hAnsi="Arial"/>
+          <w:b/>
+          <w:sz w:val="22"/>
+        </w:rPr>
+        <w:t>`6e0c7b8`</w:t>
+      </w:r>
+      <w:r>
+        <w:rPr>
+          <w:rFonts w:ascii="Arial" w:hAnsi="Arial"/>
+          <w:sz w:val="22"/>
+        </w:rPr>
+        <w:t xml:space="preserve"> - *kennhope13*: `feat: remove login session and concurrent limits for substation deployment`</w:t>
+      </w:r>
+    </w:p>
+    <w:p>
+      <w:pPr>
+        <w:pStyle w:val="ListBullet"/>
+        <w:spacing w:before="40" w:after="40" w:line="276" w:lineRule="auto"/>
+        <w:ind w:left="360"/>
+      </w:pPr>
+      <w:r>
+        <w:rPr>
+          <w:rFonts w:ascii="Arial" w:hAnsi="Arial"/>
+          <w:sz w:val="22"/>
+        </w:rPr>
+      </w:r>
+      <w:r>
+        <w:rPr>
+          <w:rFonts w:ascii="Arial" w:hAnsi="Arial"/>
+          <w:b/>
+          <w:sz w:val="22"/>
+        </w:rPr>
+        <w:t>`394fdc4`</w:t>
+      </w:r>
+      <w:r>
+        <w:rPr>
+          <w:rFonts w:ascii="Arial" w:hAnsi="Arial"/>
+          <w:sz w:val="22"/>
+        </w:rPr>
+        <w:t xml:space="preserve"> - *kennhope13*: `feat: change password, migrate admin credentials, and update app icon with transparent rounded rectangle`</w:t>
+      </w:r>
+    </w:p>
+    <w:p>
+      <w:pPr>
+        <w:pStyle w:val="ListBullet"/>
+        <w:spacing w:before="40" w:after="40" w:line="276" w:lineRule="auto"/>
+        <w:ind w:left="360"/>
+      </w:pPr>
+      <w:r>
+        <w:rPr>
+          <w:rFonts w:ascii="Arial" w:hAnsi="Arial"/>
+          <w:sz w:val="22"/>
+        </w:rPr>
+      </w:r>
+      <w:r>
+        <w:rPr>
+          <w:rFonts w:ascii="Arial" w:hAnsi="Arial"/>
+          <w:b/>
+          <w:sz w:val="22"/>
+        </w:rPr>
+        <w:t>`75b2d83`</w:t>
+      </w:r>
+      <w:r>
+        <w:rPr>
+          <w:rFonts w:ascii="Arial" w:hAnsi="Arial"/>
+          <w:sz w:val="22"/>
+        </w:rPr>
+        <w:t xml:space="preserve"> - *kennhope13*: `feat: cập nhật User entity hỗ trợ Permissions + license fix - 17/06/2026`</w:t>
+      </w:r>
+    </w:p>
+    <w:p>
+      <w:pPr>
+        <w:pStyle w:val="ListBullet"/>
+        <w:spacing w:before="40" w:after="40" w:line="276" w:lineRule="auto"/>
+        <w:ind w:left="360"/>
+      </w:pPr>
+      <w:r>
+        <w:rPr>
+          <w:rFonts w:ascii="Arial" w:hAnsi="Arial"/>
+          <w:sz w:val="22"/>
+        </w:rPr>
+      </w:r>
+      <w:r>
+        <w:rPr>
+          <w:rFonts w:ascii="Arial" w:hAnsi="Arial"/>
+          <w:b/>
+          <w:sz w:val="22"/>
+        </w:rPr>
+        <w:t>`f44378d`</w:t>
+      </w:r>
+      <w:r>
+        <w:rPr>
+          <w:rFonts w:ascii="Arial" w:hAnsi="Arial"/>
+          <w:sz w:val="22"/>
+        </w:rPr>
+        <w:t xml:space="preserve"> - *kennhope13*: `feat: bypass concurrent session limit for master station (multi) and admins`</w:t>
+      </w:r>
+    </w:p>
+    <w:p>
+      <w:pPr>
+        <w:pStyle w:val="ListBullet"/>
+        <w:spacing w:before="40" w:after="40" w:line="276" w:lineRule="auto"/>
+        <w:ind w:left="360"/>
+      </w:pPr>
+      <w:r>
+        <w:rPr>
+          <w:rFonts w:ascii="Arial" w:hAnsi="Arial"/>
+          <w:sz w:val="22"/>
+        </w:rPr>
+      </w:r>
+      <w:r>
+        <w:rPr>
+          <w:rFonts w:ascii="Arial" w:hAnsi="Arial"/>
+          <w:b/>
+          <w:sz w:val="22"/>
+        </w:rPr>
+        <w:t>`a954893`</w:t>
+      </w:r>
+      <w:r>
+        <w:rPr>
+          <w:rFonts w:ascii="Arial" w:hAnsi="Arial"/>
+          <w:sz w:val="22"/>
+        </w:rPr>
+        <w:t xml:space="preserve"> - *kennhope13*: `style: replace desktop application icon with green lightning bolt logo`</w:t>
+      </w:r>
+    </w:p>
+    <w:p>
+      <w:pPr>
+        <w:pStyle w:val="ListBullet"/>
+        <w:spacing w:before="40" w:after="40" w:line="276" w:lineRule="auto"/>
+        <w:ind w:left="360"/>
+      </w:pPr>
+      <w:r>
+        <w:rPr>
+          <w:rFonts w:ascii="Arial" w:hAnsi="Arial"/>
+          <w:sz w:val="22"/>
+        </w:rPr>
+      </w:r>
+      <w:r>
+        <w:rPr>
+          <w:rFonts w:ascii="Arial" w:hAnsi="Arial"/>
+          <w:b/>
+          <w:sz w:val="22"/>
+        </w:rPr>
+        <w:t>`d65673a`</w:t>
+      </w:r>
+      <w:r>
+        <w:rPr>
+          <w:rFonts w:ascii="Arial" w:hAnsi="Arial"/>
+          <w:sz w:val="22"/>
+        </w:rPr>
+        <w:t xml:space="preserve"> - *kennhope13*: `feat: release license session in real-time when SignalR connection drops`</w:t>
+      </w:r>
+    </w:p>
+    <w:p>
+      <w:pPr>
+        <w:pStyle w:val="ListBullet"/>
+        <w:spacing w:before="40" w:after="40" w:line="276" w:lineRule="auto"/>
+        <w:ind w:left="360"/>
+      </w:pPr>
+      <w:r>
+        <w:rPr>
+          <w:rFonts w:ascii="Arial" w:hAnsi="Arial"/>
+          <w:sz w:val="22"/>
+        </w:rPr>
+      </w:r>
+      <w:r>
+        <w:rPr>
+          <w:rFonts w:ascii="Arial" w:hAnsi="Arial"/>
+          <w:b/>
+          <w:sz w:val="22"/>
+        </w:rPr>
+        <w:t>`7d56342`</w:t>
+      </w:r>
+      <w:r>
+        <w:rPr>
+          <w:rFonts w:ascii="Arial" w:hAnsi="Arial"/>
+          <w:sz w:val="22"/>
+        </w:rPr>
+        <w:t xml:space="preserve"> - *kennhope13*: `feat: call backend logout API to release session and clear refresh token`</w:t>
+      </w:r>
+    </w:p>
+    <w:p>
+      <w:pPr>
+        <w:pStyle w:val="ListBullet"/>
+        <w:spacing w:before="40" w:after="40" w:line="276" w:lineRule="auto"/>
+        <w:ind w:left="360"/>
+      </w:pPr>
+      <w:r>
+        <w:rPr>
+          <w:rFonts w:ascii="Arial" w:hAnsi="Arial"/>
+          <w:sz w:val="22"/>
+        </w:rPr>
+      </w:r>
+      <w:r>
+        <w:rPr>
+          <w:rFonts w:ascii="Arial" w:hAnsi="Arial"/>
+          <w:b/>
+          <w:sz w:val="22"/>
+        </w:rPr>
+        <w:t>`c96d0d6`</w:t>
+      </w:r>
+      <w:r>
+        <w:rPr>
+          <w:rFonts w:ascii="Arial" w:hAnsi="Arial"/>
+          <w:sz w:val="22"/>
+        </w:rPr>
+        <w:t xml:space="preserve"> - *kennhope13*: `feat: implement concurrent session limit blocking and license upgrade warning`</w:t>
+      </w:r>
+    </w:p>
+    <w:p>
+      <w:pPr>
+        <w:pStyle w:val="ListBullet"/>
+        <w:spacing w:before="40" w:after="40" w:line="276" w:lineRule="auto"/>
+        <w:ind w:left="360"/>
+      </w:pPr>
+      <w:r>
+        <w:rPr>
+          <w:rFonts w:ascii="Arial" w:hAnsi="Arial"/>
+          <w:sz w:val="22"/>
+        </w:rPr>
+      </w:r>
+      <w:r>
+        <w:rPr>
+          <w:rFonts w:ascii="Arial" w:hAnsi="Arial"/>
+          <w:b/>
+          <w:sz w:val="22"/>
+        </w:rPr>
+        <w:t>`057f3f5`</w:t>
+      </w:r>
+      <w:r>
+        <w:rPr>
+          <w:rFonts w:ascii="Arial" w:hAnsi="Arial"/>
+          <w:sz w:val="22"/>
+        </w:rPr>
+        <w:t xml:space="preserve"> - *kennhope13*: `feat: Giftcode license - custom users, 5/10 parts validation, and electron wrapper - 16/06/2026`</w:t>
+      </w:r>
+    </w:p>
+    <w:p>
+      <w:pPr>
+        <w:pStyle w:val="ListBullet"/>
+        <w:spacing w:before="40" w:after="40" w:line="276" w:lineRule="auto"/>
+        <w:ind w:left="360"/>
+      </w:pPr>
+      <w:r>
+        <w:rPr>
+          <w:rFonts w:ascii="Arial" w:hAnsi="Arial"/>
+          <w:sz w:val="22"/>
+        </w:rPr>
+      </w:r>
+      <w:r>
+        <w:rPr>
+          <w:rFonts w:ascii="Arial" w:hAnsi="Arial"/>
+          <w:b/>
+          <w:sz w:val="22"/>
+        </w:rPr>
+        <w:t>`3715336`</w:t>
+      </w:r>
+      <w:r>
+        <w:rPr>
+          <w:rFonts w:ascii="Arial" w:hAnsi="Arial"/>
+          <w:sz w:val="22"/>
+        </w:rPr>
+        <w:t xml:space="preserve"> - *kennhope13*: `feat: Giftcode license integration and UI refinements with custom key support`</w:t>
+      </w:r>
+    </w:p>
+    <w:p>
+      <w:pPr>
+        <w:pStyle w:val="ListBullet"/>
+        <w:spacing w:before="40" w:after="40" w:line="276" w:lineRule="auto"/>
+        <w:ind w:left="360"/>
+      </w:pPr>
+      <w:r>
+        <w:rPr>
+          <w:rFonts w:ascii="Arial" w:hAnsi="Arial"/>
+          <w:sz w:val="22"/>
+        </w:rPr>
+      </w:r>
+      <w:r>
+        <w:rPr>
+          <w:rFonts w:ascii="Arial" w:hAnsi="Arial"/>
+          <w:b/>
+          <w:sz w:val="22"/>
+        </w:rPr>
+        <w:t>`d567572`</w:t>
+      </w:r>
+      <w:r>
+        <w:rPr>
+          <w:rFonts w:ascii="Arial" w:hAnsi="Arial"/>
+          <w:sz w:val="22"/>
+        </w:rPr>
+        <w:t xml:space="preserve"> - *kennhope13*: `change-go2rtc`</w:t>
+      </w:r>
+    </w:p>
+    <w:p>
+      <w:pPr>
+        <w:pStyle w:val="ListBullet"/>
+        <w:spacing w:before="40" w:after="40" w:line="276" w:lineRule="auto"/>
+        <w:ind w:left="360"/>
+      </w:pPr>
+      <w:r>
+        <w:rPr>
+          <w:rFonts w:ascii="Arial" w:hAnsi="Arial"/>
+          <w:sz w:val="22"/>
+        </w:rPr>
+      </w:r>
+      <w:r>
+        <w:rPr>
+          <w:rFonts w:ascii="Arial" w:hAnsi="Arial"/>
+          <w:b/>
+          <w:sz w:val="22"/>
+        </w:rPr>
+        <w:t>`5408cb8`</w:t>
+      </w:r>
+      <w:r>
+        <w:rPr>
+          <w:rFonts w:ascii="Arial" w:hAnsi="Arial"/>
+          <w:sz w:val="22"/>
+        </w:rPr>
+        <w:t xml:space="preserve"> - *kennhope13*: `fix: change server IP binding to 0.0.0.0 for LAN access and update configs`</w:t>
+      </w:r>
+    </w:p>
+    <w:p>
+      <w:pPr>
+        <w:pStyle w:val="ListBullet"/>
+        <w:spacing w:before="40" w:after="40" w:line="276" w:lineRule="auto"/>
+        <w:ind w:left="360"/>
+      </w:pPr>
+      <w:r>
+        <w:rPr>
+          <w:rFonts w:ascii="Arial" w:hAnsi="Arial"/>
+          <w:sz w:val="22"/>
+        </w:rPr>
+      </w:r>
+      <w:r>
+        <w:rPr>
+          <w:rFonts w:ascii="Arial" w:hAnsi="Arial"/>
+          <w:b/>
+          <w:sz w:val="22"/>
+        </w:rPr>
+        <w:t>`c97580f`</w:t>
+      </w:r>
+      <w:r>
+        <w:rPr>
+          <w:rFonts w:ascii="Arial" w:hAnsi="Arial"/>
+          <w:sz w:val="22"/>
+        </w:rPr>
+        <w:t xml:space="preserve"> - *kennhope13*: `feat: include static ffmpeg binaries for native H265 WebRTC transcoding support`</w:t>
+      </w:r>
+    </w:p>
+    <w:p>
+      <w:pPr>
+        <w:pStyle w:val="ListBullet"/>
+        <w:spacing w:before="40" w:after="40" w:line="276" w:lineRule="auto"/>
+        <w:ind w:left="360"/>
+      </w:pPr>
+      <w:r>
+        <w:rPr>
+          <w:rFonts w:ascii="Arial" w:hAnsi="Arial"/>
+          <w:sz w:val="22"/>
+        </w:rPr>
+      </w:r>
+      <w:r>
+        <w:rPr>
+          <w:rFonts w:ascii="Arial" w:hAnsi="Arial"/>
+          <w:b/>
+          <w:sz w:val="22"/>
+        </w:rPr>
+        <w:t>`dc17c79`</w:t>
+      </w:r>
+      <w:r>
+        <w:rPr>
+          <w:rFonts w:ascii="Arial" w:hAnsi="Arial"/>
+          <w:sz w:val="22"/>
+        </w:rPr>
+        <w:t xml:space="preserve"> - *kennhope13*: `feat: migrate go2rtc to native binary to support passwordless auto-start in electron`</w:t>
+      </w:r>
+    </w:p>
+    <w:p>
+      <w:pPr>
+        <w:pStyle w:val="ListBullet"/>
+        <w:spacing w:before="40" w:after="40" w:line="276" w:lineRule="auto"/>
+        <w:ind w:left="360"/>
+      </w:pPr>
+      <w:r>
+        <w:rPr>
+          <w:rFonts w:ascii="Arial" w:hAnsi="Arial"/>
+          <w:sz w:val="22"/>
+        </w:rPr>
+      </w:r>
+      <w:r>
+        <w:rPr>
+          <w:rFonts w:ascii="Arial" w:hAnsi="Arial"/>
+          <w:b/>
+          <w:sz w:val="22"/>
+        </w:rPr>
+        <w:t>`762b474`</w:t>
+      </w:r>
+      <w:r>
+        <w:rPr>
+          <w:rFonts w:ascii="Arial" w:hAnsi="Arial"/>
+          <w:sz w:val="22"/>
+        </w:rPr>
+        <w:t xml:space="preserve"> - *kennhope13*: `feat: implement manual alert forwarding to central, format measurement values, and fix electron startup race conditions`</w:t>
+      </w:r>
+    </w:p>
+    <w:p>
+      <w:pPr>
+        <w:pStyle w:val="ListBullet"/>
+        <w:spacing w:before="40" w:after="40" w:line="276" w:lineRule="auto"/>
+        <w:ind w:left="360"/>
+      </w:pPr>
+      <w:r>
+        <w:rPr>
+          <w:rFonts w:ascii="Arial" w:hAnsi="Arial"/>
+          <w:sz w:val="22"/>
+        </w:rPr>
+      </w:r>
+      <w:r>
+        <w:rPr>
+          <w:rFonts w:ascii="Arial" w:hAnsi="Arial"/>
+          <w:b/>
+          <w:sz w:val="22"/>
+        </w:rPr>
+        <w:t>`0b320f9`</w:t>
+      </w:r>
+      <w:r>
+        <w:rPr>
+          <w:rFonts w:ascii="Arial" w:hAnsi="Arial"/>
+          <w:sz w:val="22"/>
+        </w:rPr>
+        <w:t xml:space="preserve"> - *kennhope13*: `feat: pack electron app, local UI proxy server and alerts history UI refinements - thu bay 13/06/2026`</w:t>
+      </w:r>
+    </w:p>
+    <w:p>
+      <w:pPr>
+        <w:pStyle w:val="ListBullet"/>
+        <w:spacing w:before="40" w:after="40" w:line="276" w:lineRule="auto"/>
+        <w:ind w:left="360"/>
+      </w:pPr>
+      <w:r>
+        <w:rPr>
+          <w:rFonts w:ascii="Arial" w:hAnsi="Arial"/>
+          <w:sz w:val="22"/>
+        </w:rPr>
+      </w:r>
+      <w:r>
+        <w:rPr>
+          <w:rFonts w:ascii="Arial" w:hAnsi="Arial"/>
+          <w:b/>
+          <w:sz w:val="22"/>
+        </w:rPr>
+        <w:t>`4fa0aba`</w:t>
+      </w:r>
+      <w:r>
+        <w:rPr>
+          <w:rFonts w:ascii="Arial" w:hAnsi="Arial"/>
+          <w:sz w:val="22"/>
+        </w:rPr>
+        <w:t xml:space="preserve"> - *kennhope13*: `fix: audit log layout, hover, dropdown theme sync, admin fullname, Jetson H265 fix`</w:t>
+      </w:r>
+    </w:p>
+    <w:p>
+      <w:pPr>
+        <w:pStyle w:val="ListBullet"/>
+        <w:spacing w:before="40" w:after="40" w:line="276" w:lineRule="auto"/>
+        <w:ind w:left="360"/>
+      </w:pPr>
+      <w:r>
+        <w:rPr>
+          <w:rFonts w:ascii="Arial" w:hAnsi="Arial"/>
+          <w:sz w:val="22"/>
+        </w:rPr>
+      </w:r>
+      <w:r>
+        <w:rPr>
+          <w:rFonts w:ascii="Arial" w:hAnsi="Arial"/>
+          <w:b/>
+          <w:sz w:val="22"/>
+        </w:rPr>
+        <w:t>`399fd31`</w:t>
+      </w:r>
+      <w:r>
+        <w:rPr>
+          <w:rFonts w:ascii="Arial" w:hAnsi="Arial"/>
+          <w:sz w:val="22"/>
+        </w:rPr>
+        <w:t xml:space="preserve"> - *admin*: `feat: add Single Sign-On auto-login from URL token parameter in App.tsx`</w:t>
+      </w:r>
+    </w:p>
+    <w:p>
+      <w:pPr>
+        <w:pStyle w:val="ListBullet"/>
+        <w:spacing w:before="40" w:after="40" w:line="276" w:lineRule="auto"/>
+        <w:ind w:left="360"/>
+      </w:pPr>
+      <w:r>
+        <w:rPr>
+          <w:rFonts w:ascii="Arial" w:hAnsi="Arial"/>
+          <w:sz w:val="22"/>
+        </w:rPr>
+      </w:r>
+      <w:r>
+        <w:rPr>
+          <w:rFonts w:ascii="Arial" w:hAnsi="Arial"/>
+          <w:b/>
+          <w:sz w:val="22"/>
+        </w:rPr>
+        <w:t>`4cafc60`</w:t>
+      </w:r>
+      <w:r>
+        <w:rPr>
+          <w:rFonts w:ascii="Arial" w:hAnsi="Arial"/>
+          <w:sz w:val="22"/>
+        </w:rPr>
+        <w:t xml:space="preserve"> - *admin*: `fix: restore system history data visibility by defaulting to all time range and fixing all time range preset bug`</w:t>
+      </w:r>
+    </w:p>
+    <w:p>
+      <w:pPr>
+        <w:pStyle w:val="ListBullet"/>
+        <w:spacing w:before="40" w:after="40" w:line="276" w:lineRule="auto"/>
+        <w:ind w:left="360"/>
+      </w:pPr>
+      <w:r>
+        <w:rPr>
+          <w:rFonts w:ascii="Arial" w:hAnsi="Arial"/>
+          <w:sz w:val="22"/>
+        </w:rPr>
+      </w:r>
+      <w:r>
+        <w:rPr>
+          <w:rFonts w:ascii="Arial" w:hAnsi="Arial"/>
+          <w:b/>
+          <w:sz w:val="22"/>
+        </w:rPr>
+        <w:t>`92ae0a8`</w:t>
+      </w:r>
+      <w:r>
+        <w:rPr>
+          <w:rFonts w:ascii="Arial" w:hAnsi="Arial"/>
+          <w:sz w:val="22"/>
+        </w:rPr>
+        <w:t xml:space="preserve"> - *admin*: `feat: restore thermal analytics pipeline and configure dynamic startup`</w:t>
+      </w:r>
+    </w:p>
+    <w:p>
+      <w:pPr>
+        <w:pStyle w:val="ListBullet"/>
+        <w:spacing w:before="40" w:after="40" w:line="276" w:lineRule="auto"/>
+        <w:ind w:left="360"/>
+      </w:pPr>
+      <w:r>
+        <w:rPr>
+          <w:rFonts w:ascii="Arial" w:hAnsi="Arial"/>
+          <w:sz w:val="22"/>
+        </w:rPr>
+      </w:r>
+      <w:r>
+        <w:rPr>
+          <w:rFonts w:ascii="Arial" w:hAnsi="Arial"/>
+          <w:b/>
+          <w:sz w:val="22"/>
+        </w:rPr>
+        <w:t>`bc42c00`</w:t>
+      </w:r>
+      <w:r>
+        <w:rPr>
+          <w:rFonts w:ascii="Arial" w:hAnsi="Arial"/>
+          <w:sz w:val="22"/>
+        </w:rPr>
+        <w:t xml:space="preserve"> - *admin*: `fix: make Tauri commands async to prevent thread blocks on navigation`</w:t>
+      </w:r>
+    </w:p>
+    <w:p>
+      <w:pPr>
+        <w:pStyle w:val="ListBullet"/>
+        <w:spacing w:before="40" w:after="40" w:line="276" w:lineRule="auto"/>
+        <w:ind w:left="360"/>
+      </w:pPr>
+      <w:r>
+        <w:rPr>
+          <w:rFonts w:ascii="Arial" w:hAnsi="Arial"/>
+          <w:sz w:val="22"/>
+        </w:rPr>
+      </w:r>
+      <w:r>
+        <w:rPr>
+          <w:rFonts w:ascii="Arial" w:hAnsi="Arial"/>
+          <w:b/>
+          <w:sz w:val="22"/>
+        </w:rPr>
+        <w:t>`842c74e`</w:t>
+      </w:r>
+      <w:r>
+        <w:rPr>
+          <w:rFonts w:ascii="Arial" w:hAnsi="Arial"/>
+          <w:sz w:val="22"/>
+        </w:rPr>
+        <w:t xml:space="preserve"> - *admin*: `fix: bypass connection health checks in connection manager to avoid hang`</w:t>
+      </w:r>
+    </w:p>
+    <w:p>
+      <w:pPr>
+        <w:pStyle w:val="ListBullet"/>
+        <w:spacing w:before="40" w:after="40" w:line="276" w:lineRule="auto"/>
+        <w:ind w:left="360"/>
+      </w:pPr>
+      <w:r>
+        <w:rPr>
+          <w:rFonts w:ascii="Arial" w:hAnsi="Arial"/>
+          <w:sz w:val="22"/>
+        </w:rPr>
+      </w:r>
+      <w:r>
+        <w:rPr>
+          <w:rFonts w:ascii="Arial" w:hAnsi="Arial"/>
+          <w:b/>
+          <w:sz w:val="22"/>
+        </w:rPr>
+        <w:t>`a3f11f5`</w:t>
+      </w:r>
+      <w:r>
+        <w:rPr>
+          <w:rFonts w:ascii="Arial" w:hAnsi="Arial"/>
+          <w:sz w:val="22"/>
+        </w:rPr>
+        <w:t xml:space="preserve"> - *admin*: `feat: simplify thin client login page, focus on local/localhost connections`</w:t>
+      </w:r>
+    </w:p>
+    <w:p>
+      <w:pPr>
+        <w:pStyle w:val="ListBullet"/>
+        <w:spacing w:before="40" w:after="40" w:line="276" w:lineRule="auto"/>
+        <w:ind w:left="360"/>
+      </w:pPr>
+      <w:r>
+        <w:rPr>
+          <w:rFonts w:ascii="Arial" w:hAnsi="Arial"/>
+          <w:sz w:val="22"/>
+        </w:rPr>
+      </w:r>
+      <w:r>
+        <w:rPr>
+          <w:rFonts w:ascii="Arial" w:hAnsi="Arial"/>
+          <w:b/>
+          <w:sz w:val="22"/>
+        </w:rPr>
+        <w:t>`81b2eee`</w:t>
+      </w:r>
+      <w:r>
+        <w:rPr>
+          <w:rFonts w:ascii="Arial" w:hAnsi="Arial"/>
+          <w:sz w:val="22"/>
+        </w:rPr>
+        <w:t xml:space="preserve"> - *admin*: `fix: resolve compilation errors in UserManagementPage and cleanup unused vars`</w:t>
+      </w:r>
+    </w:p>
+    <w:p>
+      <w:pPr>
+        <w:pStyle w:val="ListBullet"/>
+        <w:spacing w:before="40" w:after="40" w:line="276" w:lineRule="auto"/>
+        <w:ind w:left="360"/>
+      </w:pPr>
+      <w:r>
+        <w:rPr>
+          <w:rFonts w:ascii="Arial" w:hAnsi="Arial"/>
+          <w:sz w:val="22"/>
+        </w:rPr>
+      </w:r>
+      <w:r>
+        <w:rPr>
+          <w:rFonts w:ascii="Arial" w:hAnsi="Arial"/>
+          <w:b/>
+          <w:sz w:val="22"/>
+        </w:rPr>
+        <w:t>`96ab300`</w:t>
+      </w:r>
+      <w:r>
+        <w:rPr>
+          <w:rFonts w:ascii="Arial" w:hAnsi="Arial"/>
+          <w:sz w:val="22"/>
+        </w:rPr>
+        <w:t xml:space="preserve"> - *admin*: `feat: optimize thin client UI, fix global Tauri API injection, and improve multi-site overview`</w:t>
+      </w:r>
+    </w:p>
+    <w:p>
+      <w:pPr>
+        <w:pStyle w:val="ListBullet"/>
+        <w:spacing w:before="40" w:after="40" w:line="276" w:lineRule="auto"/>
+        <w:ind w:left="360"/>
+      </w:pPr>
+      <w:r>
+        <w:rPr>
+          <w:rFonts w:ascii="Arial" w:hAnsi="Arial"/>
+          <w:sz w:val="22"/>
+        </w:rPr>
+      </w:r>
+      <w:r>
+        <w:rPr>
+          <w:rFonts w:ascii="Arial" w:hAnsi="Arial"/>
+          <w:b/>
+          <w:sz w:val="22"/>
+        </w:rPr>
+        <w:t>`0c028a8`</w:t>
+      </w:r>
+      <w:r>
+        <w:rPr>
+          <w:rFonts w:ascii="Arial" w:hAnsi="Arial"/>
+          <w:sz w:val="22"/>
+        </w:rPr>
+        <w:t xml:space="preserve"> - *admin*: `fix(desktop): enable withGlobalTauri in config and add safety check to prevent JS crash on load`</w:t>
+      </w:r>
+    </w:p>
+    <w:p>
+      <w:pPr>
+        <w:pStyle w:val="ListBullet"/>
+        <w:spacing w:before="40" w:after="40" w:line="276" w:lineRule="auto"/>
+        <w:ind w:left="360"/>
+      </w:pPr>
+      <w:r>
+        <w:rPr>
+          <w:rFonts w:ascii="Arial" w:hAnsi="Arial"/>
+          <w:sz w:val="22"/>
+        </w:rPr>
+      </w:r>
+      <w:r>
+        <w:rPr>
+          <w:rFonts w:ascii="Arial" w:hAnsi="Arial"/>
+          <w:b/>
+          <w:sz w:val="22"/>
+        </w:rPr>
+        <w:t>`3fca27f`</w:t>
+      </w:r>
+      <w:r>
+        <w:rPr>
+          <w:rFonts w:ascii="Arial" w:hAnsi="Arial"/>
+          <w:sz w:val="22"/>
+        </w:rPr>
+        <w:t xml:space="preserve"> - *admin*: `fix(desktop): handle host unreachable error properly on connect screen`</w:t>
+      </w:r>
+    </w:p>
+    <w:p>
+      <w:pPr>
+        <w:pStyle w:val="ListBullet"/>
+        <w:spacing w:before="40" w:after="40" w:line="276" w:lineRule="auto"/>
+        <w:ind w:left="360"/>
+      </w:pPr>
+      <w:r>
+        <w:rPr>
+          <w:rFonts w:ascii="Arial" w:hAnsi="Arial"/>
+          <w:sz w:val="22"/>
+        </w:rPr>
+      </w:r>
+      <w:r>
+        <w:rPr>
+          <w:rFonts w:ascii="Arial" w:hAnsi="Arial"/>
+          <w:b/>
+          <w:sz w:val="22"/>
+        </w:rPr>
+        <w:t>`241b13e`</w:t>
+      </w:r>
+      <w:r>
+        <w:rPr>
+          <w:rFonts w:ascii="Arial" w:hAnsi="Arial"/>
+          <w:sz w:val="22"/>
+        </w:rPr>
+        <w:t xml:space="preserve"> - *admin*: `feat(desktop): bundle tailscale setup installer as resource and add quick install button`</w:t>
+      </w:r>
+    </w:p>
+    <w:p>
+      <w:pPr>
+        <w:pStyle w:val="ListBullet"/>
+        <w:spacing w:before="40" w:after="40" w:line="276" w:lineRule="auto"/>
+        <w:ind w:left="360"/>
+      </w:pPr>
+      <w:r>
+        <w:rPr>
+          <w:rFonts w:ascii="Arial" w:hAnsi="Arial"/>
+          <w:sz w:val="22"/>
+        </w:rPr>
+      </w:r>
+      <w:r>
+        <w:rPr>
+          <w:rFonts w:ascii="Arial" w:hAnsi="Arial"/>
+          <w:b/>
+          <w:sz w:val="22"/>
+        </w:rPr>
+        <w:t>`4fe6c17`</w:t>
+      </w:r>
+      <w:r>
+        <w:rPr>
+          <w:rFonts w:ascii="Arial" w:hAnsi="Arial"/>
+          <w:sz w:val="22"/>
+        </w:rPr>
+        <w:t xml:space="preserve"> - *admin*: `feat: add Tailscale VPN helper and open_url command to Tauri desktop connection screen`</w:t>
+      </w:r>
+    </w:p>
+    <w:p>
+      <w:pPr>
+        <w:pStyle w:val="ListBullet"/>
+        <w:spacing w:before="40" w:after="40" w:line="276" w:lineRule="auto"/>
+        <w:ind w:left="360"/>
+      </w:pPr>
+      <w:r>
+        <w:rPr>
+          <w:rFonts w:ascii="Arial" w:hAnsi="Arial"/>
+          <w:sz w:val="22"/>
+        </w:rPr>
+      </w:r>
+      <w:r>
+        <w:rPr>
+          <w:rFonts w:ascii="Arial" w:hAnsi="Arial"/>
+          <w:b/>
+          <w:sz w:val="22"/>
+        </w:rPr>
+        <w:t>`f7a8360`</w:t>
+      </w:r>
+      <w:r>
+        <w:rPr>
+          <w:rFonts w:ascii="Arial" w:hAnsi="Arial"/>
+          <w:sz w:val="22"/>
+        </w:rPr>
+        <w:t xml:space="preserve"> - *admin*: `style: refine multi-station navigation back buttons and logos`</w:t>
+      </w:r>
+    </w:p>
+    <w:p>
+      <w:pPr>
+        <w:pStyle w:val="ListBullet"/>
+        <w:spacing w:before="40" w:after="40" w:line="276" w:lineRule="auto"/>
+        <w:ind w:left="360"/>
+      </w:pPr>
+      <w:r>
+        <w:rPr>
+          <w:rFonts w:ascii="Arial" w:hAnsi="Arial"/>
+          <w:sz w:val="22"/>
+        </w:rPr>
+      </w:r>
+      <w:r>
+        <w:rPr>
+          <w:rFonts w:ascii="Arial" w:hAnsi="Arial"/>
+          <w:b/>
+          <w:sz w:val="22"/>
+        </w:rPr>
+        <w:t>`f8d6024`</w:t>
+      </w:r>
+      <w:r>
+        <w:rPr>
+          <w:rFonts w:ascii="Arial" w:hAnsi="Arial"/>
+          <w:sz w:val="22"/>
+        </w:rPr>
+        <w:t xml:space="preserve"> - *admin*: `feat: integrate real-time PD telemetry indicator into region overlays and clean up UI build issues`</w:t>
+      </w:r>
+    </w:p>
+    <w:p>
+      <w:pPr>
+        <w:pStyle w:val="ListBullet"/>
+        <w:spacing w:before="40" w:after="40" w:line="276" w:lineRule="auto"/>
+        <w:ind w:left="360"/>
+      </w:pPr>
+      <w:r>
+        <w:rPr>
+          <w:rFonts w:ascii="Arial" w:hAnsi="Arial"/>
+          <w:sz w:val="22"/>
+        </w:rPr>
+      </w:r>
+      <w:r>
+        <w:rPr>
+          <w:rFonts w:ascii="Arial" w:hAnsi="Arial"/>
+          <w:b/>
+          <w:sz w:val="22"/>
+        </w:rPr>
+        <w:t>`ec9729d`</w:t>
+      </w:r>
+      <w:r>
+        <w:rPr>
+          <w:rFonts w:ascii="Arial" w:hAnsi="Arial"/>
+          <w:sz w:val="22"/>
+        </w:rPr>
+        <w:t xml:space="preserve"> - *admin*: `đa trạm và fix ai nhiệt độ`</w:t>
+      </w:r>
+    </w:p>
+    <w:p>
+      <w:pPr>
+        <w:pStyle w:val="ListBullet"/>
+        <w:spacing w:before="40" w:after="40" w:line="276" w:lineRule="auto"/>
+        <w:ind w:left="360"/>
+      </w:pPr>
+      <w:r>
+        <w:rPr>
+          <w:rFonts w:ascii="Arial" w:hAnsi="Arial"/>
+          <w:sz w:val="22"/>
+        </w:rPr>
+      </w:r>
+      <w:r>
+        <w:rPr>
+          <w:rFonts w:ascii="Arial" w:hAnsi="Arial"/>
+          <w:b/>
+          <w:sz w:val="22"/>
+        </w:rPr>
+        <w:t>`27c2a26`</w:t>
+      </w:r>
+      <w:r>
+        <w:rPr>
+          <w:rFonts w:ascii="Arial" w:hAnsi="Arial"/>
+          <w:sz w:val="22"/>
+        </w:rPr>
+        <w:t xml:space="preserve"> - *admin*: `feat: bypass license, optimize telemetry ingestion to memory cache, persist active station selection, and resolve scoping conflicts`</w:t>
+      </w:r>
+    </w:p>
+    <w:p>
+      <w:pPr>
+        <w:pStyle w:val="ListBullet"/>
+        <w:spacing w:before="40" w:after="40" w:line="276" w:lineRule="auto"/>
+        <w:ind w:left="360"/>
+      </w:pPr>
+      <w:r>
+        <w:rPr>
+          <w:rFonts w:ascii="Arial" w:hAnsi="Arial"/>
+          <w:sz w:val="22"/>
+        </w:rPr>
+      </w:r>
+      <w:r>
+        <w:rPr>
+          <w:rFonts w:ascii="Arial" w:hAnsi="Arial"/>
+          <w:b/>
+          <w:sz w:val="22"/>
+        </w:rPr>
+        <w:t>`00e37a2`</w:t>
+      </w:r>
+      <w:r>
+        <w:rPr>
+          <w:rFonts w:ascii="Arial" w:hAnsi="Arial"/>
+          <w:sz w:val="22"/>
+        </w:rPr>
+        <w:t xml:space="preserve"> - *admin*: `fix(thermal-pred): fix thermal forecast loop indentation and dynamic frontend retrieval`</w:t>
+      </w:r>
+    </w:p>
+    <w:p>
+      <w:pPr>
+        <w:pStyle w:val="ListBullet"/>
+        <w:spacing w:before="40" w:after="40" w:line="276" w:lineRule="auto"/>
+        <w:ind w:left="360"/>
+      </w:pPr>
+      <w:r>
+        <w:rPr>
+          <w:rFonts w:ascii="Arial" w:hAnsi="Arial"/>
+          <w:sz w:val="22"/>
+        </w:rPr>
+      </w:r>
+      <w:r>
+        <w:rPr>
+          <w:rFonts w:ascii="Arial" w:hAnsi="Arial"/>
+          <w:b/>
+          <w:sz w:val="22"/>
+        </w:rPr>
+        <w:t>`7a428c5`</w:t>
+      </w:r>
+      <w:r>
+        <w:rPr>
+          <w:rFonts w:ascii="Arial" w:hAnsi="Arial"/>
+          <w:sz w:val="22"/>
+        </w:rPr>
+        <w:t xml:space="preserve"> - *admin*: `feat: optimize PD boundaries detection logic and fix deletion constraint`</w:t>
+      </w:r>
+    </w:p>
+    <w:p>
+      <w:pPr>
+        <w:pStyle w:val="ListBullet"/>
+        <w:spacing w:before="40" w:after="40" w:line="276" w:lineRule="auto"/>
+        <w:ind w:left="360"/>
+      </w:pPr>
+      <w:r>
+        <w:rPr>
+          <w:rFonts w:ascii="Arial" w:hAnsi="Arial"/>
+          <w:sz w:val="22"/>
+        </w:rPr>
+      </w:r>
+      <w:r>
+        <w:rPr>
+          <w:rFonts w:ascii="Arial" w:hAnsi="Arial"/>
+          <w:b/>
+          <w:sz w:val="22"/>
+        </w:rPr>
+        <w:t>`7c8a43b`</w:t>
+      </w:r>
+      <w:r>
+        <w:rPr>
+          <w:rFonts w:ascii="Arial" w:hAnsi="Arial"/>
+          <w:sz w:val="22"/>
+        </w:rPr>
+        <w:t xml:space="preserve"> - *Admin*: `chore: persist db volume using name stationos-main in compose`</w:t>
+      </w:r>
+    </w:p>
+    <w:p>
+      <w:pPr>
+        <w:pStyle w:val="ListBullet"/>
+        <w:spacing w:before="40" w:after="40" w:line="276" w:lineRule="auto"/>
+        <w:ind w:left="360"/>
+      </w:pPr>
+      <w:r>
+        <w:rPr>
+          <w:rFonts w:ascii="Arial" w:hAnsi="Arial"/>
+          <w:sz w:val="22"/>
+        </w:rPr>
+      </w:r>
+      <w:r>
+        <w:rPr>
+          <w:rFonts w:ascii="Arial" w:hAnsi="Arial"/>
+          <w:b/>
+          <w:sz w:val="22"/>
+        </w:rPr>
+        <w:t>`7ce6507`</w:t>
+      </w:r>
+      <w:r>
+        <w:rPr>
+          <w:rFonts w:ascii="Arial" w:hAnsi="Arial"/>
+          <w:sz w:val="22"/>
+        </w:rPr>
+        <w:t xml:space="preserve"> - *Admin*: `fix: override beforeBuildCommand to empty for thin client build`</w:t>
+      </w:r>
+    </w:p>
+    <w:p>
+      <w:pPr>
+        <w:pStyle w:val="ListBullet"/>
+        <w:spacing w:before="40" w:after="40" w:line="276" w:lineRule="auto"/>
+        <w:ind w:left="360"/>
+      </w:pPr>
+      <w:r>
+        <w:rPr>
+          <w:rFonts w:ascii="Arial" w:hAnsi="Arial"/>
+          <w:sz w:val="22"/>
+        </w:rPr>
+      </w:r>
+      <w:r>
+        <w:rPr>
+          <w:rFonts w:ascii="Arial" w:hAnsi="Arial"/>
+          <w:b/>
+          <w:sz w:val="22"/>
+        </w:rPr>
+        <w:t>`3b6fb8a`</w:t>
+      </w:r>
+      <w:r>
+        <w:rPr>
+          <w:rFonts w:ascii="Arial" w:hAnsi="Arial"/>
+          <w:sz w:val="22"/>
+        </w:rPr>
+        <w:t xml:space="preserve"> - *Admin*: `fix: remove invalid NSIS config fields (shortcutName not in Tauri 2 schema)`</w:t>
+      </w:r>
+    </w:p>
+    <w:p>
+      <w:pPr>
+        <w:pStyle w:val="ListBullet"/>
+        <w:spacing w:before="40" w:after="40" w:line="276" w:lineRule="auto"/>
+        <w:ind w:left="360"/>
+      </w:pPr>
+      <w:r>
+        <w:rPr>
+          <w:rFonts w:ascii="Arial" w:hAnsi="Arial"/>
+          <w:sz w:val="22"/>
+        </w:rPr>
+      </w:r>
+      <w:r>
+        <w:rPr>
+          <w:rFonts w:ascii="Arial" w:hAnsi="Arial"/>
+          <w:b/>
+          <w:sz w:val="22"/>
+        </w:rPr>
+        <w:t>`2012ab0`</w:t>
+      </w:r>
+      <w:r>
+        <w:rPr>
+          <w:rFonts w:ascii="Arial" w:hAnsi="Arial"/>
+          <w:sz w:val="22"/>
+        </w:rPr>
+        <w:t xml:space="preserve"> - *Admin*: `chore: sync all latest changes before push to App-Station-Monitor`</w:t>
+      </w:r>
+    </w:p>
+    <w:p>
+      <w:pPr>
+        <w:pStyle w:val="ListBullet"/>
+        <w:spacing w:before="40" w:after="40" w:line="276" w:lineRule="auto"/>
+        <w:ind w:left="360"/>
+      </w:pPr>
+      <w:r>
+        <w:rPr>
+          <w:rFonts w:ascii="Arial" w:hAnsi="Arial"/>
+          <w:sz w:val="22"/>
+        </w:rPr>
+      </w:r>
+      <w:r>
+        <w:rPr>
+          <w:rFonts w:ascii="Arial" w:hAnsi="Arial"/>
+          <w:b/>
+          <w:sz w:val="22"/>
+        </w:rPr>
+        <w:t>`b9d2ab9`</w:t>
+      </w:r>
+      <w:r>
+        <w:rPr>
+          <w:rFonts w:ascii="Arial" w:hAnsi="Arial"/>
+          <w:sz w:val="22"/>
+        </w:rPr>
+        <w:t xml:space="preserve"> - *Admin*: `feat: add thin client Windows installer with GitHub Actions CI`</w:t>
+      </w:r>
+    </w:p>
+    <w:p>
+      <w:pPr>
+        <w:pStyle w:val="ListBullet"/>
+        <w:spacing w:before="40" w:after="40" w:line="276" w:lineRule="auto"/>
+        <w:ind w:left="360"/>
+      </w:pPr>
+      <w:r>
+        <w:rPr>
+          <w:rFonts w:ascii="Arial" w:hAnsi="Arial"/>
+          <w:sz w:val="22"/>
+        </w:rPr>
+      </w:r>
+      <w:r>
+        <w:rPr>
+          <w:rFonts w:ascii="Arial" w:hAnsi="Arial"/>
+          <w:b/>
+          <w:sz w:val="22"/>
+        </w:rPr>
+        <w:t>`2890455`</w:t>
+      </w:r>
+      <w:r>
+        <w:rPr>
+          <w:rFonts w:ascii="Arial" w:hAnsi="Arial"/>
+          <w:sz w:val="22"/>
+        </w:rPr>
+        <w:t xml:space="preserve"> - *Admin*: `Update forecasting horizon from 5 steps to 1 step to show only the next 5-minute prediction`</w:t>
+      </w:r>
+    </w:p>
+    <w:p>
+      <w:pPr>
+        <w:pStyle w:val="ListBullet"/>
+        <w:spacing w:before="40" w:after="40" w:line="276" w:lineRule="auto"/>
+        <w:ind w:left="360"/>
+      </w:pPr>
+      <w:r>
+        <w:rPr>
+          <w:rFonts w:ascii="Arial" w:hAnsi="Arial"/>
+          <w:sz w:val="22"/>
+        </w:rPr>
+      </w:r>
+      <w:r>
+        <w:rPr>
+          <w:rFonts w:ascii="Arial" w:hAnsi="Arial"/>
+          <w:b/>
+          <w:sz w:val="22"/>
+        </w:rPr>
+        <w:t>`b045b0a`</w:t>
+      </w:r>
+      <w:r>
+        <w:rPr>
+          <w:rFonts w:ascii="Arial" w:hAnsi="Arial"/>
+          <w:sz w:val="22"/>
+        </w:rPr>
+        <w:t xml:space="preserve"> - *Admin*: `Fix thermal history bucketing: include date in bucket key to ensure correct chronological sorting`</w:t>
+      </w:r>
+    </w:p>
+    <w:p>
+      <w:pPr>
+        <w:pStyle w:val="ListBullet"/>
+        <w:spacing w:before="40" w:after="40" w:line="276" w:lineRule="auto"/>
+        <w:ind w:left="360"/>
+      </w:pPr>
+      <w:r>
+        <w:rPr>
+          <w:rFonts w:ascii="Arial" w:hAnsi="Arial"/>
+          <w:sz w:val="22"/>
+        </w:rPr>
+      </w:r>
+      <w:r>
+        <w:rPr>
+          <w:rFonts w:ascii="Arial" w:hAnsi="Arial"/>
+          <w:b/>
+          <w:sz w:val="22"/>
+        </w:rPr>
+        <w:t>`b240dd5`</w:t>
+      </w:r>
+      <w:r>
+        <w:rPr>
+          <w:rFonts w:ascii="Arial" w:hAnsi="Arial"/>
+          <w:sz w:val="22"/>
+        </w:rPr>
+        <w:t xml:space="preserve"> - *Admin*: `Optimize AppShell header layout: apply square corners (borderRadius: 0) and remove unused imports`</w:t>
+      </w:r>
+    </w:p>
+    <w:p>
+      <w:pPr>
+        <w:pStyle w:val="ListBullet"/>
+        <w:spacing w:before="40" w:after="40" w:line="276" w:lineRule="auto"/>
+        <w:ind w:left="360"/>
+      </w:pPr>
+      <w:r>
+        <w:rPr>
+          <w:rFonts w:ascii="Arial" w:hAnsi="Arial"/>
+          <w:sz w:val="22"/>
+        </w:rPr>
+      </w:r>
+      <w:r>
+        <w:rPr>
+          <w:rFonts w:ascii="Arial" w:hAnsi="Arial"/>
+          <w:b/>
+          <w:sz w:val="22"/>
+        </w:rPr>
+        <w:t>`a8d71a9`</w:t>
+      </w:r>
+      <w:r>
+        <w:rPr>
+          <w:rFonts w:ascii="Arial" w:hAnsi="Arial"/>
+          <w:sz w:val="22"/>
+        </w:rPr>
+        <w:t xml:space="preserve"> - *Admin*: `Optimize dashboard alert panel: add squared edges and auto-trigger live camera view on alarm events`</w:t>
+      </w:r>
+    </w:p>
+    <w:p>
+      <w:pPr>
+        <w:pStyle w:val="ListBullet"/>
+        <w:spacing w:before="40" w:after="40" w:line="276" w:lineRule="auto"/>
+        <w:ind w:left="360"/>
+      </w:pPr>
+      <w:r>
+        <w:rPr>
+          <w:rFonts w:ascii="Arial" w:hAnsi="Arial"/>
+          <w:sz w:val="22"/>
+        </w:rPr>
+      </w:r>
+      <w:r>
+        <w:rPr>
+          <w:rFonts w:ascii="Arial" w:hAnsi="Arial"/>
+          <w:b/>
+          <w:sz w:val="22"/>
+        </w:rPr>
+        <w:t>`797e7fe`</w:t>
+      </w:r>
+      <w:r>
+        <w:rPr>
+          <w:rFonts w:ascii="Arial" w:hAnsi="Arial"/>
+          <w:sz w:val="22"/>
+        </w:rPr>
+        <w:t xml:space="preserve"> - *Admin*: `chore: remove redundant camera linkage configuration tab from SettingsPage`</w:t>
+      </w:r>
+    </w:p>
+    <w:p>
+      <w:pPr>
+        <w:pStyle w:val="ListBullet"/>
+        <w:spacing w:before="40" w:after="40" w:line="276" w:lineRule="auto"/>
+        <w:ind w:left="360"/>
+      </w:pPr>
+      <w:r>
+        <w:rPr>
+          <w:rFonts w:ascii="Arial" w:hAnsi="Arial"/>
+          <w:sz w:val="22"/>
+        </w:rPr>
+      </w:r>
+      <w:r>
+        <w:rPr>
+          <w:rFonts w:ascii="Arial" w:hAnsi="Arial"/>
+          <w:b/>
+          <w:sz w:val="22"/>
+        </w:rPr>
+        <w:t>`571df39`</w:t>
+      </w:r>
+      <w:r>
+        <w:rPr>
+          <w:rFonts w:ascii="Arial" w:hAnsi="Arial"/>
+          <w:sz w:val="22"/>
+        </w:rPr>
+        <w:t xml:space="preserve"> - *Admin*: `chore: remove redundant theme configuration tab from SettingsPage`</w:t>
+      </w:r>
+    </w:p>
+    <w:p>
+      <w:pPr>
+        <w:pStyle w:val="ListBullet"/>
+        <w:spacing w:before="40" w:after="40" w:line="276" w:lineRule="auto"/>
+        <w:ind w:left="360"/>
+      </w:pPr>
+      <w:r>
+        <w:rPr>
+          <w:rFonts w:ascii="Arial" w:hAnsi="Arial"/>
+          <w:sz w:val="22"/>
+        </w:rPr>
+      </w:r>
+      <w:r>
+        <w:rPr>
+          <w:rFonts w:ascii="Arial" w:hAnsi="Arial"/>
+          <w:b/>
+          <w:sz w:val="22"/>
+        </w:rPr>
+        <w:t>`f782c4b`</w:t>
+      </w:r>
+      <w:r>
+        <w:rPr>
+          <w:rFonts w:ascii="Arial" w:hAnsi="Arial"/>
+          <w:sz w:val="22"/>
+        </w:rPr>
+        <w:t xml:space="preserve"> - *Admin*: `style: implement collapsible inline theme selector in AppShell`</w:t>
+      </w:r>
+    </w:p>
+    <w:p>
+      <w:pPr>
+        <w:pStyle w:val="ListBullet"/>
+        <w:spacing w:before="40" w:after="40" w:line="276" w:lineRule="auto"/>
+        <w:ind w:left="360"/>
+      </w:pPr>
+      <w:r>
+        <w:rPr>
+          <w:rFonts w:ascii="Arial" w:hAnsi="Arial"/>
+          <w:sz w:val="22"/>
+        </w:rPr>
+      </w:r>
+      <w:r>
+        <w:rPr>
+          <w:rFonts w:ascii="Arial" w:hAnsi="Arial"/>
+          <w:b/>
+          <w:sz w:val="22"/>
+        </w:rPr>
+        <w:t>`209ed00`</w:t>
+      </w:r>
+      <w:r>
+        <w:rPr>
+          <w:rFonts w:ascii="Arial" w:hAnsi="Arial"/>
+          <w:sz w:val="22"/>
+        </w:rPr>
+        <w:t xml:space="preserve"> - *Admin*: `style: replace native theme select with custom styled theme selector`</w:t>
+      </w:r>
+    </w:p>
+    <w:p>
+      <w:pPr>
+        <w:pStyle w:val="ListBullet"/>
+        <w:spacing w:before="40" w:after="40" w:line="276" w:lineRule="auto"/>
+        <w:ind w:left="360"/>
+      </w:pPr>
+      <w:r>
+        <w:rPr>
+          <w:rFonts w:ascii="Arial" w:hAnsi="Arial"/>
+          <w:sz w:val="22"/>
+        </w:rPr>
+      </w:r>
+      <w:r>
+        <w:rPr>
+          <w:rFonts w:ascii="Arial" w:hAnsi="Arial"/>
+          <w:b/>
+          <w:sz w:val="22"/>
+        </w:rPr>
+        <w:t>`b08855e`</w:t>
+      </w:r>
+      <w:r>
+        <w:rPr>
+          <w:rFonts w:ascii="Arial" w:hAnsi="Arial"/>
+          <w:sz w:val="22"/>
+        </w:rPr>
+        <w:t xml:space="preserve"> - *Admin*: `chore: remove rule-engine from sidebar navigation`</w:t>
+      </w:r>
+    </w:p>
+    <w:p>
+      <w:pPr>
+        <w:pStyle w:val="ListBullet"/>
+        <w:spacing w:before="40" w:after="40" w:line="276" w:lineRule="auto"/>
+        <w:ind w:left="360"/>
+      </w:pPr>
+      <w:r>
+        <w:rPr>
+          <w:rFonts w:ascii="Arial" w:hAnsi="Arial"/>
+          <w:sz w:val="22"/>
+        </w:rPr>
+      </w:r>
+      <w:r>
+        <w:rPr>
+          <w:rFonts w:ascii="Arial" w:hAnsi="Arial"/>
+          <w:b/>
+          <w:sz w:val="22"/>
+        </w:rPr>
+        <w:t>`a8c158e`</w:t>
+      </w:r>
+      <w:r>
+        <w:rPr>
+          <w:rFonts w:ascii="Arial" w:hAnsi="Arial"/>
+          <w:sz w:val="22"/>
+        </w:rPr>
+        <w:t xml:space="preserve"> - *Admin*: `feat: implement quick rule engine configuration, optimize storage monitor worker, and clean up thermal monitoring labels`</w:t>
+      </w:r>
+    </w:p>
+    <w:p>
+      <w:pPr>
+        <w:pStyle w:val="ListBullet"/>
+        <w:spacing w:before="40" w:after="40" w:line="276" w:lineRule="auto"/>
+        <w:ind w:left="360"/>
+      </w:pPr>
+      <w:r>
+        <w:rPr>
+          <w:rFonts w:ascii="Arial" w:hAnsi="Arial"/>
+          <w:sz w:val="22"/>
+        </w:rPr>
+      </w:r>
+      <w:r>
+        <w:rPr>
+          <w:rFonts w:ascii="Arial" w:hAnsi="Arial"/>
+          <w:b/>
+          <w:sz w:val="22"/>
+        </w:rPr>
+        <w:t>`380ef91`</w:t>
+      </w:r>
+      <w:r>
+        <w:rPr>
+          <w:rFonts w:ascii="Arial" w:hAnsi="Arial"/>
+          <w:sz w:val="22"/>
+        </w:rPr>
+        <w:t xml:space="preserve"> - *Admin*: `feat(ui): optimize alert panel layout horizontal columns and vertical tight styling`</w:t>
+      </w:r>
+    </w:p>
+    <w:p>
+      <w:pPr>
+        <w:pStyle w:val="ListBullet"/>
+        <w:spacing w:before="40" w:after="40" w:line="276" w:lineRule="auto"/>
+        <w:ind w:left="360"/>
+      </w:pPr>
+      <w:r>
+        <w:rPr>
+          <w:rFonts w:ascii="Arial" w:hAnsi="Arial"/>
+          <w:sz w:val="22"/>
+        </w:rPr>
+      </w:r>
+      <w:r>
+        <w:rPr>
+          <w:rFonts w:ascii="Arial" w:hAnsi="Arial"/>
+          <w:b/>
+          <w:sz w:val="22"/>
+        </w:rPr>
+        <w:t>`220455a`</w:t>
+      </w:r>
+      <w:r>
+        <w:rPr>
+          <w:rFonts w:ascii="Arial" w:hAnsi="Arial"/>
+          <w:sz w:val="22"/>
+        </w:rPr>
+        <w:t xml:space="preserve"> - *Admin*: `feat(thermal): implement real-time dynamic sync and clashing-free point ID assignment on deletion`</w:t>
       </w:r>
     </w:p>
     <w:p>

</xml_diff>

<commit_message>
docs: expand bug fix log with detailed real-world issues from commits
</commit_message>
<xml_diff>
--- a/HO_SO_KY_THUAT.docx
+++ b/HO_SO_KY_THUAT.docx
@@ -15759,7 +15759,7 @@
           <w:b/>
           <w:sz w:val="22"/>
         </w:rPr>
-        <w:t>Sửa lỗi crash cổng kết nối socket</w:t>
+        <w:t>Sửa lỗi crash cổng kết nối socket (ECONNRESET)</w:t>
       </w:r>
       <w:r>
         <w:rPr>
@@ -15871,7 +15871,7 @@
           <w:b/>
           <w:sz w:val="22"/>
         </w:rPr>
-        <w:t>Sửa lỗi không nhận diện bản quyền trên Windows</w:t>
+        <w:t>Sửa lỗi không nhận diện bản quyền phần cứng</w:t>
       </w:r>
       <w:r>
         <w:rPr>
@@ -16039,7 +16039,7 @@
           <w:b/>
           <w:sz w:val="22"/>
         </w:rPr>
-        <w:t>Sửa lỗi 404 không tìm thấy sơ đồ SLD</w:t>
+        <w:t>Sửa lỗi 404 không tìm thấy sơ đồ SLD và ghi tệp tin</w:t>
       </w:r>
       <w:r>
         <w:rPr>
@@ -16075,6 +16075,342 @@
           <w:sz w:val="22"/>
         </w:rPr>
         <w:t>*Giải pháp*: Chuyển hướng thư mục lưu trữ động sang `%APPDATA%` của người dùng và copy tệp tin SVG mẫu khi database được khởi chạy lần đầu.</w:t>
+      </w:r>
+    </w:p>
+    <w:p>
+      <w:pPr>
+        <w:pStyle w:val="ListBullet"/>
+        <w:spacing w:before="40" w:after="40" w:line="276" w:lineRule="auto"/>
+        <w:ind w:left="360"/>
+      </w:pPr>
+      <w:r>
+        <w:rPr>
+          <w:rFonts w:ascii="Arial" w:hAnsi="Arial"/>
+          <w:sz w:val="22"/>
+        </w:rPr>
+      </w:r>
+      <w:r>
+        <w:rPr>
+          <w:rFonts w:ascii="Arial" w:hAnsi="Arial"/>
+          <w:b/>
+          <w:sz w:val="22"/>
+        </w:rPr>
+        <w:t>Sửa lỗi xung đột cổng 5000 khi chạy nhiều tiến trình trên Windows</w:t>
+      </w:r>
+      <w:r>
+        <w:rPr>
+          <w:rFonts w:ascii="Arial" w:hAnsi="Arial"/>
+          <w:sz w:val="22"/>
+        </w:rPr>
+        <w:t>:</w:t>
+      </w:r>
+    </w:p>
+    <w:p>
+      <w:pPr>
+        <w:pStyle w:val="ListBullet"/>
+        <w:spacing w:before="40" w:after="40" w:line="276" w:lineRule="auto"/>
+        <w:ind w:left="792"/>
+      </w:pPr>
+      <w:r>
+        <w:rPr>
+          <w:rFonts w:ascii="Arial" w:hAnsi="Arial"/>
+          <w:sz w:val="22"/>
+        </w:rPr>
+        <w:t>*Lỗi phát hiện*: Khi khởi chạy ứng dụng lần thứ hai hoặc tiến trình chạy ngầm trước đó chưa được kill hoàn toàn, cổng 5000 bị chiếm dụng làm treo backend.</w:t>
+      </w:r>
+    </w:p>
+    <w:p>
+      <w:pPr>
+        <w:pStyle w:val="ListBullet"/>
+        <w:spacing w:before="40" w:after="40" w:line="276" w:lineRule="auto"/>
+        <w:ind w:left="792"/>
+      </w:pPr>
+      <w:r>
+        <w:rPr>
+          <w:rFonts w:ascii="Arial" w:hAnsi="Arial"/>
+          <w:sz w:val="22"/>
+        </w:rPr>
+        <w:t>*Giải pháp*: Thay đổi cổng mặc định của backend từ 5000 sang 5050 để tránh xung đột cổng cục bộ.</w:t>
+      </w:r>
+    </w:p>
+    <w:p>
+      <w:pPr>
+        <w:pStyle w:val="ListBullet"/>
+        <w:spacing w:before="40" w:after="40" w:line="276" w:lineRule="auto"/>
+        <w:ind w:left="360"/>
+      </w:pPr>
+      <w:r>
+        <w:rPr>
+          <w:rFonts w:ascii="Arial" w:hAnsi="Arial"/>
+          <w:sz w:val="22"/>
+        </w:rPr>
+      </w:r>
+      <w:r>
+        <w:rPr>
+          <w:rFonts w:ascii="Arial" w:hAnsi="Arial"/>
+          <w:b/>
+          <w:sz w:val="22"/>
+        </w:rPr>
+        <w:t>Sửa lỗi treo/chết luồng CSDL khi đóng kết nối EF Core</w:t>
+      </w:r>
+      <w:r>
+        <w:rPr>
+          <w:rFonts w:ascii="Arial" w:hAnsi="Arial"/>
+          <w:sz w:val="22"/>
+        </w:rPr>
+        <w:t>:</w:t>
+      </w:r>
+    </w:p>
+    <w:p>
+      <w:pPr>
+        <w:pStyle w:val="ListBullet"/>
+        <w:spacing w:before="40" w:after="40" w:line="276" w:lineRule="auto"/>
+        <w:ind w:left="792"/>
+      </w:pPr>
+      <w:r>
+        <w:rPr>
+          <w:rFonts w:ascii="Arial" w:hAnsi="Arial"/>
+          <w:sz w:val="22"/>
+        </w:rPr>
+        <w:t>*Lỗi phát hiện*: Sử dụng lệnh `using` sai cách trên kết nối `GetDbConnection` dẫn đến việc EF Core tự động đóng kết nối cơ sở dữ liệu vật lý quá sớm, làm các truy vấn tiếp theo bị treo.</w:t>
+      </w:r>
+    </w:p>
+    <w:p>
+      <w:pPr>
+        <w:pStyle w:val="ListBullet"/>
+        <w:spacing w:before="40" w:after="40" w:line="276" w:lineRule="auto"/>
+        <w:ind w:left="792"/>
+      </w:pPr>
+      <w:r>
+        <w:rPr>
+          <w:rFonts w:ascii="Arial" w:hAnsi="Arial"/>
+          <w:sz w:val="22"/>
+        </w:rPr>
+        <w:t>*Giải pháp*: Loại bỏ block `using` không đúng chỗ và để EF Core tự quản lý vòng đời của DbConnection.</w:t>
+      </w:r>
+    </w:p>
+    <w:p>
+      <w:pPr>
+        <w:pStyle w:val="ListBullet"/>
+        <w:spacing w:before="40" w:after="40" w:line="276" w:lineRule="auto"/>
+        <w:ind w:left="360"/>
+      </w:pPr>
+      <w:r>
+        <w:rPr>
+          <w:rFonts w:ascii="Arial" w:hAnsi="Arial"/>
+          <w:sz w:val="22"/>
+        </w:rPr>
+      </w:r>
+      <w:r>
+        <w:rPr>
+          <w:rFonts w:ascii="Arial" w:hAnsi="Arial"/>
+          <w:b/>
+          <w:sz w:val="22"/>
+        </w:rPr>
+        <w:t>Sửa lỗi mã hóa UTF8 khi khởi tạo CSDL trên Windows</w:t>
+      </w:r>
+      <w:r>
+        <w:rPr>
+          <w:rFonts w:ascii="Arial" w:hAnsi="Arial"/>
+          <w:sz w:val="22"/>
+        </w:rPr>
+        <w:t>:</w:t>
+      </w:r>
+    </w:p>
+    <w:p>
+      <w:pPr>
+        <w:pStyle w:val="ListBullet"/>
+        <w:spacing w:before="40" w:after="40" w:line="276" w:lineRule="auto"/>
+        <w:ind w:left="792"/>
+      </w:pPr>
+      <w:r>
+        <w:rPr>
+          <w:rFonts w:ascii="Arial" w:hAnsi="Arial"/>
+          <w:sz w:val="22"/>
+        </w:rPr>
+        <w:t>*Lỗi phát hiện*: Lệnh khởi tạo database `initdb` mặc định sử dụng mã hóa hệ thống của Windows (WIN1252), gây lỗi font khi chèn dữ liệu tiếng Việt có dấu.</w:t>
+      </w:r>
+    </w:p>
+    <w:p>
+      <w:pPr>
+        <w:pStyle w:val="ListBullet"/>
+        <w:spacing w:before="40" w:after="40" w:line="276" w:lineRule="auto"/>
+        <w:ind w:left="792"/>
+      </w:pPr>
+      <w:r>
+        <w:rPr>
+          <w:rFonts w:ascii="Arial" w:hAnsi="Arial"/>
+          <w:sz w:val="22"/>
+        </w:rPr>
+        <w:t>*Giải pháp*: Ép buộc tiến trình `initdb` của PostgreSQL chạy với tham số `-E UTF8` để đảm bảo lưu trữ và truy vấn tiếng Việt chính xác.</w:t>
+      </w:r>
+    </w:p>
+    <w:p>
+      <w:pPr>
+        <w:pStyle w:val="ListBullet"/>
+        <w:spacing w:before="40" w:after="40" w:line="276" w:lineRule="auto"/>
+        <w:ind w:left="360"/>
+      </w:pPr>
+      <w:r>
+        <w:rPr>
+          <w:rFonts w:ascii="Arial" w:hAnsi="Arial"/>
+          <w:sz w:val="22"/>
+        </w:rPr>
+      </w:r>
+      <w:r>
+        <w:rPr>
+          <w:rFonts w:ascii="Arial" w:hAnsi="Arial"/>
+          <w:b/>
+          <w:sz w:val="22"/>
+        </w:rPr>
+        <w:t>Sửa lỗi lệch tọa độ vùng biên Roi và điểm đo nhiệt khi Zoom</w:t>
+      </w:r>
+      <w:r>
+        <w:rPr>
+          <w:rFonts w:ascii="Arial" w:hAnsi="Arial"/>
+          <w:sz w:val="22"/>
+        </w:rPr>
+        <w:t>:</w:t>
+      </w:r>
+    </w:p>
+    <w:p>
+      <w:pPr>
+        <w:pStyle w:val="ListBullet"/>
+        <w:spacing w:before="40" w:after="40" w:line="276" w:lineRule="auto"/>
+        <w:ind w:left="792"/>
+      </w:pPr>
+      <w:r>
+        <w:rPr>
+          <w:rFonts w:ascii="Arial" w:hAnsi="Arial"/>
+          <w:sz w:val="22"/>
+        </w:rPr>
+        <w:t>*Lỗi phát hiện*: Khi người vận hành thu phóng sơ đồ nhiệt hoặc thay đổi tab hiển thị, các điểm chọn đo nhiệt độ và tọa độ đa giác bị dịch chuyển lệch vị trí.</w:t>
+      </w:r>
+    </w:p>
+    <w:p>
+      <w:pPr>
+        <w:pStyle w:val="ListBullet"/>
+        <w:spacing w:before="40" w:after="40" w:line="276" w:lineRule="auto"/>
+        <w:ind w:left="792"/>
+      </w:pPr>
+      <w:r>
+        <w:rPr>
+          <w:rFonts w:ascii="Arial" w:hAnsi="Arial"/>
+          <w:sz w:val="22"/>
+        </w:rPr>
+        <w:t>*Giải pháp*: Lưu lại tọa độ tương đối theo tỷ lệ phần trăm (percentage-based coordinates) và cập nhật lại điểm vẽ động ngay khi thay đổi tỷ lệ zoom.</w:t>
+      </w:r>
+    </w:p>
+    <w:p>
+      <w:pPr>
+        <w:pStyle w:val="ListBullet"/>
+        <w:spacing w:before="40" w:after="40" w:line="276" w:lineRule="auto"/>
+        <w:ind w:left="360"/>
+      </w:pPr>
+      <w:r>
+        <w:rPr>
+          <w:rFonts w:ascii="Arial" w:hAnsi="Arial"/>
+          <w:sz w:val="22"/>
+        </w:rPr>
+      </w:r>
+      <w:r>
+        <w:rPr>
+          <w:rFonts w:ascii="Arial" w:hAnsi="Arial"/>
+          <w:b/>
+          <w:sz w:val="22"/>
+        </w:rPr>
+        <w:t>Sửa lỗi quyền ghi tệp tin khi lưu trữ tệp tin CSDL cục bộ</w:t>
+      </w:r>
+      <w:r>
+        <w:rPr>
+          <w:rFonts w:ascii="Arial" w:hAnsi="Arial"/>
+          <w:sz w:val="22"/>
+        </w:rPr>
+        <w:t>:</w:t>
+      </w:r>
+    </w:p>
+    <w:p>
+      <w:pPr>
+        <w:pStyle w:val="ListBullet"/>
+        <w:spacing w:before="40" w:after="40" w:line="276" w:lineRule="auto"/>
+        <w:ind w:left="792"/>
+      </w:pPr>
+      <w:r>
+        <w:rPr>
+          <w:rFonts w:ascii="Arial" w:hAnsi="Arial"/>
+          <w:sz w:val="22"/>
+        </w:rPr>
+        <w:t>*Lỗi phát hiện*: Khi đóng gói ứng dụng Electron dưới dạng Thick Client cài vào thư mục `Program Files`, tiến trình Postgres không có quyền ghi dữ liệu vào thư mục gốc gây lỗi crash khởi động.</w:t>
+      </w:r>
+    </w:p>
+    <w:p>
+      <w:pPr>
+        <w:pStyle w:val="ListBullet"/>
+        <w:spacing w:before="40" w:after="40" w:line="276" w:lineRule="auto"/>
+        <w:ind w:left="792"/>
+      </w:pPr>
+      <w:r>
+        <w:rPr>
+          <w:rFonts w:ascii="Arial" w:hAnsi="Arial"/>
+          <w:sz w:val="22"/>
+        </w:rPr>
+        <w:t>*Giải pháp*: Thay đổi đường dẫn lưu trữ thư mục dữ liệu `pg_data` sang thư mục `%APPDATA%` chuyên dụng của người dùng.</w:t>
+      </w:r>
+    </w:p>
+    <w:p>
+      <w:pPr>
+        <w:pStyle w:val="ListBullet"/>
+        <w:spacing w:before="40" w:after="40" w:line="276" w:lineRule="auto"/>
+        <w:ind w:left="360"/>
+      </w:pPr>
+      <w:r>
+        <w:rPr>
+          <w:rFonts w:ascii="Arial" w:hAnsi="Arial"/>
+          <w:sz w:val="22"/>
+        </w:rPr>
+      </w:r>
+      <w:r>
+        <w:rPr>
+          <w:rFonts w:ascii="Arial" w:hAnsi="Arial"/>
+          <w:b/>
+          <w:sz w:val="22"/>
+        </w:rPr>
+        <w:t>Sửa lỗi tràn chữ thanh công cụ toolbar trên màn hình độ phân giải thấp</w:t>
+      </w:r>
+      <w:r>
+        <w:rPr>
+          <w:rFonts w:ascii="Arial" w:hAnsi="Arial"/>
+          <w:sz w:val="22"/>
+        </w:rPr>
+        <w:t>:</w:t>
+      </w:r>
+    </w:p>
+    <w:p>
+      <w:pPr>
+        <w:pStyle w:val="ListBullet"/>
+        <w:spacing w:before="40" w:after="40" w:line="276" w:lineRule="auto"/>
+        <w:ind w:left="792"/>
+      </w:pPr>
+      <w:r>
+        <w:rPr>
+          <w:rFonts w:ascii="Arial" w:hAnsi="Arial"/>
+          <w:sz w:val="22"/>
+        </w:rPr>
+        <w:t>*Lỗi phát hiện*: Trên các màn hình vận hành công nghiệp (độ phân giải 1366x768 hoặc thấp hơn), thanh công cụ trang quản trị thiết bị bị tràn và che mất các nút chức năng.</w:t>
+      </w:r>
+    </w:p>
+    <w:p>
+      <w:pPr>
+        <w:pStyle w:val="ListBullet"/>
+        <w:spacing w:before="40" w:after="40" w:line="276" w:lineRule="auto"/>
+        <w:ind w:left="792"/>
+      </w:pPr>
+      <w:r>
+        <w:rPr>
+          <w:rFonts w:ascii="Arial" w:hAnsi="Arial"/>
+          <w:sz w:val="22"/>
+        </w:rPr>
+        <w:t>*Giải pháp*: Thiết lập thuộc tính CSS `flex-wrap` và điều chỉnh lại khoảng cách padding động để các nút tự xuống dòng mượt mà.</w:t>
       </w:r>
     </w:p>
     <w:p>

</xml_diff>